<commit_message>
docs: refocus proposal on workflow patterns and efficiency solutions
</commit_message>
<xml_diff>
--- a/AX-hackathon-proposal.docx
+++ b/AX-hackathon-proposal.docx
@@ -29,7 +29,7 @@
           <w:b/>
           <w:bCs/>
         </w:rPr>
-        <w:t xml:space="preserve">제안명: WorkMemory AI — 나도 몰랐던 나의 일을 찾아주는 AI 업무 기억 비서</w:t>
+        <w:t xml:space="preserve">제안명: WorkMemory AI — 업무를 패턴화해 효율화 솔루션을 제안하는 AI 업무 비서</w:t>
       </w:r>
     </w:p>
     <w:p>
@@ -54,7 +54,7 @@
           <w:szCs w:val="28"/>
           <w:lang w:val="ko-KR" w:eastAsia="ko-KR"/>
         </w:rPr>
-        <w:t xml:space="preserve"> PC에서 평소처럼 일하면 AI가 키보드·마우스 조작과 작업 맥락을 연결해, 내가 어떤 업무를 했는지 기억하고 분류해주는 서비스를 개발하고자 한다. Excel, 웹브라우저, 문서 편집기 등 여러 도구에 흩어진 일을 업무 단위로 정리하고, 평가노트에 활용할 업무·기여 사례와 반복 작업을 개선할 인사이트를 제공하는 업무 기억 비서를 제안한다.</w:t>
+        <w:t xml:space="preserve"> PC에서 평소처럼 일하는 동안 사용자가 허용한 범위의 업무 데이터가 자동으로 쌓이고, AI가 이를 업무 성격에 맞게 분류·패턴화하는 서비스를 개발하고자 한다. 누적된 데이터로 반복 수작업과 개선 지점을 찾아 업무 효율화 솔루션을 제안하고, 구체적인 자동화 설계안과 템플릿을 제공한다. 같은 기록은 나의 업무를 돌아보거나 일일·주간·월간 보고 등 필요한 문서를 자동으로 작성하는 데 활용한다.</w:t>
       </w:r>
     </w:p>
     <w:p>
@@ -79,7 +79,7 @@
           <w:szCs w:val="28"/>
           <w:lang w:val="ko-KR" w:eastAsia="ko-KR"/>
         </w:rPr>
-        <w:t xml:space="preserve"> “자료 정리만 했다고 생각했는데, 여러 파일과 시스템 사이에서 데이터를 옮기고 형식을 맞추는 일을 계속 반복하고 있었네.” AI가 업무의 흐름과 반복 패턴을 보여주면, 사용자는 자신의 일을 다시 이해하고 표준 양식이나 자동화를 검토할 수 있다. 확인한 기록은 평가노트에 쓸 업무 사례로도 활용한다. 아래 사례와 결과는 제품 경험을 설명하기 위한 가상의 예시다.</w:t>
+        <w:t xml:space="preserve"> “여러 파일의 자료를 옮기고 같은 형식으로 정리하는 일을 반복하고 있었네. 이 과정을 한 번에 취합하도록 바꿀 수 있겠구나.” AI가 반복 흐름을 패턴화하고, 공통 양식과 자동 취합 절차를 개선 솔루션으로 제안한다. 사용자는 적용 방법을 검토하고, 쌓인 기록으로 자신의 업무를 회고하거나 보고 초안을 만든다. 아래 사례와 결과는 제품 경험을 설명하기 위한 가상의 예시다.</w:t>
       </w:r>
     </w:p>
     <w:p>
@@ -109,7 +109,7 @@
           <w:szCs w:val="28"/>
           <w:lang w:val="ko-KR" w:eastAsia="ko-KR"/>
         </w:rPr>
-        <w:t xml:space="preserve">“하루 종일 바빴는데, 정작 무엇을 했는지 쓰려니 생각나지 않는다.”</w:t>
+        <w:t xml:space="preserve">“평소처럼 일한 기록이 쌓여, 어떤 업무를 개선할 수 있는지까지 알려주면 좋겠다.”</w:t>
       </w:r>
     </w:p>
     <w:p>
@@ -143,7 +143,7 @@
           <w:szCs w:val="28"/>
           <w:lang w:val="ko-KR" w:eastAsia="ko-KR"/>
         </w:rPr>
-        <w:t xml:space="preserve">이다. 자료를 정리하는 사람, 문서를 작성하는 사람, 개발하는 사람, 시스템을 운영하는 사람 모두 여러 프로그램을 오가며 일한다. 짧은 자료 확인, 문서 수정, 동료 지원과 문제 해결 과정은 별도의 업무 기록에 빠짐없이 남기기 어렵다. 일을 수행하는 것과 별개로 무엇을 했는지 기억하고 정리해야 하는 부담이 있다.</w:t>
+        <w:t xml:space="preserve">이다. 자료 취합·분석·개발·문서 작성·시스템 운영 등 다양한 업무에서 여러 프로그램을 오가며 일한다. 파일 사이의 값 복사, 시스템 조회, 같은 형식으로 정리하기처럼 작은 수작업이 반복되어도, 바쁜 일상에서는 그 흐름을 파악하고 개선 방법까지 찾기 어렵다. 프로그램별 사용 시간이나 입력 횟수만으로는 업무의 목적과 자동화 가능성을 설명하기도 어렵다.</w:t>
       </w:r>
     </w:p>
     <w:p>
@@ -157,7 +157,7 @@
           <w:szCs w:val="28"/>
           <w:lang w:val="ko-KR" w:eastAsia="ko-KR"/>
         </w:rPr>
-        <w:t xml:space="preserve">평가노트를 작성할 때에는 몇 달 동안 수행한 업무와 기여 사례를 다시 떠올려야 한다. 눈에 띄는 결과물은 기억해도 그 과정의 자료 정리, 검토, 협업과 작은 개선 시도는 놓치기 쉽다. 비슷한 복사·입력·서식 변경을 반복하고 있어도 각각의 작업으로만 기억하면 어떤 과정을 개선할 수 있을지 발견하기 어렵다. 프로그램별 사용 시간이나 입력 횟수만으로는 실제 업무의 목적과 의미를 설명하기도 어렵다.</w:t>
+        <w:t xml:space="preserve">업무를 돌아보거나 보고서를 작성할 때에도 별도의 기록 부담이 생긴다. 짧은 자료 확인, 검토, 동료 지원과 문제 해결 과정은 기억에서 빠지기 쉽고, 일일·주간·월간 보고 때마다 흩어진 자료를 다시 모아야 한다. 업무를 수행하면서 자연스럽게 남는 데이터를 활용하면 개선 대상을 찾는 일과 업무 기록·문서 작성을 함께 도울 수 있다.</w:t>
       </w:r>
     </w:p>
     <w:p>
@@ -182,16 +182,16 @@
           <w:b/>
           <w:bCs/>
         </w:rPr>
-        <w:t xml:space="preserve">PC 조작의 맥락을 업무의 기억·분류·개선으로 연결하는 서비스</w:t>
-      </w:r>
-      <w:r>
-        <w:rPr>
-          <w:rFonts w:ascii="바탕체" w:hAnsi="바탕체" w:eastAsia="바탕체" w:cs="바탕체"/>
-          <w:sz w:val="28"/>
-          <w:szCs w:val="28"/>
-          <w:lang w:val="ko-KR" w:eastAsia="ko-KR"/>
-        </w:rPr>
-        <w:t xml:space="preserve">를 제안한다. 하루의 일을 업무 단위로 복원하고, 여러 프로그램에서 이어진 행동을 같은 목적의 일로 연결하고자 한다. 누적된 기록에서는 반복 작업과 업무 흐름을 찾아 개선 후보를 제시한다. 사용자가 확인한 내용은 평가노트의 업무·기여 사례로 축적하고, 필요한 경우 업무 일지나 주간·월간 보고에도 재사용할 수 있게 한다.</w:t>
+        <w:t xml:space="preserve">일상 업무 데이터의 자동 축적 → 업무 성격에 따른 자동 분류·패턴화 → 효율화 솔루션 제안</w:t>
+      </w:r>
+      <w:r>
+        <w:rPr>
+          <w:rFonts w:ascii="바탕체" w:hAnsi="바탕체" w:eastAsia="바탕체" w:cs="바탕체"/>
+          <w:sz w:val="28"/>
+          <w:szCs w:val="28"/>
+          <w:lang w:val="ko-KR" w:eastAsia="ko-KR"/>
+        </w:rPr>
+        <w:t xml:space="preserve">을 중심 흐름으로 제안한다. 반복되는 절차와 수작업을 찾아 표준 양식, 자동 취합, 입력·검증 절차 자동화 등 실행 방법이 담긴 개선 솔루션을 제공하고자 한다. 축적된 업무 기록은 회고와 문서 자동화에도 재사용한다. 업무별 타임테이블과 프로그램 사용 현황은 자신의 일하는 방식을 이해하는 부수 기능으로 제공한다.</w:t>
       </w:r>
     </w:p>
     <w:p>
@@ -205,7 +205,7 @@
           <w:szCs w:val="28"/>
           <w:lang w:val="ko-KR" w:eastAsia="ko-KR"/>
         </w:rPr>
-        <w:t xml:space="preserve">적용 대상은 PC를 사용하는 업무 전반으로 설정한다. 해커톤에서는 대표 업무 시나리오와 프로그램 조합을 정해 기록 수집·저장부터 AI 업무 분류, 반복 패턴 발견, 평가노트용 사례 정리까지 이어지는 프로토타입을 개발할 계획이다. 모호한 업무는 사용자가 짧게 수정하거나 확인하도록 설계한다.</w:t>
+        <w:t xml:space="preserve">처음에 사용자가 수집할 프로그램과 파일·대화·사이트 조건을 선택하면, 그 범위 안에서 데이터가 자동으로 축적되도록 설계한다. 해커톤에서는 대표 프로그램 조합에서 선택적 수집·저장, 업무 분류·패턴화, 효율화 솔루션 한 개와 보고 초안 한 종류까지 이어지는 프로토타입을 개발할 계획이다. 사용자는 모호한 업무나 잘못 연결된 항목만 짧게 수정할 수 있게 한다.</w:t>
       </w:r>
     </w:p>
     <w:p>
@@ -237,7 +237,7 @@
           <w:b/>
           <w:bCs/>
         </w:rPr>
-        <w:t xml:space="preserve">① 흩어진 행동을 업무로 복원: “오늘 내가 한 일”</w:t>
+        <w:t xml:space="preserve">① 일상 업무 데이터를 자동 축적하고 업무 성격에 맞게 분류</w:t>
       </w:r>
     </w:p>
     <w:p>
@@ -251,7 +251,7 @@
           <w:szCs w:val="28"/>
           <w:lang w:val="ko-KR" w:eastAsia="ko-KR"/>
         </w:rPr>
-        <w:t xml:space="preserve">키보드·마우스 조작, 사용 중인 프로그램과 문서·페이지, 조작 대상, 발생 시각을 함께 분석해 관련 기록을 업무 후보로 묶도록 할 계획이다. 키 입력 횟수나 마우스 좌표에 더해 선택·입력·클릭 대상의 맥락을 활용해, 여러 프로그램에서 이어진 작업의 목적을 해석하고자 한다.</w:t>
+        <w:t xml:space="preserve">사용자가 허용한 프로그램과 작업에서 조작 시각·종류, 사용 중인 앱과 문서·페이지, 입력·클릭 대상 등 필요한 맥락을 수집할 계획이다. 초기 설정 이후에는 평소처럼 일하면 기록이 쌓이고, 설정한 주기에 맞춰 AI가 관련 기록을 업무 후보로 연결하고 분류하도록 한다. 연속 키 입력 원문과 화면 전체는 기본 수집 대상에서 제외한다.</w:t>
       </w:r>
     </w:p>
     <w:p>
@@ -340,7 +340,7 @@
                 <w:b/>
                 <w:bCs/>
               </w:rPr>
-              <w:t xml:space="preserve">AI가 제안하는 업무 후보</w:t>
+              <w:t xml:space="preserve">AI가 제안하는 업무 후보·분류</w:t>
             </w:r>
           </w:p>
         </w:tc>
@@ -366,7 +366,7 @@
                 <w:szCs w:val="28"/>
                 <w:lang w:val="ko-KR" w:eastAsia="ko-KR"/>
               </w:rPr>
-              <w:t xml:space="preserve">Excel의 ‘프로젝트 A’ 자료에서 범위 선택·복사</w:t>
+              <w:t xml:space="preserve">허용한 Excel의 ‘프로젝트 A’ 자료에서 범위 선택·복사</w:t>
             </w:r>
           </w:p>
         </w:tc>
@@ -387,7 +387,7 @@
                 <w:szCs w:val="28"/>
                 <w:lang w:val="ko-KR" w:eastAsia="ko-KR"/>
               </w:rPr>
-              <w:t xml:space="preserve">프로젝트 A 자료 취합 후보</w:t>
+              <w:t xml:space="preserve">프로젝트 A 자료 취합 / 자료 정리</w:t>
             </w:r>
           </w:p>
         </w:tc>
@@ -413,7 +413,7 @@
                 <w:szCs w:val="28"/>
                 <w:lang w:val="ko-KR" w:eastAsia="ko-KR"/>
               </w:rPr>
-              <w:t xml:space="preserve">브라우저에서 ‘프로젝트 A’ 관련 정보를 조회</w:t>
+              <w:t xml:space="preserve">허용한 업무 사이트에서 ‘프로젝트 A’ 관련 정보를 조회</w:t>
             </w:r>
           </w:p>
         </w:tc>
@@ -434,7 +434,7 @@
                 <w:szCs w:val="28"/>
                 <w:lang w:val="ko-KR" w:eastAsia="ko-KR"/>
               </w:rPr>
-              <w:t xml:space="preserve">앞선 자료와 관련된 정보 확인 후보</w:t>
+              <w:t xml:space="preserve">앞선 자료와 관련된 정보 확인 / 조사·검토</w:t>
             </w:r>
           </w:p>
         </w:tc>
@@ -481,7 +481,7 @@
                 <w:szCs w:val="28"/>
                 <w:lang w:val="ko-KR" w:eastAsia="ko-KR"/>
               </w:rPr>
-              <w:t xml:space="preserve">여러 도구의 작업이 이어진 프로젝트 A 자료 작성 후보</w:t>
+              <w:t xml:space="preserve">여러 도구의 작업이 이어진 프로젝트 A 자료 작성 / 문서 작성</w:t>
             </w:r>
           </w:p>
         </w:tc>
@@ -498,7 +498,7 @@
           <w:szCs w:val="28"/>
           <w:lang w:val="ko-KR" w:eastAsia="ko-KR"/>
         </w:rPr>
-        <w:t xml:space="preserve">사용자는 연결된 기록을 보고 ‘프로젝트 A 자료 작성’이라는 하나의 업무로 확인하거나, 잘못 연결된 항목을 제외할 수 있다. 업무는 자료 작성·분석·개발·검토·협업 등 목적에 따라 분류하고, 사용자가 이름과 분류를 수정할 수 있게 한다. 하루의 업무 목록을 먼저 보여주고 근거는 필요할 때 펼치도록 설계한다. 여러 번의 입력 수정과 클릭을 곧바로 여러 건의 업무로 세지 않는다.</w:t>
+        <w:t xml:space="preserve">AI는 시간적 흐름과 업무 목적을 함께 해석해 여러 프로그램에 걸친 작업을 연결한다. 예를 들어 Excel의 자료 취합과 문서의 표 정리를 하나의 자료 작성 업무로 묶되, 같은 프로젝트 이름이 등장해도 개발 오류 수정은 다른 성격의 업무로 구분한다. 자료 작성·분석·개발·검토·협업 등의 분류를 제안하고, 사용자가 이름과 분류를 수정하면 이후 분석에 반영한다.</w:t>
       </w:r>
     </w:p>
     <w:p>
@@ -512,7 +512,7 @@
           <w:szCs w:val="28"/>
           <w:lang w:val="ko-KR" w:eastAsia="ko-KR"/>
         </w:rPr>
-        <w:t xml:space="preserve">AI의 핵심 역할은 작업의 맥락과 목적을 함께 해석하는 것이다. Excel의 자료 취합과 문서 편집기의 표 정리를 하나의 자료 작성 업무로 연결하고, 같은 프로젝트 이름이 있어도 ‘개발 오류 수정’은 별도 목적의 업무로 구분하도록 한다. 프로그램별 사용 시간 집계나 공통 단어만으로 묶은 결과와 비교해 업무 의미를 잘 복원하는지 검증할 계획이다.</w:t>
+        <w:t xml:space="preserve">기본 화면은 하루의 업무 카드 목록으로 구성한다. 사용자는 필요한 항목만 확인·수정하고, 연결 근거는 원할 때 펼쳐 본다. 개별 클릭이나 입력 수정마다 별도 업무 기록을 작성하도록 요구하지 않는다. 프로그램 사용 시간이나 공통 단어만으로 묶은 결과와 비교해 AI가 업무 의미를 잘 복원하는지도 검증할 계획이다.</w:t>
       </w:r>
     </w:p>
     <w:p>
@@ -528,7 +528,7 @@
           <w:b/>
           <w:bCs/>
         </w:rPr>
-        <w:t xml:space="preserve">② 빠뜨린 일과 인식하지 못했던 반복 업무 발견: “이런 일을 계속하고 있었네요”</w:t>
+        <w:t xml:space="preserve">② 누적 데이터를 패턴화하고 업무 효율화 솔루션을 제안·제공</w:t>
       </w:r>
     </w:p>
     <w:p>
@@ -542,392 +542,7 @@
           <w:szCs w:val="28"/>
           <w:lang w:val="ko-KR" w:eastAsia="ko-KR"/>
         </w:rPr>
-        <w:t xml:space="preserve">발견은 두 단계로 제공하고자 한다. 먼저 복원된 업무 목록에서 잊고 있던 자료 확인·검토·협업 등을 떠올린다. 다음으로 개별 조작으로만 여겼던 행동이 어떤 반복 업무를 이루는지 확인한다. 다음은 여러 날의 가상 기록과 사용자 확인을 전제로 한 예상 결과물이다.</w:t>
-      </w:r>
-    </w:p>
-    <w:tbl>
-      <w:tblPr>
-        <w:tblW w:w="9866" w:type="dxa"/>
-        <w:tblBorders>
-          <w:top w:val="single" w:sz="4" w:color="808080"/>
-          <w:left w:val="single" w:sz="4" w:color="808080"/>
-          <w:bottom w:val="single" w:sz="4" w:color="808080"/>
-          <w:right w:val="single" w:sz="4" w:color="808080"/>
-          <w:insideH w:val="single" w:sz="4" w:color="808080"/>
-          <w:insideV w:val="single" w:sz="4" w:color="808080"/>
-        </w:tblBorders>
-        <w:tblLayout w:type="fixed"/>
-        <w:tblCellMar>
-          <w:top w:w="100" w:type="dxa"/>
-          <w:left w:w="100" w:type="dxa"/>
-          <w:bottom w:w="100" w:type="dxa"/>
-          <w:right w:w="100" w:type="dxa"/>
-        </w:tblCellMar>
-      </w:tblPr>
-      <w:tblGrid>
-        <w:gridCol w:w="3453"/>
-        <w:gridCol w:w="6413"/>
-      </w:tblGrid>
-      <w:tr>
-        <w:trPr>
-          <w:cantSplit/>
-          <w:tblHeader/>
-        </w:trPr>
-        <w:tc>
-          <w:tcPr>
-            <w:tcW w:w="3453" w:type="dxa"/>
-            <w:shd w:val="clear" w:fill="EEEEEE"/>
-            <w:vAlign w:val="top"/>
-          </w:tcPr>
-          <w:p>
-            <w:pPr>
-              <w:pStyle w:val="Normal"/>
-              <w:spacing w:after="40" w:line="280" w:lineRule="auto"/>
-            </w:pPr>
-            <w:r>
-              <w:rPr>
-                <w:rFonts w:ascii="바탕체" w:hAnsi="바탕체" w:eastAsia="바탕체" w:cs="바탕체"/>
-                <w:sz w:val="28"/>
-                <w:szCs w:val="28"/>
-                <w:lang w:val="ko-KR" w:eastAsia="ko-KR"/>
-                <w:b/>
-                <w:bCs/>
-              </w:rPr>
-              <w:t xml:space="preserve">단계</w:t>
-            </w:r>
-          </w:p>
-        </w:tc>
-        <w:tc>
-          <w:tcPr>
-            <w:tcW w:w="6413" w:type="dxa"/>
-            <w:shd w:val="clear" w:fill="EEEEEE"/>
-            <w:vAlign w:val="top"/>
-          </w:tcPr>
-          <w:p>
-            <w:pPr>
-              <w:pStyle w:val="Normal"/>
-              <w:spacing w:after="40" w:line="280" w:lineRule="auto"/>
-            </w:pPr>
-            <w:r>
-              <w:rPr>
-                <w:rFonts w:ascii="바탕체" w:hAnsi="바탕체" w:eastAsia="바탕체" w:cs="바탕체"/>
-                <w:sz w:val="28"/>
-                <w:szCs w:val="28"/>
-                <w:lang w:val="ko-KR" w:eastAsia="ko-KR"/>
-                <w:b/>
-                <w:bCs/>
-              </w:rPr>
-              <w:t xml:space="preserve">사용자에게 보이는 내용</w:t>
-            </w:r>
-          </w:p>
-        </w:tc>
-      </w:tr>
-      <w:tr>
-        <w:trPr>
-          <w:cantSplit/>
-        </w:trPr>
-        <w:tc>
-          <w:tcPr>
-            <w:tcW w:w="3453" w:type="dxa"/>
-            <w:vAlign w:val="top"/>
-          </w:tcPr>
-          <w:p>
-            <w:pPr>
-              <w:pStyle w:val="Normal"/>
-              <w:spacing w:after="40" w:line="280" w:lineRule="auto"/>
-            </w:pPr>
-            <w:r>
-              <w:rPr>
-                <w:rFonts w:ascii="바탕체" w:hAnsi="바탕체" w:eastAsia="바탕체" w:cs="바탕체"/>
-                <w:sz w:val="28"/>
-                <w:szCs w:val="28"/>
-                <w:lang w:val="ko-KR" w:eastAsia="ko-KR"/>
-              </w:rPr>
-              <w:t xml:space="preserve">사용자가 기억한 일</w:t>
-            </w:r>
-          </w:p>
-        </w:tc>
-        <w:tc>
-          <w:tcPr>
-            <w:tcW w:w="6413" w:type="dxa"/>
-            <w:vAlign w:val="top"/>
-          </w:tcPr>
-          <w:p>
-            <w:pPr>
-              <w:pStyle w:val="Normal"/>
-              <w:spacing w:after="40" w:line="280" w:lineRule="auto"/>
-            </w:pPr>
-            <w:r>
-              <w:rPr>
-                <w:rFonts w:ascii="바탕체" w:hAnsi="바탕체" w:eastAsia="바탕체" w:cs="바탕체"/>
-                <w:sz w:val="28"/>
-                <w:szCs w:val="28"/>
-                <w:lang w:val="ko-KR" w:eastAsia="ko-KR"/>
-              </w:rPr>
-              <w:t xml:space="preserve">‘프로젝트 자료 작성’</w:t>
-            </w:r>
-          </w:p>
-        </w:tc>
-      </w:tr>
-      <w:tr>
-        <w:trPr>
-          <w:cantSplit/>
-        </w:trPr>
-        <w:tc>
-          <w:tcPr>
-            <w:tcW w:w="3453" w:type="dxa"/>
-            <w:vAlign w:val="top"/>
-          </w:tcPr>
-          <w:p>
-            <w:pPr>
-              <w:pStyle w:val="Normal"/>
-              <w:spacing w:after="40" w:line="280" w:lineRule="auto"/>
-            </w:pPr>
-            <w:r>
-              <w:rPr>
-                <w:rFonts w:ascii="바탕체" w:hAnsi="바탕체" w:eastAsia="바탕체" w:cs="바탕체"/>
-                <w:sz w:val="28"/>
-                <w:szCs w:val="28"/>
-                <w:lang w:val="ko-KR" w:eastAsia="ko-KR"/>
-              </w:rPr>
-              <w:t xml:space="preserve">기록에서 복원한 일</w:t>
-            </w:r>
-          </w:p>
-        </w:tc>
-        <w:tc>
-          <w:tcPr>
-            <w:tcW w:w="6413" w:type="dxa"/>
-            <w:vAlign w:val="top"/>
-          </w:tcPr>
-          <w:p>
-            <w:pPr>
-              <w:pStyle w:val="Normal"/>
-              <w:spacing w:after="40" w:line="280" w:lineRule="auto"/>
-            </w:pPr>
-            <w:r>
-              <w:rPr>
-                <w:rFonts w:ascii="바탕체" w:hAnsi="바탕체" w:eastAsia="바탕체" w:cs="바탕체"/>
-                <w:sz w:val="28"/>
-                <w:szCs w:val="28"/>
-                <w:lang w:val="ko-KR" w:eastAsia="ko-KR"/>
-              </w:rPr>
-              <w:t xml:space="preserve">여러 파일에서 자료 취합, 시스템 조회, 문서의 표·형식 정리</w:t>
-            </w:r>
-          </w:p>
-        </w:tc>
-      </w:tr>
-      <w:tr>
-        <w:trPr>
-          <w:cantSplit/>
-        </w:trPr>
-        <w:tc>
-          <w:tcPr>
-            <w:tcW w:w="3453" w:type="dxa"/>
-            <w:vAlign w:val="top"/>
-          </w:tcPr>
-          <w:p>
-            <w:pPr>
-              <w:pStyle w:val="Normal"/>
-              <w:spacing w:after="40" w:line="280" w:lineRule="auto"/>
-            </w:pPr>
-            <w:r>
-              <w:rPr>
-                <w:rFonts w:ascii="바탕체" w:hAnsi="바탕체" w:eastAsia="바탕체" w:cs="바탕체"/>
-                <w:sz w:val="28"/>
-                <w:szCs w:val="28"/>
-                <w:lang w:val="ko-KR" w:eastAsia="ko-KR"/>
-              </w:rPr>
-              <w:t xml:space="preserve">사용자가 확인한 업무</w:t>
-            </w:r>
-          </w:p>
-        </w:tc>
-        <w:tc>
-          <w:tcPr>
-            <w:tcW w:w="6413" w:type="dxa"/>
-            <w:vAlign w:val="top"/>
-          </w:tcPr>
-          <w:p>
-            <w:pPr>
-              <w:pStyle w:val="Normal"/>
-              <w:spacing w:after="40" w:line="280" w:lineRule="auto"/>
-            </w:pPr>
-            <w:r>
-              <w:rPr>
-                <w:rFonts w:ascii="바탕체" w:hAnsi="바탕체" w:eastAsia="바탕체" w:cs="바탕체"/>
-                <w:sz w:val="28"/>
-                <w:szCs w:val="28"/>
-                <w:lang w:val="ko-KR" w:eastAsia="ko-KR"/>
-              </w:rPr>
-              <w:t xml:space="preserve">서로 다른 자료 작성 과정에서 비슷한 ‘자료 취합·서식 맞춤’을 3회 수행</w:t>
-            </w:r>
-          </w:p>
-        </w:tc>
-      </w:tr>
-      <w:tr>
-        <w:trPr>
-          <w:cantSplit/>
-        </w:trPr>
-        <w:tc>
-          <w:tcPr>
-            <w:tcW w:w="3453" w:type="dxa"/>
-            <w:vAlign w:val="top"/>
-          </w:tcPr>
-          <w:p>
-            <w:pPr>
-              <w:pStyle w:val="Normal"/>
-              <w:spacing w:after="40" w:line="280" w:lineRule="auto"/>
-            </w:pPr>
-            <w:r>
-              <w:rPr>
-                <w:rFonts w:ascii="바탕체" w:hAnsi="바탕체" w:eastAsia="바탕체" w:cs="바탕체"/>
-                <w:sz w:val="28"/>
-                <w:szCs w:val="28"/>
-                <w:lang w:val="ko-KR" w:eastAsia="ko-KR"/>
-              </w:rPr>
-              <w:t xml:space="preserve">새롭게 알게 된 점</w:t>
-            </w:r>
-          </w:p>
-        </w:tc>
-        <w:tc>
-          <w:tcPr>
-            <w:tcW w:w="6413" w:type="dxa"/>
-            <w:vAlign w:val="top"/>
-          </w:tcPr>
-          <w:p>
-            <w:pPr>
-              <w:pStyle w:val="Normal"/>
-              <w:spacing w:after="40" w:line="280" w:lineRule="auto"/>
-            </w:pPr>
-            <w:r>
-              <w:rPr>
-                <w:rFonts w:ascii="바탕체" w:hAnsi="바탕체" w:eastAsia="바탕체" w:cs="바탕체"/>
-                <w:sz w:val="28"/>
-                <w:szCs w:val="28"/>
-                <w:lang w:val="ko-KR" w:eastAsia="ko-KR"/>
-              </w:rPr>
-              <w:t xml:space="preserve">여러 프로그램 사이에서 데이터를 옮기고 형식을 맞추는 수작업이 반복되고 있음</w:t>
-            </w:r>
-          </w:p>
-        </w:tc>
-      </w:tr>
-      <w:tr>
-        <w:trPr>
-          <w:cantSplit/>
-        </w:trPr>
-        <w:tc>
-          <w:tcPr>
-            <w:tcW w:w="3453" w:type="dxa"/>
-            <w:vAlign w:val="top"/>
-          </w:tcPr>
-          <w:p>
-            <w:pPr>
-              <w:pStyle w:val="Normal"/>
-              <w:spacing w:after="40" w:line="280" w:lineRule="auto"/>
-            </w:pPr>
-            <w:r>
-              <w:rPr>
-                <w:rFonts w:ascii="바탕체" w:hAnsi="바탕체" w:eastAsia="바탕체" w:cs="바탕체"/>
-                <w:sz w:val="28"/>
-                <w:szCs w:val="28"/>
-                <w:lang w:val="ko-KR" w:eastAsia="ko-KR"/>
-              </w:rPr>
-              <w:t xml:space="preserve">개선과 기록에 활용</w:t>
-            </w:r>
-          </w:p>
-        </w:tc>
-        <w:tc>
-          <w:tcPr>
-            <w:tcW w:w="6413" w:type="dxa"/>
-            <w:vAlign w:val="top"/>
-          </w:tcPr>
-          <w:p>
-            <w:pPr>
-              <w:pStyle w:val="Normal"/>
-              <w:spacing w:after="40" w:line="280" w:lineRule="auto"/>
-            </w:pPr>
-            <w:r>
-              <w:rPr>
-                <w:rFonts w:ascii="바탕체" w:hAnsi="바탕체" w:eastAsia="바탕체" w:cs="바탕체"/>
-                <w:sz w:val="28"/>
-                <w:szCs w:val="28"/>
-                <w:lang w:val="ko-KR" w:eastAsia="ko-KR"/>
-              </w:rPr>
-              <w:t xml:space="preserve">표준 양식·자료 취합 자동화를 검토할 후보로 남기고, 수행한 업무는 평가노트용 사례로 축적</w:t>
-            </w:r>
-          </w:p>
-        </w:tc>
-      </w:tr>
-    </w:tbl>
-    <w:p>
-      <w:pPr>
-        <w:pStyle w:val="Normal"/>
-      </w:pPr>
-      <w:r>
-        <w:rPr>
-          <w:rFonts w:ascii="바탕체" w:hAnsi="바탕체" w:eastAsia="바탕체" w:cs="바탕체"/>
-          <w:sz w:val="28"/>
-          <w:szCs w:val="28"/>
-          <w:lang w:val="ko-KR" w:eastAsia="ko-KR"/>
-        </w:rPr>
-        <w:t xml:space="preserve">이 비교 목록은 발견을 설명하고 효과를 검증하기 위한 자료다. 실제 사용 때 매일 기억으로 작성한 별도 일지를 요구하지 않는다.</w:t>
-      </w:r>
-    </w:p>
-    <w:p>
-      <w:pPr>
-        <w:pStyle w:val="Normal"/>
-      </w:pPr>
-      <w:r>
-        <w:rPr>
-          <w:rFonts w:ascii="바탕체" w:hAnsi="바탕체" w:eastAsia="바탕체" w:cs="바탕체"/>
-          <w:sz w:val="28"/>
-          <w:szCs w:val="28"/>
-          <w:lang w:val="ko-KR" w:eastAsia="ko-KR"/>
-        </w:rPr>
-        <w:t xml:space="preserve">확인된 업무가 누적되면 AI가 비슷한 목적과 순서가 반복되는 흐름을 찾아 개선 후보를 제시하도록 할 계획이다. 예를 들어 “여러 파일의 값을 옮기고 같은 형식으로 정리하는 흐름이 반복됐습니다. 공통 템플릿이나 자동 취합을 검토해볼까요?”라고 제안한다. 개발·분석·문서 작성·시스템 운영 등 각 업무에서도 반복되는 준비·확인·정리 과정을 찾아볼 수 있다. 어떤 업무들이 근거인지와 묶은 이유를 확인하고 잘못 연결된 항목은 제외할 수 있게 한다.</w:t>
-      </w:r>
-    </w:p>
-    <w:p>
-      <w:pPr>
-        <w:pStyle w:val="Normal"/>
-      </w:pPr>
-      <w:r>
-        <w:rPr>
-          <w:rFonts w:ascii="바탕체" w:hAnsi="바탕체" w:eastAsia="바탕체" w:cs="바탕체"/>
-          <w:sz w:val="28"/>
-          <w:szCs w:val="28"/>
-          <w:lang w:val="ko-KR" w:eastAsia="ko-KR"/>
-        </w:rPr>
-        <w:t xml:space="preserve">원시 이벤트의 반복과 실제 업무의 반복을 구분한다. 반복 횟수는 사용자가 확인한 업무 단위를 기준으로 집계하며, 아직 확인하지 않은 묶음은 후보로 표시한다. 개선 제안은 업무를 바꿔볼 가설로 제공하고, 절감 시간이나 효과는 실제 적용 후 확인한다.</w:t>
-      </w:r>
-    </w:p>
-    <w:p>
-      <w:pPr>
-        <w:pStyle w:val="Heading2"/>
-      </w:pPr>
-      <w:r>
-        <w:rPr>
-          <w:rFonts w:ascii="바탕체" w:hAnsi="바탕체" w:eastAsia="바탕체" w:cs="바탕체"/>
-          <w:sz w:val="28"/>
-          <w:szCs w:val="28"/>
-          <w:lang w:val="ko-KR" w:eastAsia="ko-KR"/>
-          <w:b/>
-          <w:bCs/>
-        </w:rPr>
-        <w:t xml:space="preserve">③ 같은 기억을 평가노트와 필요한 보고에 활용: “그동안 내가 한 일”</w:t>
-      </w:r>
-    </w:p>
-    <w:p>
-      <w:pPr>
-        <w:pStyle w:val="Normal"/>
-      </w:pPr>
-      <w:r>
-        <w:rPr>
-          <w:rFonts w:ascii="바탕체" w:hAnsi="바탕체" w:eastAsia="바탕체" w:cs="바탕체"/>
-          <w:sz w:val="28"/>
-          <w:szCs w:val="28"/>
-          <w:lang w:val="ko-KR" w:eastAsia="ko-KR"/>
-        </w:rPr>
-        <w:t xml:space="preserve">사용자가 확인한 업무를 기간·프로젝트·업무 유형별로 모으고, 평가노트에 활용할 업무·기여 사례를 정리하도록 할 계획이다. 사용자가 실제 결과와 기여를 보완하면 이를 반영해 초안을 작성한다. 주간·월간 보고는 업무에 따라 선택할 수 있는 활용 방식으로 둔다.</w:t>
+        <w:t xml:space="preserve">AI가 누적된 업무에서 비슷한 목적·처리 순서·데이터 이동을 찾아 반복 흐름으로 패턴화할 계획이다. 어떤 일을 반복했는지와 함께, 어느 단계를 어떻게 바꾸면 좋을지 제안한다. 다음은 가상 기록을 바탕으로 한 솔루션 예시다.</w:t>
       </w:r>
     </w:p>
     <w:tbl>
@@ -979,7 +594,7 @@
                 <w:b/>
                 <w:bCs/>
               </w:rPr>
-              <w:t xml:space="preserve">결과물</w:t>
+              <w:t xml:space="preserve">패턴화한 업무 흐름</w:t>
             </w:r>
           </w:p>
         </w:tc>
@@ -1003,7 +618,7 @@
                 <w:b/>
                 <w:bCs/>
               </w:rPr>
-              <w:t xml:space="preserve">정리할 내용</w:t>
+              <w:t xml:space="preserve">제안·제공할 효율화 솔루션</w:t>
             </w:r>
           </w:p>
         </w:tc>
@@ -1027,7 +642,7 @@
                 <w:b/>
                 <w:bCs/>
               </w:rPr>
-              <w:t xml:space="preserve">사용자에게 제공하는 가치</w:t>
+              <w:t xml:space="preserve">함께 보여줄 내용</w:t>
             </w:r>
           </w:p>
         </w:tc>
@@ -1053,7 +668,7 @@
                 <w:szCs w:val="28"/>
                 <w:lang w:val="ko-KR" w:eastAsia="ko-KR"/>
               </w:rPr>
-              <w:t xml:space="preserve">일일 업무 정리</w:t>
+              <w:t xml:space="preserve">여러 Excel 파일의 값을 모으고 같은 형식으로 정리</w:t>
             </w:r>
           </w:p>
         </w:tc>
@@ -1074,7 +689,7 @@
                 <w:szCs w:val="28"/>
                 <w:lang w:val="ko-KR" w:eastAsia="ko-KR"/>
               </w:rPr>
-              <w:t xml:space="preserve">오늘 수행한 업무와 분류, 관련 기록, 확인할 항목</w:t>
+              <w:t xml:space="preserve">공통 양식과 자동 취합 처리 흐름 제공</w:t>
             </w:r>
           </w:p>
         </w:tc>
@@ -1095,7 +710,7 @@
                 <w:szCs w:val="28"/>
                 <w:lang w:val="ko-KR" w:eastAsia="ko-KR"/>
               </w:rPr>
-              <w:t xml:space="preserve">하루를 잊기 전에 짧게 확인하고 수정</w:t>
+              <w:t xml:space="preserve">필요한 열·입력 파일 조건, 통합·중복 확인·서식 적용 단계</w:t>
             </w:r>
           </w:p>
         </w:tc>
@@ -1121,7 +736,7 @@
                 <w:szCs w:val="28"/>
                 <w:lang w:val="ko-KR" w:eastAsia="ko-KR"/>
               </w:rPr>
-              <w:t xml:space="preserve">평가노트용 업무·기여 사례</w:t>
+              <w:t xml:space="preserve">업무 사이트의 정보를 확인해 문서에 반복 입력</w:t>
             </w:r>
           </w:p>
         </w:tc>
@@ -1142,7 +757,7 @@
                 <w:szCs w:val="28"/>
                 <w:lang w:val="ko-KR" w:eastAsia="ko-KR"/>
               </w:rPr>
-              <w:t xml:space="preserve">선택 기간의 수행 업무, 사용자가 확인한 결과·기여, 개선 시도와 근거</w:t>
+              <w:t xml:space="preserve">입력 항목 대응표와 문서 자동 채움 템플릿 제안</w:t>
             </w:r>
           </w:p>
         </w:tc>
@@ -1163,7 +778,7 @@
                 <w:szCs w:val="28"/>
                 <w:lang w:val="ko-KR" w:eastAsia="ko-KR"/>
               </w:rPr>
-              <w:t xml:space="preserve">평가노트 작성 시 기억을 다시 모으는 부담 감소</w:t>
+              <w:t xml:space="preserve">조회할 항목, 문서에 넣을 위치, 사람이 확인할 예외</w:t>
             </w:r>
           </w:p>
         </w:tc>
@@ -1189,7 +804,7 @@
                 <w:szCs w:val="28"/>
                 <w:lang w:val="ko-KR" w:eastAsia="ko-KR"/>
               </w:rPr>
-              <w:t xml:space="preserve">반복 작업 인사이트</w:t>
+              <w:t xml:space="preserve">비슷한 자료 검토와 확인 절차를 반복</w:t>
             </w:r>
           </w:p>
         </w:tc>
@@ -1210,7 +825,7 @@
                 <w:szCs w:val="28"/>
                 <w:lang w:val="ko-KR" w:eastAsia="ko-KR"/>
               </w:rPr>
-              <w:t xml:space="preserve">비슷한 목적·순서의 업무, 반복된 수작업, 개선 후보</w:t>
+              <w:t xml:space="preserve">검토 체크리스트와 규칙 기반 자동 점검 설계안 제공</w:t>
             </w:r>
           </w:p>
         </w:tc>
@@ -1231,75 +846,7 @@
                 <w:szCs w:val="28"/>
                 <w:lang w:val="ko-KR" w:eastAsia="ko-KR"/>
               </w:rPr>
-              <w:t xml:space="preserve">표준화·자동화를 검토할 단서 제공</w:t>
-            </w:r>
-          </w:p>
-        </w:tc>
-      </w:tr>
-      <w:tr>
-        <w:trPr>
-          <w:cantSplit/>
-        </w:trPr>
-        <w:tc>
-          <w:tcPr>
-            <w:tcW w:w="2072" w:type="dxa"/>
-            <w:vAlign w:val="top"/>
-          </w:tcPr>
-          <w:p>
-            <w:pPr>
-              <w:pStyle w:val="Normal"/>
-              <w:spacing w:after="40" w:line="280" w:lineRule="auto"/>
-            </w:pPr>
-            <w:r>
-              <w:rPr>
-                <w:rFonts w:ascii="바탕체" w:hAnsi="바탕체" w:eastAsia="바탕체" w:cs="바탕체"/>
-                <w:sz w:val="28"/>
-                <w:szCs w:val="28"/>
-                <w:lang w:val="ko-KR" w:eastAsia="ko-KR"/>
-              </w:rPr>
-              <w:t xml:space="preserve">선택적 주간·월간 보고</w:t>
-            </w:r>
-          </w:p>
-        </w:tc>
-        <w:tc>
-          <w:tcPr>
-            <w:tcW w:w="3354" w:type="dxa"/>
-            <w:vAlign w:val="top"/>
-          </w:tcPr>
-          <w:p>
-            <w:pPr>
-              <w:pStyle w:val="Normal"/>
-              <w:spacing w:after="40" w:line="280" w:lineRule="auto"/>
-            </w:pPr>
-            <w:r>
-              <w:rPr>
-                <w:rFonts w:ascii="바탕체" w:hAnsi="바탕체" w:eastAsia="바탕체" w:cs="바탕체"/>
-                <w:sz w:val="28"/>
-                <w:szCs w:val="28"/>
-                <w:lang w:val="ko-KR" w:eastAsia="ko-KR"/>
-              </w:rPr>
-              <w:t xml:space="preserve">담당 업무에 필요한 기간별 진행 내용과 이슈</w:t>
-            </w:r>
-          </w:p>
-        </w:tc>
-        <w:tc>
-          <w:tcPr>
-            <w:tcW w:w="4440" w:type="dxa"/>
-            <w:vAlign w:val="top"/>
-          </w:tcPr>
-          <w:p>
-            <w:pPr>
-              <w:pStyle w:val="Normal"/>
-              <w:spacing w:after="40" w:line="280" w:lineRule="auto"/>
-            </w:pPr>
-            <w:r>
-              <w:rPr>
-                <w:rFonts w:ascii="바탕체" w:hAnsi="바탕체" w:eastAsia="바탕체" w:cs="바탕체"/>
-                <w:sz w:val="28"/>
-                <w:szCs w:val="28"/>
-                <w:lang w:val="ko-KR" w:eastAsia="ko-KR"/>
-              </w:rPr>
-              <w:t xml:space="preserve">같은 기록을 직무별 보고에 재사용</w:t>
+              <w:t xml:space="preserve">반복 확인 항목, 자동 점검 조건, 수동 판단이 필요한 단계</w:t>
             </w:r>
           </w:p>
         </w:tc>
@@ -1316,7 +863,7 @@
           <w:szCs w:val="28"/>
           <w:lang w:val="ko-KR" w:eastAsia="ko-KR"/>
         </w:rPr>
-        <w:t xml:space="preserve">해커톤에서는 업무 카드, 근거가 연결된 평가노트용 사례 초안 한 종류, 반복 흐름과 개선 후보 한 개를 핵심 결과물로 구현할 계획이다. 짧은 시연에서는 실제 관측한 업무와 보완할 내용을 보여주고, 장기 축적의 모습은 별도의 가상 누적 자료로 설명한다. 평가노트 전체 서식과 주간·월간 보고 서식은 확장 항목으로 둔다.</w:t>
+        <w:t xml:space="preserve">솔루션 카드에는 대상 업무, 반복 근거, 개선할 단계, 적용 방법과 필요한 조건을 담는다. 해커톤에서는 실제 짧은 반복 작업 한 가지에 대해 자동화 설계안 또는 템플릿 한 개를 제시하고, 사용자가 채택·수정·보류할 수 있도록 구현할 계획이다. 여러 날의 누적 패턴은 별도의 가상 자료로 설명한다.</w:t>
       </w:r>
     </w:p>
     <w:p>
@@ -1330,7 +877,7 @@
           <w:szCs w:val="28"/>
           <w:lang w:val="ko-KR" w:eastAsia="ko-KR"/>
         </w:rPr>
-        <w:t xml:space="preserve">초안의 업무 항목마다 관련 카드와 원본 근거를 연결할 계획이다. 완료 여부, 해결 결과와 실제 기여는 사용자가 확인하거나 추가 자료가 있을 때 포함한다. 부족한 정보는 보완 항목으로 남긴다. 일상적인 검토는 업무 이름과 분류를 확인하는 수준으로 시작하고, 결과·기여 설명은 평가노트 작성에 필요한 시점에 보완할 수 있게 한다.</w:t>
+        <w:t xml:space="preserve">관측 이벤트의 반복과 실제 업무의 반복을 구분한다. 반복 횟수는 사용자가 확인한 업무 단위로 집계하고, 미확인 묶음은 후보로 표시한다. 자동화 실행 기능은 후속 확장으로 두며, 실제 절감 시간과 개선 효과는 사용자가 솔루션을 적용한 뒤 검증한다.</w:t>
       </w:r>
     </w:p>
     <w:p>
@@ -1346,7 +893,7 @@
           <w:b/>
           <w:bCs/>
         </w:rPr>
-        <w:t xml:space="preserve">④ AI 해석을 확인 가능한 결과로 제공</w:t>
+        <w:t xml:space="preserve">③ 같은 기록으로 나의 업무를 회고하고 필요한 문서를 자동 작성</w:t>
       </w:r>
     </w:p>
     <w:p>
@@ -1360,165 +907,7 @@
           <w:szCs w:val="28"/>
           <w:lang w:val="ko-KR" w:eastAsia="ko-KR"/>
         </w:rPr>
-        <w:t xml:space="preserve">처리 흐름은 </w:t>
-      </w:r>
-      <w:r>
-        <w:rPr>
-          <w:rFonts w:ascii="바탕체" w:hAnsi="바탕체" w:eastAsia="바탕체" w:cs="바탕체"/>
-          <w:sz w:val="28"/>
-          <w:szCs w:val="28"/>
-          <w:lang w:val="ko-KR" w:eastAsia="ko-KR"/>
-          <w:b/>
-          <w:bCs/>
-        </w:rPr>
-        <w:t xml:space="preserve">PC 조작·맥락 기록 → 업무 복원·분류 → 사용자 확인·수정 → 반복 흐름 분석 → 평가노트·필요한 보고에 활용</w:t>
-      </w:r>
-      <w:r>
-        <w:rPr>
-          <w:rFonts w:ascii="바탕체" w:hAnsi="바탕체" w:eastAsia="바탕체" w:cs="바탕체"/>
-          <w:sz w:val="28"/>
-          <w:szCs w:val="28"/>
-          <w:lang w:val="ko-KR" w:eastAsia="ko-KR"/>
-        </w:rPr>
-        <w:t xml:space="preserve">으로 설계한다. 건수·날짜 등은 코드로 계산하고, AI는 목적에 따른 업무 묶음·분류·요약·개선 후보·문서 초안을 생성하도록 역할을 나눈다. 사용자의 수정 내용은 이후 분석과 초안의 기준으로 유지할 계획이다.</w:t>
-      </w:r>
-    </w:p>
-    <w:p>
-      <w:pPr>
-        <w:pStyle w:val="Normal"/>
-      </w:pPr>
-      <w:r>
-        <w:rPr>
-          <w:rFonts w:ascii="바탕체" w:hAnsi="바탕체" w:eastAsia="바탕체" w:cs="바탕체"/>
-          <w:sz w:val="28"/>
-          <w:szCs w:val="28"/>
-          <w:lang w:val="ko-KR" w:eastAsia="ko-KR"/>
-        </w:rPr>
-        <w:t xml:space="preserve">구현에는 </w:t>
-      </w:r>
-      <w:r>
-        <w:rPr>
-          <w:rFonts w:ascii="바탕체" w:hAnsi="바탕체" w:eastAsia="바탕체" w:cs="바탕체"/>
-          <w:sz w:val="28"/>
-          <w:szCs w:val="28"/>
-          <w:lang w:val="ko-KR" w:eastAsia="ko-KR"/>
-          <w:b/>
-          <w:bCs/>
-        </w:rPr>
-        <w:t xml:space="preserve">키보드·마우스 이벤트 수집과 접근성 API</w:t>
-      </w:r>
-      <w:r>
-        <w:rPr>
-          <w:rFonts w:ascii="바탕체" w:hAnsi="바탕체" w:eastAsia="바탕체" w:cs="바탕체"/>
-          <w:sz w:val="28"/>
-          <w:szCs w:val="28"/>
-          <w:lang w:val="ko-KR" w:eastAsia="ko-KR"/>
-        </w:rPr>
-        <w:t xml:space="preserve">를 활용해 조작의 시각·대상과 앱·문서 전환 맥락을 연결하는 방안을 계획한다. 프로그램별 세부 정보가 필요하면 브라우저 확장이나 앱 연동을 보완 수단으로 활용한다. </w:t>
-      </w:r>
-      <w:r>
-        <w:rPr>
-          <w:rFonts w:ascii="바탕체" w:hAnsi="바탕체" w:eastAsia="바탕체" w:cs="바탕체"/>
-          <w:sz w:val="28"/>
-          <w:szCs w:val="28"/>
-          <w:lang w:val="ko-KR" w:eastAsia="ko-KR"/>
-          <w:b/>
-          <w:bCs/>
-        </w:rPr>
-        <w:t xml:space="preserve">로컬 DB와 업무 카드 화면</w:t>
-      </w:r>
-      <w:r>
-        <w:rPr>
-          <w:rFonts w:ascii="바탕체" w:hAnsi="바탕체" w:eastAsia="바탕체" w:cs="바탕체"/>
-          <w:sz w:val="28"/>
-          <w:szCs w:val="28"/>
-          <w:lang w:val="ko-KR" w:eastAsia="ko-KR"/>
-        </w:rPr>
-        <w:t xml:space="preserve">에서 기록과 사용자 확인을 관리하고, </w:t>
-      </w:r>
-      <w:r>
-        <w:rPr>
-          <w:rFonts w:ascii="바탕체" w:hAnsi="바탕체" w:eastAsia="바탕체" w:cs="바탕체"/>
-          <w:sz w:val="28"/>
-          <w:szCs w:val="28"/>
-          <w:lang w:val="ko-KR" w:eastAsia="ko-KR"/>
-          <w:b/>
-          <w:bCs/>
-        </w:rPr>
-        <w:t xml:space="preserve">LLM API</w:t>
-      </w:r>
-      <w:r>
-        <w:rPr>
-          <w:rFonts w:ascii="바탕체" w:hAnsi="바탕체" w:eastAsia="바탕체" w:cs="바탕체"/>
-          <w:sz w:val="28"/>
-          <w:szCs w:val="28"/>
-          <w:lang w:val="ko-KR" w:eastAsia="ko-KR"/>
-        </w:rPr>
-        <w:t xml:space="preserve">로 업무 분류·반복 패턴·개선 후보·평가노트용 초안을 생성할 예정이다. 수집 모듈은 운영체제와 앱별로 분리해 지원 범위를 넓혀갈 수 있도록 설계한다.</w:t>
-      </w:r>
-    </w:p>
-    <w:p>
-      <w:pPr>
-        <w:pStyle w:val="Normal"/>
-      </w:pPr>
-      <w:r>
-        <w:rPr>
-          <w:rFonts w:ascii="바탕체" w:hAnsi="바탕체" w:eastAsia="바탕체" w:cs="바탕체"/>
-          <w:sz w:val="28"/>
-          <w:szCs w:val="28"/>
-          <w:lang w:val="ko-KR" w:eastAsia="ko-KR"/>
-        </w:rPr>
-        <w:t xml:space="preserve">기록에는 관측 가능한 정보와 수집하지 못한 범위를 함께 남기고, AI가 관측한 행동과 업무에 대한 해석을 구분하도록 할 계획이다. 예를 들어 ‘저장’ 클릭을 최종 승인으로, 입력량을 기여 수준으로 해석하지 않게 한다. 업무별 시간은 관련 구간을 연결할 수 있는 경우에만 근거와 함께 추정하는 선택 기능으로 검토한다.</w:t>
-      </w:r>
-    </w:p>
-    <w:p>
-      <w:pPr>
-        <w:pStyle w:val="Heading1"/>
-      </w:pPr>
-      <w:r>
-        <w:rPr>
-          <w:rFonts w:ascii="바탕체" w:hAnsi="바탕체" w:eastAsia="바탕체" w:cs="바탕체"/>
-          <w:sz w:val="28"/>
-          <w:szCs w:val="28"/>
-          <w:lang w:val="ko-KR" w:eastAsia="ko-KR"/>
-          <w:b/>
-          <w:bCs/>
-        </w:rPr>
-        <w:t xml:space="preserve">3. 해커톤 2일 동안 구현해 보고 싶은 주요 기능은 무엇인가요?</w:t>
-      </w:r>
-    </w:p>
-    <w:p>
-      <w:pPr>
-        <w:pStyle w:val="Normal"/>
-      </w:pPr>
-      <w:r>
-        <w:rPr>
-          <w:rFonts w:ascii="바탕체" w:hAnsi="바탕체" w:eastAsia="바탕체" w:cs="바탕체"/>
-          <w:sz w:val="28"/>
-          <w:szCs w:val="28"/>
-          <w:lang w:val="ko-KR" w:eastAsia="ko-KR"/>
-        </w:rPr>
-        <w:t xml:space="preserve">2일 동안 </w:t>
-      </w:r>
-      <w:r>
-        <w:rPr>
-          <w:rFonts w:ascii="바탕체" w:hAnsi="바탕체" w:eastAsia="바탕체" w:cs="바탕체"/>
-          <w:sz w:val="28"/>
-          <w:szCs w:val="28"/>
-          <w:lang w:val="ko-KR" w:eastAsia="ko-KR"/>
-          <w:b/>
-          <w:bCs/>
-        </w:rPr>
-        <w:t xml:space="preserve">PC 작업 기록 수집 → 업무 복원·분류 → 반복 흐름 발견 → 평가노트용 사례 정리</w:t>
-      </w:r>
-      <w:r>
-        <w:rPr>
-          <w:rFonts w:ascii="바탕체" w:hAnsi="바탕체" w:eastAsia="바탕체" w:cs="바탕체"/>
-          <w:sz w:val="28"/>
-          <w:szCs w:val="28"/>
-          <w:lang w:val="ko-KR" w:eastAsia="ko-KR"/>
-        </w:rPr>
-        <w:t xml:space="preserve">로 이어지는 프로토타입을 개발하고자 한다. 대표 시나리오는 ‘스프레드시트 자료 취합 → 브라우저 정보 확인 → 문서 정리’처럼 여러 프로그램을 오가는 업무로 잡는다. 해커톤에서는 수집 가능성을 확인한 두 개 이상의 프로그램에서 짧은 작업을 시연하고, 앱별 관측 범위를 표시할 계획이다.</w:t>
+        <w:t xml:space="preserve">업무 기록을 기간·프로젝트·업무 유형별로 정리해 어떤 일을 했고 어떤 흐름이 반복되었는지 돌아볼 수 있게 한다. 사용자가 선택한 기간과 서식에 맞춰 같은 기록을 문서 초안으로 변환하고, 실제 결과·이슈·기여 등 부족한 정보만 보완하도록 할 계획이다.</w:t>
       </w:r>
     </w:p>
     <w:tbl>
@@ -1570,7 +959,7 @@
                 <w:b/>
                 <w:bCs/>
               </w:rPr>
-              <w:t xml:space="preserve">우선순위</w:t>
+              <w:t xml:space="preserve">활용</w:t>
             </w:r>
           </w:p>
         </w:tc>
@@ -1594,7 +983,7 @@
                 <w:b/>
                 <w:bCs/>
               </w:rPr>
-              <w:t xml:space="preserve">구현 항목</w:t>
+              <w:t xml:space="preserve">정리할 내용</w:t>
             </w:r>
           </w:p>
         </w:tc>
@@ -1618,7 +1007,7 @@
                 <w:b/>
                 <w:bCs/>
               </w:rPr>
-              <w:t xml:space="preserve">완료 기준</w:t>
+              <w:t xml:space="preserve">사용자에게 제공하는 가치</w:t>
             </w:r>
           </w:p>
         </w:tc>
@@ -1644,7 +1033,7 @@
                 <w:szCs w:val="28"/>
                 <w:lang w:val="ko-KR" w:eastAsia="ko-KR"/>
               </w:rPr>
-              <w:t xml:space="preserve">필수</w:t>
+              <w:t xml:space="preserve">업무 회고</w:t>
             </w:r>
           </w:p>
         </w:tc>
@@ -1665,7 +1054,7 @@
                 <w:szCs w:val="28"/>
                 <w:lang w:val="ko-KR" w:eastAsia="ko-KR"/>
               </w:rPr>
-              <w:t xml:space="preserve">PC 조작·맥락 수집과 저장</w:t>
+              <w:t xml:space="preserve">기간별 수행 업무, 반복 흐름, 개선 시도와 확인할 항목</w:t>
             </w:r>
           </w:p>
         </w:tc>
@@ -1686,7 +1075,7 @@
                 <w:szCs w:val="28"/>
                 <w:lang w:val="ko-KR" w:eastAsia="ko-KR"/>
               </w:rPr>
-              <w:t xml:space="preserve">선정한 프로그램에서 입력·클릭·앱 전환 맥락을 수집하고 로컬에서 원본 조회</w:t>
+              <w:t xml:space="preserve">기억에 의존하지 않고 자신의 업무를 돌아보고 다음 개선 방향 검토</w:t>
             </w:r>
           </w:p>
         </w:tc>
@@ -1712,7 +1101,7 @@
                 <w:szCs w:val="28"/>
                 <w:lang w:val="ko-KR" w:eastAsia="ko-KR"/>
               </w:rPr>
-              <w:t xml:space="preserve">필수</w:t>
+              <w:t xml:space="preserve">일일·주간·월간 보고 자동화</w:t>
             </w:r>
           </w:p>
         </w:tc>
@@ -1733,7 +1122,7 @@
                 <w:szCs w:val="28"/>
                 <w:lang w:val="ko-KR" w:eastAsia="ko-KR"/>
               </w:rPr>
-              <w:t xml:space="preserve">업무 복원·분류 카드</w:t>
+              <w:t xml:space="preserve">수행 업무·진행 내용·이슈·다음 계획을 선택 서식에 맞춘 초안</w:t>
             </w:r>
           </w:p>
         </w:tc>
@@ -1754,7 +1143,7 @@
                 <w:szCs w:val="28"/>
                 <w:lang w:val="ko-KR" w:eastAsia="ko-KR"/>
               </w:rPr>
-              <w:t xml:space="preserve">여러 프로그램의 관련 기록을 업무 후보로 연결하고 분류·근거 제시</w:t>
+              <w:t xml:space="preserve">흩어진 기록을 다시 모으는 부담과 반복 문서 작성 시간 감소</w:t>
             </w:r>
           </w:p>
         </w:tc>
@@ -1780,7 +1169,7 @@
                 <w:szCs w:val="28"/>
                 <w:lang w:val="ko-KR" w:eastAsia="ko-KR"/>
               </w:rPr>
-              <w:t xml:space="preserve">필수</w:t>
+              <w:t xml:space="preserve">필요시 다른 업무 문서에 활용</w:t>
             </w:r>
           </w:p>
         </w:tc>
@@ -1801,7 +1190,7 @@
                 <w:szCs w:val="28"/>
                 <w:lang w:val="ko-KR" w:eastAsia="ko-KR"/>
               </w:rPr>
-              <w:t xml:space="preserve">간단한 검토·확인 저장</w:t>
+              <w:t xml:space="preserve">사용자가 확인한 업무 사례·결과·기여와 관련 근거</w:t>
             </w:r>
           </w:p>
         </w:tc>
@@ -1822,211 +1211,7 @@
                 <w:szCs w:val="28"/>
                 <w:lang w:val="ko-KR" w:eastAsia="ko-KR"/>
               </w:rPr>
-              <w:t xml:space="preserve">이름·분류 수정, 잘못된 연결 제외, 선택 카드 확인과 수정 내용 유지</w:t>
-            </w:r>
-          </w:p>
-        </w:tc>
-      </w:tr>
-      <w:tr>
-        <w:trPr>
-          <w:cantSplit/>
-        </w:trPr>
-        <w:tc>
-          <w:tcPr>
-            <w:tcW w:w="2072" w:type="dxa"/>
-            <w:vAlign w:val="top"/>
-          </w:tcPr>
-          <w:p>
-            <w:pPr>
-              <w:pStyle w:val="Normal"/>
-              <w:spacing w:after="40" w:line="280" w:lineRule="auto"/>
-            </w:pPr>
-            <w:r>
-              <w:rPr>
-                <w:rFonts w:ascii="바탕체" w:hAnsi="바탕체" w:eastAsia="바탕체" w:cs="바탕체"/>
-                <w:sz w:val="28"/>
-                <w:szCs w:val="28"/>
-                <w:lang w:val="ko-KR" w:eastAsia="ko-KR"/>
-              </w:rPr>
-              <w:t xml:space="preserve">필수</w:t>
-            </w:r>
-          </w:p>
-        </w:tc>
-        <w:tc>
-          <w:tcPr>
-            <w:tcW w:w="3354" w:type="dxa"/>
-            <w:vAlign w:val="top"/>
-          </w:tcPr>
-          <w:p>
-            <w:pPr>
-              <w:pStyle w:val="Normal"/>
-              <w:spacing w:after="40" w:line="280" w:lineRule="auto"/>
-            </w:pPr>
-            <w:r>
-              <w:rPr>
-                <w:rFonts w:ascii="바탕체" w:hAnsi="바탕체" w:eastAsia="바탕체" w:cs="바탕체"/>
-                <w:sz w:val="28"/>
-                <w:szCs w:val="28"/>
-                <w:lang w:val="ko-KR" w:eastAsia="ko-KR"/>
-              </w:rPr>
-              <w:t xml:space="preserve">반복 흐름과 개선 후보 한 개</w:t>
-            </w:r>
-          </w:p>
-        </w:tc>
-        <w:tc>
-          <w:tcPr>
-            <w:tcW w:w="4440" w:type="dxa"/>
-            <w:vAlign w:val="top"/>
-          </w:tcPr>
-          <w:p>
-            <w:pPr>
-              <w:pStyle w:val="Normal"/>
-              <w:spacing w:after="40" w:line="280" w:lineRule="auto"/>
-            </w:pPr>
-            <w:r>
-              <w:rPr>
-                <w:rFonts w:ascii="바탕체" w:hAnsi="바탕체" w:eastAsia="바탕체" w:cs="바탕체"/>
-                <w:sz w:val="28"/>
-                <w:szCs w:val="28"/>
-                <w:lang w:val="ko-KR" w:eastAsia="ko-KR"/>
-              </w:rPr>
-              <w:t xml:space="preserve">실제 테스트 작업에서 반복 패턴과 근거를 보여주고 템플릿·자동화 등 검토 후보 제안</w:t>
-            </w:r>
-          </w:p>
-        </w:tc>
-      </w:tr>
-      <w:tr>
-        <w:trPr>
-          <w:cantSplit/>
-        </w:trPr>
-        <w:tc>
-          <w:tcPr>
-            <w:tcW w:w="2072" w:type="dxa"/>
-            <w:vAlign w:val="top"/>
-          </w:tcPr>
-          <w:p>
-            <w:pPr>
-              <w:pStyle w:val="Normal"/>
-              <w:spacing w:after="40" w:line="280" w:lineRule="auto"/>
-            </w:pPr>
-            <w:r>
-              <w:rPr>
-                <w:rFonts w:ascii="바탕체" w:hAnsi="바탕체" w:eastAsia="바탕체" w:cs="바탕체"/>
-                <w:sz w:val="28"/>
-                <w:szCs w:val="28"/>
-                <w:lang w:val="ko-KR" w:eastAsia="ko-KR"/>
-              </w:rPr>
-              <w:t xml:space="preserve">필수</w:t>
-            </w:r>
-          </w:p>
-        </w:tc>
-        <w:tc>
-          <w:tcPr>
-            <w:tcW w:w="3354" w:type="dxa"/>
-            <w:vAlign w:val="top"/>
-          </w:tcPr>
-          <w:p>
-            <w:pPr>
-              <w:pStyle w:val="Normal"/>
-              <w:spacing w:after="40" w:line="280" w:lineRule="auto"/>
-            </w:pPr>
-            <w:r>
-              <w:rPr>
-                <w:rFonts w:ascii="바탕체" w:hAnsi="바탕체" w:eastAsia="바탕체" w:cs="바탕체"/>
-                <w:sz w:val="28"/>
-                <w:szCs w:val="28"/>
-                <w:lang w:val="ko-KR" w:eastAsia="ko-KR"/>
-              </w:rPr>
-              <w:t xml:space="preserve">평가노트용 업무 사례 초안</w:t>
-            </w:r>
-          </w:p>
-        </w:tc>
-        <w:tc>
-          <w:tcPr>
-            <w:tcW w:w="4440" w:type="dxa"/>
-            <w:vAlign w:val="top"/>
-          </w:tcPr>
-          <w:p>
-            <w:pPr>
-              <w:pStyle w:val="Normal"/>
-              <w:spacing w:after="40" w:line="280" w:lineRule="auto"/>
-            </w:pPr>
-            <w:r>
-              <w:rPr>
-                <w:rFonts w:ascii="바탕체" w:hAnsi="바탕체" w:eastAsia="바탕체" w:cs="바탕체"/>
-                <w:sz w:val="28"/>
-                <w:szCs w:val="28"/>
-                <w:lang w:val="ko-KR" w:eastAsia="ko-KR"/>
-              </w:rPr>
-              <w:t xml:space="preserve">확인한 업무와 사용자 보완 내용으로 초안 생성, 근거 열기·수정·저장·텍스트 내보내기</w:t>
-            </w:r>
-          </w:p>
-        </w:tc>
-      </w:tr>
-      <w:tr>
-        <w:trPr>
-          <w:cantSplit/>
-        </w:trPr>
-        <w:tc>
-          <w:tcPr>
-            <w:tcW w:w="2072" w:type="dxa"/>
-            <w:vAlign w:val="top"/>
-          </w:tcPr>
-          <w:p>
-            <w:pPr>
-              <w:pStyle w:val="Normal"/>
-              <w:spacing w:after="40" w:line="280" w:lineRule="auto"/>
-            </w:pPr>
-            <w:r>
-              <w:rPr>
-                <w:rFonts w:ascii="바탕체" w:hAnsi="바탕체" w:eastAsia="바탕체" w:cs="바탕체"/>
-                <w:sz w:val="28"/>
-                <w:szCs w:val="28"/>
-                <w:lang w:val="ko-KR" w:eastAsia="ko-KR"/>
-              </w:rPr>
-              <w:t xml:space="preserve">확장</w:t>
-            </w:r>
-          </w:p>
-        </w:tc>
-        <w:tc>
-          <w:tcPr>
-            <w:tcW w:w="3354" w:type="dxa"/>
-            <w:vAlign w:val="top"/>
-          </w:tcPr>
-          <w:p>
-            <w:pPr>
-              <w:pStyle w:val="Normal"/>
-              <w:spacing w:after="40" w:line="280" w:lineRule="auto"/>
-            </w:pPr>
-            <w:r>
-              <w:rPr>
-                <w:rFonts w:ascii="바탕체" w:hAnsi="바탕체" w:eastAsia="바탕체" w:cs="바탕체"/>
-                <w:sz w:val="28"/>
-                <w:szCs w:val="28"/>
-                <w:lang w:val="ko-KR" w:eastAsia="ko-KR"/>
-              </w:rPr>
-              <w:t xml:space="preserve">보고 서식과 지원 환경 확대</w:t>
-            </w:r>
-          </w:p>
-        </w:tc>
-        <w:tc>
-          <w:tcPr>
-            <w:tcW w:w="4440" w:type="dxa"/>
-            <w:vAlign w:val="top"/>
-          </w:tcPr>
-          <w:p>
-            <w:pPr>
-              <w:pStyle w:val="Normal"/>
-              <w:spacing w:after="40" w:line="280" w:lineRule="auto"/>
-            </w:pPr>
-            <w:r>
-              <w:rPr>
-                <w:rFonts w:ascii="바탕체" w:hAnsi="바탕체" w:eastAsia="바탕체" w:cs="바탕체"/>
-                <w:sz w:val="28"/>
-                <w:szCs w:val="28"/>
-                <w:lang w:val="ko-KR" w:eastAsia="ko-KR"/>
-              </w:rPr>
-              <w:t xml:space="preserve">주간·월간 보고, 평가노트 전체 서식, 고급 편집과 다양한 앱·운영체제 지원</w:t>
+              <w:t xml:space="preserve">평가노트 등 필요한 문서에 같은 기록을 선택적으로 재사용</w:t>
             </w:r>
           </w:p>
         </w:tc>
@@ -2043,51 +1228,13 @@
           <w:szCs w:val="28"/>
           <w:lang w:val="ko-KR" w:eastAsia="ko-KR"/>
         </w:rPr>
-        <w:t xml:space="preserve">1일 차 오전에는 시연 환경과 프로그램 조합을 정하고, 키보드·마우스 이벤트와 접근성 정보를 활용한 최소 수집·저장을 구현할 계획이다. 오후에는 LLM API를 연결해 업무 후보·분류와 간단한 수정·확인 기능을 개발한다. 2일 차에는 짧은 반복 작업에서 패턴과 개선 후보를 제시하고, 평가노트용 사례 초안과 근거 열기·내보내기를 구현한다. 수집한 정보만으로 업무 의미가 드러나지 않으면 작업 시나리오와 맥락 수집 방법을 조정할 예정이다.</w:t>
-      </w:r>
-    </w:p>
-    <w:p>
-      <w:pPr>
-        <w:pStyle w:val="Normal"/>
-      </w:pPr>
-      <w:r>
-        <w:rPr>
-          <w:rFonts w:ascii="바탕체" w:hAnsi="바탕체" w:eastAsia="바탕체" w:cs="바탕체"/>
-          <w:sz w:val="28"/>
-          <w:szCs w:val="28"/>
-          <w:lang w:val="ko-KR" w:eastAsia="ko-KR"/>
-        </w:rPr>
-        <w:t xml:space="preserve">짧은 시연 자료에는 실제 수집한 날짜·프로그램·범위를 표시하고, 평가기간 전체를 기록한 것처럼 제시하지 않는다. 장기 누적과 다양한 직무의 활용 모습은 별도로 준비한 가상 자료로 설명할 계획이다. 다양한 앱과 운영체제의 호환성, 하루 연속 기록, 정기 자동 생성과 연간 목표 연결은 후속 구현·검증 대상으로 둔다.</w:t>
-      </w:r>
-    </w:p>
-    <w:p>
-      <w:pPr>
-        <w:pStyle w:val="Normal"/>
-      </w:pPr>
-      <w:r>
-        <w:rPr>
-          <w:rFonts w:ascii="바탕체" w:hAnsi="바탕체" w:eastAsia="바탕체" w:cs="바탕체"/>
-          <w:sz w:val="28"/>
-          <w:szCs w:val="28"/>
-          <w:lang w:val="ko-KR" w:eastAsia="ko-KR"/>
-        </w:rPr>
-        <w:t xml:space="preserve">구현 후에는 다음 순서로 시연할 계획이다.</w:t>
-      </w:r>
-    </w:p>
-    <w:p>
-      <w:pPr>
-        <w:pStyle w:val="Normal"/>
-        <w:ind w:left="420" w:hanging="420"/>
-      </w:pPr>
-      <w:r>
-        <w:rPr>
-          <w:rFonts w:ascii="바탕체" w:hAnsi="바탕체" w:eastAsia="바탕체" w:cs="바탕체"/>
-          <w:sz w:val="28"/>
-          <w:szCs w:val="28"/>
-          <w:lang w:val="ko-KR" w:eastAsia="ko-KR"/>
-        </w:rPr>
-        <w:t xml:space="preserve">1. </w:t>
-      </w:r>
+        <w:t xml:space="preserve">해커톤에서는 업무 기록 조회와 일일 보고 초안 한 종류의 생성·수정·저장·텍스트 내보내기를 핵심 결과물로 구현할 계획이다. 주간·월간 보고와 다양한 문서 서식, 정기 자동 생성은 확장 항목으로 둔다. 문서 항목마다 관련 업무 카드와 관측 근거를 연결하고, 완료 여부·실제 결과·기여는 사용자 확인이나 추가 자료가 있을 때 포함한다. 부족한 정보는 보완 항목으로 남긴다.</w:t>
+      </w:r>
+    </w:p>
+    <w:p>
+      <w:pPr>
+        <w:pStyle w:val="Heading2"/>
+      </w:pPr>
       <w:r>
         <w:rPr>
           <w:rFonts w:ascii="바탕체" w:hAnsi="바탕체" w:eastAsia="바탕체" w:cs="바탕체"/>
@@ -2097,31 +1244,49 @@
           <w:b/>
           <w:bCs/>
         </w:rPr>
-        <w:t xml:space="preserve">평소처럼 작업:</w:t>
-      </w:r>
-      <w:r>
-        <w:rPr>
-          <w:rFonts w:ascii="바탕체" w:hAnsi="바탕체" w:eastAsia="바탕체" w:cs="바탕체"/>
-          <w:sz w:val="28"/>
-          <w:szCs w:val="28"/>
-          <w:lang w:val="ko-KR" w:eastAsia="ko-KR"/>
-        </w:rPr>
-        <w:t xml:space="preserve"> 기밀 없는 테스트 자료로 스프레드시트·브라우저·문서 편집기 중 선정한 프로그램을 오가며 일한다. 다른 목적의 작업도 섞는다.</w:t>
+        <w:t xml:space="preserve">④ 부수 기능: 업무 타임테이블과 프로그램 사용 현황</w:t>
       </w:r>
     </w:p>
     <w:p>
       <w:pPr>
         <w:pStyle w:val="Normal"/>
-        <w:ind w:left="420" w:hanging="420"/>
-      </w:pPr>
-      <w:r>
-        <w:rPr>
-          <w:rFonts w:ascii="바탕체" w:hAnsi="바탕체" w:eastAsia="바탕체" w:cs="바탕체"/>
-          <w:sz w:val="28"/>
-          <w:szCs w:val="28"/>
-          <w:lang w:val="ko-KR" w:eastAsia="ko-KR"/>
-        </w:rPr>
-        <w:t xml:space="preserve">2. </w:t>
+      </w:pPr>
+      <w:r>
+        <w:rPr>
+          <w:rFonts w:ascii="바탕체" w:hAnsi="바탕체" w:eastAsia="바탕체" w:cs="바탕체"/>
+          <w:sz w:val="28"/>
+          <w:szCs w:val="28"/>
+          <w:lang w:val="ko-KR" w:eastAsia="ko-KR"/>
+        </w:rPr>
+        <w:t xml:space="preserve">수집한 시각·앱 전환·업무 분류 정보를 활용해 시간대별 업무 타임테이블, 업무별 소요 시간 추정치, 프로그램별 관측 사용 시간과 사용 비중을 제공할 수 있다. 사용자는 어떤 업무에 시간이 많이 들었는지, 어떤 프로그램을 자주 오갔는지 확인하고 효율화 솔루션을 검토할 참고 자료로 활용한다.</w:t>
+      </w:r>
+    </w:p>
+    <w:p>
+      <w:pPr>
+        <w:pStyle w:val="Normal"/>
+      </w:pPr>
+      <w:r>
+        <w:rPr>
+          <w:rFonts w:ascii="바탕체" w:hAnsi="바탕체" w:eastAsia="바탕체" w:cs="바탕체"/>
+          <w:sz w:val="28"/>
+          <w:szCs w:val="28"/>
+          <w:lang w:val="ko-KR" w:eastAsia="ko-KR"/>
+        </w:rPr>
+        <w:t xml:space="preserve">시간은 허용한 범위에서 관측한 활동 구간을 기준으로 집계한다. 업무별 배분은 연결 근거가 충분할 때만 추정하고, 겹치는 구간은 중복 합산하지 않는다. 유휴·오프라인 업무·미수집 구간과 분류가 불확실한 시간은 구분해 표시한다. 일부 프로그램만 수집했다면 그 범위의 사용 비중임을 명시하며, 이를 전체 근무시간이나 개인 생산성 점수로 해석하지 않는다. 해커톤에서는 여유가 있을 때 간단한 타임라인과 프로그램별 집계를 시연하고, 정교한 시간 배분은 후속 검증 대상으로 둔다.</w:t>
+      </w:r>
+    </w:p>
+    <w:p>
+      <w:pPr>
+        <w:pStyle w:val="Normal"/>
+      </w:pPr>
+      <w:r>
+        <w:rPr>
+          <w:rFonts w:ascii="바탕체" w:hAnsi="바탕체" w:eastAsia="바탕체" w:cs="바탕체"/>
+          <w:sz w:val="28"/>
+          <w:szCs w:val="28"/>
+          <w:lang w:val="ko-KR" w:eastAsia="ko-KR"/>
+        </w:rPr>
+        <w:t xml:space="preserve">전체 처리 흐름은 </w:t>
       </w:r>
       <w:r>
         <w:rPr>
@@ -2132,32 +1297,22 @@
           <w:b/>
           <w:bCs/>
         </w:rPr>
-        <w:t xml:space="preserve">발견의 전후 비교:</w:t>
-      </w:r>
-      <w:r>
-        <w:rPr>
-          <w:rFonts w:ascii="바탕체" w:hAnsi="바탕체" w:eastAsia="바탕체" w:cs="바탕체"/>
-          <w:sz w:val="28"/>
-          <w:szCs w:val="28"/>
-          <w:lang w:val="ko-KR" w:eastAsia="ko-KR"/>
-        </w:rPr>
-        <w:t xml:space="preserve"> 시연자가 기억으로 적은 목록과 실제 기록에서 AI가 복원한 업무 후보를 나란히 보여준다. 계획된 시연의 비교임을 밝힌다.</w:t>
-      </w:r>
-    </w:p>
-    <w:p>
-      <w:pPr>
-        <w:pStyle w:val="Normal"/>
-        <w:ind w:left="420" w:hanging="420"/>
-      </w:pPr>
-      <w:r>
-        <w:rPr>
-          <w:rFonts w:ascii="바탕체" w:hAnsi="바탕체" w:eastAsia="바탕체" w:cs="바탕체"/>
-          <w:sz w:val="28"/>
-          <w:szCs w:val="28"/>
-          <w:lang w:val="ko-KR" w:eastAsia="ko-KR"/>
-        </w:rPr>
-        <w:t xml:space="preserve">3. </w:t>
-      </w:r>
+        <w:t xml:space="preserve">허용 범위의 데이터 자동 축적 → AI 업무 분류·패턴화 → 효율화 솔루션 제안 + 업무 회고·문서 자동화</w:t>
+      </w:r>
+      <w:r>
+        <w:rPr>
+          <w:rFonts w:ascii="바탕체" w:hAnsi="바탕체" w:eastAsia="바탕체" w:cs="바탕체"/>
+          <w:sz w:val="28"/>
+          <w:szCs w:val="28"/>
+          <w:lang w:val="ko-KR" w:eastAsia="ko-KR"/>
+        </w:rPr>
+        <w:t xml:space="preserve">로 설계한다. 건수·날짜·관측 시간은 코드로 계산하고, AI는 맥락에 따른 업무 연결·분류·패턴 해석·솔루션과 문서 초안 생성을 담당한다. 키보드·마우스 이벤트, 접근성 API와 필요한 앱 연동으로 최소 맥락을 확보하고, 로컬 DB·업무 카드 화면·LLM API를 연결할 계획이다. 수집 조건 적용과 민감정보 제외를 저장·외부 전송보다 먼저 수행한다.</w:t>
+      </w:r>
+    </w:p>
+    <w:p>
+      <w:pPr>
+        <w:pStyle w:val="Heading1"/>
+      </w:pPr>
       <w:r>
         <w:rPr>
           <w:rFonts w:ascii="바탕체" w:hAnsi="바탕체" w:eastAsia="바탕체" w:cs="바탕체"/>
@@ -2167,31 +1322,21 @@
           <w:b/>
           <w:bCs/>
         </w:rPr>
-        <w:t xml:space="preserve">짧게 확인:</w:t>
-      </w:r>
-      <w:r>
-        <w:rPr>
-          <w:rFonts w:ascii="바탕체" w:hAnsi="바탕체" w:eastAsia="바탕체" w:cs="바탕체"/>
-          <w:sz w:val="28"/>
-          <w:szCs w:val="28"/>
-          <w:lang w:val="ko-KR" w:eastAsia="ko-KR"/>
-        </w:rPr>
-        <w:t xml:space="preserve"> 잘못 연결된 항목을 제외하거나 이름·분류를 고친 뒤 업무 카드를 확인한다. 원본은 필요한 카드에서만 연다.</w:t>
+        <w:t xml:space="preserve">3. 해커톤 2일 동안 구현해 보고 싶은 주요 기능은 무엇인가요?</w:t>
       </w:r>
     </w:p>
     <w:p>
       <w:pPr>
         <w:pStyle w:val="Normal"/>
-        <w:ind w:left="420" w:hanging="420"/>
-      </w:pPr>
-      <w:r>
-        <w:rPr>
-          <w:rFonts w:ascii="바탕체" w:hAnsi="바탕체" w:eastAsia="바탕체" w:cs="바탕체"/>
-          <w:sz w:val="28"/>
-          <w:szCs w:val="28"/>
-          <w:lang w:val="ko-KR" w:eastAsia="ko-KR"/>
-        </w:rPr>
-        <w:t xml:space="preserve">4. </w:t>
+      </w:pPr>
+      <w:r>
+        <w:rPr>
+          <w:rFonts w:ascii="바탕체" w:hAnsi="바탕체" w:eastAsia="바탕체" w:cs="바탕체"/>
+          <w:sz w:val="28"/>
+          <w:szCs w:val="28"/>
+          <w:lang w:val="ko-KR" w:eastAsia="ko-KR"/>
+        </w:rPr>
+        <w:t xml:space="preserve">2일 동안 </w:t>
       </w:r>
       <w:r>
         <w:rPr>
@@ -2202,101 +1347,16 @@
           <w:b/>
           <w:bCs/>
         </w:rPr>
-        <w:t xml:space="preserve">반복 작업 발견:</w:t>
-      </w:r>
-      <w:r>
-        <w:rPr>
-          <w:rFonts w:ascii="바탕체" w:hAnsi="바탕체" w:eastAsia="바탕체" w:cs="바탕체"/>
-          <w:sz w:val="28"/>
-          <w:szCs w:val="28"/>
-          <w:lang w:val="ko-KR" w:eastAsia="ko-KR"/>
-        </w:rPr>
-        <w:t xml:space="preserve"> 같은 자료 취합·서식 맞춤 등을 반복한 기록에서 패턴과 표준화·자동화 검토 후보를 보여준다.</w:t>
-      </w:r>
-    </w:p>
-    <w:p>
-      <w:pPr>
-        <w:pStyle w:val="Normal"/>
-        <w:ind w:left="420" w:hanging="420"/>
-      </w:pPr>
-      <w:r>
-        <w:rPr>
-          <w:rFonts w:ascii="바탕체" w:hAnsi="바탕체" w:eastAsia="바탕체" w:cs="바탕체"/>
-          <w:sz w:val="28"/>
-          <w:szCs w:val="28"/>
-          <w:lang w:val="ko-KR" w:eastAsia="ko-KR"/>
-        </w:rPr>
-        <w:t xml:space="preserve">5. </w:t>
-      </w:r>
-      <w:r>
-        <w:rPr>
-          <w:rFonts w:ascii="바탕체" w:hAnsi="바탕체" w:eastAsia="바탕체" w:cs="바탕체"/>
-          <w:sz w:val="28"/>
-          <w:szCs w:val="28"/>
-          <w:lang w:val="ko-KR" w:eastAsia="ko-KR"/>
-          <w:b/>
-          <w:bCs/>
-        </w:rPr>
-        <w:t xml:space="preserve">평가노트에 활용:</w:t>
-      </w:r>
-      <w:r>
-        <w:rPr>
-          <w:rFonts w:ascii="바탕체" w:hAnsi="바탕체" w:eastAsia="바탕체" w:cs="바탕체"/>
-          <w:sz w:val="28"/>
-          <w:szCs w:val="28"/>
-          <w:lang w:val="ko-KR" w:eastAsia="ko-KR"/>
-        </w:rPr>
-        <w:t xml:space="preserve"> 확인한 업무로 사례 초안을 만들고, 실제 결과·기여를 보완할 항목과 원본 근거를 함께 보여준다. 장기 축적의 모습은 별도 가상 자료로 설명한다.</w:t>
-      </w:r>
-    </w:p>
-    <w:p>
-      <w:pPr>
-        <w:pStyle w:val="Heading1"/>
-      </w:pPr>
-      <w:r>
-        <w:rPr>
-          <w:rFonts w:ascii="바탕체" w:hAnsi="바탕체" w:eastAsia="바탕체" w:cs="바탕체"/>
-          <w:sz w:val="28"/>
-          <w:szCs w:val="28"/>
-          <w:lang w:val="ko-KR" w:eastAsia="ko-KR"/>
-          <w:b/>
-          <w:bCs/>
-        </w:rPr>
-        <w:t xml:space="preserve">4. 이 아이디어의 주요 사용자는 누구이며, 어떤 기대효과가 있나요?</w:t>
-      </w:r>
-    </w:p>
-    <w:p>
-      <w:pPr>
-        <w:pStyle w:val="Normal"/>
-      </w:pPr>
-      <w:r>
-        <w:rPr>
-          <w:rFonts w:ascii="바탕체" w:hAnsi="바탕체" w:eastAsia="바탕체" w:cs="바탕체"/>
-          <w:sz w:val="28"/>
-          <w:szCs w:val="28"/>
-          <w:lang w:val="ko-KR" w:eastAsia="ko-KR"/>
-        </w:rPr>
-        <w:t xml:space="preserve">주요 대상 사용자는 </w:t>
-      </w:r>
-      <w:r>
-        <w:rPr>
-          <w:rFonts w:ascii="바탕체" w:hAnsi="바탕체" w:eastAsia="바탕체" w:cs="바탕체"/>
-          <w:sz w:val="28"/>
-          <w:szCs w:val="28"/>
-          <w:lang w:val="ko-KR" w:eastAsia="ko-KR"/>
-          <w:b/>
-          <w:bCs/>
-        </w:rPr>
-        <w:t xml:space="preserve">PC로 일하며 평가노트를 작성하는 SDS 임직원</w:t>
-      </w:r>
-      <w:r>
-        <w:rPr>
-          <w:rFonts w:ascii="바탕체" w:hAnsi="바탕체" w:eastAsia="바탕체" w:cs="바탕체"/>
-          <w:sz w:val="28"/>
-          <w:szCs w:val="28"/>
-          <w:lang w:val="ko-KR" w:eastAsia="ko-KR"/>
-        </w:rPr>
-        <w:t xml:space="preserve">이다. 기획·개발·분석·운영·지원 등 직무와 사용하는 도구가 달라도, 자신의 일을 기억하고 설명하며 반복 작업을 개선하려는 필요에 대응하고자 한다. 주간보고 작성 여부와 관계없이 활용할 수 있고, 장기적으로는 PC로 일하는 다양한 조직과 사용자에게 확장할 수 있는 아이디어다.</w:t>
+        <w:t xml:space="preserve">선택적 데이터 수집 → 업무 자동 분류·패턴화 → 효율화 솔루션 제안 → 업무 회고·보고 초안 생성</w:t>
+      </w:r>
+      <w:r>
+        <w:rPr>
+          <w:rFonts w:ascii="바탕체" w:hAnsi="바탕체" w:eastAsia="바탕체" w:cs="바탕체"/>
+          <w:sz w:val="28"/>
+          <w:szCs w:val="28"/>
+          <w:lang w:val="ko-KR" w:eastAsia="ko-KR"/>
+        </w:rPr>
+        <w:t xml:space="preserve">으로 이어지는 프로토타입을 개발하고자 한다. 대표 시나리오는 ‘스프레드시트 자료 취합 → 업무 사이트 정보 확인 → 문서 정리’처럼 여러 프로그램을 오가는 업무로 잡는다. 수집 가능성을 확인한 두 개 이상의 프로그램에서 짧은 작업을 시연하고, 앱별 관측 범위를 표시할 계획이다.</w:t>
       </w:r>
     </w:p>
     <w:tbl>
@@ -2348,7 +1408,7 @@
                 <w:b/>
                 <w:bCs/>
               </w:rPr>
-              <w:t xml:space="preserve">사용자의 상황</w:t>
+              <w:t xml:space="preserve">우선순위</w:t>
             </w:r>
           </w:p>
         </w:tc>
@@ -2372,7 +1432,7 @@
                 <w:b/>
                 <w:bCs/>
               </w:rPr>
-              <w:t xml:space="preserve">기대효과</w:t>
+              <w:t xml:space="preserve">구현 항목</w:t>
             </w:r>
           </w:p>
         </w:tc>
@@ -2396,7 +1456,7 @@
                 <w:b/>
                 <w:bCs/>
               </w:rPr>
-              <w:t xml:space="preserve">검증 방법</w:t>
+              <w:t xml:space="preserve">완료 기준</w:t>
             </w:r>
           </w:p>
         </w:tc>
@@ -2422,7 +1482,7 @@
                 <w:szCs w:val="28"/>
                 <w:lang w:val="ko-KR" w:eastAsia="ko-KR"/>
               </w:rPr>
-              <w:t xml:space="preserve">짧은 업무가 기록에서 자주 빠짐</w:t>
+              <w:t xml:space="preserve">필수</w:t>
             </w:r>
           </w:p>
         </w:tc>
@@ -2443,7 +1503,7 @@
                 <w:szCs w:val="28"/>
                 <w:lang w:val="ko-KR" w:eastAsia="ko-KR"/>
               </w:rPr>
-              <w:t xml:space="preserve">미처 적지 못한 일을 떠올릴 단서 제공</w:t>
+              <w:t xml:space="preserve">허용 범위 설정과 데이터 수집·저장</w:t>
             </w:r>
           </w:p>
         </w:tc>
@@ -2464,7 +1524,7 @@
                 <w:szCs w:val="28"/>
                 <w:lang w:val="ko-KR" w:eastAsia="ko-KR"/>
               </w:rPr>
-              <w:t xml:space="preserve">AI 확인 전 작성한 업무 목록과 비교해 유용하게 추가된 업무 확인</w:t>
+              <w:t xml:space="preserve">선택한 프로그램과 지원 가능한 파일명·사이트 조건을 적용하고, 비허용 작업은 저장하지 않음. 시작·중지·전체 삭제 제공</w:t>
             </w:r>
           </w:p>
         </w:tc>
@@ -2490,7 +1550,7 @@
                 <w:szCs w:val="28"/>
                 <w:lang w:val="ko-KR" w:eastAsia="ko-KR"/>
               </w:rPr>
-              <w:t xml:space="preserve">여러 앱의 행동을 다시 정리해야 함</w:t>
+              <w:t xml:space="preserve">필수</w:t>
             </w:r>
           </w:p>
         </w:tc>
@@ -2511,7 +1571,7 @@
                 <w:szCs w:val="28"/>
                 <w:lang w:val="ko-KR" w:eastAsia="ko-KR"/>
               </w:rPr>
-              <w:t xml:space="preserve">업무 목적에 따른 목록과 분류 제공</w:t>
+              <w:t xml:space="preserve">업무 자동 분류 카드와 짧은 수정</w:t>
             </w:r>
           </w:p>
         </w:tc>
@@ -2532,7 +1592,7 @@
                 <w:szCs w:val="28"/>
                 <w:lang w:val="ko-KR" w:eastAsia="ko-KR"/>
               </w:rPr>
-              <w:t xml:space="preserve">사용자 기준 목록과 카드의 연결·분류 정확성 및 수정 부담 비교</w:t>
+              <w:t xml:space="preserve">수집 기록을 설정한 주기로 업무 후보에 연결하고 분류·근거 표시. 이름·분류 수정과 잘못된 연결 제외 내용을 저장</w:t>
             </w:r>
           </w:p>
         </w:tc>
@@ -2558,7 +1618,7 @@
                 <w:szCs w:val="28"/>
                 <w:lang w:val="ko-KR" w:eastAsia="ko-KR"/>
               </w:rPr>
-              <w:t xml:space="preserve">평가노트 작성 때 지난 업무를 다시 떠올림</w:t>
+              <w:t xml:space="preserve">필수</w:t>
             </w:r>
           </w:p>
         </w:tc>
@@ -2579,7 +1639,7 @@
                 <w:szCs w:val="28"/>
                 <w:lang w:val="ko-KR" w:eastAsia="ko-KR"/>
               </w:rPr>
-              <w:t xml:space="preserve">업무·기여 사례와 근거를 지속적으로 축적</w:t>
+              <w:t xml:space="preserve">반복 업무 패턴화와 효율화 솔루션 한 개</w:t>
             </w:r>
           </w:p>
         </w:tc>
@@ -2600,7 +1660,7 @@
                 <w:szCs w:val="28"/>
                 <w:lang w:val="ko-KR" w:eastAsia="ko-KR"/>
               </w:rPr>
-              <w:t xml:space="preserve">수동으로 사례를 정리할 때와 AI 초안 검토·보완까지의 시간 비교</w:t>
+              <w:t xml:space="preserve">실제 반복 작업의 근거와 개선 단계를 설명하고, 자동화 설계안 또는 템플릿 제시</w:t>
             </w:r>
           </w:p>
         </w:tc>
@@ -2626,7 +1686,7 @@
                 <w:szCs w:val="28"/>
                 <w:lang w:val="ko-KR" w:eastAsia="ko-KR"/>
               </w:rPr>
-              <w:t xml:space="preserve">자료 이동·입력·확인·서식 맞춤 등을 반복함</w:t>
+              <w:t xml:space="preserve">필수</w:t>
             </w:r>
           </w:p>
         </w:tc>
@@ -2647,7 +1707,7 @@
                 <w:szCs w:val="28"/>
                 <w:lang w:val="ko-KR" w:eastAsia="ko-KR"/>
               </w:rPr>
-              <w:t xml:space="preserve">반복 흐름과 개선할 업무를 발견할 기회 제공</w:t>
+              <w:t xml:space="preserve">업무 회고와 일일 보고 초안</w:t>
             </w:r>
           </w:p>
         </w:tc>
@@ -2668,7 +1728,7 @@
                 <w:szCs w:val="28"/>
                 <w:lang w:val="ko-KR" w:eastAsia="ko-KR"/>
               </w:rPr>
-              <w:t xml:space="preserve">사용자가 유효하다고 판단한 반복 패턴과 실행해볼 제안 확인</w:t>
+              <w:t xml:space="preserve">선택 기간의 업무 조회, 확인한 기록과 보완 정보로 초안 생성, 근거 열기·수정·저장·텍스트 내보내기</w:t>
             </w:r>
           </w:p>
         </w:tc>
@@ -2694,7 +1754,7 @@
                 <w:szCs w:val="28"/>
                 <w:lang w:val="ko-KR" w:eastAsia="ko-KR"/>
               </w:rPr>
-              <w:t xml:space="preserve">담당 업무에 따라 주간·월간 보고가 필요함</w:t>
+              <w:t xml:space="preserve">선택 시연</w:t>
             </w:r>
           </w:p>
         </w:tc>
@@ -2715,7 +1775,7 @@
                 <w:szCs w:val="28"/>
                 <w:lang w:val="ko-KR" w:eastAsia="ko-KR"/>
               </w:rPr>
-              <w:t xml:space="preserve">같은 업무 기억을 필요한 서식으로 재사용</w:t>
+              <w:t xml:space="preserve">타임테이블과 프로그램 사용 집계</w:t>
             </w:r>
           </w:p>
         </w:tc>
@@ -2736,7 +1796,7 @@
                 <w:szCs w:val="28"/>
                 <w:lang w:val="ko-KR" w:eastAsia="ko-KR"/>
               </w:rPr>
-              <w:t xml:space="preserve">각 직무의 보고에 필요한 보완량과 작성 시간 확인</w:t>
+              <w:t xml:space="preserve">관측 범위 안에서 시간대별 활동과 프로그램 사용 시간을 표시하고 미수집 구간 구분</w:t>
             </w:r>
           </w:p>
         </w:tc>
@@ -2762,7 +1822,7 @@
                 <w:szCs w:val="28"/>
                 <w:lang w:val="ko-KR" w:eastAsia="ko-KR"/>
               </w:rPr>
-              <w:t xml:space="preserve">조직에서 반복 수작업의 개선 대상을 찾기 어려움</w:t>
+              <w:t xml:space="preserve">확장</w:t>
             </w:r>
           </w:p>
         </w:tc>
@@ -2783,7 +1843,7 @@
                 <w:szCs w:val="28"/>
                 <w:lang w:val="ko-KR" w:eastAsia="ko-KR"/>
               </w:rPr>
-              <w:t xml:space="preserve">사용자가 선택한 요약으로 표준화·자동화 검토 대상을 설명할 근거 확보</w:t>
+              <w:t xml:space="preserve">세부 조건·문서 서식·지원 환경 확대</w:t>
             </w:r>
           </w:p>
         </w:tc>
@@ -2804,7 +1864,7 @@
                 <w:szCs w:val="28"/>
                 <w:lang w:val="ko-KR" w:eastAsia="ko-KR"/>
               </w:rPr>
-              <w:t xml:space="preserve">공유한 요약이 개선 우선순위 논의에 도움이 되는지 검토</w:t>
+              <w:t xml:space="preserve">메신저 대화 상대 등 앱별 세부 필터, 주간·월간 보고와 다양한 서식, 정기 문서 생성, 고급 편집과 다양한 앱·운영체제 지원</w:t>
             </w:r>
           </w:p>
         </w:tc>
@@ -2821,7 +1881,7 @@
           <w:szCs w:val="28"/>
           <w:lang w:val="ko-KR" w:eastAsia="ko-KR"/>
         </w:rPr>
-        <w:t xml:space="preserve">해커톤에서는 업무 연결·분류의 정확성, 누락, 수정 횟수, 근거의 타당성과 전체 검토 시간을 측정할 계획이다. 사용자 테스트에서는 AI를 보기 전 목록에서 빠졌지만 실제 수행했다고 확인한 일을 집계하고, 평가노트용 업무 사례를 수동으로 정리할 때와 AI를 활용해 확인·보완할 때의 총시간을 비교하고자 한다. 반복 패턴과 개선 제안이 실제 업무에 도움이 되는지도 확인한다. 평가기간 전체의 활용 효과와 개선안의 실제 시간 절감은 후속 사용을 통해 검증할 예정이다.</w:t>
+        <w:t xml:space="preserve">1일 차 오전에는 시연 앱과 수집 조건을 정하고, 로컬에서 허용 여부를 판별한 뒤 최소 맥락을 수집·저장하는 기능을 구현한다. 오후에는 LLM API를 연결해 업무 자동 분류와 간단한 수정·확인을 개발한다. 2일 차에는 반복 흐름의 패턴화와 솔루션 카드, 일일 보고 초안의 근거 연결·내보내기를 구현한다. 허용·비허용 파일과 사이트를 섞어 개인정보 보호 조건도 함께 검증한다.</w:t>
       </w:r>
     </w:p>
     <w:p>
@@ -2835,13 +1895,37 @@
           <w:szCs w:val="28"/>
           <w:lang w:val="ko-KR" w:eastAsia="ko-KR"/>
         </w:rPr>
-        <w:t xml:space="preserve">로그만으로 모든 업무를 관측할 수 없으므로 오프라인 업무나 미지원 앱의 작업은 사용자가 선택적으로 추가할 수 있게 한다. 활동량·입력 횟수·유휴 시간을 개인의 생산성 점수로 환산하지 않는다. 반복 업무 개선의 효과는 실제 적용과 후속 사용 기간이 필요하므로 해커톤의 발견·제안 검증과 나누어 측정한다.</w:t>
-      </w:r>
-    </w:p>
-    <w:p>
-      <w:pPr>
-        <w:pStyle w:val="Heading1"/>
-      </w:pPr>
+        <w:t xml:space="preserve">짧은 시연에는 실제 수집한 날짜·프로그램·범위를 표시한다. 여러 날의 누적과 다양한 직무의 활용 모습은 별도의 가상 자료로 설명한다. 메신저의 대화 상대 식별 등 앱별 세부 수집 조건은 접근성 API·연동 지원을 확인한 범위에서만 구현하고, 조건을 확인할 수 없으면 수집하지 않는다. 다양한 앱·운영체제 호환성, 하루 연속 기록과 개선안의 실제 효과는 후속 검증 대상으로 둔다.</w:t>
+      </w:r>
+    </w:p>
+    <w:p>
+      <w:pPr>
+        <w:pStyle w:val="Normal"/>
+      </w:pPr>
+      <w:r>
+        <w:rPr>
+          <w:rFonts w:ascii="바탕체" w:hAnsi="바탕체" w:eastAsia="바탕체" w:cs="바탕체"/>
+          <w:sz w:val="28"/>
+          <w:szCs w:val="28"/>
+          <w:lang w:val="ko-KR" w:eastAsia="ko-KR"/>
+        </w:rPr>
+        <w:t xml:space="preserve">구현 후에는 다음 순서로 시연할 계획이다.</w:t>
+      </w:r>
+    </w:p>
+    <w:p>
+      <w:pPr>
+        <w:pStyle w:val="Normal"/>
+        <w:ind w:left="420" w:hanging="420"/>
+      </w:pPr>
+      <w:r>
+        <w:rPr>
+          <w:rFonts w:ascii="바탕체" w:hAnsi="바탕체" w:eastAsia="바탕체" w:cs="바탕체"/>
+          <w:sz w:val="28"/>
+          <w:szCs w:val="28"/>
+          <w:lang w:val="ko-KR" w:eastAsia="ko-KR"/>
+        </w:rPr>
+        <w:t xml:space="preserve">1. </w:t>
+      </w:r>
       <w:r>
         <w:rPr>
           <w:rFonts w:ascii="바탕체" w:hAnsi="바탕체" w:eastAsia="바탕체" w:cs="바탕체"/>
@@ -2851,13 +1935,32 @@
           <w:b/>
           <w:bCs/>
         </w:rPr>
-        <w:t xml:space="preserve">5. 아이디어가 구현된 모습을 한 줄로 요약하면 어떤 모습일까요?</w:t>
+        <w:t xml:space="preserve">수집 범위 선택:</w:t>
+      </w:r>
+      <w:r>
+        <w:rPr>
+          <w:rFonts w:ascii="바탕체" w:hAnsi="바탕체" w:eastAsia="바탕체" w:cs="바탕체"/>
+          <w:sz w:val="28"/>
+          <w:szCs w:val="28"/>
+          <w:lang w:val="ko-KR" w:eastAsia="ko-KR"/>
+        </w:rPr>
+        <w:t xml:space="preserve"> 업무용 프로그램과 파일명·사이트 조건을 지정하고, 제외한 개인 작업이 저장되지 않는지 보여준다.</w:t>
       </w:r>
     </w:p>
     <w:p>
       <w:pPr>
         <w:pStyle w:val="Normal"/>
-      </w:pPr>
+        <w:ind w:left="420" w:hanging="420"/>
+      </w:pPr>
+      <w:r>
+        <w:rPr>
+          <w:rFonts w:ascii="바탕체" w:hAnsi="바탕체" w:eastAsia="바탕체" w:cs="바탕체"/>
+          <w:sz w:val="28"/>
+          <w:szCs w:val="28"/>
+          <w:lang w:val="ko-KR" w:eastAsia="ko-KR"/>
+        </w:rPr>
+        <w:t xml:space="preserve">2. </w:t>
+      </w:r>
       <w:r>
         <w:rPr>
           <w:rFonts w:ascii="바탕체" w:hAnsi="바탕체" w:eastAsia="바탕체" w:cs="바탕체"/>
@@ -2867,7 +1970,810 @@
           <w:b/>
           <w:bCs/>
         </w:rPr>
-        <w:t xml:space="preserve">PC에서 평소처럼 일하면, AI가 흩어진 조작 기록을 업무로 기억·분류하고 평가노트에 활용할 근거와 반복 작업을 개선할 인사이트를 제공하는 업무 기억 비서.</w:t>
+        <w:t xml:space="preserve">평소처럼 작업:</w:t>
+      </w:r>
+      <w:r>
+        <w:rPr>
+          <w:rFonts w:ascii="바탕체" w:hAnsi="바탕체" w:eastAsia="바탕체" w:cs="바탕체"/>
+          <w:sz w:val="28"/>
+          <w:szCs w:val="28"/>
+          <w:lang w:val="ko-KR" w:eastAsia="ko-KR"/>
+        </w:rPr>
+        <w:t xml:space="preserve"> 기밀 없는 테스트 자료로 여러 프로그램을 오가며 자료 취합과 문서 정리를 반복한다.</w:t>
+      </w:r>
+    </w:p>
+    <w:p>
+      <w:pPr>
+        <w:pStyle w:val="Normal"/>
+        <w:ind w:left="420" w:hanging="420"/>
+      </w:pPr>
+      <w:r>
+        <w:rPr>
+          <w:rFonts w:ascii="바탕체" w:hAnsi="바탕체" w:eastAsia="바탕체" w:cs="바탕체"/>
+          <w:sz w:val="28"/>
+          <w:szCs w:val="28"/>
+          <w:lang w:val="ko-KR" w:eastAsia="ko-KR"/>
+        </w:rPr>
+        <w:t xml:space="preserve">3. </w:t>
+      </w:r>
+      <w:r>
+        <w:rPr>
+          <w:rFonts w:ascii="바탕체" w:hAnsi="바탕체" w:eastAsia="바탕체" w:cs="바탕체"/>
+          <w:sz w:val="28"/>
+          <w:szCs w:val="28"/>
+          <w:lang w:val="ko-KR" w:eastAsia="ko-KR"/>
+          <w:b/>
+          <w:bCs/>
+        </w:rPr>
+        <w:t xml:space="preserve">업무 자동 분류:</w:t>
+      </w:r>
+      <w:r>
+        <w:rPr>
+          <w:rFonts w:ascii="바탕체" w:hAnsi="바탕체" w:eastAsia="바탕체" w:cs="바탕체"/>
+          <w:sz w:val="28"/>
+          <w:szCs w:val="28"/>
+          <w:lang w:val="ko-KR" w:eastAsia="ko-KR"/>
+        </w:rPr>
+        <w:t xml:space="preserve"> 생성된 업무 카드와 연결 근거를 확인하고, 모호한 이름·분류나 잘못된 연결만 수정한다.</w:t>
+      </w:r>
+    </w:p>
+    <w:p>
+      <w:pPr>
+        <w:pStyle w:val="Normal"/>
+        <w:ind w:left="420" w:hanging="420"/>
+      </w:pPr>
+      <w:r>
+        <w:rPr>
+          <w:rFonts w:ascii="바탕체" w:hAnsi="바탕체" w:eastAsia="바탕체" w:cs="바탕체"/>
+          <w:sz w:val="28"/>
+          <w:szCs w:val="28"/>
+          <w:lang w:val="ko-KR" w:eastAsia="ko-KR"/>
+        </w:rPr>
+        <w:t xml:space="preserve">4. </w:t>
+      </w:r>
+      <w:r>
+        <w:rPr>
+          <w:rFonts w:ascii="바탕체" w:hAnsi="바탕체" w:eastAsia="바탕체" w:cs="바탕체"/>
+          <w:sz w:val="28"/>
+          <w:szCs w:val="28"/>
+          <w:lang w:val="ko-KR" w:eastAsia="ko-KR"/>
+          <w:b/>
+          <w:bCs/>
+        </w:rPr>
+        <w:t xml:space="preserve">효율화 솔루션 확인:</w:t>
+      </w:r>
+      <w:r>
+        <w:rPr>
+          <w:rFonts w:ascii="바탕체" w:hAnsi="바탕체" w:eastAsia="바탕체" w:cs="바탕체"/>
+          <w:sz w:val="28"/>
+          <w:szCs w:val="28"/>
+          <w:lang w:val="ko-KR" w:eastAsia="ko-KR"/>
+        </w:rPr>
+        <w:t xml:space="preserve"> 반복 작업의 패턴과 근거, 자동화할 단계와 적용 조건이 담긴 솔루션을 보여준다.</w:t>
+      </w:r>
+    </w:p>
+    <w:p>
+      <w:pPr>
+        <w:pStyle w:val="Normal"/>
+        <w:ind w:left="420" w:hanging="420"/>
+      </w:pPr>
+      <w:r>
+        <w:rPr>
+          <w:rFonts w:ascii="바탕체" w:hAnsi="바탕체" w:eastAsia="바탕체" w:cs="바탕체"/>
+          <w:sz w:val="28"/>
+          <w:szCs w:val="28"/>
+          <w:lang w:val="ko-KR" w:eastAsia="ko-KR"/>
+        </w:rPr>
+        <w:t xml:space="preserve">5. </w:t>
+      </w:r>
+      <w:r>
+        <w:rPr>
+          <w:rFonts w:ascii="바탕체" w:hAnsi="바탕체" w:eastAsia="바탕체" w:cs="바탕체"/>
+          <w:sz w:val="28"/>
+          <w:szCs w:val="28"/>
+          <w:lang w:val="ko-KR" w:eastAsia="ko-KR"/>
+          <w:b/>
+          <w:bCs/>
+        </w:rPr>
+        <w:t xml:space="preserve">회고·문서 자동화:</w:t>
+      </w:r>
+      <w:r>
+        <w:rPr>
+          <w:rFonts w:ascii="바탕체" w:hAnsi="바탕체" w:eastAsia="바탕체" w:cs="바탕체"/>
+          <w:sz w:val="28"/>
+          <w:szCs w:val="28"/>
+          <w:lang w:val="ko-KR" w:eastAsia="ko-KR"/>
+        </w:rPr>
+        <w:t xml:space="preserve"> 같은 업무 기록을 돌아보고 일일 보고 초안을 생성·수정·내보낸다. 구현 여유가 있으면 타임테이블과 프로그램별 사용 현황도 보여준다.</w:t>
+      </w:r>
+    </w:p>
+    <w:p>
+      <w:pPr>
+        <w:pStyle w:val="Heading1"/>
+      </w:pPr>
+      <w:r>
+        <w:rPr>
+          <w:rFonts w:ascii="바탕체" w:hAnsi="바탕체" w:eastAsia="바탕체" w:cs="바탕체"/>
+          <w:sz w:val="28"/>
+          <w:szCs w:val="28"/>
+          <w:lang w:val="ko-KR" w:eastAsia="ko-KR"/>
+          <w:b/>
+          <w:bCs/>
+        </w:rPr>
+        <w:t xml:space="preserve">4. 이 아이디어의 주요 사용자는 누구이며, 어떤 기대효과가 있나요?</w:t>
+      </w:r>
+    </w:p>
+    <w:p>
+      <w:pPr>
+        <w:pStyle w:val="Normal"/>
+      </w:pPr>
+      <w:r>
+        <w:rPr>
+          <w:rFonts w:ascii="바탕체" w:hAnsi="바탕체" w:eastAsia="바탕체" w:cs="바탕체"/>
+          <w:sz w:val="28"/>
+          <w:szCs w:val="28"/>
+          <w:lang w:val="ko-KR" w:eastAsia="ko-KR"/>
+        </w:rPr>
+        <w:t xml:space="preserve">주요 대상 사용자는 </w:t>
+      </w:r>
+      <w:r>
+        <w:rPr>
+          <w:rFonts w:ascii="바탕체" w:hAnsi="바탕체" w:eastAsia="바탕체" w:cs="바탕체"/>
+          <w:sz w:val="28"/>
+          <w:szCs w:val="28"/>
+          <w:lang w:val="ko-KR" w:eastAsia="ko-KR"/>
+          <w:b/>
+          <w:bCs/>
+        </w:rPr>
+        <w:t xml:space="preserve">PC로 일하는 SDS 임직원</w:t>
+      </w:r>
+      <w:r>
+        <w:rPr>
+          <w:rFonts w:ascii="바탕체" w:hAnsi="바탕체" w:eastAsia="바탕체" w:cs="바탕체"/>
+          <w:sz w:val="28"/>
+          <w:szCs w:val="28"/>
+          <w:lang w:val="ko-KR" w:eastAsia="ko-KR"/>
+        </w:rPr>
+        <w:t xml:space="preserve">이다. 기획·개발·분석·운영·지원 등 직무와 사용하는 도구가 달라도, 일상 업무에서 반복 수작업을 줄이고 자신의 업무를 회고하려는 필요에 대응한다. 보고서 작성 여부와 관계없이 활용할 수 있으며, 장기적으로 다양한 조직과 PC 업무 사용자에게 확장할 수 있다.</w:t>
+      </w:r>
+    </w:p>
+    <w:tbl>
+      <w:tblPr>
+        <w:tblW w:w="9866" w:type="dxa"/>
+        <w:tblBorders>
+          <w:top w:val="single" w:sz="4" w:color="808080"/>
+          <w:left w:val="single" w:sz="4" w:color="808080"/>
+          <w:bottom w:val="single" w:sz="4" w:color="808080"/>
+          <w:right w:val="single" w:sz="4" w:color="808080"/>
+          <w:insideH w:val="single" w:sz="4" w:color="808080"/>
+          <w:insideV w:val="single" w:sz="4" w:color="808080"/>
+        </w:tblBorders>
+        <w:tblLayout w:type="fixed"/>
+        <w:tblCellMar>
+          <w:top w:w="100" w:type="dxa"/>
+          <w:left w:w="100" w:type="dxa"/>
+          <w:bottom w:w="100" w:type="dxa"/>
+          <w:right w:w="100" w:type="dxa"/>
+        </w:tblCellMar>
+      </w:tblPr>
+      <w:tblGrid>
+        <w:gridCol w:w="2072"/>
+        <w:gridCol w:w="3354"/>
+        <w:gridCol w:w="4440"/>
+      </w:tblGrid>
+      <w:tr>
+        <w:trPr>
+          <w:cantSplit/>
+          <w:tblHeader/>
+        </w:trPr>
+        <w:tc>
+          <w:tcPr>
+            <w:tcW w:w="2072" w:type="dxa"/>
+            <w:shd w:val="clear" w:fill="EEEEEE"/>
+            <w:vAlign w:val="top"/>
+          </w:tcPr>
+          <w:p>
+            <w:pPr>
+              <w:pStyle w:val="Normal"/>
+              <w:spacing w:after="40" w:line="280" w:lineRule="auto"/>
+            </w:pPr>
+            <w:r>
+              <w:rPr>
+                <w:rFonts w:ascii="바탕체" w:hAnsi="바탕체" w:eastAsia="바탕체" w:cs="바탕체"/>
+                <w:sz w:val="28"/>
+                <w:szCs w:val="28"/>
+                <w:lang w:val="ko-KR" w:eastAsia="ko-KR"/>
+                <w:b/>
+                <w:bCs/>
+              </w:rPr>
+              <w:t xml:space="preserve">사용자의 상황</w:t>
+            </w:r>
+          </w:p>
+        </w:tc>
+        <w:tc>
+          <w:tcPr>
+            <w:tcW w:w="3354" w:type="dxa"/>
+            <w:shd w:val="clear" w:fill="EEEEEE"/>
+            <w:vAlign w:val="top"/>
+          </w:tcPr>
+          <w:p>
+            <w:pPr>
+              <w:pStyle w:val="Normal"/>
+              <w:spacing w:after="40" w:line="280" w:lineRule="auto"/>
+            </w:pPr>
+            <w:r>
+              <w:rPr>
+                <w:rFonts w:ascii="바탕체" w:hAnsi="바탕체" w:eastAsia="바탕체" w:cs="바탕체"/>
+                <w:sz w:val="28"/>
+                <w:szCs w:val="28"/>
+                <w:lang w:val="ko-KR" w:eastAsia="ko-KR"/>
+                <w:b/>
+                <w:bCs/>
+              </w:rPr>
+              <w:t xml:space="preserve">기대효과</w:t>
+            </w:r>
+          </w:p>
+        </w:tc>
+        <w:tc>
+          <w:tcPr>
+            <w:tcW w:w="4440" w:type="dxa"/>
+            <w:shd w:val="clear" w:fill="EEEEEE"/>
+            <w:vAlign w:val="top"/>
+          </w:tcPr>
+          <w:p>
+            <w:pPr>
+              <w:pStyle w:val="Normal"/>
+              <w:spacing w:after="40" w:line="280" w:lineRule="auto"/>
+            </w:pPr>
+            <w:r>
+              <w:rPr>
+                <w:rFonts w:ascii="바탕체" w:hAnsi="바탕체" w:eastAsia="바탕체" w:cs="바탕체"/>
+                <w:sz w:val="28"/>
+                <w:szCs w:val="28"/>
+                <w:lang w:val="ko-KR" w:eastAsia="ko-KR"/>
+                <w:b/>
+                <w:bCs/>
+              </w:rPr>
+              <w:t xml:space="preserve">검증 방법</w:t>
+            </w:r>
+          </w:p>
+        </w:tc>
+      </w:tr>
+      <w:tr>
+        <w:trPr>
+          <w:cantSplit/>
+        </w:trPr>
+        <w:tc>
+          <w:tcPr>
+            <w:tcW w:w="2072" w:type="dxa"/>
+            <w:vAlign w:val="top"/>
+          </w:tcPr>
+          <w:p>
+            <w:pPr>
+              <w:pStyle w:val="Normal"/>
+              <w:spacing w:after="40" w:line="280" w:lineRule="auto"/>
+            </w:pPr>
+            <w:r>
+              <w:rPr>
+                <w:rFonts w:ascii="바탕체" w:hAnsi="바탕체" w:eastAsia="바탕체" w:cs="바탕체"/>
+                <w:sz w:val="28"/>
+                <w:szCs w:val="28"/>
+                <w:lang w:val="ko-KR" w:eastAsia="ko-KR"/>
+              </w:rPr>
+              <w:t xml:space="preserve">자료 이동·입력·검토·서식 맞춤을 반복함</w:t>
+            </w:r>
+          </w:p>
+        </w:tc>
+        <w:tc>
+          <w:tcPr>
+            <w:tcW w:w="3354" w:type="dxa"/>
+            <w:vAlign w:val="top"/>
+          </w:tcPr>
+          <w:p>
+            <w:pPr>
+              <w:pStyle w:val="Normal"/>
+              <w:spacing w:after="40" w:line="280" w:lineRule="auto"/>
+            </w:pPr>
+            <w:r>
+              <w:rPr>
+                <w:rFonts w:ascii="바탕체" w:hAnsi="바탕체" w:eastAsia="바탕체" w:cs="바탕체"/>
+                <w:sz w:val="28"/>
+                <w:szCs w:val="28"/>
+                <w:lang w:val="ko-KR" w:eastAsia="ko-KR"/>
+              </w:rPr>
+              <w:t xml:space="preserve">패턴화한 업무를 근거로 효율화 솔루션과 적용 방법 제안</w:t>
+            </w:r>
+          </w:p>
+        </w:tc>
+        <w:tc>
+          <w:tcPr>
+            <w:tcW w:w="4440" w:type="dxa"/>
+            <w:vAlign w:val="top"/>
+          </w:tcPr>
+          <w:p>
+            <w:pPr>
+              <w:pStyle w:val="Normal"/>
+              <w:spacing w:after="40" w:line="280" w:lineRule="auto"/>
+            </w:pPr>
+            <w:r>
+              <w:rPr>
+                <w:rFonts w:ascii="바탕체" w:hAnsi="바탕체" w:eastAsia="바탕체" w:cs="바탕체"/>
+                <w:sz w:val="28"/>
+                <w:szCs w:val="28"/>
+                <w:lang w:val="ko-KR" w:eastAsia="ko-KR"/>
+              </w:rPr>
+              <w:t xml:space="preserve">유효한 반복 패턴, 실행 가능한 제안인지 사용자 검토. 적용 후 실제 변화 별도 확인</w:t>
+            </w:r>
+          </w:p>
+        </w:tc>
+      </w:tr>
+      <w:tr>
+        <w:trPr>
+          <w:cantSplit/>
+        </w:trPr>
+        <w:tc>
+          <w:tcPr>
+            <w:tcW w:w="2072" w:type="dxa"/>
+            <w:vAlign w:val="top"/>
+          </w:tcPr>
+          <w:p>
+            <w:pPr>
+              <w:pStyle w:val="Normal"/>
+              <w:spacing w:after="40" w:line="280" w:lineRule="auto"/>
+            </w:pPr>
+            <w:r>
+              <w:rPr>
+                <w:rFonts w:ascii="바탕체" w:hAnsi="바탕체" w:eastAsia="바탕체" w:cs="바탕체"/>
+                <w:sz w:val="28"/>
+                <w:szCs w:val="28"/>
+                <w:lang w:val="ko-KR" w:eastAsia="ko-KR"/>
+              </w:rPr>
+              <w:t xml:space="preserve">여러 앱에 업무 맥락이 흩어져 있음</w:t>
+            </w:r>
+          </w:p>
+        </w:tc>
+        <w:tc>
+          <w:tcPr>
+            <w:tcW w:w="3354" w:type="dxa"/>
+            <w:vAlign w:val="top"/>
+          </w:tcPr>
+          <w:p>
+            <w:pPr>
+              <w:pStyle w:val="Normal"/>
+              <w:spacing w:after="40" w:line="280" w:lineRule="auto"/>
+            </w:pPr>
+            <w:r>
+              <w:rPr>
+                <w:rFonts w:ascii="바탕체" w:hAnsi="바탕체" w:eastAsia="바탕체" w:cs="바탕체"/>
+                <w:sz w:val="28"/>
+                <w:szCs w:val="28"/>
+                <w:lang w:val="ko-KR" w:eastAsia="ko-KR"/>
+              </w:rPr>
+              <w:t xml:space="preserve">업무 성격에 맞게 자동 연결·분류하고 누락된 일을 떠올릴 단서 제공</w:t>
+            </w:r>
+          </w:p>
+        </w:tc>
+        <w:tc>
+          <w:tcPr>
+            <w:tcW w:w="4440" w:type="dxa"/>
+            <w:vAlign w:val="top"/>
+          </w:tcPr>
+          <w:p>
+            <w:pPr>
+              <w:pStyle w:val="Normal"/>
+              <w:spacing w:after="40" w:line="280" w:lineRule="auto"/>
+            </w:pPr>
+            <w:r>
+              <w:rPr>
+                <w:rFonts w:ascii="바탕체" w:hAnsi="바탕체" w:eastAsia="바탕체" w:cs="바탕체"/>
+                <w:sz w:val="28"/>
+                <w:szCs w:val="28"/>
+                <w:lang w:val="ko-KR" w:eastAsia="ko-KR"/>
+              </w:rPr>
+              <w:t xml:space="preserve">사용자 기준 업무와 카드의 연결·분류 정확성, 누락과 수정 부담 비교</w:t>
+            </w:r>
+          </w:p>
+        </w:tc>
+      </w:tr>
+      <w:tr>
+        <w:trPr>
+          <w:cantSplit/>
+        </w:trPr>
+        <w:tc>
+          <w:tcPr>
+            <w:tcW w:w="2072" w:type="dxa"/>
+            <w:vAlign w:val="top"/>
+          </w:tcPr>
+          <w:p>
+            <w:pPr>
+              <w:pStyle w:val="Normal"/>
+              <w:spacing w:after="40" w:line="280" w:lineRule="auto"/>
+            </w:pPr>
+            <w:r>
+              <w:rPr>
+                <w:rFonts w:ascii="바탕체" w:hAnsi="바탕체" w:eastAsia="바탕체" w:cs="바탕체"/>
+                <w:sz w:val="28"/>
+                <w:szCs w:val="28"/>
+                <w:lang w:val="ko-KR" w:eastAsia="ko-KR"/>
+              </w:rPr>
+              <w:t xml:space="preserve">자신의 업무 흐름을 돌아보기 어려움</w:t>
+            </w:r>
+          </w:p>
+        </w:tc>
+        <w:tc>
+          <w:tcPr>
+            <w:tcW w:w="3354" w:type="dxa"/>
+            <w:vAlign w:val="top"/>
+          </w:tcPr>
+          <w:p>
+            <w:pPr>
+              <w:pStyle w:val="Normal"/>
+              <w:spacing w:after="40" w:line="280" w:lineRule="auto"/>
+            </w:pPr>
+            <w:r>
+              <w:rPr>
+                <w:rFonts w:ascii="바탕체" w:hAnsi="바탕체" w:eastAsia="바탕체" w:cs="바탕체"/>
+                <w:sz w:val="28"/>
+                <w:szCs w:val="28"/>
+                <w:lang w:val="ko-KR" w:eastAsia="ko-KR"/>
+              </w:rPr>
+              <w:t xml:space="preserve">기간·프로젝트·업무 유형별 회고와 개선 시도 확인</w:t>
+            </w:r>
+          </w:p>
+        </w:tc>
+        <w:tc>
+          <w:tcPr>
+            <w:tcW w:w="4440" w:type="dxa"/>
+            <w:vAlign w:val="top"/>
+          </w:tcPr>
+          <w:p>
+            <w:pPr>
+              <w:pStyle w:val="Normal"/>
+              <w:spacing w:after="40" w:line="280" w:lineRule="auto"/>
+            </w:pPr>
+            <w:r>
+              <w:rPr>
+                <w:rFonts w:ascii="바탕체" w:hAnsi="바탕체" w:eastAsia="바탕체" w:cs="바탕체"/>
+                <w:sz w:val="28"/>
+                <w:szCs w:val="28"/>
+                <w:lang w:val="ko-KR" w:eastAsia="ko-KR"/>
+              </w:rPr>
+              <w:t xml:space="preserve">기록이 업무 이해와 다음 개선 방향 설정에 도움이 되는지 확인</w:t>
+            </w:r>
+          </w:p>
+        </w:tc>
+      </w:tr>
+      <w:tr>
+        <w:trPr>
+          <w:cantSplit/>
+        </w:trPr>
+        <w:tc>
+          <w:tcPr>
+            <w:tcW w:w="2072" w:type="dxa"/>
+            <w:vAlign w:val="top"/>
+          </w:tcPr>
+          <w:p>
+            <w:pPr>
+              <w:pStyle w:val="Normal"/>
+              <w:spacing w:after="40" w:line="280" w:lineRule="auto"/>
+            </w:pPr>
+            <w:r>
+              <w:rPr>
+                <w:rFonts w:ascii="바탕체" w:hAnsi="바탕체" w:eastAsia="바탕체" w:cs="바탕체"/>
+                <w:sz w:val="28"/>
+                <w:szCs w:val="28"/>
+                <w:lang w:val="ko-KR" w:eastAsia="ko-KR"/>
+              </w:rPr>
+              <w:t xml:space="preserve">일일·주간·월간 보고 등 문서를 반복 작성함</w:t>
+            </w:r>
+          </w:p>
+        </w:tc>
+        <w:tc>
+          <w:tcPr>
+            <w:tcW w:w="3354" w:type="dxa"/>
+            <w:vAlign w:val="top"/>
+          </w:tcPr>
+          <w:p>
+            <w:pPr>
+              <w:pStyle w:val="Normal"/>
+              <w:spacing w:after="40" w:line="280" w:lineRule="auto"/>
+            </w:pPr>
+            <w:r>
+              <w:rPr>
+                <w:rFonts w:ascii="바탕체" w:hAnsi="바탕체" w:eastAsia="바탕체" w:cs="바탕체"/>
+                <w:sz w:val="28"/>
+                <w:szCs w:val="28"/>
+                <w:lang w:val="ko-KR" w:eastAsia="ko-KR"/>
+              </w:rPr>
+              <w:t xml:space="preserve">같은 업무 기록으로 문서 초안 자동 생성</w:t>
+            </w:r>
+          </w:p>
+        </w:tc>
+        <w:tc>
+          <w:tcPr>
+            <w:tcW w:w="4440" w:type="dxa"/>
+            <w:vAlign w:val="top"/>
+          </w:tcPr>
+          <w:p>
+            <w:pPr>
+              <w:pStyle w:val="Normal"/>
+              <w:spacing w:after="40" w:line="280" w:lineRule="auto"/>
+            </w:pPr>
+            <w:r>
+              <w:rPr>
+                <w:rFonts w:ascii="바탕체" w:hAnsi="바탕체" w:eastAsia="바탕체" w:cs="바탕체"/>
+                <w:sz w:val="28"/>
+                <w:szCs w:val="28"/>
+                <w:lang w:val="ko-KR" w:eastAsia="ko-KR"/>
+              </w:rPr>
+              <w:t xml:space="preserve">수동 작성과 AI 초안 검토·보완까지의 총시간 및 사실 정확성 비교</w:t>
+            </w:r>
+          </w:p>
+        </w:tc>
+      </w:tr>
+      <w:tr>
+        <w:trPr>
+          <w:cantSplit/>
+        </w:trPr>
+        <w:tc>
+          <w:tcPr>
+            <w:tcW w:w="2072" w:type="dxa"/>
+            <w:vAlign w:val="top"/>
+          </w:tcPr>
+          <w:p>
+            <w:pPr>
+              <w:pStyle w:val="Normal"/>
+              <w:spacing w:after="40" w:line="280" w:lineRule="auto"/>
+            </w:pPr>
+            <w:r>
+              <w:rPr>
+                <w:rFonts w:ascii="바탕체" w:hAnsi="바탕체" w:eastAsia="바탕체" w:cs="바탕체"/>
+                <w:sz w:val="28"/>
+                <w:szCs w:val="28"/>
+                <w:lang w:val="ko-KR" w:eastAsia="ko-KR"/>
+              </w:rPr>
+              <w:t xml:space="preserve">업무·프로그램별 시간 사용이 궁금함</w:t>
+            </w:r>
+          </w:p>
+        </w:tc>
+        <w:tc>
+          <w:tcPr>
+            <w:tcW w:w="3354" w:type="dxa"/>
+            <w:vAlign w:val="top"/>
+          </w:tcPr>
+          <w:p>
+            <w:pPr>
+              <w:pStyle w:val="Normal"/>
+              <w:spacing w:after="40" w:line="280" w:lineRule="auto"/>
+            </w:pPr>
+            <w:r>
+              <w:rPr>
+                <w:rFonts w:ascii="바탕체" w:hAnsi="바탕체" w:eastAsia="바탕체" w:cs="바탕체"/>
+                <w:sz w:val="28"/>
+                <w:szCs w:val="28"/>
+                <w:lang w:val="ko-KR" w:eastAsia="ko-KR"/>
+              </w:rPr>
+              <w:t xml:space="preserve">선택 범위의 타임테이블과 프로그램 사용 현황 제공</w:t>
+            </w:r>
+          </w:p>
+        </w:tc>
+        <w:tc>
+          <w:tcPr>
+            <w:tcW w:w="4440" w:type="dxa"/>
+            <w:vAlign w:val="top"/>
+          </w:tcPr>
+          <w:p>
+            <w:pPr>
+              <w:pStyle w:val="Normal"/>
+              <w:spacing w:after="40" w:line="280" w:lineRule="auto"/>
+            </w:pPr>
+            <w:r>
+              <w:rPr>
+                <w:rFonts w:ascii="바탕체" w:hAnsi="바탕체" w:eastAsia="바탕체" w:cs="바탕체"/>
+                <w:sz w:val="28"/>
+                <w:szCs w:val="28"/>
+                <w:lang w:val="ko-KR" w:eastAsia="ko-KR"/>
+              </w:rPr>
+              <w:t xml:space="preserve">실제 테스트 구간과 집계 비교, 중복·유휴·미수집 구간 처리 확인</w:t>
+            </w:r>
+          </w:p>
+        </w:tc>
+      </w:tr>
+      <w:tr>
+        <w:trPr>
+          <w:cantSplit/>
+        </w:trPr>
+        <w:tc>
+          <w:tcPr>
+            <w:tcW w:w="2072" w:type="dxa"/>
+            <w:vAlign w:val="top"/>
+          </w:tcPr>
+          <w:p>
+            <w:pPr>
+              <w:pStyle w:val="Normal"/>
+              <w:spacing w:after="40" w:line="280" w:lineRule="auto"/>
+            </w:pPr>
+            <w:r>
+              <w:rPr>
+                <w:rFonts w:ascii="바탕체" w:hAnsi="바탕체" w:eastAsia="바탕체" w:cs="바탕체"/>
+                <w:sz w:val="28"/>
+                <w:szCs w:val="28"/>
+                <w:lang w:val="ko-KR" w:eastAsia="ko-KR"/>
+              </w:rPr>
+              <w:t xml:space="preserve">개인 작업까지 수집될까 우려함</w:t>
+            </w:r>
+          </w:p>
+        </w:tc>
+        <w:tc>
+          <w:tcPr>
+            <w:tcW w:w="3354" w:type="dxa"/>
+            <w:vAlign w:val="top"/>
+          </w:tcPr>
+          <w:p>
+            <w:pPr>
+              <w:pStyle w:val="Normal"/>
+              <w:spacing w:after="40" w:line="280" w:lineRule="auto"/>
+            </w:pPr>
+            <w:r>
+              <w:rPr>
+                <w:rFonts w:ascii="바탕체" w:hAnsi="바탕체" w:eastAsia="바탕체" w:cs="바탕체"/>
+                <w:sz w:val="28"/>
+                <w:szCs w:val="28"/>
+                <w:lang w:val="ko-KR" w:eastAsia="ko-KR"/>
+              </w:rPr>
+              <w:t xml:space="preserve">프로그램·파일·대화·사이트 조건으로 업무 데이터 수집 범위 직접 통제</w:t>
+            </w:r>
+          </w:p>
+        </w:tc>
+        <w:tc>
+          <w:tcPr>
+            <w:tcW w:w="4440" w:type="dxa"/>
+            <w:vAlign w:val="top"/>
+          </w:tcPr>
+          <w:p>
+            <w:pPr>
+              <w:pStyle w:val="Normal"/>
+              <w:spacing w:after="40" w:line="280" w:lineRule="auto"/>
+            </w:pPr>
+            <w:r>
+              <w:rPr>
+                <w:rFonts w:ascii="바탕체" w:hAnsi="바탕체" w:eastAsia="바탕체" w:cs="바탕체"/>
+                <w:sz w:val="28"/>
+                <w:szCs w:val="28"/>
+                <w:lang w:val="ko-KR" w:eastAsia="ko-KR"/>
+              </w:rPr>
+              <w:t xml:space="preserve">비허용 작업이 저장·분석·외부 전송에 포함되지 않는지 검증</w:t>
+            </w:r>
+          </w:p>
+        </w:tc>
+      </w:tr>
+      <w:tr>
+        <w:trPr>
+          <w:cantSplit/>
+        </w:trPr>
+        <w:tc>
+          <w:tcPr>
+            <w:tcW w:w="2072" w:type="dxa"/>
+            <w:vAlign w:val="top"/>
+          </w:tcPr>
+          <w:p>
+            <w:pPr>
+              <w:pStyle w:val="Normal"/>
+              <w:spacing w:after="40" w:line="280" w:lineRule="auto"/>
+            </w:pPr>
+            <w:r>
+              <w:rPr>
+                <w:rFonts w:ascii="바탕체" w:hAnsi="바탕체" w:eastAsia="바탕체" w:cs="바탕체"/>
+                <w:sz w:val="28"/>
+                <w:szCs w:val="28"/>
+                <w:lang w:val="ko-KR" w:eastAsia="ko-KR"/>
+              </w:rPr>
+              <w:t xml:space="preserve">조직에서 반복 수작업 개선 대상을 찾기 어려움</w:t>
+            </w:r>
+          </w:p>
+        </w:tc>
+        <w:tc>
+          <w:tcPr>
+            <w:tcW w:w="3354" w:type="dxa"/>
+            <w:vAlign w:val="top"/>
+          </w:tcPr>
+          <w:p>
+            <w:pPr>
+              <w:pStyle w:val="Normal"/>
+              <w:spacing w:after="40" w:line="280" w:lineRule="auto"/>
+            </w:pPr>
+            <w:r>
+              <w:rPr>
+                <w:rFonts w:ascii="바탕체" w:hAnsi="바탕체" w:eastAsia="바탕체" w:cs="바탕체"/>
+                <w:sz w:val="28"/>
+                <w:szCs w:val="28"/>
+                <w:lang w:val="ko-KR" w:eastAsia="ko-KR"/>
+              </w:rPr>
+              <w:t xml:space="preserve">사용자가 선택해 공유한 요약으로 표준화·자동화 논의 지원</w:t>
+            </w:r>
+          </w:p>
+        </w:tc>
+        <w:tc>
+          <w:tcPr>
+            <w:tcW w:w="4440" w:type="dxa"/>
+            <w:vAlign w:val="top"/>
+          </w:tcPr>
+          <w:p>
+            <w:pPr>
+              <w:pStyle w:val="Normal"/>
+              <w:spacing w:after="40" w:line="280" w:lineRule="auto"/>
+            </w:pPr>
+            <w:r>
+              <w:rPr>
+                <w:rFonts w:ascii="바탕체" w:hAnsi="바탕체" w:eastAsia="바탕체" w:cs="바탕체"/>
+                <w:sz w:val="28"/>
+                <w:szCs w:val="28"/>
+                <w:lang w:val="ko-KR" w:eastAsia="ko-KR"/>
+              </w:rPr>
+              <w:t xml:space="preserve">공유한 요약이 개선 우선순위 결정에 도움이 되는지 검토</w:t>
+            </w:r>
+          </w:p>
+        </w:tc>
+      </w:tr>
+    </w:tbl>
+    <w:p>
+      <w:pPr>
+        <w:pStyle w:val="Normal"/>
+      </w:pPr>
+      <w:r>
+        <w:rPr>
+          <w:rFonts w:ascii="바탕체" w:hAnsi="바탕체" w:eastAsia="바탕체" w:cs="바탕체"/>
+          <w:sz w:val="28"/>
+          <w:szCs w:val="28"/>
+          <w:lang w:val="ko-KR" w:eastAsia="ko-KR"/>
+        </w:rPr>
+        <w:t xml:space="preserve">해커톤에서는 분류·연결 정확성, 반복 패턴과 솔루션의 타당성, 문서 초안의 근거 품질과 전체 검토 시간을 측정한다. 최초 수집 설정과 일상적인 수정 부담도 함께 확인한다. 솔루션 제안의 유용성과 실제 적용 후의 시간 절감은 구분해 검증하며, 장기적인 업무 효율화 효과는 후속 사용을 통해 측정할 계획이다.</w:t>
+      </w:r>
+    </w:p>
+    <w:p>
+      <w:pPr>
+        <w:pStyle w:val="Normal"/>
+      </w:pPr>
+      <w:r>
+        <w:rPr>
+          <w:rFonts w:ascii="바탕체" w:hAnsi="바탕체" w:eastAsia="바탕체" w:cs="바탕체"/>
+          <w:sz w:val="28"/>
+          <w:szCs w:val="28"/>
+          <w:lang w:val="ko-KR" w:eastAsia="ko-KR"/>
+        </w:rPr>
+        <w:t xml:space="preserve">로그만으로 모든 업무를 관측할 수 없으므로 오프라인 업무나 미지원 앱의 작업은 필요시 사용자가 추가할 수 있게 한다. 활동량·입력 횟수·유휴 시간을 개인의 생산성 점수로 환산하지 않는다. 개인 원본 기록은 자동으로 조직에 공유하지 않고, 사용자가 선택한 업무 요약과 개선 제안만 공유할 수 있도록 설계한다.</w:t>
+      </w:r>
+    </w:p>
+    <w:p>
+      <w:pPr>
+        <w:pStyle w:val="Heading1"/>
+      </w:pPr>
+      <w:r>
+        <w:rPr>
+          <w:rFonts w:ascii="바탕체" w:hAnsi="바탕체" w:eastAsia="바탕체" w:cs="바탕체"/>
+          <w:sz w:val="28"/>
+          <w:szCs w:val="28"/>
+          <w:lang w:val="ko-KR" w:eastAsia="ko-KR"/>
+          <w:b/>
+          <w:bCs/>
+        </w:rPr>
+        <w:t xml:space="preserve">5. 아이디어가 구현된 모습을 한 줄로 요약하면 어떤 모습일까요?</w:t>
+      </w:r>
+    </w:p>
+    <w:p>
+      <w:pPr>
+        <w:pStyle w:val="Normal"/>
+      </w:pPr>
+      <w:r>
+        <w:rPr>
+          <w:rFonts w:ascii="바탕체" w:hAnsi="바탕체" w:eastAsia="바탕체" w:cs="바탕체"/>
+          <w:sz w:val="28"/>
+          <w:szCs w:val="28"/>
+          <w:lang w:val="ko-KR" w:eastAsia="ko-KR"/>
+          <w:b/>
+          <w:bCs/>
+        </w:rPr>
+        <w:t xml:space="preserve">평소처럼 일하면 자동으로 쌓이는 업무 데이터를 AI가 업무 성격에 맞게 분류·패턴화해 업무 효율화 솔루션을 제안하고, 나의 업무 회고와 문서 자동화를 돕는 AI 업무 비서.</w:t>
       </w:r>
     </w:p>
     <w:p>
@@ -3048,7 +2954,7 @@
                 <w:szCs w:val="28"/>
                 <w:lang w:val="ko-KR" w:eastAsia="ko-KR"/>
               </w:rPr>
-              <w:t xml:space="preserve">수집할 작업 맥락</w:t>
+              <w:t xml:space="preserve">수집 범위 설정</w:t>
             </w:r>
           </w:p>
         </w:tc>
@@ -3069,7 +2975,7 @@
                 <w:szCs w:val="28"/>
                 <w:lang w:val="ko-KR" w:eastAsia="ko-KR"/>
               </w:rPr>
-              <w:t xml:space="preserve">작업 시각·사용 프로그램·문서 또는 페이지·전환 맥락</w:t>
+              <w:t xml:space="preserve">허용 프로그램·파일명 키워드·대화 상대·사이트 조건, 제외 조건</w:t>
             </w:r>
           </w:p>
         </w:tc>
@@ -3090,7 +2996,7 @@
                 <w:szCs w:val="28"/>
                 <w:lang w:val="ko-KR" w:eastAsia="ko-KR"/>
               </w:rPr>
-              <w:t xml:space="preserve">개발할 PC 수집 모듈에서 관측 가능한 정보를 로컬 DB에 저장</w:t>
+              <w:t xml:space="preserve">사용자가 로컬에서 설정하고 적용 가능한 앱별 범위 표시</w:t>
             </w:r>
           </w:p>
         </w:tc>
@@ -3137,7 +3043,7 @@
                 <w:szCs w:val="28"/>
                 <w:lang w:val="ko-KR" w:eastAsia="ko-KR"/>
               </w:rPr>
-              <w:t xml:space="preserve">수집할 조작 기록</w:t>
+              <w:t xml:space="preserve">수집할 작업 맥락</w:t>
             </w:r>
           </w:p>
         </w:tc>
@@ -3158,7 +3064,7 @@
                 <w:szCs w:val="28"/>
                 <w:lang w:val="ko-KR" w:eastAsia="ko-KR"/>
               </w:rPr>
-              <w:t xml:space="preserve">키보드·마우스 조작과 입력·클릭 대상, 수집 상태</w:t>
+              <w:t xml:space="preserve">작업 시각·사용 프로그램·문서 또는 페이지·전환 맥락</w:t>
             </w:r>
           </w:p>
         </w:tc>
@@ -3179,7 +3085,7 @@
                 <w:szCs w:val="28"/>
                 <w:lang w:val="ko-KR" w:eastAsia="ko-KR"/>
               </w:rPr>
-              <w:t xml:space="preserve">운영체제 이벤트·접근성 API와 필요한 앱 연동으로 수집</w:t>
+              <w:t xml:space="preserve">허용 조건에 맞는 최소 정보만 PC 수집 모듈에서 로컬 DB에 저장</w:t>
             </w:r>
           </w:p>
         </w:tc>
@@ -3226,7 +3132,7 @@
                 <w:szCs w:val="28"/>
                 <w:lang w:val="ko-KR" w:eastAsia="ko-KR"/>
               </w:rPr>
-              <w:t xml:space="preserve">분석 과정에서 생성할 데이터</w:t>
+              <w:t xml:space="preserve">수집할 조작 기록</w:t>
             </w:r>
           </w:p>
         </w:tc>
@@ -3247,7 +3153,7 @@
                 <w:szCs w:val="28"/>
                 <w:lang w:val="ko-KR" w:eastAsia="ko-KR"/>
               </w:rPr>
-              <w:t xml:space="preserve">업무 카드·근거·사용자 수정·확인 내역</w:t>
+              <w:t xml:space="preserve">조작 종류와 입력·클릭 대상, 수집 상태</w:t>
             </w:r>
           </w:p>
         </w:tc>
@@ -3268,7 +3174,7 @@
                 <w:szCs w:val="28"/>
                 <w:lang w:val="ko-KR" w:eastAsia="ko-KR"/>
               </w:rPr>
-              <w:t xml:space="preserve">AI 분석 결과와 사용자 확인 내용을 로컬 DB에 저장</w:t>
+              <w:t xml:space="preserve">운영체제 이벤트·접근성 API와 필요한 앱 연동으로 허용 범위만 수집</w:t>
             </w:r>
           </w:p>
         </w:tc>
@@ -3289,7 +3195,7 @@
                 <w:szCs w:val="28"/>
                 <w:lang w:val="ko-KR" w:eastAsia="ko-KR"/>
               </w:rPr>
-              <w:t xml:space="preserve">구조화 데이터</w:t>
+              <w:t xml:space="preserve">JSON / SQLite</w:t>
             </w:r>
           </w:p>
         </w:tc>
@@ -3315,7 +3221,7 @@
                 <w:szCs w:val="28"/>
                 <w:lang w:val="ko-KR" w:eastAsia="ko-KR"/>
               </w:rPr>
-              <w:t xml:space="preserve">선택적 사용자 입력</w:t>
+              <w:t xml:space="preserve">분석·사용자 확인 데이터</w:t>
             </w:r>
           </w:p>
         </w:tc>
@@ -3336,7 +3242,7 @@
                 <w:szCs w:val="28"/>
                 <w:lang w:val="ko-KR" w:eastAsia="ko-KR"/>
               </w:rPr>
-              <w:t xml:space="preserve">결과·이슈·다음 계획·미수집 업무</w:t>
+              <w:t xml:space="preserve">업무 카드·분류·근거·수정 및 확인 내역</w:t>
             </w:r>
           </w:p>
         </w:tc>
@@ -3357,7 +3263,7 @@
                 <w:szCs w:val="28"/>
                 <w:lang w:val="ko-KR" w:eastAsia="ko-KR"/>
               </w:rPr>
-              <w:t xml:space="preserve">사용자가 선택해 업무 카드에 보완</w:t>
+              <w:t xml:space="preserve">AI 분석 결과와 사용자 수정 내용을 로컬 DB에 저장</w:t>
             </w:r>
           </w:p>
         </w:tc>
@@ -3378,7 +3284,7 @@
                 <w:szCs w:val="28"/>
                 <w:lang w:val="ko-KR" w:eastAsia="ko-KR"/>
               </w:rPr>
-              <w:t xml:space="preserve">텍스트 / 구조화 데이터</w:t>
+              <w:t xml:space="preserve">구조화 데이터</w:t>
             </w:r>
           </w:p>
         </w:tc>
@@ -3404,7 +3310,7 @@
                 <w:szCs w:val="28"/>
                 <w:lang w:val="ko-KR" w:eastAsia="ko-KR"/>
               </w:rPr>
-              <w:t xml:space="preserve">분석·문서 생성 데이터</w:t>
+              <w:t xml:space="preserve">솔루션·문서 데이터</w:t>
             </w:r>
           </w:p>
         </w:tc>
@@ -3425,7 +3331,7 @@
                 <w:szCs w:val="28"/>
                 <w:lang w:val="ko-KR" w:eastAsia="ko-KR"/>
               </w:rPr>
-              <w:t xml:space="preserve">반복 패턴·개선 후보·평가노트용 사례와 원본 연결</w:t>
+              <w:t xml:space="preserve">반복 패턴·효율화 솔루션·보고 초안과 근거 연결</w:t>
             </w:r>
           </w:p>
         </w:tc>
@@ -3446,7 +3352,7 @@
                 <w:szCs w:val="28"/>
                 <w:lang w:val="ko-KR" w:eastAsia="ko-KR"/>
               </w:rPr>
-              <w:t xml:space="preserve">확인 업무를 분석해 생성하고 로컬에 저장</w:t>
+              <w:t xml:space="preserve">업무 기록과 선택적 결과·이슈·기여 보완 내용을 활용해 생성</w:t>
             </w:r>
           </w:p>
         </w:tc>
@@ -3493,6 +3399,95 @@
                 <w:szCs w:val="28"/>
                 <w:lang w:val="ko-KR" w:eastAsia="ko-KR"/>
               </w:rPr>
+              <w:t xml:space="preserve">부수 집계 데이터</w:t>
+            </w:r>
+          </w:p>
+        </w:tc>
+        <w:tc>
+          <w:tcPr>
+            <w:tcW w:w="2368" w:type="dxa"/>
+            <w:vAlign w:val="top"/>
+          </w:tcPr>
+          <w:p>
+            <w:pPr>
+              <w:pStyle w:val="Normal"/>
+              <w:spacing w:after="40" w:line="280" w:lineRule="auto"/>
+            </w:pPr>
+            <w:r>
+              <w:rPr>
+                <w:rFonts w:ascii="바탕체" w:hAnsi="바탕체" w:eastAsia="바탕체" w:cs="바탕체"/>
+                <w:sz w:val="28"/>
+                <w:szCs w:val="28"/>
+                <w:lang w:val="ko-KR" w:eastAsia="ko-KR"/>
+              </w:rPr>
+              <w:t xml:space="preserve">시간대별 활동 구간·프로그램 사용 시간·업무별 시간 추정</w:t>
+            </w:r>
+          </w:p>
+        </w:tc>
+        <w:tc>
+          <w:tcPr>
+            <w:tcW w:w="3946" w:type="dxa"/>
+            <w:vAlign w:val="top"/>
+          </w:tcPr>
+          <w:p>
+            <w:pPr>
+              <w:pStyle w:val="Normal"/>
+              <w:spacing w:after="40" w:line="280" w:lineRule="auto"/>
+            </w:pPr>
+            <w:r>
+              <w:rPr>
+                <w:rFonts w:ascii="바탕체" w:hAnsi="바탕체" w:eastAsia="바탕체" w:cs="바탕체"/>
+                <w:sz w:val="28"/>
+                <w:szCs w:val="28"/>
+                <w:lang w:val="ko-KR" w:eastAsia="ko-KR"/>
+              </w:rPr>
+              <w:t xml:space="preserve">수집한 시각·전환 맥락에서 계산하고 관측 범위·미분류 구간 함께 표시</w:t>
+            </w:r>
+          </w:p>
+        </w:tc>
+        <w:tc>
+          <w:tcPr>
+            <w:tcW w:w="1776" w:type="dxa"/>
+            <w:vAlign w:val="top"/>
+          </w:tcPr>
+          <w:p>
+            <w:pPr>
+              <w:pStyle w:val="Normal"/>
+              <w:spacing w:after="40" w:line="280" w:lineRule="auto"/>
+            </w:pPr>
+            <w:r>
+              <w:rPr>
+                <w:rFonts w:ascii="바탕체" w:hAnsi="바탕체" w:eastAsia="바탕체" w:cs="바탕체"/>
+                <w:sz w:val="28"/>
+                <w:szCs w:val="28"/>
+                <w:lang w:val="ko-KR" w:eastAsia="ko-KR"/>
+              </w:rPr>
+              <w:t xml:space="preserve">구조화 데이터</w:t>
+            </w:r>
+          </w:p>
+        </w:tc>
+      </w:tr>
+      <w:tr>
+        <w:trPr>
+          <w:cantSplit/>
+        </w:trPr>
+        <w:tc>
+          <w:tcPr>
+            <w:tcW w:w="1776" w:type="dxa"/>
+            <w:vAlign w:val="top"/>
+          </w:tcPr>
+          <w:p>
+            <w:pPr>
+              <w:pStyle w:val="Normal"/>
+              <w:spacing w:after="40" w:line="280" w:lineRule="auto"/>
+            </w:pPr>
+            <w:r>
+              <w:rPr>
+                <w:rFonts w:ascii="바탕체" w:hAnsi="바탕체" w:eastAsia="바탕체" w:cs="바탕체"/>
+                <w:sz w:val="28"/>
+                <w:szCs w:val="28"/>
+                <w:lang w:val="ko-KR" w:eastAsia="ko-KR"/>
+              </w:rPr>
               <w:t xml:space="preserve">시연·검증 자료</w:t>
             </w:r>
           </w:p>
@@ -3535,7 +3530,7 @@
                 <w:szCs w:val="28"/>
                 <w:lang w:val="ko-KR" w:eastAsia="ko-KR"/>
               </w:rPr>
-              <w:t xml:space="preserve">기밀 없는 스프레드시트·문서·테스트 페이지와 별도 시연 자료로 직접 준비</w:t>
+              <w:t xml:space="preserve">기밀 없는 스프레드시트·문서·테스트 페이지와 별도 자료로 직접 준비</w:t>
             </w:r>
           </w:p>
         </w:tc>
@@ -3572,53 +3567,414 @@
           <w:sz w:val="28"/>
           <w:szCs w:val="28"/>
           <w:lang w:val="ko-KR" w:eastAsia="ko-KR"/>
-        </w:rPr>
-        <w:t xml:space="preserve">기록은 사용자가 시작한 뒤 선택한 프로그램·작업에서 수집하도록 설계할 계획이다. 기록 시작·중지, 대상 선택, 민감 입력 제외와 전체 삭제를 제공하고, 원문을 저장할 때는 운영체제의 보호 기능을 활용하고자 한다. 전체 화면·클립보드 원문·문서 전체 내용은 기본 수집 대상에서 제외하고, 업무 해석에 필요한 맥락과 관측 범위를 기록한다.</w:t>
-      </w:r>
-    </w:p>
-    <w:p>
-      <w:pPr>
-        <w:pStyle w:val="Normal"/>
-      </w:pPr>
-      <w:r>
-        <w:rPr>
-          <w:rFonts w:ascii="바탕체" w:hAnsi="바탕체" w:eastAsia="바탕체" w:cs="바탕체"/>
-          <w:sz w:val="28"/>
-          <w:szCs w:val="28"/>
-          <w:lang w:val="ko-KR" w:eastAsia="ko-KR"/>
-        </w:rPr>
-        <w:t xml:space="preserve">AI 분석 전에는 대상 기간·프로그램과 전송 자료를 선택할 수 있게 할 예정이다. 외부 모델을 사용할 때는 필요한 기록만 추출하고, 전송 전 민감정보 가림 처리와 입력 자료 미리보기를 제공하도록 설계한다. 분석 결과와 사용자 확인 업무도 보관·삭제 대상에 포함한다. 로컬 모델은 실행 환경과 분석 품질을 확인한 뒤 선택지로 검토할 계획이다.</w:t>
-      </w:r>
-    </w:p>
-    <w:p>
-      <w:pPr>
-        <w:pStyle w:val="Normal"/>
-      </w:pPr>
-      <w:r>
-        <w:rPr>
-          <w:rFonts w:ascii="바탕체" w:hAnsi="바탕체" w:eastAsia="바탕체" w:cs="바탕체"/>
-          <w:sz w:val="28"/>
-          <w:szCs w:val="28"/>
-          <w:lang w:val="ko-KR" w:eastAsia="ko-KR"/>
           <w:b/>
           <w:bCs/>
         </w:rPr>
-        <w:t xml:space="preserve">필요 지원 사항:</w:t>
-      </w:r>
-      <w:r>
-        <w:rPr>
-          <w:rFonts w:ascii="바탕체" w:hAnsi="바탕체" w:eastAsia="바탕체" w:cs="바탕체"/>
-          <w:sz w:val="28"/>
-          <w:szCs w:val="28"/>
-          <w:lang w:val="ko-KR" w:eastAsia="ko-KR"/>
-        </w:rPr>
-        <w:t xml:space="preserve"> 사용할 AI 모델의 호출 권한과 접속 환경, 기밀 없는 테스트 업무를 수행할 PC와 프로그램, 다양한 직무의 업무 분류·개선 후보·평가노트용 사례를 검토할 SDS 임직원의 협조가 필요하다. 사내 자료를 활용할 경우에는 해당 환경에서 허용된 모델과 자료 범위를 확인해 적용한다.</w:t>
-      </w:r>
-    </w:p>
-    <w:p>
-      <w:pPr>
-        <w:pStyle w:val="Heading1"/>
-      </w:pPr>
+        <w:t xml:space="preserve">개인정보 보호를 위한 선택적 데이터 수집</w:t>
+      </w:r>
+    </w:p>
+    <w:p>
+      <w:pPr>
+        <w:pStyle w:val="Normal"/>
+      </w:pPr>
+      <w:r>
+        <w:rPr>
+          <w:rFonts w:ascii="바탕체" w:hAnsi="바탕체" w:eastAsia="바탕체" w:cs="바탕체"/>
+          <w:sz w:val="28"/>
+          <w:szCs w:val="28"/>
+          <w:lang w:val="ko-KR" w:eastAsia="ko-KR"/>
+        </w:rPr>
+        <w:t xml:space="preserve">기본값은 수집하지 않는 상태로 두고, 사용자가 선택한 프로그램과 세부 조건에 맞는 작업만 추적하도록 설계한다. 프로그램 전체를 허용하거나, 같은 프로그램 안에서도 업무용 파일·대화·사이트로 범위를 더 좁힐 수 있게 한다.</w:t>
+      </w:r>
+    </w:p>
+    <w:tbl>
+      <w:tblPr>
+        <w:tblW w:w="9866" w:type="dxa"/>
+        <w:tblBorders>
+          <w:top w:val="single" w:sz="4" w:color="808080"/>
+          <w:left w:val="single" w:sz="4" w:color="808080"/>
+          <w:bottom w:val="single" w:sz="4" w:color="808080"/>
+          <w:right w:val="single" w:sz="4" w:color="808080"/>
+          <w:insideH w:val="single" w:sz="4" w:color="808080"/>
+          <w:insideV w:val="single" w:sz="4" w:color="808080"/>
+        </w:tblBorders>
+        <w:tblLayout w:type="fixed"/>
+        <w:tblCellMar>
+          <w:top w:w="100" w:type="dxa"/>
+          <w:left w:w="100" w:type="dxa"/>
+          <w:bottom w:w="100" w:type="dxa"/>
+          <w:right w:w="100" w:type="dxa"/>
+        </w:tblCellMar>
+      </w:tblPr>
+      <w:tblGrid>
+        <w:gridCol w:w="2072"/>
+        <w:gridCol w:w="3354"/>
+        <w:gridCol w:w="4440"/>
+      </w:tblGrid>
+      <w:tr>
+        <w:trPr>
+          <w:cantSplit/>
+          <w:tblHeader/>
+        </w:trPr>
+        <w:tc>
+          <w:tcPr>
+            <w:tcW w:w="2072" w:type="dxa"/>
+            <w:shd w:val="clear" w:fill="EEEEEE"/>
+            <w:vAlign w:val="top"/>
+          </w:tcPr>
+          <w:p>
+            <w:pPr>
+              <w:pStyle w:val="Normal"/>
+              <w:spacing w:after="40" w:line="280" w:lineRule="auto"/>
+            </w:pPr>
+            <w:r>
+              <w:rPr>
+                <w:rFonts w:ascii="바탕체" w:hAnsi="바탕체" w:eastAsia="바탕체" w:cs="바탕체"/>
+                <w:sz w:val="28"/>
+                <w:szCs w:val="28"/>
+                <w:lang w:val="ko-KR" w:eastAsia="ko-KR"/>
+                <w:b/>
+                <w:bCs/>
+              </w:rPr>
+              <w:t xml:space="preserve">선택 단위</w:t>
+            </w:r>
+          </w:p>
+        </w:tc>
+        <w:tc>
+          <w:tcPr>
+            <w:tcW w:w="3354" w:type="dxa"/>
+            <w:shd w:val="clear" w:fill="EEEEEE"/>
+            <w:vAlign w:val="top"/>
+          </w:tcPr>
+          <w:p>
+            <w:pPr>
+              <w:pStyle w:val="Normal"/>
+              <w:spacing w:after="40" w:line="280" w:lineRule="auto"/>
+            </w:pPr>
+            <w:r>
+              <w:rPr>
+                <w:rFonts w:ascii="바탕체" w:hAnsi="바탕체" w:eastAsia="바탕체" w:cs="바탕체"/>
+                <w:sz w:val="28"/>
+                <w:szCs w:val="28"/>
+                <w:lang w:val="ko-KR" w:eastAsia="ko-KR"/>
+                <w:b/>
+                <w:bCs/>
+              </w:rPr>
+              <w:t xml:space="preserve">사용자가 설정할 수 있는 예시</w:t>
+            </w:r>
+          </w:p>
+        </w:tc>
+        <w:tc>
+          <w:tcPr>
+            <w:tcW w:w="4440" w:type="dxa"/>
+            <w:shd w:val="clear" w:fill="EEEEEE"/>
+            <w:vAlign w:val="top"/>
+          </w:tcPr>
+          <w:p>
+            <w:pPr>
+              <w:pStyle w:val="Normal"/>
+              <w:spacing w:after="40" w:line="280" w:lineRule="auto"/>
+            </w:pPr>
+            <w:r>
+              <w:rPr>
+                <w:rFonts w:ascii="바탕체" w:hAnsi="바탕체" w:eastAsia="바탕체" w:cs="바탕체"/>
+                <w:sz w:val="28"/>
+                <w:szCs w:val="28"/>
+                <w:lang w:val="ko-KR" w:eastAsia="ko-KR"/>
+                <w:b/>
+                <w:bCs/>
+              </w:rPr>
+              <w:t xml:space="preserve">수집 제한 방식</w:t>
+            </w:r>
+          </w:p>
+        </w:tc>
+      </w:tr>
+      <w:tr>
+        <w:trPr>
+          <w:cantSplit/>
+        </w:trPr>
+        <w:tc>
+          <w:tcPr>
+            <w:tcW w:w="2072" w:type="dxa"/>
+            <w:vAlign w:val="top"/>
+          </w:tcPr>
+          <w:p>
+            <w:pPr>
+              <w:pStyle w:val="Normal"/>
+              <w:spacing w:after="40" w:line="280" w:lineRule="auto"/>
+            </w:pPr>
+            <w:r>
+              <w:rPr>
+                <w:rFonts w:ascii="바탕체" w:hAnsi="바탕체" w:eastAsia="바탕체" w:cs="바탕체"/>
+                <w:sz w:val="28"/>
+                <w:szCs w:val="28"/>
+                <w:lang w:val="ko-KR" w:eastAsia="ko-KR"/>
+              </w:rPr>
+              <w:t xml:space="preserve">프로그램</w:t>
+            </w:r>
+          </w:p>
+        </w:tc>
+        <w:tc>
+          <w:tcPr>
+            <w:tcW w:w="3354" w:type="dxa"/>
+            <w:vAlign w:val="top"/>
+          </w:tcPr>
+          <w:p>
+            <w:pPr>
+              <w:pStyle w:val="Normal"/>
+              <w:spacing w:after="40" w:line="280" w:lineRule="auto"/>
+            </w:pPr>
+            <w:r>
+              <w:rPr>
+                <w:rFonts w:ascii="바탕체" w:hAnsi="바탕체" w:eastAsia="바탕체" w:cs="바탕체"/>
+                <w:sz w:val="28"/>
+                <w:szCs w:val="28"/>
+                <w:lang w:val="ko-KR" w:eastAsia="ko-KR"/>
+              </w:rPr>
+              <w:t xml:space="preserve">업무용 Excel과 문서 편집기만 선택</w:t>
+            </w:r>
+          </w:p>
+        </w:tc>
+        <w:tc>
+          <w:tcPr>
+            <w:tcW w:w="4440" w:type="dxa"/>
+            <w:vAlign w:val="top"/>
+          </w:tcPr>
+          <w:p>
+            <w:pPr>
+              <w:pStyle w:val="Normal"/>
+              <w:spacing w:after="40" w:line="280" w:lineRule="auto"/>
+            </w:pPr>
+            <w:r>
+              <w:rPr>
+                <w:rFonts w:ascii="바탕체" w:hAnsi="바탕체" w:eastAsia="바탕체" w:cs="바탕체"/>
+                <w:sz w:val="28"/>
+                <w:szCs w:val="28"/>
+                <w:lang w:val="ko-KR" w:eastAsia="ko-KR"/>
+              </w:rPr>
+              <w:t xml:space="preserve">선택하지 않은 앱의 활동·입력 내용 제외</w:t>
+            </w:r>
+          </w:p>
+        </w:tc>
+      </w:tr>
+      <w:tr>
+        <w:trPr>
+          <w:cantSplit/>
+        </w:trPr>
+        <w:tc>
+          <w:tcPr>
+            <w:tcW w:w="2072" w:type="dxa"/>
+            <w:vAlign w:val="top"/>
+          </w:tcPr>
+          <w:p>
+            <w:pPr>
+              <w:pStyle w:val="Normal"/>
+              <w:spacing w:after="40" w:line="280" w:lineRule="auto"/>
+            </w:pPr>
+            <w:r>
+              <w:rPr>
+                <w:rFonts w:ascii="바탕체" w:hAnsi="바탕체" w:eastAsia="바탕체" w:cs="바탕체"/>
+                <w:sz w:val="28"/>
+                <w:szCs w:val="28"/>
+                <w:lang w:val="ko-KR" w:eastAsia="ko-KR"/>
+              </w:rPr>
+              <w:t xml:space="preserve">파일명·업무 키워드</w:t>
+            </w:r>
+          </w:p>
+        </w:tc>
+        <w:tc>
+          <w:tcPr>
+            <w:tcW w:w="3354" w:type="dxa"/>
+            <w:vAlign w:val="top"/>
+          </w:tcPr>
+          <w:p>
+            <w:pPr>
+              <w:pStyle w:val="Normal"/>
+              <w:spacing w:after="40" w:line="280" w:lineRule="auto"/>
+            </w:pPr>
+            <w:r>
+              <w:rPr>
+                <w:rFonts w:ascii="바탕체" w:hAnsi="바탕체" w:eastAsia="바탕체" w:cs="바탕체"/>
+                <w:sz w:val="28"/>
+                <w:szCs w:val="28"/>
+                <w:lang w:val="ko-KR" w:eastAsia="ko-KR"/>
+              </w:rPr>
+              <w:t xml:space="preserve">Excel 파일명에 ‘프로젝트 A’ 또는 ‘월간집계’가 포함된 경우만 허용</w:t>
+            </w:r>
+          </w:p>
+        </w:tc>
+        <w:tc>
+          <w:tcPr>
+            <w:tcW w:w="4440" w:type="dxa"/>
+            <w:vAlign w:val="top"/>
+          </w:tcPr>
+          <w:p>
+            <w:pPr>
+              <w:pStyle w:val="Normal"/>
+              <w:spacing w:after="40" w:line="280" w:lineRule="auto"/>
+            </w:pPr>
+            <w:r>
+              <w:rPr>
+                <w:rFonts w:ascii="바탕체" w:hAnsi="바탕체" w:eastAsia="바탕체" w:cs="바탕체"/>
+                <w:sz w:val="28"/>
+                <w:szCs w:val="28"/>
+                <w:lang w:val="ko-KR" w:eastAsia="ko-KR"/>
+              </w:rPr>
+              <w:t xml:space="preserve">같은 Excel에서도 조건 밖의 개인 파일은 제외</w:t>
+            </w:r>
+          </w:p>
+        </w:tc>
+      </w:tr>
+      <w:tr>
+        <w:trPr>
+          <w:cantSplit/>
+        </w:trPr>
+        <w:tc>
+          <w:tcPr>
+            <w:tcW w:w="2072" w:type="dxa"/>
+            <w:vAlign w:val="top"/>
+          </w:tcPr>
+          <w:p>
+            <w:pPr>
+              <w:pStyle w:val="Normal"/>
+              <w:spacing w:after="40" w:line="280" w:lineRule="auto"/>
+            </w:pPr>
+            <w:r>
+              <w:rPr>
+                <w:rFonts w:ascii="바탕체" w:hAnsi="바탕체" w:eastAsia="바탕체" w:cs="바탕체"/>
+                <w:sz w:val="28"/>
+                <w:szCs w:val="28"/>
+                <w:lang w:val="ko-KR" w:eastAsia="ko-KR"/>
+              </w:rPr>
+              <w:t xml:space="preserve">메신저 대화 상대·대화방</w:t>
+            </w:r>
+          </w:p>
+        </w:tc>
+        <w:tc>
+          <w:tcPr>
+            <w:tcW w:w="3354" w:type="dxa"/>
+            <w:vAlign w:val="top"/>
+          </w:tcPr>
+          <w:p>
+            <w:pPr>
+              <w:pStyle w:val="Normal"/>
+              <w:spacing w:after="40" w:line="280" w:lineRule="auto"/>
+            </w:pPr>
+            <w:r>
+              <w:rPr>
+                <w:rFonts w:ascii="바탕체" w:hAnsi="바탕체" w:eastAsia="바탕체" w:cs="바탕체"/>
+                <w:sz w:val="28"/>
+                <w:szCs w:val="28"/>
+                <w:lang w:val="ko-KR" w:eastAsia="ko-KR"/>
+              </w:rPr>
+              <w:t xml:space="preserve">사용자가 지정한 업무 상대 또는 프로젝트 대화방만 허용</w:t>
+            </w:r>
+          </w:p>
+        </w:tc>
+        <w:tc>
+          <w:tcPr>
+            <w:tcW w:w="4440" w:type="dxa"/>
+            <w:vAlign w:val="top"/>
+          </w:tcPr>
+          <w:p>
+            <w:pPr>
+              <w:pStyle w:val="Normal"/>
+              <w:spacing w:after="40" w:line="280" w:lineRule="auto"/>
+            </w:pPr>
+            <w:r>
+              <w:rPr>
+                <w:rFonts w:ascii="바탕체" w:hAnsi="바탕체" w:eastAsia="바탕체" w:cs="바탕체"/>
+                <w:sz w:val="28"/>
+                <w:szCs w:val="28"/>
+                <w:lang w:val="ko-KR" w:eastAsia="ko-KR"/>
+              </w:rPr>
+              <w:t xml:space="preserve">지원 앱에서 식별 가능한 대화만 대상으로 하고, 다른 대화와 전체 대화 내역은 제외</w:t>
+            </w:r>
+          </w:p>
+        </w:tc>
+      </w:tr>
+      <w:tr>
+        <w:trPr>
+          <w:cantSplit/>
+        </w:trPr>
+        <w:tc>
+          <w:tcPr>
+            <w:tcW w:w="2072" w:type="dxa"/>
+            <w:vAlign w:val="top"/>
+          </w:tcPr>
+          <w:p>
+            <w:pPr>
+              <w:pStyle w:val="Normal"/>
+              <w:spacing w:after="40" w:line="280" w:lineRule="auto"/>
+            </w:pPr>
+            <w:r>
+              <w:rPr>
+                <w:rFonts w:ascii="바탕체" w:hAnsi="바탕체" w:eastAsia="바탕체" w:cs="바탕체"/>
+                <w:sz w:val="28"/>
+                <w:szCs w:val="28"/>
+                <w:lang w:val="ko-KR" w:eastAsia="ko-KR"/>
+              </w:rPr>
+              <w:t xml:space="preserve">브라우저 사이트</w:t>
+            </w:r>
+          </w:p>
+        </w:tc>
+        <w:tc>
+          <w:tcPr>
+            <w:tcW w:w="3354" w:type="dxa"/>
+            <w:vAlign w:val="top"/>
+          </w:tcPr>
+          <w:p>
+            <w:pPr>
+              <w:pStyle w:val="Normal"/>
+              <w:spacing w:after="40" w:line="280" w:lineRule="auto"/>
+            </w:pPr>
+            <w:r>
+              <w:rPr>
+                <w:rFonts w:ascii="바탕체" w:hAnsi="바탕체" w:eastAsia="바탕체" w:cs="바탕체"/>
+                <w:sz w:val="28"/>
+                <w:szCs w:val="28"/>
+                <w:lang w:val="ko-KR" w:eastAsia="ko-KR"/>
+              </w:rPr>
+              <w:t xml:space="preserve">Chrome에서 지정한 업무 도메인·경로만 허용</w:t>
+            </w:r>
+          </w:p>
+        </w:tc>
+        <w:tc>
+          <w:tcPr>
+            <w:tcW w:w="4440" w:type="dxa"/>
+            <w:vAlign w:val="top"/>
+          </w:tcPr>
+          <w:p>
+            <w:pPr>
+              <w:pStyle w:val="Normal"/>
+              <w:spacing w:after="40" w:line="280" w:lineRule="auto"/>
+            </w:pPr>
+            <w:r>
+              <w:rPr>
+                <w:rFonts w:ascii="바탕체" w:hAnsi="바탕체" w:eastAsia="바탕체" w:cs="바탕체"/>
+                <w:sz w:val="28"/>
+                <w:szCs w:val="28"/>
+                <w:lang w:val="ko-KR" w:eastAsia="ko-KR"/>
+              </w:rPr>
+              <w:t xml:space="preserve">개인 메일·은행·개인 사이트 등 조건 밖의 탭은 제외. 전체 방문 기록·URL 쿼리는 기본 제외</w:t>
+            </w:r>
+          </w:p>
+        </w:tc>
+      </w:tr>
+    </w:tbl>
+    <w:p>
+      <w:pPr>
+        <w:pStyle w:val="Normal"/>
+      </w:pPr>
+      <w:r>
+        <w:rPr>
+          <w:rFonts w:ascii="바탕체" w:hAnsi="바탕체" w:eastAsia="바탕체" w:cs="바탕체"/>
+          <w:sz w:val="28"/>
+          <w:szCs w:val="28"/>
+          <w:lang w:val="ko-KR" w:eastAsia="ko-KR"/>
+        </w:rPr>
+        <w:t xml:space="preserve">허용 여부는 로컬에서 최소한의 식별 정보로 먼저 판단하고, </w:t>
+      </w:r>
       <w:r>
         <w:rPr>
           <w:rFonts w:ascii="바탕체" w:hAnsi="바탕체" w:eastAsia="바탕체" w:cs="바탕체"/>
@@ -3628,7 +3984,16 @@
           <w:b/>
           <w:bCs/>
         </w:rPr>
-        <w:t xml:space="preserve">7. 제안해 주신 아이디어에 대해 추가로 언급하고 싶은 내용이 있으면 작성해 주세요.</w:t>
+        <w:t xml:space="preserve">프로그램과 설정한 세부 조건을 함께 만족한 작업만 내용을 수집·저장</w:t>
+      </w:r>
+      <w:r>
+        <w:rPr>
+          <w:rFonts w:ascii="바탕체" w:hAnsi="바탕체" w:eastAsia="바탕체" w:cs="바탕체"/>
+          <w:sz w:val="28"/>
+          <w:szCs w:val="28"/>
+          <w:lang w:val="ko-KR" w:eastAsia="ko-KR"/>
+        </w:rPr>
+        <w:t xml:space="preserve">한다. 제외 조건을 우선 적용하며, 조건을 판별할 수 없는 작업은 수집하지 않는다. 대상 판단에 잠시 사용한 비허용 파일명·대화 상대·사이트 정보도 기록하거나 외부로 보내지 않는다. 앱·파일·대화·탭이 전환되면 조건을 다시 확인한다. 세부 식별이 가능한지는 앱별로 검증하고 지원 범위를 표시할 계획이다.</w:t>
       </w:r>
     </w:p>
     <w:p>
@@ -3642,47 +4007,7 @@
           <w:szCs w:val="28"/>
           <w:lang w:val="ko-KR" w:eastAsia="ko-KR"/>
         </w:rPr>
-        <w:t xml:space="preserve">자동 활동 기록과 AI 요약을 제공하는 관련 서비스가 있다. </w:t>
-      </w:r>
-      <w:hyperlink r:id="rIdLink1">
-        <w:r>
-          <w:rPr>
-            <w:rFonts w:ascii="바탕체" w:hAnsi="바탕체" w:eastAsia="바탕체" w:cs="바탕체"/>
-            <w:sz w:val="28"/>
-            <w:szCs w:val="28"/>
-            <w:lang w:val="ko-KR" w:eastAsia="ko-KR"/>
-          </w:rPr>
-          <w:t xml:space="preserve">Timely AutoSheet</w:t>
-        </w:r>
-      </w:hyperlink>
-      <w:r>
-        <w:rPr>
-          <w:rFonts w:ascii="바탕체" w:hAnsi="바탕체" w:eastAsia="바탕체" w:cs="바탕체"/>
-          <w:sz w:val="28"/>
-          <w:szCs w:val="28"/>
-          <w:lang w:val="ko-KR" w:eastAsia="ko-KR"/>
-        </w:rPr>
-        <w:t xml:space="preserve">는 수집한 활동을 시간 블록으로 묶고 프로젝트와 요약을 제안한다. </w:t>
-      </w:r>
-      <w:hyperlink r:id="rIdLink2">
-        <w:r>
-          <w:rPr>
-            <w:rFonts w:ascii="바탕체" w:hAnsi="바탕체" w:eastAsia="바탕체" w:cs="바탕체"/>
-            <w:sz w:val="28"/>
-            <w:szCs w:val="28"/>
-            <w:lang w:val="ko-KR" w:eastAsia="ko-KR"/>
-          </w:rPr>
-          <w:t xml:space="preserve">RescueTime Timesheets</w:t>
-        </w:r>
-      </w:hyperlink>
-      <w:r>
-        <w:rPr>
-          <w:rFonts w:ascii="바탕체" w:hAnsi="바탕체" w:eastAsia="바탕체" w:cs="바탕체"/>
-          <w:sz w:val="28"/>
-          <w:szCs w:val="28"/>
-          <w:lang w:val="ko-KR" w:eastAsia="ko-KR"/>
-        </w:rPr>
-        <w:t xml:space="preserve">도 활동을 프로젝트에 배정하는 자동완성 기능을 제공한다.</w:t>
+        <w:t xml:space="preserve">비밀번호·인증정보 등 민감 입력, 연속 키 입력 원문, 전체 화면·클립보드 원문·문서와 대화의 전체 내용은 기본 수집 대상에서 제외한다. 기록 시작·일시중지·수집 상태 확인·전체 삭제를 제공하고, 원문은 로컬에 우선 저장하며 운영체제의 보호 기능을 활용한다. 세부 보관 기간 설정은 확장 항목으로 둔다.</w:t>
       </w:r>
     </w:p>
     <w:p>
@@ -3696,8 +4021,13 @@
           <w:szCs w:val="28"/>
           <w:lang w:val="ko-KR" w:eastAsia="ko-KR"/>
         </w:rPr>
-        <w:t xml:space="preserve">WorkMemory AI를 통해 검증하고자 하는 가설은 </w:t>
-      </w:r>
+        <w:t xml:space="preserve">수집 허용과 외부 AI 전송 허용은 별도로 설정한다. 외부 모델 분석을 사용할 때에는 허용한 자료 중 필요한 최소 맥락만 전송하고, 민감정보 가림 처리와 전송 자료 미리보기를 제공할 계획이다. 자동 분석도 사용자가 설정한 기간·자료·전송 범위 안에서만 실행한다. 원본뿐 아니라 분석 입력 사본·업무 카드·솔루션·문서 초안에도 삭제 범위를 적용한다. 이러한 설계의 실제 차단 동작은 허용·비허용 작업을 섞은 테스트로 검증한다.</w:t>
+      </w:r>
+    </w:p>
+    <w:p>
+      <w:pPr>
+        <w:pStyle w:val="Normal"/>
+      </w:pPr>
       <w:r>
         <w:rPr>
           <w:rFonts w:ascii="바탕체" w:hAnsi="바탕체" w:eastAsia="바탕체" w:cs="바탕체"/>
@@ -3707,16 +4037,66 @@
           <w:b/>
           <w:bCs/>
         </w:rPr>
-        <w:t xml:space="preserve">여러 PC 도구의 조작과 맥락을 연결하면 사용자가 수행한 일을 의미 있는 업무로 복원·분류하고 반복 작업의 개선 기회를 찾을 수 있는가</w:t>
-      </w:r>
-      <w:r>
-        <w:rPr>
-          <w:rFonts w:ascii="바탕체" w:hAnsi="바탕체" w:eastAsia="바탕체" w:cs="바탕체"/>
-          <w:sz w:val="28"/>
-          <w:szCs w:val="28"/>
-          <w:lang w:val="ko-KR" w:eastAsia="ko-KR"/>
-        </w:rPr>
-        <w:t xml:space="preserve">다. Excel·브라우저·문서 편집기·개발 도구는 서로 다른 작업이 이어지는 활용 예시다. 주요 가치는 사용하는 도구를 넘어 업무의 목적과 흐름을 이해하고, 그 기억을 개인이 다시 활용할 수 있게 하는 데 둔다.</w:t>
+        <w:t xml:space="preserve">필요 지원 사항:</w:t>
+      </w:r>
+      <w:r>
+        <w:rPr>
+          <w:rFonts w:ascii="바탕체" w:hAnsi="바탕체" w:eastAsia="바탕체" w:cs="바탕체"/>
+          <w:sz w:val="28"/>
+          <w:szCs w:val="28"/>
+          <w:lang w:val="ko-KR" w:eastAsia="ko-KR"/>
+        </w:rPr>
+        <w:t xml:space="preserve"> 사용할 AI 모델의 호출 권한과 접속 환경, 기밀 없는 테스트 업무를 수행할 PC와 프로그램, 다양한 직무의 업무 분류·솔루션·문서 초안을 검토할 SDS 임직원의 협조가 필요하다. 사내 자료에는 해당 환경에서 허용된 모델과 자료 범위를 적용한다.</w:t>
+      </w:r>
+    </w:p>
+    <w:p>
+      <w:pPr>
+        <w:pStyle w:val="Heading1"/>
+      </w:pPr>
+      <w:r>
+        <w:rPr>
+          <w:rFonts w:ascii="바탕체" w:hAnsi="바탕체" w:eastAsia="바탕체" w:cs="바탕체"/>
+          <w:sz w:val="28"/>
+          <w:szCs w:val="28"/>
+          <w:lang w:val="ko-KR" w:eastAsia="ko-KR"/>
+          <w:b/>
+          <w:bCs/>
+        </w:rPr>
+        <w:t xml:space="preserve">7. 제안해 주신 아이디어에 대해 추가로 언급하고 싶은 내용이 있으면 작성해 주세요.</w:t>
+      </w:r>
+    </w:p>
+    <w:p>
+      <w:pPr>
+        <w:pStyle w:val="Normal"/>
+      </w:pPr>
+      <w:r>
+        <w:rPr>
+          <w:rFonts w:ascii="바탕체" w:hAnsi="바탕체" w:eastAsia="바탕체" w:cs="바탕체"/>
+          <w:sz w:val="28"/>
+          <w:szCs w:val="28"/>
+          <w:lang w:val="ko-KR" w:eastAsia="ko-KR"/>
+        </w:rPr>
+        <w:t xml:space="preserve">WorkMemory AI를 통해 검증하고자 하는 가설은 </w:t>
+      </w:r>
+      <w:r>
+        <w:rPr>
+          <w:rFonts w:ascii="바탕체" w:hAnsi="바탕체" w:eastAsia="바탕체" w:cs="바탕체"/>
+          <w:sz w:val="28"/>
+          <w:szCs w:val="28"/>
+          <w:lang w:val="ko-KR" w:eastAsia="ko-KR"/>
+          <w:b/>
+          <w:bCs/>
+        </w:rPr>
+        <w:t xml:space="preserve">평소처럼 일하며 쌓인 데이터를 업무 성격에 맞게 분류·패턴화하면, 반복 업무를 줄일 구체적인 솔루션을 제안하고 회고·문서 작성에도 재사용할 수 있는가</w:t>
+      </w:r>
+      <w:r>
+        <w:rPr>
+          <w:rFonts w:ascii="바탕체" w:hAnsi="바탕체" w:eastAsia="바탕체" w:cs="바탕체"/>
+          <w:sz w:val="28"/>
+          <w:szCs w:val="28"/>
+          <w:lang w:val="ko-KR" w:eastAsia="ko-KR"/>
+        </w:rPr>
+        <w:t xml:space="preserve">다. Excel·브라우저·문서 편집기·개발 도구는 서로 다른 작업이 이어지는 활용 예시다.</w:t>
       </w:r>
     </w:p>
     <w:tbl>
@@ -3817,7 +4197,7 @@
                 <w:szCs w:val="28"/>
                 <w:lang w:val="ko-KR" w:eastAsia="ko-KR"/>
               </w:rPr>
-              <w:t xml:space="preserve">나의 업무를 기억하고 분류</w:t>
+              <w:t xml:space="preserve">업무 데이터의 자동 축적과 분류</w:t>
             </w:r>
           </w:p>
         </w:tc>
@@ -3838,7 +4218,7 @@
                 <w:szCs w:val="28"/>
                 <w:lang w:val="ko-KR" w:eastAsia="ko-KR"/>
               </w:rPr>
-              <w:t xml:space="preserve">여러 도구에 흩어진 행동을 업무의 목적에 따라 연결하고 빠뜨린 일 확인</w:t>
+              <w:t xml:space="preserve">처음 정한 수집 범위 안에서 평소처럼 일하면 기록이 쌓이고 업무 성격에 맞게 정리</w:t>
             </w:r>
           </w:p>
         </w:tc>
@@ -3864,7 +4244,7 @@
                 <w:szCs w:val="28"/>
                 <w:lang w:val="ko-KR" w:eastAsia="ko-KR"/>
               </w:rPr>
-              <w:t xml:space="preserve">반복 작업을 개선 기회로 연결</w:t>
+              <w:t xml:space="preserve">패턴화에서 효율화 솔루션으로 연결</w:t>
             </w:r>
           </w:p>
         </w:tc>
@@ -3885,7 +4265,7 @@
                 <w:szCs w:val="28"/>
                 <w:lang w:val="ko-KR" w:eastAsia="ko-KR"/>
               </w:rPr>
-              <w:t xml:space="preserve">사용자가 확인한 반복 흐름에서 템플릿·절차 정리·자동화 검토 후보 제안</w:t>
+              <w:t xml:space="preserve">반복 근거·개선 단계·적용 조건을 담은 자동화 설계안과 템플릿 제안·제공</w:t>
             </w:r>
           </w:p>
         </w:tc>
@@ -3911,7 +4291,7 @@
                 <w:szCs w:val="28"/>
                 <w:lang w:val="ko-KR" w:eastAsia="ko-KR"/>
               </w:rPr>
-              <w:t xml:space="preserve">근거가 쌓이는 업무 기억</w:t>
+              <w:t xml:space="preserve">나의 업무 회고와 문서 자동화</w:t>
             </w:r>
           </w:p>
         </w:tc>
@@ -3932,7 +4312,54 @@
                 <w:szCs w:val="28"/>
                 <w:lang w:val="ko-KR" w:eastAsia="ko-KR"/>
               </w:rPr>
-              <w:t xml:space="preserve">확인·수정한 업무를 평가노트용 사례로 축적하고 필요한 보고에 재사용</w:t>
+              <w:t xml:space="preserve">같은 기록으로 업무 흐름을 돌아보고 일일·주간·월간 보고 등 필요한 문서 작성</w:t>
+            </w:r>
+          </w:p>
+        </w:tc>
+      </w:tr>
+      <w:tr>
+        <w:trPr>
+          <w:cantSplit/>
+        </w:trPr>
+        <w:tc>
+          <w:tcPr>
+            <w:tcW w:w="3453" w:type="dxa"/>
+            <w:vAlign w:val="top"/>
+          </w:tcPr>
+          <w:p>
+            <w:pPr>
+              <w:pStyle w:val="Normal"/>
+              <w:spacing w:after="40" w:line="280" w:lineRule="auto"/>
+            </w:pPr>
+            <w:r>
+              <w:rPr>
+                <w:rFonts w:ascii="바탕체" w:hAnsi="바탕체" w:eastAsia="바탕체" w:cs="바탕체"/>
+                <w:sz w:val="28"/>
+                <w:szCs w:val="28"/>
+                <w:lang w:val="ko-KR" w:eastAsia="ko-KR"/>
+              </w:rPr>
+              <w:t xml:space="preserve">필요한 범위만 선택해 수집</w:t>
+            </w:r>
+          </w:p>
+        </w:tc>
+        <w:tc>
+          <w:tcPr>
+            <w:tcW w:w="6413" w:type="dxa"/>
+            <w:vAlign w:val="top"/>
+          </w:tcPr>
+          <w:p>
+            <w:pPr>
+              <w:pStyle w:val="Normal"/>
+              <w:spacing w:after="40" w:line="280" w:lineRule="auto"/>
+            </w:pPr>
+            <w:r>
+              <w:rPr>
+                <w:rFonts w:ascii="바탕체" w:hAnsi="바탕체" w:eastAsia="바탕체" w:cs="바탕체"/>
+                <w:sz w:val="28"/>
+                <w:szCs w:val="28"/>
+                <w:lang w:val="ko-KR" w:eastAsia="ko-KR"/>
+              </w:rPr>
+              <w:t xml:space="preserve">프로그램 안에서도 파일·대화·사이트 조건을 정해 개인 작업의 수집을 제한</w:t>
             </w:r>
           </w:p>
         </w:tc>
@@ -3949,22 +4376,13 @@
           <w:szCs w:val="28"/>
           <w:lang w:val="ko-KR" w:eastAsia="ko-KR"/>
         </w:rPr>
-        <w:t xml:space="preserve">개인이 자신의 업무를 이해하고 개선하는 제품을 목표로 한다. 사용자가 수집 범위와 분석 대상을 정하고, 평가노트나 보고에 사용할 내용을 선택하도록 설계할 계획이다. 향후에는 연간 목표와 업무 사례를 연결하고, 직무별 분류와 지원 환경을 확장하고자 한다.</w:t>
+        <w:t xml:space="preserve">타임테이블과 프로그램 사용 현황은 부수 기능으로 제공한다. 수집·분석·공유 범위와 활용할 솔루션·문서는 사용자가 선택하며, 향후 솔루션 적용 전후 비교와 지원 환경 확장을 검토한다.</w:t>
       </w:r>
     </w:p>
     <w:p>
       <w:pPr>
         <w:pStyle w:val="Normal"/>
       </w:pPr>
-      <w:r>
-        <w:rPr>
-          <w:rFonts w:ascii="바탕체" w:hAnsi="바탕체" w:eastAsia="바탕체" w:cs="바탕체"/>
-          <w:sz w:val="28"/>
-          <w:szCs w:val="28"/>
-          <w:lang w:val="ko-KR" w:eastAsia="ko-KR"/>
-        </w:rPr>
-        <w:t xml:space="preserve">해커톤에서 보여줄 핵심 장면은 </w:t>
-      </w:r>
       <w:r>
         <w:rPr>
           <w:rFonts w:ascii="바탕체" w:hAnsi="바탕체" w:eastAsia="바탕체" w:cs="바탕체"/>
@@ -3974,16 +4392,16 @@
           <w:b/>
           <w:bCs/>
         </w:rPr>
-        <w:t xml:space="preserve">“이런 일을 반복하고 있었네”라는 발견이, 나의 업무를 설명할 평가노트용 사례와 개선을 시작할 단서로 이어지는 순간</w:t>
-      </w:r>
-      <w:r>
-        <w:rPr>
-          <w:rFonts w:ascii="바탕체" w:hAnsi="바탕체" w:eastAsia="바탕체" w:cs="바탕체"/>
-          <w:sz w:val="28"/>
-          <w:szCs w:val="28"/>
-          <w:lang w:val="ko-KR" w:eastAsia="ko-KR"/>
-        </w:rPr>
-        <w:t xml:space="preserve">이다.</w:t>
+        <w:t xml:space="preserve">반복 업무의 발견이 효율화 솔루션과 업무 회고·문서 초안으로 이어지는 순간</w:t>
+      </w:r>
+      <w:r>
+        <w:rPr>
+          <w:rFonts w:ascii="바탕체" w:hAnsi="바탕체" w:eastAsia="바탕체" w:cs="바탕체"/>
+          <w:sz w:val="28"/>
+          <w:szCs w:val="28"/>
+          <w:lang w:val="ko-KR" w:eastAsia="ko-KR"/>
+        </w:rPr>
+        <w:t xml:space="preserve">을 핵심 장면으로 시연할 계획이다.</w:t>
       </w:r>
     </w:p>
     <w:sectPr>

</xml_diff>

<commit_message>
docs: align proposal and Word export with submission form
</commit_message>
<xml_diff>
--- a/AX-hackathon-proposal.docx
+++ b/AX-hackathon-proposal.docx
@@ -18,7 +18,7 @@
     </w:p>
     <w:p>
       <w:pPr>
-        <w:pStyle w:val="Normal"/>
+        <w:pStyle w:val="Heading1"/>
       </w:pPr>
       <w:r>
         <w:rPr>
@@ -29,13 +29,36 @@
           <w:b/>
           <w:bCs/>
         </w:rPr>
-        <w:t xml:space="preserve">제안명: WorkMemory AI — 업무를 패턴화해 효율화 솔루션을 제안하는 AI 업무 비서</w:t>
+        <w:t xml:space="preserve">1. AI로 해결하고자 하는 문제 상황 또는 새롭게 시도해보고 싶은 업무/서비스는 무엇인가요?</w:t>
+      </w:r>
+    </w:p>
+    <w:p>
+      <w:pPr>
+        <w:pStyle w:val="Guidance"/>
+      </w:pPr>
+      <w:r>
+        <w:rPr>
+          <w:rFonts w:ascii="바탕체" w:hAnsi="바탕체" w:eastAsia="바탕체" w:cs="바탕체"/>
+          <w:sz w:val="28"/>
+          <w:szCs w:val="28"/>
+          <w:lang w:val="ko-KR" w:eastAsia="ko-KR"/>
+        </w:rPr>
+        <w:t xml:space="preserve">현재의 업무를 더 효율적으로 바꾸는 것부터, 지금까지 없던 새로운 업무 경험이나 서비스를 만드는 것까지 자유롭게 적어주세요.</w:t>
       </w:r>
     </w:p>
     <w:p>
       <w:pPr>
         <w:pStyle w:val="Normal"/>
       </w:pPr>
+      <w:r>
+        <w:rPr>
+          <w:rFonts w:ascii="바탕체" w:hAnsi="바탕체" w:eastAsia="바탕체" w:cs="바탕체"/>
+          <w:sz w:val="28"/>
+          <w:szCs w:val="28"/>
+          <w:lang w:val="ko-KR" w:eastAsia="ko-KR"/>
+        </w:rPr>
+        <w:t xml:space="preserve">제안하는 서비스는 </w:t>
+      </w:r>
       <w:r>
         <w:rPr>
           <w:rFonts w:ascii="바탕체" w:hAnsi="바탕체" w:eastAsia="바탕체" w:cs="바탕체"/>
@@ -45,22 +68,59 @@
           <w:b/>
           <w:bCs/>
         </w:rPr>
-        <w:t xml:space="preserve">핵심 제안:</w:t>
-      </w:r>
-      <w:r>
-        <w:rPr>
-          <w:rFonts w:ascii="바탕체" w:hAnsi="바탕체" w:eastAsia="바탕체" w:cs="바탕체"/>
-          <w:sz w:val="28"/>
-          <w:szCs w:val="28"/>
-          <w:lang w:val="ko-KR" w:eastAsia="ko-KR"/>
-        </w:rPr>
-        <w:t xml:space="preserve"> PC에서 평소처럼 일하는 동안 사용자가 허용한 범위의 업무 데이터가 자동으로 쌓이고, AI가 이를 업무 성격에 맞게 분류·패턴화하는 서비스를 개발하고자 한다. 누적된 데이터로 반복 수작업과 개선 지점을 찾아 업무 효율화 솔루션을 제안하고, 구체적인 자동화 설계안과 템플릿을 제공한다. 같은 기록은 나의 업무를 돌아보거나 일일·주간·월간 보고 등 필요한 문서를 자동으로 작성하는 데 활용한다.</w:t>
+        <w:t xml:space="preserve">WorkMemory AI — 업무를 패턴화해 효율화 솔루션을 제안하는 AI 업무 비서</w:t>
+      </w:r>
+      <w:r>
+        <w:rPr>
+          <w:rFonts w:ascii="바탕체" w:hAnsi="바탕체" w:eastAsia="바탕체" w:cs="바탕체"/>
+          <w:sz w:val="28"/>
+          <w:szCs w:val="28"/>
+          <w:lang w:val="ko-KR" w:eastAsia="ko-KR"/>
+        </w:rPr>
+        <w:t xml:space="preserve">다. PC에서 평소처럼 일하면 사용자가 허용한 업무 데이터가 자동으로 쌓이고, AI가 업무 성격에 맞게 정리해 개선 방법과 필요한 문서 초안을 제공하는 경험을 만들고자 한다.</w:t>
       </w:r>
     </w:p>
     <w:p>
       <w:pPr>
         <w:pStyle w:val="Normal"/>
       </w:pPr>
+      <w:r>
+        <w:rPr>
+          <w:rFonts w:ascii="바탕체" w:hAnsi="바탕체" w:eastAsia="바탕체" w:cs="바탕체"/>
+          <w:sz w:val="28"/>
+          <w:szCs w:val="28"/>
+          <w:lang w:val="ko-KR" w:eastAsia="ko-KR"/>
+        </w:rPr>
+        <w:t xml:space="preserve">PC 업무에서는 파일 사이의 값 복사, 시스템 조회, 문서 입력과 서식 맞춤 같은 작은 수작업이 반복된다. 여러 프로그램에 흩어진 행동을 개별 작업으로만 기억하면 어떤 절차가 반복되는지, 어느 단계를 자동화하면 좋을지 찾기 어렵다. 프로그램 사용 시간이나 입력 횟수만으로도 업무의 목적과 개선 방법을 설명하기 어렵다.</w:t>
+      </w:r>
+    </w:p>
+    <w:p>
+      <w:pPr>
+        <w:pStyle w:val="Normal"/>
+      </w:pPr>
+      <w:r>
+        <w:rPr>
+          <w:rFonts w:ascii="바탕체" w:hAnsi="바탕체" w:eastAsia="바탕체" w:cs="바탕체"/>
+          <w:sz w:val="28"/>
+          <w:szCs w:val="28"/>
+          <w:lang w:val="ko-KR" w:eastAsia="ko-KR"/>
+        </w:rPr>
+        <w:t xml:space="preserve">업무를 돌아보거나 일일·주간·월간 보고를 작성할 때에는 흩어진 자료를 다시 모아야 한다. 짧은 자료 확인·검토·동료 지원·문제 해결 과정은 기억에서 빠지기 쉽고, 별도로 기록하는 데도 시간이 든다.</w:t>
+      </w:r>
+    </w:p>
+    <w:p>
+      <w:pPr>
+        <w:pStyle w:val="Normal"/>
+      </w:pPr>
+      <w:r>
+        <w:rPr>
+          <w:rFonts w:ascii="바탕체" w:hAnsi="바탕체" w:eastAsia="바탕체" w:cs="바탕체"/>
+          <w:sz w:val="28"/>
+          <w:szCs w:val="28"/>
+          <w:lang w:val="ko-KR" w:eastAsia="ko-KR"/>
+        </w:rPr>
+        <w:t xml:space="preserve">WorkMemory AI는 </w:t>
+      </w:r>
       <w:r>
         <w:rPr>
           <w:rFonts w:ascii="바탕체" w:hAnsi="바탕체" w:eastAsia="바탕체" w:cs="바탕체"/>
@@ -70,16 +130,16 @@
           <w:b/>
           <w:bCs/>
         </w:rPr>
-        <w:t xml:space="preserve">대표 경험:</w:t>
-      </w:r>
-      <w:r>
-        <w:rPr>
-          <w:rFonts w:ascii="바탕체" w:hAnsi="바탕체" w:eastAsia="바탕체" w:cs="바탕체"/>
-          <w:sz w:val="28"/>
-          <w:szCs w:val="28"/>
-          <w:lang w:val="ko-KR" w:eastAsia="ko-KR"/>
-        </w:rPr>
-        <w:t xml:space="preserve"> “여러 파일의 자료를 옮기고 같은 형식으로 정리하는 일을 반복하고 있었네. 이 과정을 한 번에 취합하도록 바꿀 수 있겠구나.” AI가 반복 흐름을 패턴화하고, 공통 양식과 자동 취합 절차를 개선 솔루션으로 제안한다. 사용자는 적용 방법을 검토하고, 쌓인 기록으로 자신의 업무를 회고하거나 보고 초안을 만든다. 아래 사례와 결과는 제품 경험을 설명하기 위한 가상의 예시다.</w:t>
+        <w:t xml:space="preserve">일상 업무 데이터의 자동 축적 → 업무 성격에 따른 자동 분류·패턴화 → 업무 효율화 솔루션 제안</w:t>
+      </w:r>
+      <w:r>
+        <w:rPr>
+          <w:rFonts w:ascii="바탕체" w:hAnsi="바탕체" w:eastAsia="바탕체" w:cs="바탕체"/>
+          <w:sz w:val="28"/>
+          <w:szCs w:val="28"/>
+          <w:lang w:val="ko-KR" w:eastAsia="ko-KR"/>
+        </w:rPr>
+        <w:t xml:space="preserve">으로 반복 수작업의 개선을 돕는다. 같은 기록으로 자신의 업무를 회고하고 필요한 문서를 자동 작성할 수 있게 한다. 처음에 수집할 프로그램과 파일·대화·사이트 조건을 정하면 그 범위 안에서 기록이 쌓이도록 설계한다. 타임테이블과 프로그램 사용 현황은 자신의 일하는 방식을 이해하는 부수 기능으로 제공한다.</w:t>
       </w:r>
     </w:p>
     <w:p>
@@ -95,36 +155,27 @@
           <w:b/>
           <w:bCs/>
         </w:rPr>
-        <w:t xml:space="preserve">1. AI로 해결하고자 하는 문제 상황 또는 새롭게 시도해보고 싶은 업무/서비스는 무엇인가요?</w:t>
-      </w:r>
-    </w:p>
-    <w:p>
-      <w:pPr>
-        <w:pStyle w:val="Normal"/>
-      </w:pPr>
-      <w:r>
-        <w:rPr>
-          <w:rFonts w:ascii="바탕체" w:hAnsi="바탕체" w:eastAsia="바탕체" w:cs="바탕체"/>
-          <w:sz w:val="28"/>
-          <w:szCs w:val="28"/>
-          <w:lang w:val="ko-KR" w:eastAsia="ko-KR"/>
-        </w:rPr>
-        <w:t xml:space="preserve">“평소처럼 일한 기록이 쌓여, 어떤 업무를 개선할 수 있는지까지 알려주면 좋겠다.”</w:t>
-      </w:r>
-    </w:p>
-    <w:p>
-      <w:pPr>
-        <w:pStyle w:val="Normal"/>
-      </w:pPr>
-      <w:r>
-        <w:rPr>
-          <w:rFonts w:ascii="바탕체" w:hAnsi="바탕체" w:eastAsia="바탕체" w:cs="바탕체"/>
-          <w:sz w:val="28"/>
-          <w:szCs w:val="28"/>
-          <w:lang w:val="ko-KR" w:eastAsia="ko-KR"/>
-        </w:rPr>
-        <w:t xml:space="preserve">주요 대상 사용자는 </w:t>
-      </w:r>
+        <w:t xml:space="preserve">2. 제안한 아이디어를 실현하기 위해 AI를 어떻게 활용할 계획인가요?</w:t>
+      </w:r>
+    </w:p>
+    <w:p>
+      <w:pPr>
+        <w:pStyle w:val="Guidance"/>
+      </w:pPr>
+      <w:r>
+        <w:rPr>
+          <w:rFonts w:ascii="바탕체" w:hAnsi="바탕체" w:eastAsia="바탕체" w:cs="바탕체"/>
+          <w:sz w:val="28"/>
+          <w:szCs w:val="28"/>
+          <w:lang w:val="ko-KR" w:eastAsia="ko-KR"/>
+        </w:rPr>
+        <w:t xml:space="preserve">AI 활용 방안과 이를 통해 문제를 해결하거나 새로운 변화를 만드는 방법을 구체적으로 작성해 주세요.</w:t>
+      </w:r>
+    </w:p>
+    <w:p>
+      <w:pPr>
+        <w:pStyle w:val="Heading2"/>
+      </w:pPr>
       <w:r>
         <w:rPr>
           <w:rFonts w:ascii="바탕체" w:hAnsi="바탕체" w:eastAsia="바탕체" w:cs="바탕체"/>
@@ -134,16 +185,7 @@
           <w:b/>
           <w:bCs/>
         </w:rPr>
-        <w:t xml:space="preserve">PC로 업무를 수행하는 SDS 임직원</w:t>
-      </w:r>
-      <w:r>
-        <w:rPr>
-          <w:rFonts w:ascii="바탕체" w:hAnsi="바탕체" w:eastAsia="바탕체" w:cs="바탕체"/>
-          <w:sz w:val="28"/>
-          <w:szCs w:val="28"/>
-          <w:lang w:val="ko-KR" w:eastAsia="ko-KR"/>
-        </w:rPr>
-        <w:t xml:space="preserve">이다. 자료 취합·분석·개발·문서 작성·시스템 운영 등 다양한 업무에서 여러 프로그램을 오가며 일한다. 파일 사이의 값 복사, 시스템 조회, 같은 형식으로 정리하기처럼 작은 수작업이 반복되어도, 바쁜 일상에서는 그 흐름을 파악하고 개선 방법까지 찾기 어렵다. 프로그램별 사용 시간이나 입력 횟수만으로는 업무의 목적과 자동화 가능성을 설명하기도 어렵다.</w:t>
+        <w:t xml:space="preserve">① 자동으로 쌓인 데이터를 업무 성격에 맞게 분류</w:t>
       </w:r>
     </w:p>
     <w:p>
@@ -157,7 +199,7 @@
           <w:szCs w:val="28"/>
           <w:lang w:val="ko-KR" w:eastAsia="ko-KR"/>
         </w:rPr>
-        <w:t xml:space="preserve">업무를 돌아보거나 보고서를 작성할 때에도 별도의 기록 부담이 생긴다. 짧은 자료 확인, 검토, 동료 지원과 문제 해결 과정은 기억에서 빠지기 쉽고, 일일·주간·월간 보고 때마다 흩어진 자료를 다시 모아야 한다. 업무를 수행하면서 자연스럽게 남는 데이터를 활용하면 개선 대상을 찾는 일과 업무 기록·문서 작성을 함께 도울 수 있다.</w:t>
+        <w:t xml:space="preserve">사용자가 허용한 작업의 시각·조작 종류·프로그램·문서·페이지·입력 또는 클릭 대상 등 최소 맥락을 로컬에 수집한다. AI는 설정한 주기에 맞춰 관련 기록을 연결하고 자료 작성·분석·개발·검토·협업 등 업무 성격에 따라 자동 분류하도록 할 계획이다. 연속 키 입력 원문과 화면 전체는 기본 수집 대상에서 제외한다.</w:t>
       </w:r>
     </w:p>
     <w:p>
@@ -171,101 +213,7 @@
           <w:szCs w:val="28"/>
           <w:lang w:val="ko-KR" w:eastAsia="ko-KR"/>
         </w:rPr>
-        <w:t xml:space="preserve">WorkMemory AI는 </w:t>
-      </w:r>
-      <w:r>
-        <w:rPr>
-          <w:rFonts w:ascii="바탕체" w:hAnsi="바탕체" w:eastAsia="바탕체" w:cs="바탕체"/>
-          <w:sz w:val="28"/>
-          <w:szCs w:val="28"/>
-          <w:lang w:val="ko-KR" w:eastAsia="ko-KR"/>
-          <w:b/>
-          <w:bCs/>
-        </w:rPr>
-        <w:t xml:space="preserve">일상 업무 데이터의 자동 축적 → 업무 성격에 따른 자동 분류·패턴화 → 효율화 솔루션 제안</w:t>
-      </w:r>
-      <w:r>
-        <w:rPr>
-          <w:rFonts w:ascii="바탕체" w:hAnsi="바탕체" w:eastAsia="바탕체" w:cs="바탕체"/>
-          <w:sz w:val="28"/>
-          <w:szCs w:val="28"/>
-          <w:lang w:val="ko-KR" w:eastAsia="ko-KR"/>
-        </w:rPr>
-        <w:t xml:space="preserve">을 중심 흐름으로 제안한다. 반복되는 절차와 수작업을 찾아 표준 양식, 자동 취합, 입력·검증 절차 자동화 등 실행 방법이 담긴 개선 솔루션을 제공하고자 한다. 축적된 업무 기록은 회고와 문서 자동화에도 재사용한다. 업무별 타임테이블과 프로그램 사용 현황은 자신의 일하는 방식을 이해하는 부수 기능으로 제공한다.</w:t>
-      </w:r>
-    </w:p>
-    <w:p>
-      <w:pPr>
-        <w:pStyle w:val="Normal"/>
-      </w:pPr>
-      <w:r>
-        <w:rPr>
-          <w:rFonts w:ascii="바탕체" w:hAnsi="바탕체" w:eastAsia="바탕체" w:cs="바탕체"/>
-          <w:sz w:val="28"/>
-          <w:szCs w:val="28"/>
-          <w:lang w:val="ko-KR" w:eastAsia="ko-KR"/>
-        </w:rPr>
-        <w:t xml:space="preserve">처음에 사용자가 수집할 프로그램과 파일·대화·사이트 조건을 선택하면, 그 범위 안에서 데이터가 자동으로 축적되도록 설계한다. 해커톤에서는 대표 프로그램 조합에서 선택적 수집·저장, 업무 분류·패턴화, 효율화 솔루션 한 개와 보고 초안 한 종류까지 이어지는 프로토타입을 개발할 계획이다. 사용자는 모호한 업무나 잘못 연결된 항목만 짧게 수정할 수 있게 한다.</w:t>
-      </w:r>
-    </w:p>
-    <w:p>
-      <w:pPr>
-        <w:pStyle w:val="Heading1"/>
-      </w:pPr>
-      <w:r>
-        <w:rPr>
-          <w:rFonts w:ascii="바탕체" w:hAnsi="바탕체" w:eastAsia="바탕체" w:cs="바탕체"/>
-          <w:sz w:val="28"/>
-          <w:szCs w:val="28"/>
-          <w:lang w:val="ko-KR" w:eastAsia="ko-KR"/>
-          <w:b/>
-          <w:bCs/>
-        </w:rPr>
-        <w:t xml:space="preserve">2. 제안한 아이디어를 실현하기 위해 AI를 어떻게 활용할 계획인가요?</w:t>
-      </w:r>
-    </w:p>
-    <w:p>
-      <w:pPr>
-        <w:pStyle w:val="Heading2"/>
-      </w:pPr>
-      <w:r>
-        <w:rPr>
-          <w:rFonts w:ascii="바탕체" w:hAnsi="바탕체" w:eastAsia="바탕체" w:cs="바탕체"/>
-          <w:sz w:val="28"/>
-          <w:szCs w:val="28"/>
-          <w:lang w:val="ko-KR" w:eastAsia="ko-KR"/>
-          <w:b/>
-          <w:bCs/>
-        </w:rPr>
-        <w:t xml:space="preserve">① 일상 업무 데이터를 자동 축적하고 업무 성격에 맞게 분류</w:t>
-      </w:r>
-    </w:p>
-    <w:p>
-      <w:pPr>
-        <w:pStyle w:val="Normal"/>
-      </w:pPr>
-      <w:r>
-        <w:rPr>
-          <w:rFonts w:ascii="바탕체" w:hAnsi="바탕체" w:eastAsia="바탕체" w:cs="바탕체"/>
-          <w:sz w:val="28"/>
-          <w:szCs w:val="28"/>
-          <w:lang w:val="ko-KR" w:eastAsia="ko-KR"/>
-        </w:rPr>
-        <w:t xml:space="preserve">사용자가 허용한 프로그램과 작업에서 조작 시각·종류, 사용 중인 앱과 문서·페이지, 입력·클릭 대상 등 필요한 맥락을 수집할 계획이다. 초기 설정 이후에는 평소처럼 일하면 기록이 쌓이고, 설정한 주기에 맞춰 AI가 관련 기록을 업무 후보로 연결하고 분류하도록 한다. 연속 키 입력 원문과 화면 전체는 기본 수집 대상에서 제외한다.</w:t>
-      </w:r>
-    </w:p>
-    <w:p>
-      <w:pPr>
-        <w:pStyle w:val="Normal"/>
-      </w:pPr>
-      <w:r>
-        <w:rPr>
-          <w:rFonts w:ascii="바탕체" w:hAnsi="바탕체" w:eastAsia="바탕체" w:cs="바탕체"/>
-          <w:sz w:val="28"/>
-          <w:szCs w:val="28"/>
-          <w:lang w:val="ko-KR" w:eastAsia="ko-KR"/>
-        </w:rPr>
-        <w:t xml:space="preserve">다음은 기능을 설명하기 위한 가상의 기록이다.</w:t>
+        <w:t xml:space="preserve">다음은 기밀 없는 시연 자료를 이용한 가상의 예시다.</w:t>
       </w:r>
     </w:p>
     <w:tbl>
@@ -340,7 +288,7 @@
                 <w:b/>
                 <w:bCs/>
               </w:rPr>
-              <w:t xml:space="preserve">AI가 제안하는 업무 후보·분류</w:t>
+              <w:t xml:space="preserve">AI가 연결·분류할 업무</w:t>
             </w:r>
           </w:p>
         </w:tc>
@@ -366,7 +314,7 @@
                 <w:szCs w:val="28"/>
                 <w:lang w:val="ko-KR" w:eastAsia="ko-KR"/>
               </w:rPr>
-              <w:t xml:space="preserve">허용한 Excel의 ‘프로젝트 A’ 자료에서 범위 선택·복사</w:t>
+              <w:t xml:space="preserve">Excel의 ‘프로젝트 A’ 자료에서 범위 선택·복사</w:t>
             </w:r>
           </w:p>
         </w:tc>
@@ -413,7 +361,7 @@
                 <w:szCs w:val="28"/>
                 <w:lang w:val="ko-KR" w:eastAsia="ko-KR"/>
               </w:rPr>
-              <w:t xml:space="preserve">허용한 업무 사이트에서 ‘프로젝트 A’ 관련 정보를 조회</w:t>
+              <w:t xml:space="preserve">허용한 업무 사이트에서 관련 정보를 조회</w:t>
             </w:r>
           </w:p>
         </w:tc>
@@ -434,7 +382,7 @@
                 <w:szCs w:val="28"/>
                 <w:lang w:val="ko-KR" w:eastAsia="ko-KR"/>
               </w:rPr>
-              <w:t xml:space="preserve">앞선 자료와 관련된 정보 확인 / 조사·검토</w:t>
+              <w:t xml:space="preserve">프로젝트 A 정보 확인 / 조사·검토</w:t>
             </w:r>
           </w:p>
         </w:tc>
@@ -460,7 +408,7 @@
                 <w:szCs w:val="28"/>
                 <w:lang w:val="ko-KR" w:eastAsia="ko-KR"/>
               </w:rPr>
-              <w:t xml:space="preserve">문서 편집기에서 ‘프로젝트 A’ 내용을 입력하고 표를 정리</w:t>
+              <w:t xml:space="preserve">문서 편집기에서 관련 내용을 입력하고 표 정리</w:t>
             </w:r>
           </w:p>
         </w:tc>
@@ -481,7 +429,7 @@
                 <w:szCs w:val="28"/>
                 <w:lang w:val="ko-KR" w:eastAsia="ko-KR"/>
               </w:rPr>
-              <w:t xml:space="preserve">여러 도구의 작업이 이어진 프로젝트 A 자료 작성 / 문서 작성</w:t>
+              <w:t xml:space="preserve">앞선 기록과 연결된 프로젝트 A 자료 작성 / 문서 작성</w:t>
             </w:r>
           </w:p>
         </w:tc>
@@ -498,21 +446,7 @@
           <w:szCs w:val="28"/>
           <w:lang w:val="ko-KR" w:eastAsia="ko-KR"/>
         </w:rPr>
-        <w:t xml:space="preserve">AI는 시간적 흐름과 업무 목적을 함께 해석해 여러 프로그램에 걸친 작업을 연결한다. 예를 들어 Excel의 자료 취합과 문서의 표 정리를 하나의 자료 작성 업무로 묶되, 같은 프로젝트 이름이 등장해도 개발 오류 수정은 다른 성격의 업무로 구분한다. 자료 작성·분석·개발·검토·협업 등의 분류를 제안하고, 사용자가 이름과 분류를 수정하면 이후 분석에 반영한다.</w:t>
-      </w:r>
-    </w:p>
-    <w:p>
-      <w:pPr>
-        <w:pStyle w:val="Normal"/>
-      </w:pPr>
-      <w:r>
-        <w:rPr>
-          <w:rFonts w:ascii="바탕체" w:hAnsi="바탕체" w:eastAsia="바탕체" w:cs="바탕체"/>
-          <w:sz w:val="28"/>
-          <w:szCs w:val="28"/>
-          <w:lang w:val="ko-KR" w:eastAsia="ko-KR"/>
-        </w:rPr>
-        <w:t xml:space="preserve">기본 화면은 하루의 업무 카드 목록으로 구성한다. 사용자는 필요한 항목만 확인·수정하고, 연결 근거는 원할 때 펼쳐 본다. 개별 클릭이나 입력 수정마다 별도 업무 기록을 작성하도록 요구하지 않는다. 프로그램 사용 시간이나 공통 단어만으로 묶은 결과와 비교해 AI가 업무 의미를 잘 복원하는지도 검증할 계획이다.</w:t>
+        <w:t xml:space="preserve">같은 프로젝트 이름이라도 자료 작성과 개발 오류 수정처럼 목적이 다른 업무는 구분한다. 여러 클릭을 곧바로 여러 업무로 세지 않고, 연결 이유와 근거를 업무 카드에 표시한다. 사용자는 모호한 이름·분류나 잘못된 연결만 짧게 수정하고, 수정 내용은 이후 분석에 반영한다.</w:t>
       </w:r>
     </w:p>
     <w:p>
@@ -528,7 +462,7 @@
           <w:b/>
           <w:bCs/>
         </w:rPr>
-        <w:t xml:space="preserve">② 누적 데이터를 패턴화하고 업무 효율화 솔루션을 제안·제공</w:t>
+        <w:t xml:space="preserve">② 반복 흐름을 패턴화해 효율화 솔루션 제안·제공</w:t>
       </w:r>
     </w:p>
     <w:p>
@@ -542,7 +476,7 @@
           <w:szCs w:val="28"/>
           <w:lang w:val="ko-KR" w:eastAsia="ko-KR"/>
         </w:rPr>
-        <w:t xml:space="preserve">AI가 누적된 업무에서 비슷한 목적·처리 순서·데이터 이동을 찾아 반복 흐름으로 패턴화할 계획이다. 어떤 일을 반복했는지와 함께, 어느 단계를 어떻게 바꾸면 좋을지 제안한다. 다음은 가상 기록을 바탕으로 한 솔루션 예시다.</w:t>
+        <w:t xml:space="preserve">AI가 누적된 업무의 목적·처리 순서·데이터 이동을 비교해 반복 흐름을 패턴화한다. 무엇을 반복했는지에 더해, 어느 단계를 어떻게 바꾸면 좋을지 자동화 설계안이나 템플릿으로 제공하고자 한다.</w:t>
       </w:r>
     </w:p>
     <w:tbl>
@@ -618,7 +552,7 @@
                 <w:b/>
                 <w:bCs/>
               </w:rPr>
-              <w:t xml:space="preserve">제안·제공할 효율화 솔루션</w:t>
+              <w:t xml:space="preserve">효율화 솔루션</w:t>
             </w:r>
           </w:p>
         </w:tc>
@@ -642,7 +576,7 @@
                 <w:b/>
                 <w:bCs/>
               </w:rPr>
-              <w:t xml:space="preserve">함께 보여줄 내용</w:t>
+              <w:t xml:space="preserve">제공할 적용 방법</w:t>
             </w:r>
           </w:p>
         </w:tc>
@@ -668,7 +602,7 @@
                 <w:szCs w:val="28"/>
                 <w:lang w:val="ko-KR" w:eastAsia="ko-KR"/>
               </w:rPr>
-              <w:t xml:space="preserve">여러 Excel 파일의 값을 모으고 같은 형식으로 정리</w:t>
+              <w:t xml:space="preserve">여러 Excel 파일의 값을 취합하고 같은 형식으로 정리</w:t>
             </w:r>
           </w:p>
         </w:tc>
@@ -689,7 +623,7 @@
                 <w:szCs w:val="28"/>
                 <w:lang w:val="ko-KR" w:eastAsia="ko-KR"/>
               </w:rPr>
-              <w:t xml:space="preserve">공통 양식과 자동 취합 처리 흐름 제공</w:t>
+              <w:t xml:space="preserve">공통 양식과 자동 취합 설계안</w:t>
             </w:r>
           </w:p>
         </w:tc>
@@ -710,7 +644,7 @@
                 <w:szCs w:val="28"/>
                 <w:lang w:val="ko-KR" w:eastAsia="ko-KR"/>
               </w:rPr>
-              <w:t xml:space="preserve">필요한 열·입력 파일 조건, 통합·중복 확인·서식 적용 단계</w:t>
+              <w:t xml:space="preserve">필요한 열·파일 조건, 통합·중복 확인·서식 적용 단계</w:t>
             </w:r>
           </w:p>
         </w:tc>
@@ -736,7 +670,7 @@
                 <w:szCs w:val="28"/>
                 <w:lang w:val="ko-KR" w:eastAsia="ko-KR"/>
               </w:rPr>
-              <w:t xml:space="preserve">업무 사이트의 정보를 확인해 문서에 반복 입력</w:t>
+              <w:t xml:space="preserve">업무 사이트의 정보를 문서에 반복 입력</w:t>
             </w:r>
           </w:p>
         </w:tc>
@@ -757,7 +691,7 @@
                 <w:szCs w:val="28"/>
                 <w:lang w:val="ko-KR" w:eastAsia="ko-KR"/>
               </w:rPr>
-              <w:t xml:space="preserve">입력 항목 대응표와 문서 자동 채움 템플릿 제안</w:t>
+              <w:t xml:space="preserve">입력 항목 대응표와 문서 자동 채움 템플릿</w:t>
             </w:r>
           </w:p>
         </w:tc>
@@ -778,7 +712,7 @@
                 <w:szCs w:val="28"/>
                 <w:lang w:val="ko-KR" w:eastAsia="ko-KR"/>
               </w:rPr>
-              <w:t xml:space="preserve">조회할 항목, 문서에 넣을 위치, 사람이 확인할 예외</w:t>
+              <w:t xml:space="preserve">조회 항목, 문서에 넣을 위치, 사람이 확인할 예외</w:t>
             </w:r>
           </w:p>
         </w:tc>
@@ -804,7 +738,7 @@
                 <w:szCs w:val="28"/>
                 <w:lang w:val="ko-KR" w:eastAsia="ko-KR"/>
               </w:rPr>
-              <w:t xml:space="preserve">비슷한 자료 검토와 확인 절차를 반복</w:t>
+              <w:t xml:space="preserve">비슷한 자료 검토·확인을 반복</w:t>
             </w:r>
           </w:p>
         </w:tc>
@@ -825,7 +759,7 @@
                 <w:szCs w:val="28"/>
                 <w:lang w:val="ko-KR" w:eastAsia="ko-KR"/>
               </w:rPr>
-              <w:t xml:space="preserve">검토 체크리스트와 규칙 기반 자동 점검 설계안 제공</w:t>
+              <w:t xml:space="preserve">체크리스트와 규칙 기반 자동 점검 설계안</w:t>
             </w:r>
           </w:p>
         </w:tc>
@@ -846,7 +780,7 @@
                 <w:szCs w:val="28"/>
                 <w:lang w:val="ko-KR" w:eastAsia="ko-KR"/>
               </w:rPr>
-              <w:t xml:space="preserve">반복 확인 항목, 자동 점검 조건, 수동 판단이 필요한 단계</w:t>
+              <w:t xml:space="preserve">반복 확인 항목, 자동 점검 조건, 수동 판단 단계</w:t>
             </w:r>
           </w:p>
         </w:tc>
@@ -863,21 +797,7 @@
           <w:szCs w:val="28"/>
           <w:lang w:val="ko-KR" w:eastAsia="ko-KR"/>
         </w:rPr>
-        <w:t xml:space="preserve">솔루션 카드에는 대상 업무, 반복 근거, 개선할 단계, 적용 방법과 필요한 조건을 담는다. 해커톤에서는 실제 짧은 반복 작업 한 가지에 대해 자동화 설계안 또는 템플릿 한 개를 제시하고, 사용자가 채택·수정·보류할 수 있도록 구현할 계획이다. 여러 날의 누적 패턴은 별도의 가상 자료로 설명한다.</w:t>
-      </w:r>
-    </w:p>
-    <w:p>
-      <w:pPr>
-        <w:pStyle w:val="Normal"/>
-      </w:pPr>
-      <w:r>
-        <w:rPr>
-          <w:rFonts w:ascii="바탕체" w:hAnsi="바탕체" w:eastAsia="바탕체" w:cs="바탕체"/>
-          <w:sz w:val="28"/>
-          <w:szCs w:val="28"/>
-          <w:lang w:val="ko-KR" w:eastAsia="ko-KR"/>
-        </w:rPr>
-        <w:t xml:space="preserve">관측 이벤트의 반복과 실제 업무의 반복을 구분한다. 반복 횟수는 사용자가 확인한 업무 단위로 집계하고, 미확인 묶음은 후보로 표시한다. 자동화 실행 기능은 후속 확장으로 두며, 실제 절감 시간과 개선 효과는 사용자가 솔루션을 적용한 뒤 검증한다.</w:t>
+        <w:t xml:space="preserve">솔루션에는 대상 업무·반복 근거·개선 단계·적용 조건을 담고, 사용자가 채택·수정·보류할 수 있게 한다. 미확인 패턴은 후보로 표시하며, 실제 업무 반복 횟수는 사용자가 확인한 업무 단위로 계산한다. 자동화 실행은 후속 확장으로 두고, 절감 시간과 효과는 실제 적용 후 검증한다.</w:t>
       </w:r>
     </w:p>
     <w:p>
@@ -893,7 +813,7 @@
           <w:b/>
           <w:bCs/>
         </w:rPr>
-        <w:t xml:space="preserve">③ 같은 기록으로 나의 업무를 회고하고 필요한 문서를 자동 작성</w:t>
+        <w:t xml:space="preserve">③ 같은 기록으로 업무 회고와 문서 자동화</w:t>
       </w:r>
     </w:p>
     <w:p>
@@ -907,7 +827,7 @@
           <w:szCs w:val="28"/>
           <w:lang w:val="ko-KR" w:eastAsia="ko-KR"/>
         </w:rPr>
-        <w:t xml:space="preserve">업무 기록을 기간·프로젝트·업무 유형별로 정리해 어떤 일을 했고 어떤 흐름이 반복되었는지 돌아볼 수 있게 한다. 사용자가 선택한 기간과 서식에 맞춰 같은 기록을 문서 초안으로 변환하고, 실제 결과·이슈·기여 등 부족한 정보만 보완하도록 할 계획이다.</w:t>
+        <w:t xml:space="preserve">AI가 업무 기록을 기간·프로젝트·업무 유형별로 정리하고, 사용자가 선택한 서식에 맞춰 문서 초안을 생성하도록 할 계획이다.</w:t>
       </w:r>
     </w:p>
     <w:tbl>
@@ -983,7 +903,7 @@
                 <w:b/>
                 <w:bCs/>
               </w:rPr>
-              <w:t xml:space="preserve">정리할 내용</w:t>
+              <w:t xml:space="preserve">AI가 제공할 결과</w:t>
             </w:r>
           </w:p>
         </w:tc>
@@ -1007,7 +927,7 @@
                 <w:b/>
                 <w:bCs/>
               </w:rPr>
-              <w:t xml:space="preserve">사용자에게 제공하는 가치</w:t>
+              <w:t xml:space="preserve">사용자 활용</w:t>
             </w:r>
           </w:p>
         </w:tc>
@@ -1054,7 +974,7 @@
                 <w:szCs w:val="28"/>
                 <w:lang w:val="ko-KR" w:eastAsia="ko-KR"/>
               </w:rPr>
-              <w:t xml:space="preserve">기간별 수행 업무, 반복 흐름, 개선 시도와 확인할 항목</w:t>
+              <w:t xml:space="preserve">수행 업무·반복 흐름·개선 시도와 관련 근거</w:t>
             </w:r>
           </w:p>
         </w:tc>
@@ -1075,7 +995,7 @@
                 <w:szCs w:val="28"/>
                 <w:lang w:val="ko-KR" w:eastAsia="ko-KR"/>
               </w:rPr>
-              <w:t xml:space="preserve">기억에 의존하지 않고 자신의 업무를 돌아보고 다음 개선 방향 검토</w:t>
+              <w:t xml:space="preserve">무엇을 했고 어떤 과정을 개선할지 돌아보기</w:t>
             </w:r>
           </w:p>
         </w:tc>
@@ -1101,7 +1021,7 @@
                 <w:szCs w:val="28"/>
                 <w:lang w:val="ko-KR" w:eastAsia="ko-KR"/>
               </w:rPr>
-              <w:t xml:space="preserve">일일·주간·월간 보고 자동화</w:t>
+              <w:t xml:space="preserve">일일·주간·월간 보고</w:t>
             </w:r>
           </w:p>
         </w:tc>
@@ -1122,7 +1042,7 @@
                 <w:szCs w:val="28"/>
                 <w:lang w:val="ko-KR" w:eastAsia="ko-KR"/>
               </w:rPr>
-              <w:t xml:space="preserve">수행 업무·진행 내용·이슈·다음 계획을 선택 서식에 맞춘 초안</w:t>
+              <w:t xml:space="preserve">수행 업무·진행 내용·이슈·다음 계획의 서식별 초안</w:t>
             </w:r>
           </w:p>
         </w:tc>
@@ -1143,7 +1063,7 @@
                 <w:szCs w:val="28"/>
                 <w:lang w:val="ko-KR" w:eastAsia="ko-KR"/>
               </w:rPr>
-              <w:t xml:space="preserve">흩어진 기록을 다시 모으는 부담과 반복 문서 작성 시간 감소</w:t>
+              <w:t xml:space="preserve">필요한 내용만 보완해 문서 작성 시간 절감</w:t>
             </w:r>
           </w:p>
         </w:tc>
@@ -1169,7 +1089,7 @@
                 <w:szCs w:val="28"/>
                 <w:lang w:val="ko-KR" w:eastAsia="ko-KR"/>
               </w:rPr>
-              <w:t xml:space="preserve">필요시 다른 업무 문서에 활용</w:t>
+              <w:t xml:space="preserve">기타 업무 문서</w:t>
             </w:r>
           </w:p>
         </w:tc>
@@ -1190,7 +1110,7 @@
                 <w:szCs w:val="28"/>
                 <w:lang w:val="ko-KR" w:eastAsia="ko-KR"/>
               </w:rPr>
-              <w:t xml:space="preserve">사용자가 확인한 업무 사례·결과·기여와 관련 근거</w:t>
+              <w:t xml:space="preserve">확인한 업무 사례·결과·기여의 요약</w:t>
             </w:r>
           </w:p>
         </w:tc>
@@ -1211,7 +1131,7 @@
                 <w:szCs w:val="28"/>
                 <w:lang w:val="ko-KR" w:eastAsia="ko-KR"/>
               </w:rPr>
-              <w:t xml:space="preserve">평가노트 등 필요한 문서에 같은 기록을 선택적으로 재사용</w:t>
+              <w:t xml:space="preserve">필요시 평가노트 등 다른 문서에 재사용</w:t>
             </w:r>
           </w:p>
         </w:tc>
@@ -1228,7 +1148,7 @@
           <w:szCs w:val="28"/>
           <w:lang w:val="ko-KR" w:eastAsia="ko-KR"/>
         </w:rPr>
-        <w:t xml:space="preserve">해커톤에서는 업무 기록 조회와 일일 보고 초안 한 종류의 생성·수정·저장·텍스트 내보내기를 핵심 결과물로 구현할 계획이다. 주간·월간 보고와 다양한 문서 서식, 정기 자동 생성은 확장 항목으로 둔다. 문서 항목마다 관련 업무 카드와 관측 근거를 연결하고, 완료 여부·실제 결과·기여는 사용자 확인이나 추가 자료가 있을 때 포함한다. 부족한 정보는 보완 항목으로 남긴다.</w:t>
+        <w:t xml:space="preserve">문서 항목에는 업무 카드와 관측 근거를 연결한다. 완료 여부·실제 결과·기여는 사용자 확인이나 추가 자료가 있을 때 포함하고, 부족한 정보는 보완 항목으로 남긴다. 사용자가 검토한 뒤 저장·내보낼 수 있게 한다.</w:t>
       </w:r>
     </w:p>
     <w:p>
@@ -1244,7 +1164,7 @@
           <w:b/>
           <w:bCs/>
         </w:rPr>
-        <w:t xml:space="preserve">④ 부수 기능: 업무 타임테이블과 프로그램 사용 현황</w:t>
+        <w:t xml:space="preserve">④ 부수 기능: 타임테이블과 프로그램 사용 현황</w:t>
       </w:r>
     </w:p>
     <w:p>
@@ -1258,7 +1178,7 @@
           <w:szCs w:val="28"/>
           <w:lang w:val="ko-KR" w:eastAsia="ko-KR"/>
         </w:rPr>
-        <w:t xml:space="preserve">수집한 시각·앱 전환·업무 분류 정보를 활용해 시간대별 업무 타임테이블, 업무별 소요 시간 추정치, 프로그램별 관측 사용 시간과 사용 비중을 제공할 수 있다. 사용자는 어떤 업무에 시간이 많이 들었는지, 어떤 프로그램을 자주 오갔는지 확인하고 효율화 솔루션을 검토할 참고 자료로 활용한다.</w:t>
+        <w:t xml:space="preserve">수집 시각·앱 전환·업무 분류를 활용해 시간대별 타임테이블, 업무별 소요 시간 추정치, 프로그램별 관측 사용 시간과 사용 비중을 제공할 수 있다. 어떤 업무에 시간이 많이 들고 어떤 도구를 자주 오가는지 확인하는 참고 자료로 활용한다.</w:t>
       </w:r>
     </w:p>
     <w:p>
@@ -1272,7 +1192,7 @@
           <w:szCs w:val="28"/>
           <w:lang w:val="ko-KR" w:eastAsia="ko-KR"/>
         </w:rPr>
-        <w:t xml:space="preserve">시간은 허용한 범위에서 관측한 활동 구간을 기준으로 집계한다. 업무별 배분은 연결 근거가 충분할 때만 추정하고, 겹치는 구간은 중복 합산하지 않는다. 유휴·오프라인 업무·미수집 구간과 분류가 불확실한 시간은 구분해 표시한다. 일부 프로그램만 수집했다면 그 범위의 사용 비중임을 명시하며, 이를 전체 근무시간이나 개인 생산성 점수로 해석하지 않는다. 해커톤에서는 여유가 있을 때 간단한 타임라인과 프로그램별 집계를 시연하고, 정교한 시간 배분은 후속 검증 대상으로 둔다.</w:t>
+        <w:t xml:space="preserve">허용한 범위에서 관측한 시간만 집계하고, 업무별 배분은 근거가 있을 때만 추정한다. 겹치는 구간은 중복 합산하지 않으며 유휴·오프라인 업무·미수집·미분류 구간을 구분한다. 일부 프로그램만 수집했다면 그 범위의 통계임을 표시한다.</w:t>
       </w:r>
     </w:p>
     <w:p>
@@ -1286,8 +1206,13 @@
           <w:szCs w:val="28"/>
           <w:lang w:val="ko-KR" w:eastAsia="ko-KR"/>
         </w:rPr>
-        <w:t xml:space="preserve">전체 처리 흐름은 </w:t>
-      </w:r>
+        <w:t xml:space="preserve">구현에는 운영체제 이벤트·접근성 API와 필요한 앱 연동, 로컬 DB, 업무 카드 화면과 LLM API를 활용할 계획이다. 건수·날짜·관측 시간은 코드로 계산하고, AI는 맥락에 따른 업무 연결·분류·패턴 해석·솔루션과 문서 초안 생성을 맡는다.</w:t>
+      </w:r>
+    </w:p>
+    <w:p>
+      <w:pPr>
+        <w:pStyle w:val="Heading1"/>
+      </w:pPr>
       <w:r>
         <w:rPr>
           <w:rFonts w:ascii="바탕체" w:hAnsi="바탕체" w:eastAsia="바탕체" w:cs="바탕체"/>
@@ -1297,22 +1222,36 @@
           <w:b/>
           <w:bCs/>
         </w:rPr>
-        <w:t xml:space="preserve">허용 범위의 데이터 자동 축적 → AI 업무 분류·패턴화 → 효율화 솔루션 제안 + 업무 회고·문서 자동화</w:t>
-      </w:r>
-      <w:r>
-        <w:rPr>
-          <w:rFonts w:ascii="바탕체" w:hAnsi="바탕체" w:eastAsia="바탕체" w:cs="바탕체"/>
-          <w:sz w:val="28"/>
-          <w:szCs w:val="28"/>
-          <w:lang w:val="ko-KR" w:eastAsia="ko-KR"/>
-        </w:rPr>
-        <w:t xml:space="preserve">로 설계한다. 건수·날짜·관측 시간은 코드로 계산하고, AI는 맥락에 따른 업무 연결·분류·패턴 해석·솔루션과 문서 초안 생성을 담당한다. 키보드·마우스 이벤트, 접근성 API와 필요한 앱 연동으로 최소 맥락을 확보하고, 로컬 DB·업무 카드 화면·LLM API를 연결할 계획이다. 수집 조건 적용과 민감정보 제외를 저장·외부 전송보다 먼저 수행한다.</w:t>
-      </w:r>
-    </w:p>
-    <w:p>
-      <w:pPr>
-        <w:pStyle w:val="Heading1"/>
-      </w:pPr>
+        <w:t xml:space="preserve">3. 해커톤 2일 동안 구현해 보고 싶은 주요기능은 무엇인가요?</w:t>
+      </w:r>
+    </w:p>
+    <w:p>
+      <w:pPr>
+        <w:pStyle w:val="Guidance"/>
+      </w:pPr>
+      <w:r>
+        <w:rPr>
+          <w:rFonts w:ascii="바탕체" w:hAnsi="바탕체" w:eastAsia="바탕체" w:cs="바탕체"/>
+          <w:sz w:val="28"/>
+          <w:szCs w:val="28"/>
+          <w:lang w:val="ko-KR" w:eastAsia="ko-KR"/>
+        </w:rPr>
+        <w:t xml:space="preserve">아이디어가 구현되면 사용자가 무엇을 하고, AI가 어떤 결과를 보여줄지 적어주세요.</w:t>
+      </w:r>
+    </w:p>
+    <w:p>
+      <w:pPr>
+        <w:pStyle w:val="Normal"/>
+      </w:pPr>
+      <w:r>
+        <w:rPr>
+          <w:rFonts w:ascii="바탕체" w:hAnsi="바탕체" w:eastAsia="바탕체" w:cs="바탕체"/>
+          <w:sz w:val="28"/>
+          <w:szCs w:val="28"/>
+          <w:lang w:val="ko-KR" w:eastAsia="ko-KR"/>
+        </w:rPr>
+        <w:t xml:space="preserve">2일 동안 </w:t>
+      </w:r>
       <w:r>
         <w:rPr>
           <w:rFonts w:ascii="바탕체" w:hAnsi="바탕체" w:eastAsia="바탕체" w:cs="바탕체"/>
@@ -1322,41 +1261,16 @@
           <w:b/>
           <w:bCs/>
         </w:rPr>
-        <w:t xml:space="preserve">3. 해커톤 2일 동안 구현해 보고 싶은 주요 기능은 무엇인가요?</w:t>
-      </w:r>
-    </w:p>
-    <w:p>
-      <w:pPr>
-        <w:pStyle w:val="Normal"/>
-      </w:pPr>
-      <w:r>
-        <w:rPr>
-          <w:rFonts w:ascii="바탕체" w:hAnsi="바탕체" w:eastAsia="바탕체" w:cs="바탕체"/>
-          <w:sz w:val="28"/>
-          <w:szCs w:val="28"/>
-          <w:lang w:val="ko-KR" w:eastAsia="ko-KR"/>
-        </w:rPr>
-        <w:t xml:space="preserve">2일 동안 </w:t>
-      </w:r>
-      <w:r>
-        <w:rPr>
-          <w:rFonts w:ascii="바탕체" w:hAnsi="바탕체" w:eastAsia="바탕체" w:cs="바탕체"/>
-          <w:sz w:val="28"/>
-          <w:szCs w:val="28"/>
-          <w:lang w:val="ko-KR" w:eastAsia="ko-KR"/>
-          <w:b/>
-          <w:bCs/>
-        </w:rPr>
-        <w:t xml:space="preserve">선택적 데이터 수집 → 업무 자동 분류·패턴화 → 효율화 솔루션 제안 → 업무 회고·보고 초안 생성</w:t>
-      </w:r>
-      <w:r>
-        <w:rPr>
-          <w:rFonts w:ascii="바탕체" w:hAnsi="바탕체" w:eastAsia="바탕체" w:cs="바탕체"/>
-          <w:sz w:val="28"/>
-          <w:szCs w:val="28"/>
-          <w:lang w:val="ko-KR" w:eastAsia="ko-KR"/>
-        </w:rPr>
-        <w:t xml:space="preserve">으로 이어지는 프로토타입을 개발하고자 한다. 대표 시나리오는 ‘스프레드시트 자료 취합 → 업무 사이트 정보 확인 → 문서 정리’처럼 여러 프로그램을 오가는 업무로 잡는다. 수집 가능성을 확인한 두 개 이상의 프로그램에서 짧은 작업을 시연하고, 앱별 관측 범위를 표시할 계획이다.</w:t>
+        <w:t xml:space="preserve">선택적 수집 → 업무 자동 분류·패턴화 → 효율화 솔루션 제안 → 업무 회고·일일 보고 초안 생성</w:t>
+      </w:r>
+      <w:r>
+        <w:rPr>
+          <w:rFonts w:ascii="바탕체" w:hAnsi="바탕체" w:eastAsia="바탕체" w:cs="바탕체"/>
+          <w:sz w:val="28"/>
+          <w:szCs w:val="28"/>
+          <w:lang w:val="ko-KR" w:eastAsia="ko-KR"/>
+        </w:rPr>
+        <w:t xml:space="preserve">을 연결하는 프로토타입을 구현하고자 한다.</w:t>
       </w:r>
     </w:p>
     <w:tbl>
@@ -1408,7 +1322,7 @@
                 <w:b/>
                 <w:bCs/>
               </w:rPr>
-              <w:t xml:space="preserve">우선순위</w:t>
+              <w:t xml:space="preserve">주요기능</w:t>
             </w:r>
           </w:p>
         </w:tc>
@@ -1432,7 +1346,7 @@
                 <w:b/>
                 <w:bCs/>
               </w:rPr>
-              <w:t xml:space="preserve">구현 항목</w:t>
+              <w:t xml:space="preserve">사용자가 하는 일</w:t>
             </w:r>
           </w:p>
         </w:tc>
@@ -1456,7 +1370,7 @@
                 <w:b/>
                 <w:bCs/>
               </w:rPr>
-              <w:t xml:space="preserve">완료 기준</w:t>
+              <w:t xml:space="preserve">AI·시스템이 보여주는 결과</w:t>
             </w:r>
           </w:p>
         </w:tc>
@@ -1482,7 +1396,7 @@
                 <w:szCs w:val="28"/>
                 <w:lang w:val="ko-KR" w:eastAsia="ko-KR"/>
               </w:rPr>
-              <w:t xml:space="preserve">필수</w:t>
+              <w:t xml:space="preserve">허용 범위 설정·자동 기록</w:t>
             </w:r>
           </w:p>
         </w:tc>
@@ -1503,7 +1417,7 @@
                 <w:szCs w:val="28"/>
                 <w:lang w:val="ko-KR" w:eastAsia="ko-KR"/>
               </w:rPr>
-              <w:t xml:space="preserve">허용 범위 설정과 데이터 수집·저장</w:t>
+              <w:t xml:space="preserve">프로그램과 지원 가능한 파일명·사이트 조건을 지정하고 평소처럼 작업</w:t>
             </w:r>
           </w:p>
         </w:tc>
@@ -1524,7 +1438,7 @@
                 <w:szCs w:val="28"/>
                 <w:lang w:val="ko-KR" w:eastAsia="ko-KR"/>
               </w:rPr>
-              <w:t xml:space="preserve">선택한 프로그램과 지원 가능한 파일명·사이트 조건을 적용하고, 비허용 작업은 저장하지 않음. 시작·중지·전체 삭제 제공</w:t>
+              <w:t xml:space="preserve">허용한 작업만 로컬에 축적하고 수집 상태 표시. 시작·중지·전체 삭제 제공</w:t>
             </w:r>
           </w:p>
         </w:tc>
@@ -1550,7 +1464,7 @@
                 <w:szCs w:val="28"/>
                 <w:lang w:val="ko-KR" w:eastAsia="ko-KR"/>
               </w:rPr>
-              <w:t xml:space="preserve">필수</w:t>
+              <w:t xml:space="preserve">업무 자동 분류·확인</w:t>
             </w:r>
           </w:p>
         </w:tc>
@@ -1571,7 +1485,7 @@
                 <w:szCs w:val="28"/>
                 <w:lang w:val="ko-KR" w:eastAsia="ko-KR"/>
               </w:rPr>
-              <w:t xml:space="preserve">업무 자동 분류 카드와 짧은 수정</w:t>
+              <w:t xml:space="preserve">여러 프로그램을 오가며 일하고 모호한 항목만 수정</w:t>
             </w:r>
           </w:p>
         </w:tc>
@@ -1592,7 +1506,7 @@
                 <w:szCs w:val="28"/>
                 <w:lang w:val="ko-KR" w:eastAsia="ko-KR"/>
               </w:rPr>
-              <w:t xml:space="preserve">수집 기록을 설정한 주기로 업무 후보에 연결하고 분류·근거 표시. 이름·분류 수정과 잘못된 연결 제외 내용을 저장</w:t>
+              <w:t xml:space="preserve">관련 기록을 업무 카드로 연결하고 분류·연결 근거 표시</w:t>
             </w:r>
           </w:p>
         </w:tc>
@@ -1618,7 +1532,7 @@
                 <w:szCs w:val="28"/>
                 <w:lang w:val="ko-KR" w:eastAsia="ko-KR"/>
               </w:rPr>
-              <w:t xml:space="preserve">필수</w:t>
+              <w:t xml:space="preserve">반복 업무 패턴화·솔루션 제안</w:t>
             </w:r>
           </w:p>
         </w:tc>
@@ -1639,7 +1553,7 @@
                 <w:szCs w:val="28"/>
                 <w:lang w:val="ko-KR" w:eastAsia="ko-KR"/>
               </w:rPr>
-              <w:t xml:space="preserve">반복 업무 패턴화와 효율화 솔루션 한 개</w:t>
+              <w:t xml:space="preserve">자료 취합·문서 정리를 반복하고 제안을 검토</w:t>
             </w:r>
           </w:p>
         </w:tc>
@@ -1660,7 +1574,7 @@
                 <w:szCs w:val="28"/>
                 <w:lang w:val="ko-KR" w:eastAsia="ko-KR"/>
               </w:rPr>
-              <w:t xml:space="preserve">실제 반복 작업의 근거와 개선 단계를 설명하고, 자동화 설계안 또는 템플릿 제시</w:t>
+              <w:t xml:space="preserve">반복 근거와 개선 단계·조건을 담은 솔루션 한 개, 자동화 설계안 또는 템플릿</w:t>
             </w:r>
           </w:p>
         </w:tc>
@@ -1686,7 +1600,7 @@
                 <w:szCs w:val="28"/>
                 <w:lang w:val="ko-KR" w:eastAsia="ko-KR"/>
               </w:rPr>
-              <w:t xml:space="preserve">필수</w:t>
+              <w:t xml:space="preserve">업무 회고·일일 보고</w:t>
             </w:r>
           </w:p>
         </w:tc>
@@ -1707,7 +1621,7 @@
                 <w:szCs w:val="28"/>
                 <w:lang w:val="ko-KR" w:eastAsia="ko-KR"/>
               </w:rPr>
-              <w:t xml:space="preserve">업무 회고와 일일 보고 초안</w:t>
+              <w:t xml:space="preserve">기간을 선택해 업무를 돌아보고 결과·이슈를 보완</w:t>
             </w:r>
           </w:p>
         </w:tc>
@@ -1728,7 +1642,7 @@
                 <w:szCs w:val="28"/>
                 <w:lang w:val="ko-KR" w:eastAsia="ko-KR"/>
               </w:rPr>
-              <w:t xml:space="preserve">선택 기간의 업무 조회, 확인한 기록과 보완 정보로 초안 생성, 근거 열기·수정·저장·텍스트 내보내기</w:t>
+              <w:t xml:space="preserve">업무 목록과 근거가 연결된 일일 보고 초안. 수정·저장·텍스트 내보내기</w:t>
             </w:r>
           </w:p>
         </w:tc>
@@ -1754,7 +1668,7 @@
                 <w:szCs w:val="28"/>
                 <w:lang w:val="ko-KR" w:eastAsia="ko-KR"/>
               </w:rPr>
-              <w:t xml:space="preserve">선택 시연</w:t>
+              <w:t xml:space="preserve">부수 기능의 선택 시연</w:t>
             </w:r>
           </w:p>
         </w:tc>
@@ -1775,7 +1689,7 @@
                 <w:szCs w:val="28"/>
                 <w:lang w:val="ko-KR" w:eastAsia="ko-KR"/>
               </w:rPr>
-              <w:t xml:space="preserve">타임테이블과 프로그램 사용 집계</w:t>
+              <w:t xml:space="preserve">시간대별 흐름과 프로그램 사용 현황 확인</w:t>
             </w:r>
           </w:p>
         </w:tc>
@@ -1796,75 +1710,7 @@
                 <w:szCs w:val="28"/>
                 <w:lang w:val="ko-KR" w:eastAsia="ko-KR"/>
               </w:rPr>
-              <w:t xml:space="preserve">관측 범위 안에서 시간대별 활동과 프로그램 사용 시간을 표시하고 미수집 구간 구분</w:t>
-            </w:r>
-          </w:p>
-        </w:tc>
-      </w:tr>
-      <w:tr>
-        <w:trPr>
-          <w:cantSplit/>
-        </w:trPr>
-        <w:tc>
-          <w:tcPr>
-            <w:tcW w:w="2072" w:type="dxa"/>
-            <w:vAlign w:val="top"/>
-          </w:tcPr>
-          <w:p>
-            <w:pPr>
-              <w:pStyle w:val="Normal"/>
-              <w:spacing w:after="40" w:line="280" w:lineRule="auto"/>
-            </w:pPr>
-            <w:r>
-              <w:rPr>
-                <w:rFonts w:ascii="바탕체" w:hAnsi="바탕체" w:eastAsia="바탕체" w:cs="바탕체"/>
-                <w:sz w:val="28"/>
-                <w:szCs w:val="28"/>
-                <w:lang w:val="ko-KR" w:eastAsia="ko-KR"/>
-              </w:rPr>
-              <w:t xml:space="preserve">확장</w:t>
-            </w:r>
-          </w:p>
-        </w:tc>
-        <w:tc>
-          <w:tcPr>
-            <w:tcW w:w="3354" w:type="dxa"/>
-            <w:vAlign w:val="top"/>
-          </w:tcPr>
-          <w:p>
-            <w:pPr>
-              <w:pStyle w:val="Normal"/>
-              <w:spacing w:after="40" w:line="280" w:lineRule="auto"/>
-            </w:pPr>
-            <w:r>
-              <w:rPr>
-                <w:rFonts w:ascii="바탕체" w:hAnsi="바탕체" w:eastAsia="바탕체" w:cs="바탕체"/>
-                <w:sz w:val="28"/>
-                <w:szCs w:val="28"/>
-                <w:lang w:val="ko-KR" w:eastAsia="ko-KR"/>
-              </w:rPr>
-              <w:t xml:space="preserve">세부 조건·문서 서식·지원 환경 확대</w:t>
-            </w:r>
-          </w:p>
-        </w:tc>
-        <w:tc>
-          <w:tcPr>
-            <w:tcW w:w="4440" w:type="dxa"/>
-            <w:vAlign w:val="top"/>
-          </w:tcPr>
-          <w:p>
-            <w:pPr>
-              <w:pStyle w:val="Normal"/>
-              <w:spacing w:after="40" w:line="280" w:lineRule="auto"/>
-            </w:pPr>
-            <w:r>
-              <w:rPr>
-                <w:rFonts w:ascii="바탕체" w:hAnsi="바탕체" w:eastAsia="바탕체" w:cs="바탕체"/>
-                <w:sz w:val="28"/>
-                <w:szCs w:val="28"/>
-                <w:lang w:val="ko-KR" w:eastAsia="ko-KR"/>
-              </w:rPr>
-              <w:t xml:space="preserve">메신저 대화 상대 등 앱별 세부 필터, 주간·월간 보고와 다양한 서식, 정기 문서 생성, 고급 편집과 다양한 앱·운영체제 지원</w:t>
+              <w:t xml:space="preserve">관측한 범위의 타임테이블·프로그램 집계와 미수집 구간 표시</w:t>
             </w:r>
           </w:p>
         </w:tc>
@@ -1881,7 +1727,7 @@
           <w:szCs w:val="28"/>
           <w:lang w:val="ko-KR" w:eastAsia="ko-KR"/>
         </w:rPr>
-        <w:t xml:space="preserve">1일 차 오전에는 시연 앱과 수집 조건을 정하고, 로컬에서 허용 여부를 판별한 뒤 최소 맥락을 수집·저장하는 기능을 구현한다. 오후에는 LLM API를 연결해 업무 자동 분류와 간단한 수정·확인을 개발한다. 2일 차에는 반복 흐름의 패턴화와 솔루션 카드, 일일 보고 초안의 근거 연결·내보내기를 구현한다. 허용·비허용 파일과 사이트를 섞어 개인정보 보호 조건도 함께 검증한다.</w:t>
+        <w:t xml:space="preserve">대표 시연은 두 개 이상의 프로그램에서 ‘스프레드시트 자료 취합 → 업무 사이트 확인 → 문서 정리’를 수행하는 흐름으로 구성한다. 1일 차에는 허용 조건 판별·수집·로컬 저장과 AI 자동 분류를 연결하고, 2일 차에는 반복 패턴·솔루션 한 개와 일일 보고 초안·근거 연결·내보내기를 구현할 계획이다.</w:t>
       </w:r>
     </w:p>
     <w:p>
@@ -1895,7 +1741,7 @@
           <w:szCs w:val="28"/>
           <w:lang w:val="ko-KR" w:eastAsia="ko-KR"/>
         </w:rPr>
-        <w:t xml:space="preserve">짧은 시연에는 실제 수집한 날짜·프로그램·범위를 표시한다. 여러 날의 누적과 다양한 직무의 활용 모습은 별도의 가상 자료로 설명한다. 메신저의 대화 상대 식별 등 앱별 세부 수집 조건은 접근성 API·연동 지원을 확인한 범위에서만 구현하고, 조건을 확인할 수 없으면 수집하지 않는다. 다양한 앱·운영체제 호환성, 하루 연속 기록과 개선안의 실제 효과는 후속 검증 대상으로 둔다.</w:t>
+        <w:t xml:space="preserve">허용·비허용 파일과 사이트를 섞어 제외한 개인 작업이 저장·전송되지 않는지도 확인한다. 실제 수집한 날짜·프로그램·범위를 표시하고, 여러 날의 누적 모습은 별도의 가상 자료로 설명한다.</w:t>
       </w:r>
     </w:p>
     <w:p>
@@ -1909,23 +1755,13 @@
           <w:szCs w:val="28"/>
           <w:lang w:val="ko-KR" w:eastAsia="ko-KR"/>
         </w:rPr>
-        <w:t xml:space="preserve">구현 후에는 다음 순서로 시연할 계획이다.</w:t>
-      </w:r>
-    </w:p>
-    <w:p>
-      <w:pPr>
-        <w:pStyle w:val="Normal"/>
-        <w:ind w:left="420" w:hanging="420"/>
-      </w:pPr>
-      <w:r>
-        <w:rPr>
-          <w:rFonts w:ascii="바탕체" w:hAnsi="바탕체" w:eastAsia="바탕체" w:cs="바탕체"/>
-          <w:sz w:val="28"/>
-          <w:szCs w:val="28"/>
-          <w:lang w:val="ko-KR" w:eastAsia="ko-KR"/>
-        </w:rPr>
-        <w:t xml:space="preserve">1. </w:t>
-      </w:r>
+        <w:t xml:space="preserve">타임테이블·프로그램 집계는 여유가 있을 때 시연한다. 메신저 대화 상대 등 추가 세부 필터, 주간·월간 보고·다양한 서식·정기 문서 생성, 고급 편집과 여러 앱·운영체제 지원은 후속 확장으로 둔다. 앱별 조건을 판별할 수 없으면 해당 작업은 수집하지 않는다.</w:t>
+      </w:r>
+    </w:p>
+    <w:p>
+      <w:pPr>
+        <w:pStyle w:val="Heading1"/>
+      </w:pPr>
       <w:r>
         <w:rPr>
           <w:rFonts w:ascii="바탕체" w:hAnsi="바탕체" w:eastAsia="바탕체" w:cs="바탕체"/>
@@ -1935,31 +1771,35 @@
           <w:b/>
           <w:bCs/>
         </w:rPr>
-        <w:t xml:space="preserve">수집 범위 선택:</w:t>
-      </w:r>
-      <w:r>
-        <w:rPr>
-          <w:rFonts w:ascii="바탕체" w:hAnsi="바탕체" w:eastAsia="바탕체" w:cs="바탕체"/>
-          <w:sz w:val="28"/>
-          <w:szCs w:val="28"/>
-          <w:lang w:val="ko-KR" w:eastAsia="ko-KR"/>
-        </w:rPr>
-        <w:t xml:space="preserve"> 업무용 프로그램과 파일명·사이트 조건을 지정하고, 제외한 개인 작업이 저장되지 않는지 보여준다.</w:t>
+        <w:t xml:space="preserve">4. 이 아이디어의 주요 사용자는 누구이며, 어떤 기대효과가 있나요?</w:t>
+      </w:r>
+    </w:p>
+    <w:p>
+      <w:pPr>
+        <w:pStyle w:val="Guidance"/>
+      </w:pPr>
+      <w:r>
+        <w:rPr>
+          <w:rFonts w:ascii="바탕체" w:hAnsi="바탕체" w:eastAsia="바탕체" w:cs="바탕체"/>
+          <w:sz w:val="28"/>
+          <w:szCs w:val="28"/>
+          <w:lang w:val="ko-KR" w:eastAsia="ko-KR"/>
+        </w:rPr>
+        <w:t xml:space="preserve">고객 가치 창출, 오류 감소, 정보 접근성 개선, 업무 효율 향상 등 기대하는 변화를 구체적으로 적어주세요.</w:t>
       </w:r>
     </w:p>
     <w:p>
       <w:pPr>
         <w:pStyle w:val="Normal"/>
-        <w:ind w:left="420" w:hanging="420"/>
-      </w:pPr>
-      <w:r>
-        <w:rPr>
-          <w:rFonts w:ascii="바탕체" w:hAnsi="바탕체" w:eastAsia="바탕체" w:cs="바탕체"/>
-          <w:sz w:val="28"/>
-          <w:szCs w:val="28"/>
-          <w:lang w:val="ko-KR" w:eastAsia="ko-KR"/>
-        </w:rPr>
-        <w:t xml:space="preserve">2. </w:t>
+      </w:pPr>
+      <w:r>
+        <w:rPr>
+          <w:rFonts w:ascii="바탕체" w:hAnsi="바탕체" w:eastAsia="바탕체" w:cs="바탕체"/>
+          <w:sz w:val="28"/>
+          <w:szCs w:val="28"/>
+          <w:lang w:val="ko-KR" w:eastAsia="ko-KR"/>
+        </w:rPr>
+        <w:t xml:space="preserve">주요 사용자는 </w:t>
       </w:r>
       <w:r>
         <w:rPr>
@@ -1970,161 +1810,6 @@
           <w:b/>
           <w:bCs/>
         </w:rPr>
-        <w:t xml:space="preserve">평소처럼 작업:</w:t>
-      </w:r>
-      <w:r>
-        <w:rPr>
-          <w:rFonts w:ascii="바탕체" w:hAnsi="바탕체" w:eastAsia="바탕체" w:cs="바탕체"/>
-          <w:sz w:val="28"/>
-          <w:szCs w:val="28"/>
-          <w:lang w:val="ko-KR" w:eastAsia="ko-KR"/>
-        </w:rPr>
-        <w:t xml:space="preserve"> 기밀 없는 테스트 자료로 여러 프로그램을 오가며 자료 취합과 문서 정리를 반복한다.</w:t>
-      </w:r>
-    </w:p>
-    <w:p>
-      <w:pPr>
-        <w:pStyle w:val="Normal"/>
-        <w:ind w:left="420" w:hanging="420"/>
-      </w:pPr>
-      <w:r>
-        <w:rPr>
-          <w:rFonts w:ascii="바탕체" w:hAnsi="바탕체" w:eastAsia="바탕체" w:cs="바탕체"/>
-          <w:sz w:val="28"/>
-          <w:szCs w:val="28"/>
-          <w:lang w:val="ko-KR" w:eastAsia="ko-KR"/>
-        </w:rPr>
-        <w:t xml:space="preserve">3. </w:t>
-      </w:r>
-      <w:r>
-        <w:rPr>
-          <w:rFonts w:ascii="바탕체" w:hAnsi="바탕체" w:eastAsia="바탕체" w:cs="바탕체"/>
-          <w:sz w:val="28"/>
-          <w:szCs w:val="28"/>
-          <w:lang w:val="ko-KR" w:eastAsia="ko-KR"/>
-          <w:b/>
-          <w:bCs/>
-        </w:rPr>
-        <w:t xml:space="preserve">업무 자동 분류:</w:t>
-      </w:r>
-      <w:r>
-        <w:rPr>
-          <w:rFonts w:ascii="바탕체" w:hAnsi="바탕체" w:eastAsia="바탕체" w:cs="바탕체"/>
-          <w:sz w:val="28"/>
-          <w:szCs w:val="28"/>
-          <w:lang w:val="ko-KR" w:eastAsia="ko-KR"/>
-        </w:rPr>
-        <w:t xml:space="preserve"> 생성된 업무 카드와 연결 근거를 확인하고, 모호한 이름·분류나 잘못된 연결만 수정한다.</w:t>
-      </w:r>
-    </w:p>
-    <w:p>
-      <w:pPr>
-        <w:pStyle w:val="Normal"/>
-        <w:ind w:left="420" w:hanging="420"/>
-      </w:pPr>
-      <w:r>
-        <w:rPr>
-          <w:rFonts w:ascii="바탕체" w:hAnsi="바탕체" w:eastAsia="바탕체" w:cs="바탕체"/>
-          <w:sz w:val="28"/>
-          <w:szCs w:val="28"/>
-          <w:lang w:val="ko-KR" w:eastAsia="ko-KR"/>
-        </w:rPr>
-        <w:t xml:space="preserve">4. </w:t>
-      </w:r>
-      <w:r>
-        <w:rPr>
-          <w:rFonts w:ascii="바탕체" w:hAnsi="바탕체" w:eastAsia="바탕체" w:cs="바탕체"/>
-          <w:sz w:val="28"/>
-          <w:szCs w:val="28"/>
-          <w:lang w:val="ko-KR" w:eastAsia="ko-KR"/>
-          <w:b/>
-          <w:bCs/>
-        </w:rPr>
-        <w:t xml:space="preserve">효율화 솔루션 확인:</w:t>
-      </w:r>
-      <w:r>
-        <w:rPr>
-          <w:rFonts w:ascii="바탕체" w:hAnsi="바탕체" w:eastAsia="바탕체" w:cs="바탕체"/>
-          <w:sz w:val="28"/>
-          <w:szCs w:val="28"/>
-          <w:lang w:val="ko-KR" w:eastAsia="ko-KR"/>
-        </w:rPr>
-        <w:t xml:space="preserve"> 반복 작업의 패턴과 근거, 자동화할 단계와 적용 조건이 담긴 솔루션을 보여준다.</w:t>
-      </w:r>
-    </w:p>
-    <w:p>
-      <w:pPr>
-        <w:pStyle w:val="Normal"/>
-        <w:ind w:left="420" w:hanging="420"/>
-      </w:pPr>
-      <w:r>
-        <w:rPr>
-          <w:rFonts w:ascii="바탕체" w:hAnsi="바탕체" w:eastAsia="바탕체" w:cs="바탕체"/>
-          <w:sz w:val="28"/>
-          <w:szCs w:val="28"/>
-          <w:lang w:val="ko-KR" w:eastAsia="ko-KR"/>
-        </w:rPr>
-        <w:t xml:space="preserve">5. </w:t>
-      </w:r>
-      <w:r>
-        <w:rPr>
-          <w:rFonts w:ascii="바탕체" w:hAnsi="바탕체" w:eastAsia="바탕체" w:cs="바탕체"/>
-          <w:sz w:val="28"/>
-          <w:szCs w:val="28"/>
-          <w:lang w:val="ko-KR" w:eastAsia="ko-KR"/>
-          <w:b/>
-          <w:bCs/>
-        </w:rPr>
-        <w:t xml:space="preserve">회고·문서 자동화:</w:t>
-      </w:r>
-      <w:r>
-        <w:rPr>
-          <w:rFonts w:ascii="바탕체" w:hAnsi="바탕체" w:eastAsia="바탕체" w:cs="바탕체"/>
-          <w:sz w:val="28"/>
-          <w:szCs w:val="28"/>
-          <w:lang w:val="ko-KR" w:eastAsia="ko-KR"/>
-        </w:rPr>
-        <w:t xml:space="preserve"> 같은 업무 기록을 돌아보고 일일 보고 초안을 생성·수정·내보낸다. 구현 여유가 있으면 타임테이블과 프로그램별 사용 현황도 보여준다.</w:t>
-      </w:r>
-    </w:p>
-    <w:p>
-      <w:pPr>
-        <w:pStyle w:val="Heading1"/>
-      </w:pPr>
-      <w:r>
-        <w:rPr>
-          <w:rFonts w:ascii="바탕체" w:hAnsi="바탕체" w:eastAsia="바탕체" w:cs="바탕체"/>
-          <w:sz w:val="28"/>
-          <w:szCs w:val="28"/>
-          <w:lang w:val="ko-KR" w:eastAsia="ko-KR"/>
-          <w:b/>
-          <w:bCs/>
-        </w:rPr>
-        <w:t xml:space="preserve">4. 이 아이디어의 주요 사용자는 누구이며, 어떤 기대효과가 있나요?</w:t>
-      </w:r>
-    </w:p>
-    <w:p>
-      <w:pPr>
-        <w:pStyle w:val="Normal"/>
-      </w:pPr>
-      <w:r>
-        <w:rPr>
-          <w:rFonts w:ascii="바탕체" w:hAnsi="바탕체" w:eastAsia="바탕체" w:cs="바탕체"/>
-          <w:sz w:val="28"/>
-          <w:szCs w:val="28"/>
-          <w:lang w:val="ko-KR" w:eastAsia="ko-KR"/>
-        </w:rPr>
-        <w:t xml:space="preserve">주요 대상 사용자는 </w:t>
-      </w:r>
-      <w:r>
-        <w:rPr>
-          <w:rFonts w:ascii="바탕체" w:hAnsi="바탕체" w:eastAsia="바탕체" w:cs="바탕체"/>
-          <w:sz w:val="28"/>
-          <w:szCs w:val="28"/>
-          <w:lang w:val="ko-KR" w:eastAsia="ko-KR"/>
-          <w:b/>
-          <w:bCs/>
-        </w:rPr>
         <w:t xml:space="preserve">PC로 일하는 SDS 임직원</w:t>
       </w:r>
       <w:r>
@@ -2134,7 +1819,7 @@
           <w:szCs w:val="28"/>
           <w:lang w:val="ko-KR" w:eastAsia="ko-KR"/>
         </w:rPr>
-        <w:t xml:space="preserve">이다. 기획·개발·분석·운영·지원 등 직무와 사용하는 도구가 달라도, 일상 업무에서 반복 수작업을 줄이고 자신의 업무를 회고하려는 필요에 대응한다. 보고서 작성 여부와 관계없이 활용할 수 있으며, 장기적으로 다양한 조직과 PC 업무 사용자에게 확장할 수 있다.</w:t>
+        <w:t xml:space="preserve">이다. 기획·개발·분석·운영·지원 등 직무와 사용하는 도구가 달라도, 반복 수작업을 줄이고 자신의 업무를 돌아보려는 필요에 대응한다. 보고서 작성 여부와 관계없이 활용할 수 있으며, 장기적으로 다양한 조직의 PC 업무로 확장하고자 한다.</w:t>
       </w:r>
     </w:p>
     <w:tbl>
@@ -2210,7 +1895,7 @@
                 <w:b/>
                 <w:bCs/>
               </w:rPr>
-              <w:t xml:space="preserve">기대효과</w:t>
+              <w:t xml:space="preserve">기대하는 변화</w:t>
             </w:r>
           </w:p>
         </w:tc>
@@ -2234,7 +1919,7 @@
                 <w:b/>
                 <w:bCs/>
               </w:rPr>
-              <w:t xml:space="preserve">검증 방법</w:t>
+              <w:t xml:space="preserve">확인 방법</w:t>
             </w:r>
           </w:p>
         </w:tc>
@@ -2260,7 +1945,7 @@
                 <w:szCs w:val="28"/>
                 <w:lang w:val="ko-KR" w:eastAsia="ko-KR"/>
               </w:rPr>
-              <w:t xml:space="preserve">자료 이동·입력·검토·서식 맞춤을 반복함</w:t>
+              <w:t xml:space="preserve">자료 이동·입력·서식 맞춤 반복</w:t>
             </w:r>
           </w:p>
         </w:tc>
@@ -2281,7 +1966,7 @@
                 <w:szCs w:val="28"/>
                 <w:lang w:val="ko-KR" w:eastAsia="ko-KR"/>
               </w:rPr>
-              <w:t xml:space="preserve">패턴화한 업무를 근거로 효율화 솔루션과 적용 방법 제안</w:t>
+              <w:t xml:space="preserve">반복 패턴을 근거로 효율화 솔루션과 적용 방법 제공</w:t>
             </w:r>
           </w:p>
         </w:tc>
@@ -2302,7 +1987,7 @@
                 <w:szCs w:val="28"/>
                 <w:lang w:val="ko-KR" w:eastAsia="ko-KR"/>
               </w:rPr>
-              <w:t xml:space="preserve">유효한 반복 패턴, 실행 가능한 제안인지 사용자 검토. 적용 후 실제 변화 별도 확인</w:t>
+              <w:t xml:space="preserve">제안의 실행 가능성 검토, 적용 후 시간·수작업 변화 확인</w:t>
             </w:r>
           </w:p>
         </w:tc>
@@ -2328,7 +2013,7 @@
                 <w:szCs w:val="28"/>
                 <w:lang w:val="ko-KR" w:eastAsia="ko-KR"/>
               </w:rPr>
-              <w:t xml:space="preserve">여러 앱에 업무 맥락이 흩어져 있음</w:t>
+              <w:t xml:space="preserve">여러 앱에 업무 맥락이 흩어짐</w:t>
             </w:r>
           </w:p>
         </w:tc>
@@ -2349,7 +2034,7 @@
                 <w:szCs w:val="28"/>
                 <w:lang w:val="ko-KR" w:eastAsia="ko-KR"/>
               </w:rPr>
-              <w:t xml:space="preserve">업무 성격에 맞게 자동 연결·분류하고 누락된 일을 떠올릴 단서 제공</w:t>
+              <w:t xml:space="preserve">업무 성격에 맞게 연결·분류하고 놓친 일을 떠올릴 단서 제공</w:t>
             </w:r>
           </w:p>
         </w:tc>
@@ -2370,7 +2055,7 @@
                 <w:szCs w:val="28"/>
                 <w:lang w:val="ko-KR" w:eastAsia="ko-KR"/>
               </w:rPr>
-              <w:t xml:space="preserve">사용자 기준 업무와 카드의 연결·분류 정확성, 누락과 수정 부담 비교</w:t>
+              <w:t xml:space="preserve">사용자 기준 업무와 비교해 잘못된 연결·누락·수정 부담 확인</w:t>
             </w:r>
           </w:p>
         </w:tc>
@@ -2417,7 +2102,7 @@
                 <w:szCs w:val="28"/>
                 <w:lang w:val="ko-KR" w:eastAsia="ko-KR"/>
               </w:rPr>
-              <w:t xml:space="preserve">기간·프로젝트·업무 유형별 회고와 개선 시도 확인</w:t>
+              <w:t xml:space="preserve">기간·프로젝트별 기록과 개선 시도를 회고</w:t>
             </w:r>
           </w:p>
         </w:tc>
@@ -2438,7 +2123,7 @@
                 <w:szCs w:val="28"/>
                 <w:lang w:val="ko-KR" w:eastAsia="ko-KR"/>
               </w:rPr>
-              <w:t xml:space="preserve">기록이 업무 이해와 다음 개선 방향 설정에 도움이 되는지 확인</w:t>
+              <w:t xml:space="preserve">업무 이해와 다음 개선 방향 설정에 도움이 되는지 확인</w:t>
             </w:r>
           </w:p>
         </w:tc>
@@ -2464,7 +2149,7 @@
                 <w:szCs w:val="28"/>
                 <w:lang w:val="ko-KR" w:eastAsia="ko-KR"/>
               </w:rPr>
-              <w:t xml:space="preserve">일일·주간·월간 보고 등 문서를 반복 작성함</w:t>
+              <w:t xml:space="preserve">보고 문서를 반복 작성</w:t>
             </w:r>
           </w:p>
         </w:tc>
@@ -2485,7 +2170,7 @@
                 <w:szCs w:val="28"/>
                 <w:lang w:val="ko-KR" w:eastAsia="ko-KR"/>
               </w:rPr>
-              <w:t xml:space="preserve">같은 업무 기록으로 문서 초안 자동 생성</w:t>
+              <w:t xml:space="preserve">같은 기록으로 초안을 만들고 관련 근거에 바로 접근</w:t>
             </w:r>
           </w:p>
         </w:tc>
@@ -2506,7 +2191,7 @@
                 <w:szCs w:val="28"/>
                 <w:lang w:val="ko-KR" w:eastAsia="ko-KR"/>
               </w:rPr>
-              <w:t xml:space="preserve">수동 작성과 AI 초안 검토·보완까지의 총시간 및 사실 정확성 비교</w:t>
+              <w:t xml:space="preserve">수동 작성과 AI 초안 검토·보완까지 총시간·사실 정확성 비교</w:t>
             </w:r>
           </w:p>
         </w:tc>
@@ -2553,7 +2238,7 @@
                 <w:szCs w:val="28"/>
                 <w:lang w:val="ko-KR" w:eastAsia="ko-KR"/>
               </w:rPr>
-              <w:t xml:space="preserve">선택 범위의 타임테이블과 프로그램 사용 현황 제공</w:t>
+              <w:t xml:space="preserve">선택 범위의 타임테이블과 프로그램 사용 현황 확인</w:t>
             </w:r>
           </w:p>
         </w:tc>
@@ -2574,7 +2259,7 @@
                 <w:szCs w:val="28"/>
                 <w:lang w:val="ko-KR" w:eastAsia="ko-KR"/>
               </w:rPr>
-              <w:t xml:space="preserve">실제 테스트 구간과 집계 비교, 중복·유휴·미수집 구간 처리 확인</w:t>
+              <w:t xml:space="preserve">테스트 구간과 집계 비교, 중복·미수집 처리 확인</w:t>
             </w:r>
           </w:p>
         </w:tc>
@@ -2621,7 +2306,7 @@
                 <w:szCs w:val="28"/>
                 <w:lang w:val="ko-KR" w:eastAsia="ko-KR"/>
               </w:rPr>
-              <w:t xml:space="preserve">프로그램·파일·대화·사이트 조건으로 업무 데이터 수집 범위 직접 통제</w:t>
+              <w:t xml:space="preserve">앱 안에서도 파일·대화·사이트 조건으로 수집 범위 통제</w:t>
             </w:r>
           </w:p>
         </w:tc>
@@ -2642,75 +2327,7 @@
                 <w:szCs w:val="28"/>
                 <w:lang w:val="ko-KR" w:eastAsia="ko-KR"/>
               </w:rPr>
-              <w:t xml:space="preserve">비허용 작업이 저장·분석·외부 전송에 포함되지 않는지 검증</w:t>
-            </w:r>
-          </w:p>
-        </w:tc>
-      </w:tr>
-      <w:tr>
-        <w:trPr>
-          <w:cantSplit/>
-        </w:trPr>
-        <w:tc>
-          <w:tcPr>
-            <w:tcW w:w="2072" w:type="dxa"/>
-            <w:vAlign w:val="top"/>
-          </w:tcPr>
-          <w:p>
-            <w:pPr>
-              <w:pStyle w:val="Normal"/>
-              <w:spacing w:after="40" w:line="280" w:lineRule="auto"/>
-            </w:pPr>
-            <w:r>
-              <w:rPr>
-                <w:rFonts w:ascii="바탕체" w:hAnsi="바탕체" w:eastAsia="바탕체" w:cs="바탕체"/>
-                <w:sz w:val="28"/>
-                <w:szCs w:val="28"/>
-                <w:lang w:val="ko-KR" w:eastAsia="ko-KR"/>
-              </w:rPr>
-              <w:t xml:space="preserve">조직에서 반복 수작업 개선 대상을 찾기 어려움</w:t>
-            </w:r>
-          </w:p>
-        </w:tc>
-        <w:tc>
-          <w:tcPr>
-            <w:tcW w:w="3354" w:type="dxa"/>
-            <w:vAlign w:val="top"/>
-          </w:tcPr>
-          <w:p>
-            <w:pPr>
-              <w:pStyle w:val="Normal"/>
-              <w:spacing w:after="40" w:line="280" w:lineRule="auto"/>
-            </w:pPr>
-            <w:r>
-              <w:rPr>
-                <w:rFonts w:ascii="바탕체" w:hAnsi="바탕체" w:eastAsia="바탕체" w:cs="바탕체"/>
-                <w:sz w:val="28"/>
-                <w:szCs w:val="28"/>
-                <w:lang w:val="ko-KR" w:eastAsia="ko-KR"/>
-              </w:rPr>
-              <w:t xml:space="preserve">사용자가 선택해 공유한 요약으로 표준화·자동화 논의 지원</w:t>
-            </w:r>
-          </w:p>
-        </w:tc>
-        <w:tc>
-          <w:tcPr>
-            <w:tcW w:w="4440" w:type="dxa"/>
-            <w:vAlign w:val="top"/>
-          </w:tcPr>
-          <w:p>
-            <w:pPr>
-              <w:pStyle w:val="Normal"/>
-              <w:spacing w:after="40" w:line="280" w:lineRule="auto"/>
-            </w:pPr>
-            <w:r>
-              <w:rPr>
-                <w:rFonts w:ascii="바탕체" w:hAnsi="바탕체" w:eastAsia="바탕체" w:cs="바탕체"/>
-                <w:sz w:val="28"/>
-                <w:szCs w:val="28"/>
-                <w:lang w:val="ko-KR" w:eastAsia="ko-KR"/>
-              </w:rPr>
-              <w:t xml:space="preserve">공유한 요약이 개선 우선순위 결정에 도움이 되는지 검토</w:t>
+              <w:t xml:space="preserve">비허용 자료가 저장·분석·외부 전송에 포함되지 않는지 검증</w:t>
             </w:r>
           </w:p>
         </w:tc>
@@ -2727,7 +2344,7 @@
           <w:szCs w:val="28"/>
           <w:lang w:val="ko-KR" w:eastAsia="ko-KR"/>
         </w:rPr>
-        <w:t xml:space="preserve">해커톤에서는 분류·연결 정확성, 반복 패턴과 솔루션의 타당성, 문서 초안의 근거 품질과 전체 검토 시간을 측정한다. 최초 수집 설정과 일상적인 수정 부담도 함께 확인한다. 솔루션 제안의 유용성과 실제 적용 후의 시간 절감은 구분해 검증하며, 장기적인 업무 효율화 효과는 후속 사용을 통해 측정할 계획이다.</w:t>
+        <w:t xml:space="preserve">최초 수집 설정과 일상적인 검토·수정 부담을 함께 측정한다. 솔루션 제안의 유용성과 실제 적용 효과는 구분하고, 장기적인 시간 절감과 오류 감소는 후속 사용을 통해 검증한다. 조직에는 사용자가 선택해 공유한 업무 요약과 개선 제안으로 표준화·자동화 우선순위 논의를 도울 수 있다.</w:t>
       </w:r>
     </w:p>
     <w:p>
@@ -2741,7 +2358,7 @@
           <w:szCs w:val="28"/>
           <w:lang w:val="ko-KR" w:eastAsia="ko-KR"/>
         </w:rPr>
-        <w:t xml:space="preserve">로그만으로 모든 업무를 관측할 수 없으므로 오프라인 업무나 미지원 앱의 작업은 필요시 사용자가 추가할 수 있게 한다. 활동량·입력 횟수·유휴 시간을 개인의 생산성 점수로 환산하지 않는다. 개인 원본 기록은 자동으로 조직에 공유하지 않고, 사용자가 선택한 업무 요약과 개선 제안만 공유할 수 있도록 설계한다.</w:t>
+        <w:t xml:space="preserve">오프라인 업무나 미지원 앱의 작업은 필요시 사용자가 추가할 수 있게 한다. 관측한 활동 시간·입력 횟수·유휴 시간을 전체 근무시간이나 개인 생산성 점수로 환산하지 않는다.</w:t>
       </w:r>
     </w:p>
     <w:p>
@@ -2789,7 +2406,21 @@
           <w:b/>
           <w:bCs/>
         </w:rPr>
-        <w:t xml:space="preserve">6. [선택] 아이디어 구현에 필요한 데이터가 있나요?</w:t>
+        <w:t xml:space="preserve">6. [선택] 아이디어를 구현에 필요한 데이터가 있나요?</w:t>
+      </w:r>
+    </w:p>
+    <w:p>
+      <w:pPr>
+        <w:pStyle w:val="Guidance"/>
+      </w:pPr>
+      <w:r>
+        <w:rPr>
+          <w:rFonts w:ascii="바탕체" w:hAnsi="바탕체" w:eastAsia="바탕체" w:cs="바탕체"/>
+          <w:sz w:val="28"/>
+          <w:szCs w:val="28"/>
+          <w:lang w:val="ko-KR" w:eastAsia="ko-KR"/>
+        </w:rPr>
+        <w:t xml:space="preserve">알고 있는 범위에서 작성해 주시고 해당사항이 없거나 작성이 어려운 항목은 비워두셔도 됩니다.</w:t>
       </w:r>
     </w:p>
     <w:p>
@@ -2803,7 +2434,7 @@
           <w:szCs w:val="28"/>
           <w:lang w:val="ko-KR" w:eastAsia="ko-KR"/>
         </w:rPr>
-        <w:t xml:space="preserve">필요한 데이터는 해커톤 중 기밀 없는 테스트 업무를 수행하며 직접 수집하거나 생성할 계획이다. 여러 날의 반복 흐름을 설명할 자료는 가상의 시연 데이터로 별도 준비한다.</w:t>
+        <w:t xml:space="preserve">해커톤에서는 기밀 없는 테스트 자료로 필요한 데이터를 직접 수집·생성할 계획이다. 표에는 데이터의 원천 위치와 신규 수집·생성 예정 항목을 구분해 적었다.</w:t>
       </w:r>
     </w:p>
     <w:tbl>
@@ -2904,7 +2535,7 @@
                 <w:b/>
                 <w:bCs/>
               </w:rPr>
-              <w:t xml:space="preserve">확보·생성 방법 / 저장 계획</w:t>
+              <w:t xml:space="preserve">현재 위치 / 시스템</w:t>
             </w:r>
           </w:p>
         </w:tc>
@@ -2954,7 +2585,7 @@
                 <w:szCs w:val="28"/>
                 <w:lang w:val="ko-KR" w:eastAsia="ko-KR"/>
               </w:rPr>
-              <w:t xml:space="preserve">수집 범위 설정</w:t>
+              <w:t xml:space="preserve">데이터</w:t>
             </w:r>
           </w:p>
         </w:tc>
@@ -2975,7 +2606,7 @@
                 <w:szCs w:val="28"/>
                 <w:lang w:val="ko-KR" w:eastAsia="ko-KR"/>
               </w:rPr>
-              <w:t xml:space="preserve">허용 프로그램·파일명 키워드·대화 상대·사이트 조건, 제외 조건</w:t>
+              <w:t xml:space="preserve">시연용 업무 파일·문서와 테스트 페이지의 식별 정보</w:t>
             </w:r>
           </w:p>
         </w:tc>
@@ -2996,7 +2627,7 @@
                 <w:szCs w:val="28"/>
                 <w:lang w:val="ko-KR" w:eastAsia="ko-KR"/>
               </w:rPr>
-              <w:t xml:space="preserve">사용자가 로컬에서 설정하고 적용 가능한 앱별 범위 표시</w:t>
+              <w:t xml:space="preserve">개인 PC의 Excel·문서 편집기·테스트 사이트에서 직접 준비 예정</w:t>
             </w:r>
           </w:p>
         </w:tc>
@@ -3017,7 +2648,7 @@
                 <w:szCs w:val="28"/>
                 <w:lang w:val="ko-KR" w:eastAsia="ko-KR"/>
               </w:rPr>
-              <w:t xml:space="preserve">JSON / SQLite</w:t>
+              <w:t xml:space="preserve">XLSX·DOCX·HTML 등의 메타데이터</w:t>
             </w:r>
           </w:p>
         </w:tc>
@@ -3043,7 +2674,7 @@
                 <w:szCs w:val="28"/>
                 <w:lang w:val="ko-KR" w:eastAsia="ko-KR"/>
               </w:rPr>
-              <w:t xml:space="preserve">수집할 작업 맥락</w:t>
+              <w:t xml:space="preserve">데이터</w:t>
             </w:r>
           </w:p>
         </w:tc>
@@ -3064,7 +2695,7 @@
                 <w:szCs w:val="28"/>
                 <w:lang w:val="ko-KR" w:eastAsia="ko-KR"/>
               </w:rPr>
-              <w:t xml:space="preserve">작업 시각·사용 프로그램·문서 또는 페이지·전환 맥락</w:t>
+              <w:t xml:space="preserve">작업 시각·허용 프로그램·문서·페이지 전환·조작 대상</w:t>
             </w:r>
           </w:p>
         </w:tc>
@@ -3085,7 +2716,7 @@
                 <w:szCs w:val="28"/>
                 <w:lang w:val="ko-KR" w:eastAsia="ko-KR"/>
               </w:rPr>
-              <w:t xml:space="preserve">허용 조건에 맞는 최소 정보만 PC 수집 모듈에서 로컬 DB에 저장</w:t>
+              <w:t xml:space="preserve">개인 PC의 선택한 앱·운영체제에서 신규 수집 예정</w:t>
             </w:r>
           </w:p>
         </w:tc>
@@ -3106,7 +2737,7 @@
                 <w:szCs w:val="28"/>
                 <w:lang w:val="ko-KR" w:eastAsia="ko-KR"/>
               </w:rPr>
-              <w:t xml:space="preserve">JSON / SQLite</w:t>
+              <w:t xml:space="preserve">수집 후 JSON / SQLite</w:t>
             </w:r>
           </w:p>
         </w:tc>
@@ -3132,7 +2763,7 @@
                 <w:szCs w:val="28"/>
                 <w:lang w:val="ko-KR" w:eastAsia="ko-KR"/>
               </w:rPr>
-              <w:t xml:space="preserve">수집할 조작 기록</w:t>
+              <w:t xml:space="preserve">설정 데이터</w:t>
             </w:r>
           </w:p>
         </w:tc>
@@ -3153,7 +2784,7 @@
                 <w:szCs w:val="28"/>
                 <w:lang w:val="ko-KR" w:eastAsia="ko-KR"/>
               </w:rPr>
-              <w:t xml:space="preserve">조작 종류와 입력·클릭 대상, 수집 상태</w:t>
+              <w:t xml:space="preserve">허용 앱·파일명 키워드·대화 상대·사이트 및 제외 조건</w:t>
             </w:r>
           </w:p>
         </w:tc>
@@ -3174,7 +2805,7 @@
                 <w:szCs w:val="28"/>
                 <w:lang w:val="ko-KR" w:eastAsia="ko-KR"/>
               </w:rPr>
-              <w:t xml:space="preserve">운영체제 이벤트·접근성 API와 필요한 앱 연동으로 허용 범위만 수집</w:t>
+              <w:t xml:space="preserve">신규 로컬 설정 화면에서 사용자 지정 예정</w:t>
             </w:r>
           </w:p>
         </w:tc>
@@ -3221,7 +2852,7 @@
                 <w:szCs w:val="28"/>
                 <w:lang w:val="ko-KR" w:eastAsia="ko-KR"/>
               </w:rPr>
-              <w:t xml:space="preserve">분석·사용자 확인 데이터</w:t>
+              <w:t xml:space="preserve">생성 데이터</w:t>
             </w:r>
           </w:p>
         </w:tc>
@@ -3242,7 +2873,7 @@
                 <w:szCs w:val="28"/>
                 <w:lang w:val="ko-KR" w:eastAsia="ko-KR"/>
               </w:rPr>
-              <w:t xml:space="preserve">업무 카드·분류·근거·수정 및 확인 내역</w:t>
+              <w:t xml:space="preserve">업무 카드·분류·근거·사용자 수정·확인 내역</w:t>
             </w:r>
           </w:p>
         </w:tc>
@@ -3263,7 +2894,7 @@
                 <w:szCs w:val="28"/>
                 <w:lang w:val="ko-KR" w:eastAsia="ko-KR"/>
               </w:rPr>
-              <w:t xml:space="preserve">AI 분석 결과와 사용자 수정 내용을 로컬 DB에 저장</w:t>
+              <w:t xml:space="preserve">신규 로컬 DB에 생성·저장 예정</w:t>
             </w:r>
           </w:p>
         </w:tc>
@@ -3284,7 +2915,7 @@
                 <w:szCs w:val="28"/>
                 <w:lang w:val="ko-KR" w:eastAsia="ko-KR"/>
               </w:rPr>
-              <w:t xml:space="preserve">구조화 데이터</w:t>
+              <w:t xml:space="preserve">JSON / SQLite</w:t>
             </w:r>
           </w:p>
         </w:tc>
@@ -3310,7 +2941,7 @@
                 <w:szCs w:val="28"/>
                 <w:lang w:val="ko-KR" w:eastAsia="ko-KR"/>
               </w:rPr>
-              <w:t xml:space="preserve">솔루션·문서 데이터</w:t>
+              <w:t xml:space="preserve">생성 데이터</w:t>
             </w:r>
           </w:p>
         </w:tc>
@@ -3331,7 +2962,7 @@
                 <w:szCs w:val="28"/>
                 <w:lang w:val="ko-KR" w:eastAsia="ko-KR"/>
               </w:rPr>
-              <w:t xml:space="preserve">반복 패턴·효율화 솔루션·보고 초안과 근거 연결</w:t>
+              <w:t xml:space="preserve">반복 패턴·효율화 솔루션·보고 초안·시간 집계</w:t>
             </w:r>
           </w:p>
         </w:tc>
@@ -3352,7 +2983,7 @@
                 <w:szCs w:val="28"/>
                 <w:lang w:val="ko-KR" w:eastAsia="ko-KR"/>
               </w:rPr>
-              <w:t xml:space="preserve">업무 기록과 선택적 결과·이슈·기여 보완 내용을 활용해 생성</w:t>
+              <w:t xml:space="preserve">신규 분석 모듈에서 생성해 로컬 저장 예정</w:t>
             </w:r>
           </w:p>
         </w:tc>
@@ -3399,7 +3030,7 @@
                 <w:szCs w:val="28"/>
                 <w:lang w:val="ko-KR" w:eastAsia="ko-KR"/>
               </w:rPr>
-              <w:t xml:space="preserve">부수 집계 데이터</w:t>
+              <w:t xml:space="preserve">시연 데이터</w:t>
             </w:r>
           </w:p>
         </w:tc>
@@ -3420,7 +3051,7 @@
                 <w:szCs w:val="28"/>
                 <w:lang w:val="ko-KR" w:eastAsia="ko-KR"/>
               </w:rPr>
-              <w:t xml:space="preserve">시간대별 활동 구간·프로그램 사용 시간·업무별 시간 추정</w:t>
+              <w:t xml:space="preserve">여러 날의 반복 업무를 설명할 가상 기록</w:t>
             </w:r>
           </w:p>
         </w:tc>
@@ -3441,7 +3072,7 @@
                 <w:szCs w:val="28"/>
                 <w:lang w:val="ko-KR" w:eastAsia="ko-KR"/>
               </w:rPr>
-              <w:t xml:space="preserve">수집한 시각·전환 맥락에서 계산하고 관측 범위·미분류 구간 함께 표시</w:t>
+              <w:t xml:space="preserve">실제 수집과 구분해 별도 제작 예정</w:t>
             </w:r>
           </w:p>
         </w:tc>
@@ -3462,96 +3093,7 @@
                 <w:szCs w:val="28"/>
                 <w:lang w:val="ko-KR" w:eastAsia="ko-KR"/>
               </w:rPr>
-              <w:t xml:space="preserve">구조화 데이터</w:t>
-            </w:r>
-          </w:p>
-        </w:tc>
-      </w:tr>
-      <w:tr>
-        <w:trPr>
-          <w:cantSplit/>
-        </w:trPr>
-        <w:tc>
-          <w:tcPr>
-            <w:tcW w:w="1776" w:type="dxa"/>
-            <w:vAlign w:val="top"/>
-          </w:tcPr>
-          <w:p>
-            <w:pPr>
-              <w:pStyle w:val="Normal"/>
-              <w:spacing w:after="40" w:line="280" w:lineRule="auto"/>
-            </w:pPr>
-            <w:r>
-              <w:rPr>
-                <w:rFonts w:ascii="바탕체" w:hAnsi="바탕체" w:eastAsia="바탕체" w:cs="바탕체"/>
-                <w:sz w:val="28"/>
-                <w:szCs w:val="28"/>
-                <w:lang w:val="ko-KR" w:eastAsia="ko-KR"/>
-              </w:rPr>
-              <w:t xml:space="preserve">시연·검증 자료</w:t>
-            </w:r>
-          </w:p>
-        </w:tc>
-        <w:tc>
-          <w:tcPr>
-            <w:tcW w:w="2368" w:type="dxa"/>
-            <w:vAlign w:val="top"/>
-          </w:tcPr>
-          <w:p>
-            <w:pPr>
-              <w:pStyle w:val="Normal"/>
-              <w:spacing w:after="40" w:line="280" w:lineRule="auto"/>
-            </w:pPr>
-            <w:r>
-              <w:rPr>
-                <w:rFonts w:ascii="바탕체" w:hAnsi="바탕체" w:eastAsia="바탕체" w:cs="바탕체"/>
-                <w:sz w:val="28"/>
-                <w:szCs w:val="28"/>
-                <w:lang w:val="ko-KR" w:eastAsia="ko-KR"/>
-              </w:rPr>
-              <w:t xml:space="preserve">실제 테스트 작업과 가상의 장기 기록</w:t>
-            </w:r>
-          </w:p>
-        </w:tc>
-        <w:tc>
-          <w:tcPr>
-            <w:tcW w:w="3946" w:type="dxa"/>
-            <w:vAlign w:val="top"/>
-          </w:tcPr>
-          <w:p>
-            <w:pPr>
-              <w:pStyle w:val="Normal"/>
-              <w:spacing w:after="40" w:line="280" w:lineRule="auto"/>
-            </w:pPr>
-            <w:r>
-              <w:rPr>
-                <w:rFonts w:ascii="바탕체" w:hAnsi="바탕체" w:eastAsia="바탕체" w:cs="바탕체"/>
-                <w:sz w:val="28"/>
-                <w:szCs w:val="28"/>
-                <w:lang w:val="ko-KR" w:eastAsia="ko-KR"/>
-              </w:rPr>
-              <w:t xml:space="preserve">기밀 없는 스프레드시트·문서·테스트 페이지와 별도 자료로 직접 준비</w:t>
-            </w:r>
-          </w:p>
-        </w:tc>
-        <w:tc>
-          <w:tcPr>
-            <w:tcW w:w="1776" w:type="dxa"/>
-            <w:vAlign w:val="top"/>
-          </w:tcPr>
-          <w:p>
-            <w:pPr>
-              <w:pStyle w:val="Normal"/>
-              <w:spacing w:after="40" w:line="280" w:lineRule="auto"/>
-            </w:pPr>
-            <w:r>
-              <w:rPr>
-                <w:rFonts w:ascii="바탕체" w:hAnsi="바탕체" w:eastAsia="바탕체" w:cs="바탕체"/>
-                <w:sz w:val="28"/>
-                <w:szCs w:val="28"/>
-                <w:lang w:val="ko-KR" w:eastAsia="ko-KR"/>
-              </w:rPr>
-              <w:t xml:space="preserve">문서 / JSON / SQLite</w:t>
+              <w:t xml:space="preserve">JSON / SQLite</w:t>
             </w:r>
           </w:p>
         </w:tc>
@@ -3559,6 +3101,20 @@
     </w:tbl>
     <w:p>
       <w:pPr>
+        <w:pStyle w:val="Guidance"/>
+      </w:pPr>
+      <w:r>
+        <w:rPr>
+          <w:rFonts w:ascii="바탕체" w:hAnsi="바탕체" w:eastAsia="바탕체" w:cs="바탕체"/>
+          <w:sz w:val="28"/>
+          <w:szCs w:val="28"/>
+          <w:lang w:val="ko-KR" w:eastAsia="ko-KR"/>
+        </w:rPr>
+        <w:t xml:space="preserve">※ 데이터 외에 우수 아이디어로 선정되어 해커톤 참여 시, 필요한 사항이 있으면 함께 작성해주세요.</w:t>
+      </w:r>
+    </w:p>
+    <w:p>
+      <w:pPr>
         <w:pStyle w:val="Normal"/>
       </w:pPr>
       <w:r>
@@ -3570,6 +3126,45 @@
           <w:b/>
           <w:bCs/>
         </w:rPr>
+        <w:t xml:space="preserve">필요 지원 사항:</w:t>
+      </w:r>
+      <w:r>
+        <w:rPr>
+          <w:rFonts w:ascii="바탕체" w:hAnsi="바탕체" w:eastAsia="바탕체" w:cs="바탕체"/>
+          <w:sz w:val="28"/>
+          <w:szCs w:val="28"/>
+          <w:lang w:val="ko-KR" w:eastAsia="ko-KR"/>
+        </w:rPr>
+        <w:t xml:space="preserve"> AI 모델 호출 권한과 접속 환경, 기밀 없는 테스트 업무를 수행할 PC·프로그램, 업무 분류·솔루션·문서 초안을 검토할 SDS 임직원의 협조가 필요하다. 사내 자료를 활용할 경우에는 해당 환경에서 허용된 모델과 자료 범위를 적용한다.</w:t>
+      </w:r>
+    </w:p>
+    <w:p>
+      <w:pPr>
+        <w:pStyle w:val="Heading1"/>
+      </w:pPr>
+      <w:r>
+        <w:rPr>
+          <w:rFonts w:ascii="바탕체" w:hAnsi="바탕체" w:eastAsia="바탕체" w:cs="바탕체"/>
+          <w:sz w:val="28"/>
+          <w:szCs w:val="28"/>
+          <w:lang w:val="ko-KR" w:eastAsia="ko-KR"/>
+          <w:b/>
+          <w:bCs/>
+        </w:rPr>
+        <w:t xml:space="preserve">7. 제안해 주신 아이디어에 대해 추가로 언급하고 싶은 내용이 있으면 작성해 주세요.</w:t>
+      </w:r>
+    </w:p>
+    <w:p>
+      <w:pPr>
+        <w:pStyle w:val="Heading2"/>
+      </w:pPr>
+      <w:r>
+        <w:rPr>
+          <w:rFonts w:ascii="바탕체" w:hAnsi="바탕체" w:eastAsia="바탕체" w:cs="바탕체"/>
+          <w:sz w:val="28"/>
+          <w:szCs w:val="28"/>
+          <w:lang w:val="ko-KR" w:eastAsia="ko-KR"/>
+        </w:rPr>
         <w:t xml:space="preserve">개인정보 보호를 위한 선택적 데이터 수집</w:t>
       </w:r>
     </w:p>
@@ -3584,7 +3179,7 @@
           <w:szCs w:val="28"/>
           <w:lang w:val="ko-KR" w:eastAsia="ko-KR"/>
         </w:rPr>
-        <w:t xml:space="preserve">기본값은 수집하지 않는 상태로 두고, 사용자가 선택한 프로그램과 세부 조건에 맞는 작업만 추적하도록 설계한다. 프로그램 전체를 허용하거나, 같은 프로그램 안에서도 업무용 파일·대화·사이트로 범위를 더 좁힐 수 있게 한다.</w:t>
+        <w:t xml:space="preserve">기본값은 수집하지 않는 상태로 두고, 사용자가 선택한 프로그램과 세부 조건에 맞는 작업만 추적하도록 설계한다. 프로그램 전체를 허용하거나, 같은 프로그램 안에서도 업무용 파일·대화·사이트로 범위를 좁힐 수 있게 한다.</w:t>
       </w:r>
     </w:p>
     <w:tbl>
@@ -3820,7 +3415,7 @@
                 <w:szCs w:val="28"/>
                 <w:lang w:val="ko-KR" w:eastAsia="ko-KR"/>
               </w:rPr>
-              <w:t xml:space="preserve">같은 Excel에서도 조건 밖의 개인 파일은 제외</w:t>
+              <w:t xml:space="preserve">같은 Excel에서도 조건 밖의 개인 파일 제외</w:t>
             </w:r>
           </w:p>
         </w:tc>
@@ -3867,7 +3462,7 @@
                 <w:szCs w:val="28"/>
                 <w:lang w:val="ko-KR" w:eastAsia="ko-KR"/>
               </w:rPr>
-              <w:t xml:space="preserve">사용자가 지정한 업무 상대 또는 프로젝트 대화방만 허용</w:t>
+              <w:t xml:space="preserve">지정한 업무 상대 또는 프로젝트 대화방만 허용</w:t>
             </w:r>
           </w:p>
         </w:tc>
@@ -3888,7 +3483,7 @@
                 <w:szCs w:val="28"/>
                 <w:lang w:val="ko-KR" w:eastAsia="ko-KR"/>
               </w:rPr>
-              <w:t xml:space="preserve">지원 앱에서 식별 가능한 대화만 대상으로 하고, 다른 대화와 전체 대화 내역은 제외</w:t>
+              <w:t xml:space="preserve">식별 가능한 지원 앱의 해당 대화만 대상. 다른 대화·전체 대화 내역 제외</w:t>
             </w:r>
           </w:p>
         </w:tc>
@@ -3956,7 +3551,7 @@
                 <w:szCs w:val="28"/>
                 <w:lang w:val="ko-KR" w:eastAsia="ko-KR"/>
               </w:rPr>
-              <w:t xml:space="preserve">개인 메일·은행·개인 사이트 등 조건 밖의 탭은 제외. 전체 방문 기록·URL 쿼리는 기본 제외</w:t>
+              <w:t xml:space="preserve">조건 밖의 개인 사이트·탭 제외. 전체 방문 기록·URL 쿼리는 기본 제외</w:t>
             </w:r>
           </w:p>
         </w:tc>
@@ -3973,7 +3568,7 @@
           <w:szCs w:val="28"/>
           <w:lang w:val="ko-KR" w:eastAsia="ko-KR"/>
         </w:rPr>
-        <w:t xml:space="preserve">허용 여부는 로컬에서 최소한의 식별 정보로 먼저 판단하고, </w:t>
+        <w:t xml:space="preserve">허용 여부는 로컬에서 최소 식별 정보로 먼저 판단하고, </w:t>
       </w:r>
       <w:r>
         <w:rPr>
@@ -3984,16 +3579,16 @@
           <w:b/>
           <w:bCs/>
         </w:rPr>
-        <w:t xml:space="preserve">프로그램과 설정한 세부 조건을 함께 만족한 작업만 내용을 수집·저장</w:t>
-      </w:r>
-      <w:r>
-        <w:rPr>
-          <w:rFonts w:ascii="바탕체" w:hAnsi="바탕체" w:eastAsia="바탕체" w:cs="바탕체"/>
-          <w:sz w:val="28"/>
-          <w:szCs w:val="28"/>
-          <w:lang w:val="ko-KR" w:eastAsia="ko-KR"/>
-        </w:rPr>
-        <w:t xml:space="preserve">한다. 제외 조건을 우선 적용하며, 조건을 판별할 수 없는 작업은 수집하지 않는다. 대상 판단에 잠시 사용한 비허용 파일명·대화 상대·사이트 정보도 기록하거나 외부로 보내지 않는다. 앱·파일·대화·탭이 전환되면 조건을 다시 확인한다. 세부 식별이 가능한지는 앱별로 검증하고 지원 범위를 표시할 계획이다.</w:t>
+        <w:t xml:space="preserve">프로그램과 설정한 세부 조건을 함께 만족한 작업만 상세 맥락을 읽고 저장</w:t>
+      </w:r>
+      <w:r>
+        <w:rPr>
+          <w:rFonts w:ascii="바탕체" w:hAnsi="바탕체" w:eastAsia="바탕체" w:cs="바탕체"/>
+          <w:sz w:val="28"/>
+          <w:szCs w:val="28"/>
+          <w:lang w:val="ko-KR" w:eastAsia="ko-KR"/>
+        </w:rPr>
+        <w:t xml:space="preserve">한다. 제외 조건을 우선하고, 조건을 판별할 수 없으면 수집하지 않는다. 앱·파일·대화·탭이 전환될 때 다시 확인하며, 판단에 잠시 사용한 비허용 식별 정보도 기록하거나 외부로 보내지 않는다. 앱별 세부 식별의 지원 범위는 구현 과정에서 검증해 표시한다.</w:t>
       </w:r>
     </w:p>
     <w:p>
@@ -4007,7 +3602,7 @@
           <w:szCs w:val="28"/>
           <w:lang w:val="ko-KR" w:eastAsia="ko-KR"/>
         </w:rPr>
-        <w:t xml:space="preserve">비밀번호·인증정보 등 민감 입력, 연속 키 입력 원문, 전체 화면·클립보드 원문·문서와 대화의 전체 내용은 기본 수집 대상에서 제외한다. 기록 시작·일시중지·수집 상태 확인·전체 삭제를 제공하고, 원문은 로컬에 우선 저장하며 운영체제의 보호 기능을 활용한다. 세부 보관 기간 설정은 확장 항목으로 둔다.</w:t>
+        <w:t xml:space="preserve">비밀번호·인증정보 입력은 제외하고, 연속 키 입력 원문·전체 화면·클립보드 원문·문서와 대화의 전체 내용은 기본 수집하지 않는다. 기록 시작·일시중지·현재 수집 상태 확인·전체 삭제를 제공한다. 원문은 로컬에 우선 저장하며 운영체제 보호 기능을 활용한다.</w:t>
       </w:r>
     </w:p>
     <w:p>
@@ -4021,13 +3616,22 @@
           <w:szCs w:val="28"/>
           <w:lang w:val="ko-KR" w:eastAsia="ko-KR"/>
         </w:rPr>
-        <w:t xml:space="preserve">수집 허용과 외부 AI 전송 허용은 별도로 설정한다. 외부 모델 분석을 사용할 때에는 허용한 자료 중 필요한 최소 맥락만 전송하고, 민감정보 가림 처리와 전송 자료 미리보기를 제공할 계획이다. 자동 분석도 사용자가 설정한 기간·자료·전송 범위 안에서만 실행한다. 원본뿐 아니라 분석 입력 사본·업무 카드·솔루션·문서 초안에도 삭제 범위를 적용한다. 이러한 설계의 실제 차단 동작은 허용·비허용 작업을 섞은 테스트로 검증한다.</w:t>
+        <w:t xml:space="preserve">수집 허용과 외부 AI 전송 허용은 별도로 설정한다. 외부 모델에는 허용 자료 중 필요한 최소 맥락만 전송하고 민감정보 가림 처리와 전송 자료 미리보기를 제공할 계획이다. 자동 분석도 사용자가 정한 범위에서만 실행한다. 삭제는 원본과 분석 입력 사본·업무 카드·솔루션·문서 초안·시간 집계에 함께 적용한다. 개인 원본을 조직에 자동 공유하지 않고, 사용자가 선택한 요약과 제안만 공유할 수 있도록 한다.</w:t>
       </w:r>
     </w:p>
     <w:p>
       <w:pPr>
         <w:pStyle w:val="Normal"/>
       </w:pPr>
+      <w:r>
+        <w:rPr>
+          <w:rFonts w:ascii="바탕체" w:hAnsi="바탕체" w:eastAsia="바탕체" w:cs="바탕체"/>
+          <w:sz w:val="28"/>
+          <w:szCs w:val="28"/>
+          <w:lang w:val="ko-KR" w:eastAsia="ko-KR"/>
+        </w:rPr>
+        <w:t xml:space="preserve">장기적으로는 솔루션 적용 전후 비교, 직무별 템플릿과 지원 환경을 확장하고자 한다. </w:t>
+      </w:r>
       <w:r>
         <w:rPr>
           <w:rFonts w:ascii="바탕체" w:hAnsi="바탕체" w:eastAsia="바탕체" w:cs="바탕체"/>
@@ -4037,371 +3641,16 @@
           <w:b/>
           <w:bCs/>
         </w:rPr>
-        <w:t xml:space="preserve">필요 지원 사항:</w:t>
-      </w:r>
-      <w:r>
-        <w:rPr>
-          <w:rFonts w:ascii="바탕체" w:hAnsi="바탕체" w:eastAsia="바탕체" w:cs="바탕체"/>
-          <w:sz w:val="28"/>
-          <w:szCs w:val="28"/>
-          <w:lang w:val="ko-KR" w:eastAsia="ko-KR"/>
-        </w:rPr>
-        <w:t xml:space="preserve"> 사용할 AI 모델의 호출 권한과 접속 환경, 기밀 없는 테스트 업무를 수행할 PC와 프로그램, 다양한 직무의 업무 분류·솔루션·문서 초안을 검토할 SDS 임직원의 협조가 필요하다. 사내 자료에는 해당 환경에서 허용된 모델과 자료 범위를 적용한다.</w:t>
-      </w:r>
-    </w:p>
-    <w:p>
-      <w:pPr>
-        <w:pStyle w:val="Heading1"/>
-      </w:pPr>
-      <w:r>
-        <w:rPr>
-          <w:rFonts w:ascii="바탕체" w:hAnsi="바탕체" w:eastAsia="바탕체" w:cs="바탕체"/>
-          <w:sz w:val="28"/>
-          <w:szCs w:val="28"/>
-          <w:lang w:val="ko-KR" w:eastAsia="ko-KR"/>
-          <w:b/>
-          <w:bCs/>
-        </w:rPr>
-        <w:t xml:space="preserve">7. 제안해 주신 아이디어에 대해 추가로 언급하고 싶은 내용이 있으면 작성해 주세요.</w:t>
-      </w:r>
-    </w:p>
-    <w:p>
-      <w:pPr>
-        <w:pStyle w:val="Normal"/>
-      </w:pPr>
-      <w:r>
-        <w:rPr>
-          <w:rFonts w:ascii="바탕체" w:hAnsi="바탕체" w:eastAsia="바탕체" w:cs="바탕체"/>
-          <w:sz w:val="28"/>
-          <w:szCs w:val="28"/>
-          <w:lang w:val="ko-KR" w:eastAsia="ko-KR"/>
-        </w:rPr>
-        <w:t xml:space="preserve">WorkMemory AI를 통해 검증하고자 하는 가설은 </w:t>
-      </w:r>
-      <w:r>
-        <w:rPr>
-          <w:rFonts w:ascii="바탕체" w:hAnsi="바탕체" w:eastAsia="바탕체" w:cs="바탕체"/>
-          <w:sz w:val="28"/>
-          <w:szCs w:val="28"/>
-          <w:lang w:val="ko-KR" w:eastAsia="ko-KR"/>
-          <w:b/>
-          <w:bCs/>
-        </w:rPr>
-        <w:t xml:space="preserve">평소처럼 일하며 쌓인 데이터를 업무 성격에 맞게 분류·패턴화하면, 반복 업무를 줄일 구체적인 솔루션을 제안하고 회고·문서 작성에도 재사용할 수 있는가</w:t>
-      </w:r>
-      <w:r>
-        <w:rPr>
-          <w:rFonts w:ascii="바탕체" w:hAnsi="바탕체" w:eastAsia="바탕체" w:cs="바탕체"/>
-          <w:sz w:val="28"/>
-          <w:szCs w:val="28"/>
-          <w:lang w:val="ko-KR" w:eastAsia="ko-KR"/>
-        </w:rPr>
-        <w:t xml:space="preserve">다. Excel·브라우저·문서 편집기·개발 도구는 서로 다른 작업이 이어지는 활용 예시다.</w:t>
-      </w:r>
-    </w:p>
-    <w:tbl>
-      <w:tblPr>
-        <w:tblW w:w="9866" w:type="dxa"/>
-        <w:tblBorders>
-          <w:top w:val="single" w:sz="4" w:color="808080"/>
-          <w:left w:val="single" w:sz="4" w:color="808080"/>
-          <w:bottom w:val="single" w:sz="4" w:color="808080"/>
-          <w:right w:val="single" w:sz="4" w:color="808080"/>
-          <w:insideH w:val="single" w:sz="4" w:color="808080"/>
-          <w:insideV w:val="single" w:sz="4" w:color="808080"/>
-        </w:tblBorders>
-        <w:tblLayout w:type="fixed"/>
-        <w:tblCellMar>
-          <w:top w:w="100" w:type="dxa"/>
-          <w:left w:w="100" w:type="dxa"/>
-          <w:bottom w:w="100" w:type="dxa"/>
-          <w:right w:w="100" w:type="dxa"/>
-        </w:tblCellMar>
-      </w:tblPr>
-      <w:tblGrid>
-        <w:gridCol w:w="3453"/>
-        <w:gridCol w:w="6413"/>
-      </w:tblGrid>
-      <w:tr>
-        <w:trPr>
-          <w:cantSplit/>
-          <w:tblHeader/>
-        </w:trPr>
-        <w:tc>
-          <w:tcPr>
-            <w:tcW w:w="3453" w:type="dxa"/>
-            <w:shd w:val="clear" w:fill="EEEEEE"/>
-            <w:vAlign w:val="top"/>
-          </w:tcPr>
-          <w:p>
-            <w:pPr>
-              <w:pStyle w:val="Normal"/>
-              <w:spacing w:after="40" w:line="280" w:lineRule="auto"/>
-            </w:pPr>
-            <w:r>
-              <w:rPr>
-                <w:rFonts w:ascii="바탕체" w:hAnsi="바탕체" w:eastAsia="바탕체" w:cs="바탕체"/>
-                <w:sz w:val="28"/>
-                <w:szCs w:val="28"/>
-                <w:lang w:val="ko-KR" w:eastAsia="ko-KR"/>
-                <w:b/>
-                <w:bCs/>
-              </w:rPr>
-              <w:t xml:space="preserve">집중할 지점</w:t>
-            </w:r>
-          </w:p>
-        </w:tc>
-        <w:tc>
-          <w:tcPr>
-            <w:tcW w:w="6413" w:type="dxa"/>
-            <w:shd w:val="clear" w:fill="EEEEEE"/>
-            <w:vAlign w:val="top"/>
-          </w:tcPr>
-          <w:p>
-            <w:pPr>
-              <w:pStyle w:val="Normal"/>
-              <w:spacing w:after="40" w:line="280" w:lineRule="auto"/>
-            </w:pPr>
-            <w:r>
-              <w:rPr>
-                <w:rFonts w:ascii="바탕체" w:hAnsi="바탕체" w:eastAsia="바탕체" w:cs="바탕체"/>
-                <w:sz w:val="28"/>
-                <w:szCs w:val="28"/>
-                <w:lang w:val="ko-KR" w:eastAsia="ko-KR"/>
-                <w:b/>
-                <w:bCs/>
-              </w:rPr>
-              <w:t xml:space="preserve">제공하려는 경험</w:t>
-            </w:r>
-          </w:p>
-        </w:tc>
-      </w:tr>
-      <w:tr>
-        <w:trPr>
-          <w:cantSplit/>
-        </w:trPr>
-        <w:tc>
-          <w:tcPr>
-            <w:tcW w:w="3453" w:type="dxa"/>
-            <w:vAlign w:val="top"/>
-          </w:tcPr>
-          <w:p>
-            <w:pPr>
-              <w:pStyle w:val="Normal"/>
-              <w:spacing w:after="40" w:line="280" w:lineRule="auto"/>
-            </w:pPr>
-            <w:r>
-              <w:rPr>
-                <w:rFonts w:ascii="바탕체" w:hAnsi="바탕체" w:eastAsia="바탕체" w:cs="바탕체"/>
-                <w:sz w:val="28"/>
-                <w:szCs w:val="28"/>
-                <w:lang w:val="ko-KR" w:eastAsia="ko-KR"/>
-              </w:rPr>
-              <w:t xml:space="preserve">업무 데이터의 자동 축적과 분류</w:t>
-            </w:r>
-          </w:p>
-        </w:tc>
-        <w:tc>
-          <w:tcPr>
-            <w:tcW w:w="6413" w:type="dxa"/>
-            <w:vAlign w:val="top"/>
-          </w:tcPr>
-          <w:p>
-            <w:pPr>
-              <w:pStyle w:val="Normal"/>
-              <w:spacing w:after="40" w:line="280" w:lineRule="auto"/>
-            </w:pPr>
-            <w:r>
-              <w:rPr>
-                <w:rFonts w:ascii="바탕체" w:hAnsi="바탕체" w:eastAsia="바탕체" w:cs="바탕체"/>
-                <w:sz w:val="28"/>
-                <w:szCs w:val="28"/>
-                <w:lang w:val="ko-KR" w:eastAsia="ko-KR"/>
-              </w:rPr>
-              <w:t xml:space="preserve">처음 정한 수집 범위 안에서 평소처럼 일하면 기록이 쌓이고 업무 성격에 맞게 정리</w:t>
-            </w:r>
-          </w:p>
-        </w:tc>
-      </w:tr>
-      <w:tr>
-        <w:trPr>
-          <w:cantSplit/>
-        </w:trPr>
-        <w:tc>
-          <w:tcPr>
-            <w:tcW w:w="3453" w:type="dxa"/>
-            <w:vAlign w:val="top"/>
-          </w:tcPr>
-          <w:p>
-            <w:pPr>
-              <w:pStyle w:val="Normal"/>
-              <w:spacing w:after="40" w:line="280" w:lineRule="auto"/>
-            </w:pPr>
-            <w:r>
-              <w:rPr>
-                <w:rFonts w:ascii="바탕체" w:hAnsi="바탕체" w:eastAsia="바탕체" w:cs="바탕체"/>
-                <w:sz w:val="28"/>
-                <w:szCs w:val="28"/>
-                <w:lang w:val="ko-KR" w:eastAsia="ko-KR"/>
-              </w:rPr>
-              <w:t xml:space="preserve">패턴화에서 효율화 솔루션으로 연결</w:t>
-            </w:r>
-          </w:p>
-        </w:tc>
-        <w:tc>
-          <w:tcPr>
-            <w:tcW w:w="6413" w:type="dxa"/>
-            <w:vAlign w:val="top"/>
-          </w:tcPr>
-          <w:p>
-            <w:pPr>
-              <w:pStyle w:val="Normal"/>
-              <w:spacing w:after="40" w:line="280" w:lineRule="auto"/>
-            </w:pPr>
-            <w:r>
-              <w:rPr>
-                <w:rFonts w:ascii="바탕체" w:hAnsi="바탕체" w:eastAsia="바탕체" w:cs="바탕체"/>
-                <w:sz w:val="28"/>
-                <w:szCs w:val="28"/>
-                <w:lang w:val="ko-KR" w:eastAsia="ko-KR"/>
-              </w:rPr>
-              <w:t xml:space="preserve">반복 근거·개선 단계·적용 조건을 담은 자동화 설계안과 템플릿 제안·제공</w:t>
-            </w:r>
-          </w:p>
-        </w:tc>
-      </w:tr>
-      <w:tr>
-        <w:trPr>
-          <w:cantSplit/>
-        </w:trPr>
-        <w:tc>
-          <w:tcPr>
-            <w:tcW w:w="3453" w:type="dxa"/>
-            <w:vAlign w:val="top"/>
-          </w:tcPr>
-          <w:p>
-            <w:pPr>
-              <w:pStyle w:val="Normal"/>
-              <w:spacing w:after="40" w:line="280" w:lineRule="auto"/>
-            </w:pPr>
-            <w:r>
-              <w:rPr>
-                <w:rFonts w:ascii="바탕체" w:hAnsi="바탕체" w:eastAsia="바탕체" w:cs="바탕체"/>
-                <w:sz w:val="28"/>
-                <w:szCs w:val="28"/>
-                <w:lang w:val="ko-KR" w:eastAsia="ko-KR"/>
-              </w:rPr>
-              <w:t xml:space="preserve">나의 업무 회고와 문서 자동화</w:t>
-            </w:r>
-          </w:p>
-        </w:tc>
-        <w:tc>
-          <w:tcPr>
-            <w:tcW w:w="6413" w:type="dxa"/>
-            <w:vAlign w:val="top"/>
-          </w:tcPr>
-          <w:p>
-            <w:pPr>
-              <w:pStyle w:val="Normal"/>
-              <w:spacing w:after="40" w:line="280" w:lineRule="auto"/>
-            </w:pPr>
-            <w:r>
-              <w:rPr>
-                <w:rFonts w:ascii="바탕체" w:hAnsi="바탕체" w:eastAsia="바탕체" w:cs="바탕체"/>
-                <w:sz w:val="28"/>
-                <w:szCs w:val="28"/>
-                <w:lang w:val="ko-KR" w:eastAsia="ko-KR"/>
-              </w:rPr>
-              <w:t xml:space="preserve">같은 기록으로 업무 흐름을 돌아보고 일일·주간·월간 보고 등 필요한 문서 작성</w:t>
-            </w:r>
-          </w:p>
-        </w:tc>
-      </w:tr>
-      <w:tr>
-        <w:trPr>
-          <w:cantSplit/>
-        </w:trPr>
-        <w:tc>
-          <w:tcPr>
-            <w:tcW w:w="3453" w:type="dxa"/>
-            <w:vAlign w:val="top"/>
-          </w:tcPr>
-          <w:p>
-            <w:pPr>
-              <w:pStyle w:val="Normal"/>
-              <w:spacing w:after="40" w:line="280" w:lineRule="auto"/>
-            </w:pPr>
-            <w:r>
-              <w:rPr>
-                <w:rFonts w:ascii="바탕체" w:hAnsi="바탕체" w:eastAsia="바탕체" w:cs="바탕체"/>
-                <w:sz w:val="28"/>
-                <w:szCs w:val="28"/>
-                <w:lang w:val="ko-KR" w:eastAsia="ko-KR"/>
-              </w:rPr>
-              <w:t xml:space="preserve">필요한 범위만 선택해 수집</w:t>
-            </w:r>
-          </w:p>
-        </w:tc>
-        <w:tc>
-          <w:tcPr>
-            <w:tcW w:w="6413" w:type="dxa"/>
-            <w:vAlign w:val="top"/>
-          </w:tcPr>
-          <w:p>
-            <w:pPr>
-              <w:pStyle w:val="Normal"/>
-              <w:spacing w:after="40" w:line="280" w:lineRule="auto"/>
-            </w:pPr>
-            <w:r>
-              <w:rPr>
-                <w:rFonts w:ascii="바탕체" w:hAnsi="바탕체" w:eastAsia="바탕체" w:cs="바탕체"/>
-                <w:sz w:val="28"/>
-                <w:szCs w:val="28"/>
-                <w:lang w:val="ko-KR" w:eastAsia="ko-KR"/>
-              </w:rPr>
-              <w:t xml:space="preserve">프로그램 안에서도 파일·대화·사이트 조건을 정해 개인 작업의 수집을 제한</w:t>
-            </w:r>
-          </w:p>
-        </w:tc>
-      </w:tr>
-    </w:tbl>
-    <w:p>
-      <w:pPr>
-        <w:pStyle w:val="Normal"/>
-      </w:pPr>
-      <w:r>
-        <w:rPr>
-          <w:rFonts w:ascii="바탕체" w:hAnsi="바탕체" w:eastAsia="바탕체" w:cs="바탕체"/>
-          <w:sz w:val="28"/>
-          <w:szCs w:val="28"/>
-          <w:lang w:val="ko-KR" w:eastAsia="ko-KR"/>
-        </w:rPr>
-        <w:t xml:space="preserve">타임테이블과 프로그램 사용 현황은 부수 기능으로 제공한다. 수집·분석·공유 범위와 활용할 솔루션·문서는 사용자가 선택하며, 향후 솔루션 적용 전후 비교와 지원 환경 확장을 검토한다.</w:t>
-      </w:r>
-    </w:p>
-    <w:p>
-      <w:pPr>
-        <w:pStyle w:val="Normal"/>
-      </w:pPr>
-      <w:r>
-        <w:rPr>
-          <w:rFonts w:ascii="바탕체" w:hAnsi="바탕체" w:eastAsia="바탕체" w:cs="바탕체"/>
-          <w:sz w:val="28"/>
-          <w:szCs w:val="28"/>
-          <w:lang w:val="ko-KR" w:eastAsia="ko-KR"/>
-          <w:b/>
-          <w:bCs/>
-        </w:rPr>
-        <w:t xml:space="preserve">반복 업무의 발견이 효율화 솔루션과 업무 회고·문서 초안으로 이어지는 순간</w:t>
-      </w:r>
-      <w:r>
-        <w:rPr>
-          <w:rFonts w:ascii="바탕체" w:hAnsi="바탕체" w:eastAsia="바탕체" w:cs="바탕체"/>
-          <w:sz w:val="28"/>
-          <w:szCs w:val="28"/>
-          <w:lang w:val="ko-KR" w:eastAsia="ko-KR"/>
-        </w:rPr>
-        <w:t xml:space="preserve">을 핵심 장면으로 시연할 계획이다.</w:t>
+        <w:t xml:space="preserve">반복 업무의 발견이 효율화 솔루션으로 이어지고, 같은 기록이 업무 회고와 문서 초안에 활용되는 경험</w:t>
+      </w:r>
+      <w:r>
+        <w:rPr>
+          <w:rFonts w:ascii="바탕체" w:hAnsi="바탕체" w:eastAsia="바탕체" w:cs="바탕체"/>
+          <w:sz w:val="28"/>
+          <w:szCs w:val="28"/>
+          <w:lang w:val="ko-KR" w:eastAsia="ko-KR"/>
+        </w:rPr>
+        <w:t xml:space="preserve">을 핵심 가치로 둔다.</w:t>
       </w:r>
     </w:p>
     <w:sectPr>
@@ -4437,6 +3686,24 @@
       <w:sz w:val="28"/>
       <w:szCs w:val="28"/>
       <w:lang w:val="ko-KR" w:eastAsia="ko-KR"/>
+    </w:rPr>
+  </w:style>
+  <w:style w:type="paragraph" w:styleId="Guidance">
+    <w:name w:val="양식 안내"/>
+    <w:basedOn w:val="Normal"/>
+    <w:next w:val="Normal"/>
+    <w:pPr>
+      <w:keepNext/>
+      <w:keepLines/>
+      <w:ind w:left="120" w:right="120"/>
+      <w:shd w:val="clear" w:fill="F2F4F1"/>
+    </w:pPr>
+    <w:rPr>
+      <w:rFonts w:ascii="바탕체" w:hAnsi="바탕체" w:eastAsia="바탕체" w:cs="바탕체"/>
+      <w:sz w:val="28"/>
+      <w:szCs w:val="28"/>
+      <w:lang w:val="ko-KR" w:eastAsia="ko-KR"/>
+      <w:color w:val="59635B"/>
     </w:rPr>
   </w:style>
   <w:style w:type="paragraph" w:styleId="Title">

</xml_diff>

<commit_message>
docs: clarify proposal flow and use formal Korean
</commit_message>
<xml_diff>
--- a/AX-hackathon-proposal.docx
+++ b/AX-hackathon-proposal.docx
@@ -68,58 +68,16 @@
           <w:b/>
           <w:bCs/>
         </w:rPr>
-        <w:t xml:space="preserve">WorkMemory AI — 업무를 패턴화해 효율화 솔루션을 제안하는 AI 업무 비서</w:t>
-      </w:r>
-      <w:r>
-        <w:rPr>
-          <w:rFonts w:ascii="바탕체" w:hAnsi="바탕체" w:eastAsia="바탕체" w:cs="바탕체"/>
-          <w:sz w:val="28"/>
-          <w:szCs w:val="28"/>
-          <w:lang w:val="ko-KR" w:eastAsia="ko-KR"/>
-        </w:rPr>
-        <w:t xml:space="preserve">다. PC에서 평소처럼 일하면 사용자가 허용한 업무 데이터가 자동으로 쌓이고, AI가 업무 성격에 맞게 정리해 개선 방법과 필요한 문서 초안을 제공하는 경험을 만들고자 한다.</w:t>
-      </w:r>
-    </w:p>
-    <w:p>
-      <w:pPr>
-        <w:pStyle w:val="Normal"/>
-      </w:pPr>
-      <w:r>
-        <w:rPr>
-          <w:rFonts w:ascii="바탕체" w:hAnsi="바탕체" w:eastAsia="바탕체" w:cs="바탕체"/>
-          <w:sz w:val="28"/>
-          <w:szCs w:val="28"/>
-          <w:lang w:val="ko-KR" w:eastAsia="ko-KR"/>
-        </w:rPr>
-        <w:t xml:space="preserve">PC 업무에서는 파일 사이의 값 복사, 시스템 조회, 문서 입력과 서식 맞춤 같은 작은 수작업이 반복된다. 여러 프로그램에 흩어진 행동을 개별 작업으로만 기억하면 어떤 절차가 반복되는지, 어느 단계를 자동화하면 좋을지 찾기 어렵다. 프로그램 사용 시간이나 입력 횟수만으로도 업무의 목적과 개선 방법을 설명하기 어렵다.</w:t>
-      </w:r>
-    </w:p>
-    <w:p>
-      <w:pPr>
-        <w:pStyle w:val="Normal"/>
-      </w:pPr>
-      <w:r>
-        <w:rPr>
-          <w:rFonts w:ascii="바탕체" w:hAnsi="바탕체" w:eastAsia="바탕체" w:cs="바탕체"/>
-          <w:sz w:val="28"/>
-          <w:szCs w:val="28"/>
-          <w:lang w:val="ko-KR" w:eastAsia="ko-KR"/>
-        </w:rPr>
-        <w:t xml:space="preserve">업무를 돌아보거나 일일·주간·월간 보고를 작성할 때에는 흩어진 자료를 다시 모아야 한다. 짧은 자료 확인·검토·동료 지원·문제 해결 과정은 기억에서 빠지기 쉽고, 별도로 기록하는 데도 시간이 든다.</w:t>
-      </w:r>
-    </w:p>
-    <w:p>
-      <w:pPr>
-        <w:pStyle w:val="Normal"/>
-      </w:pPr>
-      <w:r>
-        <w:rPr>
-          <w:rFonts w:ascii="바탕체" w:hAnsi="바탕체" w:eastAsia="바탕체" w:cs="바탕체"/>
-          <w:sz w:val="28"/>
-          <w:szCs w:val="28"/>
-          <w:lang w:val="ko-KR" w:eastAsia="ko-KR"/>
-        </w:rPr>
-        <w:t xml:space="preserve">WorkMemory AI는 </w:t>
+        <w:t xml:space="preserve">WorkMemory AI</w:t>
+      </w:r>
+      <w:r>
+        <w:rPr>
+          <w:rFonts w:ascii="바탕체" w:hAnsi="바탕체" w:eastAsia="바탕체" w:cs="바탕체"/>
+          <w:sz w:val="28"/>
+          <w:szCs w:val="28"/>
+          <w:lang w:val="ko-KR" w:eastAsia="ko-KR"/>
+        </w:rPr>
+        <w:t xml:space="preserve">입니다. 사용자가 PC에서 평소처럼 일하면 허용한 범위의 업무 데이터가 자동으로 쌓이고, AI가 여러 프로그램의 작업을 업무 성격에 맞게 연결합니다. 이를 ‘프로젝트 A 자료 취합’, ‘개발 오류 수정’처럼 </w:t>
       </w:r>
       <w:r>
         <w:rPr>
@@ -130,22 +88,45 @@
           <w:b/>
           <w:bCs/>
         </w:rPr>
-        <w:t xml:space="preserve">일상 업무 데이터의 자동 축적 → 업무 성격에 따른 자동 분류·패턴화 → 업무 효율화 솔루션 제안</w:t>
-      </w:r>
-      <w:r>
-        <w:rPr>
-          <w:rFonts w:ascii="바탕체" w:hAnsi="바탕체" w:eastAsia="바탕체" w:cs="바탕체"/>
-          <w:sz w:val="28"/>
-          <w:szCs w:val="28"/>
-          <w:lang w:val="ko-KR" w:eastAsia="ko-KR"/>
-        </w:rPr>
-        <w:t xml:space="preserve">으로 반복 수작업의 개선을 돕는다. 같은 기록으로 자신의 업무를 회고하고 필요한 문서를 자동 작성할 수 있게 한다. 처음에 수집할 프로그램과 파일·대화·사이트 조건을 정하면 그 범위 안에서 기록이 쌓이도록 설계한다. 타임테이블과 프로그램 사용 현황은 자신의 일하는 방식을 이해하는 부수 기능으로 제공한다.</w:t>
-      </w:r>
-    </w:p>
-    <w:p>
-      <w:pPr>
-        <w:pStyle w:val="Heading1"/>
-      </w:pPr>
+        <w:t xml:space="preserve">업무별 수행 내역으로 정리해 먼저 보여주는 AI 업무 비서</w:t>
+      </w:r>
+      <w:r>
+        <w:rPr>
+          <w:rFonts w:ascii="바탕체" w:hAnsi="바탕체" w:eastAsia="바탕체" w:cs="바탕체"/>
+          <w:sz w:val="28"/>
+          <w:szCs w:val="28"/>
+          <w:lang w:val="ko-KR" w:eastAsia="ko-KR"/>
+        </w:rPr>
+        <w:t xml:space="preserve">입니다.</w:t>
+      </w:r>
+    </w:p>
+    <w:p>
+      <w:pPr>
+        <w:pStyle w:val="Normal"/>
+      </w:pPr>
+      <w:r>
+        <w:rPr>
+          <w:rFonts w:ascii="바탕체" w:hAnsi="바탕체" w:eastAsia="바탕체" w:cs="바탕체"/>
+          <w:sz w:val="28"/>
+          <w:szCs w:val="28"/>
+          <w:lang w:val="ko-KR" w:eastAsia="ko-KR"/>
+        </w:rPr>
+        <w:t xml:space="preserve">여러 프로그램을 오가며 일하다 보면 하루 동안 어떤 업무를 했는지 한 번에 파악하기 어렵습니다. 짧은 자료 확인·검토·동료 지원·문제 해결 과정은 기억에서 빠지기 쉽고, 업무를 돌아보거나 보고할 때 흩어진 자료를 다시 모아야 합니다. 별도의 업무 기록을 빠짐없이 작성하는 데도 시간이 듭니다.</w:t>
+      </w:r>
+    </w:p>
+    <w:p>
+      <w:pPr>
+        <w:pStyle w:val="Normal"/>
+      </w:pPr>
+      <w:r>
+        <w:rPr>
+          <w:rFonts w:ascii="바탕체" w:hAnsi="바탕체" w:eastAsia="바탕체" w:cs="바탕체"/>
+          <w:sz w:val="28"/>
+          <w:szCs w:val="28"/>
+          <w:lang w:val="ko-KR" w:eastAsia="ko-KR"/>
+        </w:rPr>
+        <w:t xml:space="preserve">수행 내역이 쌓이면 개별 작업만 볼 때는 알아차리기 어려웠던 반복 과정도 확인할 수 있습니다. 예를 들어 여러 Excel 파일의 값을 취합하고 문서의 서식을 맞추는 일을 여러 차례 수행했다면, 비슷한 목적과 순서가 반복되는 공통 흐름으로 묶습니다. 이러한 정리를 </w:t>
+      </w:r>
       <w:r>
         <w:rPr>
           <w:rFonts w:ascii="바탕체" w:hAnsi="바탕체" w:eastAsia="바탕체" w:cs="바탕체"/>
@@ -155,27 +136,17 @@
           <w:b/>
           <w:bCs/>
         </w:rPr>
-        <w:t xml:space="preserve">2. 제안한 아이디어를 실현하기 위해 AI를 어떻게 활용할 계획인가요?</w:t>
-      </w:r>
-    </w:p>
-    <w:p>
-      <w:pPr>
-        <w:pStyle w:val="Guidance"/>
-      </w:pPr>
-      <w:r>
-        <w:rPr>
-          <w:rFonts w:ascii="바탕체" w:hAnsi="바탕체" w:eastAsia="바탕체" w:cs="바탕체"/>
-          <w:sz w:val="28"/>
-          <w:szCs w:val="28"/>
-          <w:lang w:val="ko-KR" w:eastAsia="ko-KR"/>
-        </w:rPr>
-        <w:t xml:space="preserve">AI 활용 방안과 이를 통해 문제를 해결하거나 새로운 변화를 만드는 방법을 구체적으로 작성해 주세요.</w:t>
-      </w:r>
-    </w:p>
-    <w:p>
-      <w:pPr>
-        <w:pStyle w:val="Heading2"/>
-      </w:pPr>
+        <w:t xml:space="preserve">업무 패턴화</w:t>
+      </w:r>
+      <w:r>
+        <w:rPr>
+          <w:rFonts w:ascii="바탕체" w:hAnsi="바탕체" w:eastAsia="바탕체" w:cs="바탕체"/>
+          <w:sz w:val="28"/>
+          <w:szCs w:val="28"/>
+          <w:lang w:val="ko-KR" w:eastAsia="ko-KR"/>
+        </w:rPr>
+        <w:t xml:space="preserve">라고 하며, 반복 흐름이 확인되면 자동 취합이나 공통 양식 적용처럼 수작업을 줄일 </w:t>
+      </w:r>
       <w:r>
         <w:rPr>
           <w:rFonts w:ascii="바탕체" w:hAnsi="바탕체" w:eastAsia="바탕체" w:cs="바탕체"/>
@@ -185,7 +156,16 @@
           <w:b/>
           <w:bCs/>
         </w:rPr>
-        <w:t xml:space="preserve">① 자동으로 쌓인 데이터를 업무 성격에 맞게 분류</w:t>
+        <w:t xml:space="preserve">업무 효율화 솔루션</w:t>
+      </w:r>
+      <w:r>
+        <w:rPr>
+          <w:rFonts w:ascii="바탕체" w:hAnsi="바탕체" w:eastAsia="바탕체" w:cs="바탕체"/>
+          <w:sz w:val="28"/>
+          <w:szCs w:val="28"/>
+          <w:lang w:val="ko-KR" w:eastAsia="ko-KR"/>
+        </w:rPr>
+        <w:t xml:space="preserve">, 즉 구체적인 개선 방법을 제안합니다.</w:t>
       </w:r>
     </w:p>
     <w:p>
@@ -199,7 +179,53 @@
           <w:szCs w:val="28"/>
           <w:lang w:val="ko-KR" w:eastAsia="ko-KR"/>
         </w:rPr>
-        <w:t xml:space="preserve">사용자가 허용한 작업의 시각·조작 종류·프로그램·문서·페이지·입력 또는 클릭 대상 등 최소 맥락을 로컬에 수집한다. AI는 설정한 주기에 맞춰 관련 기록을 연결하고 자료 작성·분석·개발·검토·협업 등 업무 성격에 따라 자동 분류하도록 할 계획이다. 연속 키 입력 원문과 화면 전체는 기본 수집 대상에서 제외한다.</w:t>
+        <w:t xml:space="preserve">정리된 업무 기록은 자신이 어떤 일을 했는지 돌아보는 회고에도 활용합니다. 같은 기록을 근거로 일일·주간·월간 보고와 필요한 업무 문서의 초안을 작성하고, 사용자가 실제 결과나 기여 등 부족한 내용만 보완할 수 있게 합니다. 처음에 수집할 프로그램과 파일·대화·사이트 조건을 정하면 그 범위 안에서만 기록이 쌓이도록 설계합니다. 부수적으로 업무별 시간과 프로그램 사용 현황도 제공해 자신의 일하는 방식을 돌아보도록 돕습니다.</w:t>
+      </w:r>
+    </w:p>
+    <w:p>
+      <w:pPr>
+        <w:pStyle w:val="Heading1"/>
+      </w:pPr>
+      <w:r>
+        <w:rPr>
+          <w:rFonts w:ascii="바탕체" w:hAnsi="바탕체" w:eastAsia="바탕체" w:cs="바탕체"/>
+          <w:sz w:val="28"/>
+          <w:szCs w:val="28"/>
+          <w:lang w:val="ko-KR" w:eastAsia="ko-KR"/>
+          <w:b/>
+          <w:bCs/>
+        </w:rPr>
+        <w:t xml:space="preserve">2. 제안한 아이디어를 실현하기 위해 AI를 어떻게 활용할 계획인가요?</w:t>
+      </w:r>
+    </w:p>
+    <w:p>
+      <w:pPr>
+        <w:pStyle w:val="Guidance"/>
+      </w:pPr>
+      <w:r>
+        <w:rPr>
+          <w:rFonts w:ascii="바탕체" w:hAnsi="바탕체" w:eastAsia="바탕체" w:cs="바탕체"/>
+          <w:sz w:val="28"/>
+          <w:szCs w:val="28"/>
+          <w:lang w:val="ko-KR" w:eastAsia="ko-KR"/>
+        </w:rPr>
+        <w:t xml:space="preserve">AI 활용 방안과 이를 통해 문제를 해결하거나 새로운 변화를 만드는 방법을 구체적으로 작성해 주세요.</w:t>
+      </w:r>
+    </w:p>
+    <w:p>
+      <w:pPr>
+        <w:pStyle w:val="Heading2"/>
+      </w:pPr>
+      <w:r>
+        <w:rPr>
+          <w:rFonts w:ascii="바탕체" w:hAnsi="바탕체" w:eastAsia="바탕체" w:cs="바탕체"/>
+          <w:sz w:val="28"/>
+          <w:szCs w:val="28"/>
+          <w:lang w:val="ko-KR" w:eastAsia="ko-KR"/>
+          <w:b/>
+          <w:bCs/>
+        </w:rPr>
+        <w:t xml:space="preserve">① 데이터를 자동으로 모으고 업무별 수행 내역을 먼저 정리합니다</w:t>
       </w:r>
     </w:p>
     <w:p>
@@ -213,7 +239,21 @@
           <w:szCs w:val="28"/>
           <w:lang w:val="ko-KR" w:eastAsia="ko-KR"/>
         </w:rPr>
-        <w:t xml:space="preserve">다음은 기밀 없는 시연 자료를 이용한 가상의 예시다.</w:t>
+        <w:t xml:space="preserve">사용자가 허용한 작업의 시각·조작 종류·프로그램·문서·페이지·입력 또는 클릭 대상 등 필요한 정보를 사용자 PC에 수집합니다. AI는 설정한 주기에 맞춰 관련 기록을 연결하고, 자료 작성·분석·개발·검토·협업 등 업무 성격에 따라 분류합니다. 그 결과를 업무명·수행 내용·관련 프로그램이 포함된 목록으로 먼저 보여줍니다. 연속 키 입력 원문과 화면 전체는 기본 수집 대상에서 제외합니다.</w:t>
+      </w:r>
+    </w:p>
+    <w:p>
+      <w:pPr>
+        <w:pStyle w:val="Normal"/>
+      </w:pPr>
+      <w:r>
+        <w:rPr>
+          <w:rFonts w:ascii="바탕체" w:hAnsi="바탕체" w:eastAsia="바탕체" w:cs="바탕체"/>
+          <w:sz w:val="28"/>
+          <w:szCs w:val="28"/>
+          <w:lang w:val="ko-KR" w:eastAsia="ko-KR"/>
+        </w:rPr>
+        <w:t xml:space="preserve">다음은 기밀 없는 시연 자료를 이용한 가상의 예시입니다.</w:t>
       </w:r>
     </w:p>
     <w:tbl>
@@ -254,6 +294,7 @@
             <w:pPr>
               <w:pStyle w:val="Normal"/>
               <w:spacing w:after="40" w:line="280" w:lineRule="auto"/>
+              <w:keepNext/>
             </w:pPr>
             <w:r>
               <w:rPr>
@@ -264,7 +305,7 @@
                 <w:b/>
                 <w:bCs/>
               </w:rPr>
-              <w:t xml:space="preserve">관측된 기록</w:t>
+              <w:t xml:space="preserve">수집된 기록</w:t>
             </w:r>
           </w:p>
         </w:tc>
@@ -278,6 +319,7 @@
             <w:pPr>
               <w:pStyle w:val="Normal"/>
               <w:spacing w:after="40" w:line="280" w:lineRule="auto"/>
+              <w:keepNext/>
             </w:pPr>
             <w:r>
               <w:rPr>
@@ -288,7 +330,7 @@
                 <w:b/>
                 <w:bCs/>
               </w:rPr>
-              <w:t xml:space="preserve">AI가 연결·분류할 업무</w:t>
+              <w:t xml:space="preserve">AI가 정리해 보여주는 수행 내역</w:t>
             </w:r>
           </w:p>
         </w:tc>
@@ -446,13 +488,8 @@
           <w:szCs w:val="28"/>
           <w:lang w:val="ko-KR" w:eastAsia="ko-KR"/>
         </w:rPr>
-        <w:t xml:space="preserve">같은 프로젝트 이름이라도 자료 작성과 개발 오류 수정처럼 목적이 다른 업무는 구분한다. 여러 클릭을 곧바로 여러 업무로 세지 않고, 연결 이유와 근거를 업무 카드에 표시한다. 사용자는 모호한 이름·분류나 잘못된 연결만 짧게 수정하고, 수정 내용은 이후 분석에 반영한다.</w:t>
-      </w:r>
-    </w:p>
-    <w:p>
-      <w:pPr>
-        <w:pStyle w:val="Heading2"/>
-      </w:pPr>
+        <w:t xml:space="preserve">업무 하나의 이름·수행 내용·관련 기록을 함께 확인하는 요약 화면을 </w:t>
+      </w:r>
       <w:r>
         <w:rPr>
           <w:rFonts w:ascii="바탕체" w:hAnsi="바탕체" w:eastAsia="바탕체" w:cs="바탕체"/>
@@ -462,7 +499,32 @@
           <w:b/>
           <w:bCs/>
         </w:rPr>
-        <w:t xml:space="preserve">② 반복 흐름을 패턴화해 효율화 솔루션 제안·제공</w:t>
+        <w:t xml:space="preserve">업무 카드</w:t>
+      </w:r>
+      <w:r>
+        <w:rPr>
+          <w:rFonts w:ascii="바탕체" w:hAnsi="바탕체" w:eastAsia="바탕체" w:cs="바탕체"/>
+          <w:sz w:val="28"/>
+          <w:szCs w:val="28"/>
+          <w:lang w:val="ko-KR" w:eastAsia="ko-KR"/>
+        </w:rPr>
+        <w:t xml:space="preserve">로 제공합니다. 같은 프로젝트 이름이라도 자료 작성과 개발 오류 수정처럼 목적이 다른 업무는 구분합니다. 사용자는 연결이 불확실한 항목이나 잘못된 이름·분류만 짧게 수정하고, 수정 내용은 이후 분석에 반영합니다. 여러 클릭이나 입력 수정이 곧바로 여러 건의 업무가 되지 않도록 정리합니다.</w:t>
+      </w:r>
+    </w:p>
+    <w:p>
+      <w:pPr>
+        <w:pStyle w:val="Heading2"/>
+      </w:pPr>
+      <w:r>
+        <w:rPr>
+          <w:rFonts w:ascii="바탕체" w:hAnsi="바탕체" w:eastAsia="바탕체" w:cs="바탕체"/>
+          <w:sz w:val="28"/>
+          <w:szCs w:val="28"/>
+          <w:lang w:val="ko-KR" w:eastAsia="ko-KR"/>
+          <w:b/>
+          <w:bCs/>
+        </w:rPr>
+        <w:t xml:space="preserve">② 누적된 기록에서 반복 흐름이 확인되면 개선 방법을 제안합니다</w:t>
       </w:r>
     </w:p>
     <w:p>
@@ -476,7 +538,61 @@
           <w:szCs w:val="28"/>
           <w:lang w:val="ko-KR" w:eastAsia="ko-KR"/>
         </w:rPr>
-        <w:t xml:space="preserve">AI가 누적된 업무의 목적·처리 순서·데이터 이동을 비교해 반복 흐름을 패턴화한다. 무엇을 반복했는지에 더해, 어느 단계를 어떻게 바꾸면 좋을지 자동화 설계안이나 템플릿으로 제공하고자 한다.</w:t>
+        <w:t xml:space="preserve">업무별 수행 내역이 쌓이면 AI가 목적·처리 순서·자료 이동을 비교해 반복되는 흐름을 패턴화합니다. 이를 바탕으로 어떤 단계를 줄이거나 자동화하면 좋을지 효율화 솔루션을 제안합니다.</w:t>
+      </w:r>
+    </w:p>
+    <w:p>
+      <w:pPr>
+        <w:pStyle w:val="Normal"/>
+      </w:pPr>
+      <w:r>
+        <w:rPr>
+          <w:rFonts w:ascii="바탕체" w:hAnsi="바탕체" w:eastAsia="바탕체" w:cs="바탕체"/>
+          <w:sz w:val="28"/>
+          <w:szCs w:val="28"/>
+          <w:lang w:val="ko-KR" w:eastAsia="ko-KR"/>
+        </w:rPr>
+        <w:t xml:space="preserve">개선 방법은 처리 단계·필요한 입력·확인 조건을 정리한 </w:t>
+      </w:r>
+      <w:r>
+        <w:rPr>
+          <w:rFonts w:ascii="바탕체" w:hAnsi="바탕체" w:eastAsia="바탕체" w:cs="바탕체"/>
+          <w:sz w:val="28"/>
+          <w:szCs w:val="28"/>
+          <w:lang w:val="ko-KR" w:eastAsia="ko-KR"/>
+          <w:b/>
+          <w:bCs/>
+        </w:rPr>
+        <w:t xml:space="preserve">자동화 설계안</w:t>
+      </w:r>
+      <w:r>
+        <w:rPr>
+          <w:rFonts w:ascii="바탕체" w:hAnsi="바탕체" w:eastAsia="바탕체" w:cs="바탕체"/>
+          <w:sz w:val="28"/>
+          <w:szCs w:val="28"/>
+          <w:lang w:val="ko-KR" w:eastAsia="ko-KR"/>
+        </w:rPr>
+        <w:t xml:space="preserve">이나, 반복해서 사용할 수 있는 공통 양식인 </w:t>
+      </w:r>
+      <w:r>
+        <w:rPr>
+          <w:rFonts w:ascii="바탕체" w:hAnsi="바탕체" w:eastAsia="바탕체" w:cs="바탕체"/>
+          <w:sz w:val="28"/>
+          <w:szCs w:val="28"/>
+          <w:lang w:val="ko-KR" w:eastAsia="ko-KR"/>
+          <w:b/>
+          <w:bCs/>
+        </w:rPr>
+        <w:t xml:space="preserve">템플릿</w:t>
+      </w:r>
+      <w:r>
+        <w:rPr>
+          <w:rFonts w:ascii="바탕체" w:hAnsi="바탕체" w:eastAsia="바탕체" w:cs="바탕체"/>
+          <w:sz w:val="28"/>
+          <w:szCs w:val="28"/>
+          <w:lang w:val="ko-KR" w:eastAsia="ko-KR"/>
+        </w:rPr>
+        <w:t xml:space="preserve">으로 제공합니다. 다음은 반복 업무와 연결한 개선 예시입니다.</w:t>
       </w:r>
     </w:p>
     <w:tbl>
@@ -518,6 +634,7 @@
             <w:pPr>
               <w:pStyle w:val="Normal"/>
               <w:spacing w:after="40" w:line="280" w:lineRule="auto"/>
+              <w:keepNext/>
             </w:pPr>
             <w:r>
               <w:rPr>
@@ -542,6 +659,7 @@
             <w:pPr>
               <w:pStyle w:val="Normal"/>
               <w:spacing w:after="40" w:line="280" w:lineRule="auto"/>
+              <w:keepNext/>
             </w:pPr>
             <w:r>
               <w:rPr>
@@ -552,7 +670,7 @@
                 <w:b/>
                 <w:bCs/>
               </w:rPr>
-              <w:t xml:space="preserve">효율화 솔루션</w:t>
+              <w:t xml:space="preserve">제안할 효율화 솔루션</w:t>
             </w:r>
           </w:p>
         </w:tc>
@@ -566,6 +684,7 @@
             <w:pPr>
               <w:pStyle w:val="Normal"/>
               <w:spacing w:after="40" w:line="280" w:lineRule="auto"/>
+              <w:keepNext/>
             </w:pPr>
             <w:r>
               <w:rPr>
@@ -691,7 +810,7 @@
                 <w:szCs w:val="28"/>
                 <w:lang w:val="ko-KR" w:eastAsia="ko-KR"/>
               </w:rPr>
-              <w:t xml:space="preserve">입력 항목 대응표와 문서 자동 채움 템플릿</w:t>
+              <w:t xml:space="preserve">조회 항목을 문서의 어느 위치에 넣을지 정한 대응표와 자동 채움 템플릿</w:t>
             </w:r>
           </w:p>
         </w:tc>
@@ -712,7 +831,7 @@
                 <w:szCs w:val="28"/>
                 <w:lang w:val="ko-KR" w:eastAsia="ko-KR"/>
               </w:rPr>
-              <w:t xml:space="preserve">조회 항목, 문서에 넣을 위치, 사람이 확인할 예외</w:t>
+              <w:t xml:space="preserve">조회 항목, 문서 입력 위치, 사람이 확인할 예외</w:t>
             </w:r>
           </w:p>
         </w:tc>
@@ -759,7 +878,7 @@
                 <w:szCs w:val="28"/>
                 <w:lang w:val="ko-KR" w:eastAsia="ko-KR"/>
               </w:rPr>
-              <w:t xml:space="preserve">체크리스트와 규칙 기반 자동 점검 설계안</w:t>
+              <w:t xml:space="preserve">검토 체크리스트와 정해진 조건에 따른 자동 점검 설계안</w:t>
             </w:r>
           </w:p>
         </w:tc>
@@ -797,7 +916,7 @@
           <w:szCs w:val="28"/>
           <w:lang w:val="ko-KR" w:eastAsia="ko-KR"/>
         </w:rPr>
-        <w:t xml:space="preserve">솔루션에는 대상 업무·반복 근거·개선 단계·적용 조건을 담고, 사용자가 채택·수정·보류할 수 있게 한다. 미확인 패턴은 후보로 표시하며, 실제 업무 반복 횟수는 사용자가 확인한 업무 단위로 계산한다. 자동화 실행은 후속 확장으로 두고, 절감 시간과 효과는 실제 적용 후 검증한다.</w:t>
+        <w:t xml:space="preserve">제안에는 대상 업무·반복 근거·개선 단계·적용 조건을 담고, 사용자가 채택·수정·보류할 수 있게 합니다. 반복으로 묶은 이유가 불확실하면 확인이 필요한 후보로 표시하며, 실제 반복 횟수는 사용자가 확인한 업무 단위로 계산합니다. 해커톤에서는 설계안 또는 템플릿 한 개를 제안하고, 자동화 실행은 후속 확장으로 둡니다. 절감 시간과 효과는 실제 적용 후 검증합니다.</w:t>
       </w:r>
     </w:p>
     <w:p>
@@ -813,7 +932,7 @@
           <w:b/>
           <w:bCs/>
         </w:rPr>
-        <w:t xml:space="preserve">③ 같은 기록으로 업무 회고와 문서 자동화</w:t>
+        <w:t xml:space="preserve">③ 같은 업무 기록을 회고와 문서 작성의 근거로 활용합니다</w:t>
       </w:r>
     </w:p>
     <w:p>
@@ -827,7 +946,7 @@
           <w:szCs w:val="28"/>
           <w:lang w:val="ko-KR" w:eastAsia="ko-KR"/>
         </w:rPr>
-        <w:t xml:space="preserve">AI가 업무 기록을 기간·프로젝트·업무 유형별로 정리하고, 사용자가 선택한 서식에 맞춰 문서 초안을 생성하도록 할 계획이다.</w:t>
+        <w:t xml:space="preserve">문서 작성에는 ①에서 정리한 업무별 수행 내역을 기본 자료로 활용합니다. 사용자가 기간·프로젝트·업무 유형별로 자신의 일을 돌아보고, 선택한 서식에 맞는 문서 초안을 생성할 수 있게 합니다. 개선 제안을 검토하거나 적용했다면 해당 내용도 관련 기록과 함께 반영합니다.</w:t>
       </w:r>
     </w:p>
     <w:tbl>
@@ -869,6 +988,7 @@
             <w:pPr>
               <w:pStyle w:val="Normal"/>
               <w:spacing w:after="40" w:line="280" w:lineRule="auto"/>
+              <w:keepNext/>
             </w:pPr>
             <w:r>
               <w:rPr>
@@ -893,6 +1013,7 @@
             <w:pPr>
               <w:pStyle w:val="Normal"/>
               <w:spacing w:after="40" w:line="280" w:lineRule="auto"/>
+              <w:keepNext/>
             </w:pPr>
             <w:r>
               <w:rPr>
@@ -917,6 +1038,7 @@
             <w:pPr>
               <w:pStyle w:val="Normal"/>
               <w:spacing w:after="40" w:line="280" w:lineRule="auto"/>
+              <w:keepNext/>
             </w:pPr>
             <w:r>
               <w:rPr>
@@ -974,7 +1096,7 @@
                 <w:szCs w:val="28"/>
                 <w:lang w:val="ko-KR" w:eastAsia="ko-KR"/>
               </w:rPr>
-              <w:t xml:space="preserve">수행 업무·반복 흐름·개선 시도와 관련 근거</w:t>
+              <w:t xml:space="preserve">기간별 수행 내역·반복 흐름·개선 시도와 관련 기록</w:t>
             </w:r>
           </w:p>
         </w:tc>
@@ -995,7 +1117,7 @@
                 <w:szCs w:val="28"/>
                 <w:lang w:val="ko-KR" w:eastAsia="ko-KR"/>
               </w:rPr>
-              <w:t xml:space="preserve">무엇을 했고 어떤 과정을 개선할지 돌아보기</w:t>
+              <w:t xml:space="preserve">어떤 일을 했고 다음에 무엇을 개선할지 돌아보기</w:t>
             </w:r>
           </w:p>
         </w:tc>
@@ -1042,7 +1164,7 @@
                 <w:szCs w:val="28"/>
                 <w:lang w:val="ko-KR" w:eastAsia="ko-KR"/>
               </w:rPr>
-              <w:t xml:space="preserve">수행 업무·진행 내용·이슈·다음 계획의 서식별 초안</w:t>
+              <w:t xml:space="preserve">확인된 수행 내역과 사용자가 보완한 진행 내용·이슈·다음 계획을 담은 초안</w:t>
             </w:r>
           </w:p>
         </w:tc>
@@ -1063,7 +1185,7 @@
                 <w:szCs w:val="28"/>
                 <w:lang w:val="ko-KR" w:eastAsia="ko-KR"/>
               </w:rPr>
-              <w:t xml:space="preserve">필요한 내용만 보완해 문서 작성 시간 절감</w:t>
+              <w:t xml:space="preserve">필요한 내용을 검토·보완해 보고 문서 작성</w:t>
             </w:r>
           </w:p>
         </w:tc>
@@ -1089,7 +1211,7 @@
                 <w:szCs w:val="28"/>
                 <w:lang w:val="ko-KR" w:eastAsia="ko-KR"/>
               </w:rPr>
-              <w:t xml:space="preserve">기타 업무 문서</w:t>
+              <w:t xml:space="preserve">평가 노트 등 필요한 문서</w:t>
             </w:r>
           </w:p>
         </w:tc>
@@ -1110,7 +1232,7 @@
                 <w:szCs w:val="28"/>
                 <w:lang w:val="ko-KR" w:eastAsia="ko-KR"/>
               </w:rPr>
-              <w:t xml:space="preserve">확인한 업무 사례·결과·기여의 요약</w:t>
+              <w:t xml:space="preserve">수행한 업무 사례·사용자가 확인한 결과와 기여·관련 근거를 연결한 초안</w:t>
             </w:r>
           </w:p>
         </w:tc>
@@ -1131,7 +1253,7 @@
                 <w:szCs w:val="28"/>
                 <w:lang w:val="ko-KR" w:eastAsia="ko-KR"/>
               </w:rPr>
-              <w:t xml:space="preserve">필요시 평가노트 등 다른 문서에 재사용</w:t>
+              <w:t xml:space="preserve">같은 업무 기록을 문서 작성의 근거로 재사용</w:t>
             </w:r>
           </w:p>
         </w:tc>
@@ -1148,7 +1270,7 @@
           <w:szCs w:val="28"/>
           <w:lang w:val="ko-KR" w:eastAsia="ko-KR"/>
         </w:rPr>
-        <w:t xml:space="preserve">문서 항목에는 업무 카드와 관측 근거를 연결한다. 완료 여부·실제 결과·기여는 사용자 확인이나 추가 자료가 있을 때 포함하고, 부족한 정보는 보완 항목으로 남긴다. 사용자가 검토한 뒤 저장·내보낼 수 있게 한다.</w:t>
+        <w:t xml:space="preserve">문서 항목에는 해당 업무 카드와 수집 기록을 연결합니다. 실제 완료 여부·결과·기여·다음 계획은 관련 자료가 있거나 사용자가 확인·추가한 경우에 포함합니다. 기록만으로 알 수 없는 내용은 보완 항목으로 남기고, 사용자가 검토한 뒤 저장·내보낼 수 있게 합니다.</w:t>
       </w:r>
     </w:p>
     <w:p>
@@ -1164,7 +1286,7 @@
           <w:b/>
           <w:bCs/>
         </w:rPr>
-        <w:t xml:space="preserve">④ 부수 기능: 타임테이블과 프로그램 사용 현황</w:t>
+        <w:t xml:space="preserve">④ 부수 기능으로 타임테이블과 프로그램 사용 현황을 제공합니다</w:t>
       </w:r>
     </w:p>
     <w:p>
@@ -1178,41 +1300,8 @@
           <w:szCs w:val="28"/>
           <w:lang w:val="ko-KR" w:eastAsia="ko-KR"/>
         </w:rPr>
-        <w:t xml:space="preserve">수집 시각·앱 전환·업무 분류를 활용해 시간대별 타임테이블, 업무별 소요 시간 추정치, 프로그램별 관측 사용 시간과 사용 비중을 제공할 수 있다. 어떤 업무에 시간이 많이 들고 어떤 도구를 자주 오가는지 확인하는 참고 자료로 활용한다.</w:t>
-      </w:r>
-    </w:p>
-    <w:p>
-      <w:pPr>
-        <w:pStyle w:val="Normal"/>
-      </w:pPr>
-      <w:r>
-        <w:rPr>
-          <w:rFonts w:ascii="바탕체" w:hAnsi="바탕체" w:eastAsia="바탕체" w:cs="바탕체"/>
-          <w:sz w:val="28"/>
-          <w:szCs w:val="28"/>
-          <w:lang w:val="ko-KR" w:eastAsia="ko-KR"/>
-        </w:rPr>
-        <w:t xml:space="preserve">허용한 범위에서 관측한 시간만 집계하고, 업무별 배분은 근거가 있을 때만 추정한다. 겹치는 구간은 중복 합산하지 않으며 유휴·오프라인 업무·미수집·미분류 구간을 구분한다. 일부 프로그램만 수집했다면 그 범위의 통계임을 표시한다.</w:t>
-      </w:r>
-    </w:p>
-    <w:p>
-      <w:pPr>
-        <w:pStyle w:val="Normal"/>
-      </w:pPr>
-      <w:r>
-        <w:rPr>
-          <w:rFonts w:ascii="바탕체" w:hAnsi="바탕체" w:eastAsia="바탕체" w:cs="바탕체"/>
-          <w:sz w:val="28"/>
-          <w:szCs w:val="28"/>
-          <w:lang w:val="ko-KR" w:eastAsia="ko-KR"/>
-        </w:rPr>
-        <w:t xml:space="preserve">구현에는 운영체제 이벤트·접근성 API와 필요한 앱 연동, 로컬 DB, 업무 카드 화면과 LLM API를 활용할 계획이다. 건수·날짜·관측 시간은 코드로 계산하고, AI는 맥락에 따른 업무 연결·분류·패턴 해석·솔루션과 문서 초안 생성을 맡는다.</w:t>
-      </w:r>
-    </w:p>
-    <w:p>
-      <w:pPr>
-        <w:pStyle w:val="Heading1"/>
-      </w:pPr>
+        <w:t xml:space="preserve">수집 시각·프로그램 전환·업무 분류를 활용해 시간대별로 어떤 업무를 했는지 보여주는 표인 </w:t>
+      </w:r>
       <w:r>
         <w:rPr>
           <w:rFonts w:ascii="바탕체" w:hAnsi="바탕체" w:eastAsia="바탕체" w:cs="바탕체"/>
@@ -1222,21 +1311,16 @@
           <w:b/>
           <w:bCs/>
         </w:rPr>
-        <w:t xml:space="preserve">3. 해커톤 2일 동안 구현해 보고 싶은 주요기능은 무엇인가요?</w:t>
-      </w:r>
-    </w:p>
-    <w:p>
-      <w:pPr>
-        <w:pStyle w:val="Guidance"/>
-      </w:pPr>
-      <w:r>
-        <w:rPr>
-          <w:rFonts w:ascii="바탕체" w:hAnsi="바탕체" w:eastAsia="바탕체" w:cs="바탕체"/>
-          <w:sz w:val="28"/>
-          <w:szCs w:val="28"/>
-          <w:lang w:val="ko-KR" w:eastAsia="ko-KR"/>
-        </w:rPr>
-        <w:t xml:space="preserve">아이디어가 구현되면 사용자가 무엇을 하고, AI가 어떤 결과를 보여줄지 적어주세요.</w:t>
+        <w:t xml:space="preserve">타임테이블</w:t>
+      </w:r>
+      <w:r>
+        <w:rPr>
+          <w:rFonts w:ascii="바탕체" w:hAnsi="바탕체" w:eastAsia="바탕체" w:cs="바탕체"/>
+          <w:sz w:val="28"/>
+          <w:szCs w:val="28"/>
+          <w:lang w:val="ko-KR" w:eastAsia="ko-KR"/>
+        </w:rPr>
+        <w:t xml:space="preserve">을 제공합니다. 업무별 소요 시간 추정치와 프로그램별 사용 시간·비중도 함께 확인할 수 있습니다. 어떤 업무에 시간이 많이 들고 어떤 도구를 자주 오가는지 돌아보는 참고 자료로 활용합니다.</w:t>
       </w:r>
     </w:p>
     <w:p>
@@ -1250,8 +1334,27 @@
           <w:szCs w:val="28"/>
           <w:lang w:val="ko-KR" w:eastAsia="ko-KR"/>
         </w:rPr>
-        <w:t xml:space="preserve">2일 동안 </w:t>
-      </w:r>
+        <w:t xml:space="preserve">허용한 범위에서 확인한 시간만 집계하고, 업무별 시간은 연결 근거가 충분할 때만 추정합니다. 겹치는 구간은 중복 합산하지 않으며, 입력이 없는 시간·PC 밖의 업무·수집하지 않은 구간·분류가 불확실한 시간을 구분합니다. 일부 프로그램만 수집했다면 해당 범위의 통계임을 표시합니다.</w:t>
+      </w:r>
+    </w:p>
+    <w:p>
+      <w:pPr>
+        <w:pStyle w:val="Normal"/>
+      </w:pPr>
+      <w:r>
+        <w:rPr>
+          <w:rFonts w:ascii="바탕체" w:hAnsi="바탕체" w:eastAsia="바탕체" w:cs="바탕체"/>
+          <w:sz w:val="28"/>
+          <w:szCs w:val="28"/>
+          <w:lang w:val="ko-KR" w:eastAsia="ko-KR"/>
+        </w:rPr>
+        <w:t xml:space="preserve">구현에는 PC 조작과 프로그램 전환 정보를 수집하는 기능, 사용자 PC의 저장소, 업무 카드 화면과 AI 모델 연동 기능을 활용할 계획입니다. 건수·날짜·확인된 활동 시간은 코드로 계산하고, AI는 작업의 맥락에 따른 업무 연결·분류·반복 흐름 해석·개선 제안·문서 초안 생성을 맡습니다.</w:t>
+      </w:r>
+    </w:p>
+    <w:p>
+      <w:pPr>
+        <w:pStyle w:val="Heading1"/>
+      </w:pPr>
       <w:r>
         <w:rPr>
           <w:rFonts w:ascii="바탕체" w:hAnsi="바탕체" w:eastAsia="바탕체" w:cs="바탕체"/>
@@ -1261,16 +1364,55 @@
           <w:b/>
           <w:bCs/>
         </w:rPr>
-        <w:t xml:space="preserve">선택적 수집 → 업무 자동 분류·패턴화 → 효율화 솔루션 제안 → 업무 회고·일일 보고 초안 생성</w:t>
-      </w:r>
-      <w:r>
-        <w:rPr>
-          <w:rFonts w:ascii="바탕체" w:hAnsi="바탕체" w:eastAsia="바탕체" w:cs="바탕체"/>
-          <w:sz w:val="28"/>
-          <w:szCs w:val="28"/>
-          <w:lang w:val="ko-KR" w:eastAsia="ko-KR"/>
-        </w:rPr>
-        <w:t xml:space="preserve">을 연결하는 프로토타입을 구현하고자 한다.</w:t>
+        <w:t xml:space="preserve">3. 해커톤 2일 동안 구현해 보고 싶은 주요기능은 무엇인가요?</w:t>
+      </w:r>
+    </w:p>
+    <w:p>
+      <w:pPr>
+        <w:pStyle w:val="Guidance"/>
+      </w:pPr>
+      <w:r>
+        <w:rPr>
+          <w:rFonts w:ascii="바탕체" w:hAnsi="바탕체" w:eastAsia="바탕체" w:cs="바탕체"/>
+          <w:sz w:val="28"/>
+          <w:szCs w:val="28"/>
+          <w:lang w:val="ko-KR" w:eastAsia="ko-KR"/>
+        </w:rPr>
+        <w:t xml:space="preserve">아이디어가 구현되면 사용자가 무엇을 하고, AI가 어떤 결과를 보여줄지 적어주세요.</w:t>
+      </w:r>
+    </w:p>
+    <w:p>
+      <w:pPr>
+        <w:pStyle w:val="Normal"/>
+      </w:pPr>
+      <w:r>
+        <w:rPr>
+          <w:rFonts w:ascii="바탕체" w:hAnsi="바탕체" w:eastAsia="바탕체" w:cs="바탕체"/>
+          <w:sz w:val="28"/>
+          <w:szCs w:val="28"/>
+          <w:lang w:val="ko-KR" w:eastAsia="ko-KR"/>
+        </w:rPr>
+        <w:t xml:space="preserve">2일 동안 </w:t>
+      </w:r>
+      <w:r>
+        <w:rPr>
+          <w:rFonts w:ascii="바탕체" w:hAnsi="바탕체" w:eastAsia="바탕체" w:cs="바탕체"/>
+          <w:sz w:val="28"/>
+          <w:szCs w:val="28"/>
+          <w:lang w:val="ko-KR" w:eastAsia="ko-KR"/>
+          <w:b/>
+          <w:bCs/>
+        </w:rPr>
+        <w:t xml:space="preserve">선택한 범위의 자동 수집 → 업무별 수행 내역 정리·조회</w:t>
+      </w:r>
+      <w:r>
+        <w:rPr>
+          <w:rFonts w:ascii="바탕체" w:hAnsi="바탕체" w:eastAsia="바탕체" w:cs="바탕체"/>
+          <w:sz w:val="28"/>
+          <w:szCs w:val="28"/>
+          <w:lang w:val="ko-KR" w:eastAsia="ko-KR"/>
+        </w:rPr>
+        <w:t xml:space="preserve">를 먼저 구현합니다. 정리된 기록이 누적되면 반복 흐름의 패턴화와 개선 제안을 연결합니다. 업무 회고와 일일 보고 초안은 수행 내역이 정리된 시점부터 활용할 수 있도록 구현합니다.</w:t>
       </w:r>
     </w:p>
     <w:tbl>
@@ -1312,6 +1454,7 @@
             <w:pPr>
               <w:pStyle w:val="Normal"/>
               <w:spacing w:after="40" w:line="280" w:lineRule="auto"/>
+              <w:keepNext/>
             </w:pPr>
             <w:r>
               <w:rPr>
@@ -1336,6 +1479,7 @@
             <w:pPr>
               <w:pStyle w:val="Normal"/>
               <w:spacing w:after="40" w:line="280" w:lineRule="auto"/>
+              <w:keepNext/>
             </w:pPr>
             <w:r>
               <w:rPr>
@@ -1360,6 +1504,7 @@
             <w:pPr>
               <w:pStyle w:val="Normal"/>
               <w:spacing w:after="40" w:line="280" w:lineRule="auto"/>
+              <w:keepNext/>
             </w:pPr>
             <w:r>
               <w:rPr>
@@ -1438,7 +1583,7 @@
                 <w:szCs w:val="28"/>
                 <w:lang w:val="ko-KR" w:eastAsia="ko-KR"/>
               </w:rPr>
-              <w:t xml:space="preserve">허용한 작업만 로컬에 축적하고 수집 상태 표시. 시작·중지·전체 삭제 제공</w:t>
+              <w:t xml:space="preserve">허용한 작업만 사용자 PC에 축적하고 수집 상태 표시. 시작·중지·전체 삭제 제공</w:t>
             </w:r>
           </w:p>
         </w:tc>
@@ -1464,7 +1609,7 @@
                 <w:szCs w:val="28"/>
                 <w:lang w:val="ko-KR" w:eastAsia="ko-KR"/>
               </w:rPr>
-              <w:t xml:space="preserve">업무 자동 분류·확인</w:t>
+              <w:t xml:space="preserve">업무별 수행 내역 조회·수정</w:t>
             </w:r>
           </w:p>
         </w:tc>
@@ -1485,7 +1630,7 @@
                 <w:szCs w:val="28"/>
                 <w:lang w:val="ko-KR" w:eastAsia="ko-KR"/>
               </w:rPr>
-              <w:t xml:space="preserve">여러 프로그램을 오가며 일하고 모호한 항목만 수정</w:t>
+              <w:t xml:space="preserve">어떤 일을 했는지 목록으로 확인하고 불확실한 항목만 수정</w:t>
             </w:r>
           </w:p>
         </w:tc>
@@ -1506,7 +1651,7 @@
                 <w:szCs w:val="28"/>
                 <w:lang w:val="ko-KR" w:eastAsia="ko-KR"/>
               </w:rPr>
-              <w:t xml:space="preserve">관련 기록을 업무 카드로 연결하고 분류·연결 근거 표시</w:t>
+              <w:t xml:space="preserve">관련 기록을 업무 카드로 연결하고 업무명·수행 내용·분류·연결 근거 표시</w:t>
             </w:r>
           </w:p>
         </w:tc>
@@ -1532,7 +1677,7 @@
                 <w:szCs w:val="28"/>
                 <w:lang w:val="ko-KR" w:eastAsia="ko-KR"/>
               </w:rPr>
-              <w:t xml:space="preserve">반복 업무 패턴화·솔루션 제안</w:t>
+              <w:t xml:space="preserve">반복 업무 확인·개선 제안</w:t>
             </w:r>
           </w:p>
         </w:tc>
@@ -1553,7 +1698,7 @@
                 <w:szCs w:val="28"/>
                 <w:lang w:val="ko-KR" w:eastAsia="ko-KR"/>
               </w:rPr>
-              <w:t xml:space="preserve">자료 취합·문서 정리를 반복하고 제안을 검토</w:t>
+              <w:t xml:space="preserve">누적된 자료 취합·문서 정리 내역에서 반복 흐름과 제안을 검토</w:t>
             </w:r>
           </w:p>
         </w:tc>
@@ -1621,7 +1766,7 @@
                 <w:szCs w:val="28"/>
                 <w:lang w:val="ko-KR" w:eastAsia="ko-KR"/>
               </w:rPr>
-              <w:t xml:space="preserve">기간을 선택해 업무를 돌아보고 결과·이슈를 보완</w:t>
+              <w:t xml:space="preserve">기간을 선택해 업무를 돌아보고 실제 결과·이슈·다음 계획을 보완</w:t>
             </w:r>
           </w:p>
         </w:tc>
@@ -1642,7 +1787,7 @@
                 <w:szCs w:val="28"/>
                 <w:lang w:val="ko-KR" w:eastAsia="ko-KR"/>
               </w:rPr>
-              <w:t xml:space="preserve">업무 목록과 근거가 연결된 일일 보고 초안. 수정·저장·텍스트 내보내기</w:t>
+              <w:t xml:space="preserve">같은 수행 내역을 근거로 일일 보고 초안 생성. 수정·저장·텍스트 내보내기</w:t>
             </w:r>
           </w:p>
         </w:tc>
@@ -1710,7 +1855,7 @@
                 <w:szCs w:val="28"/>
                 <w:lang w:val="ko-KR" w:eastAsia="ko-KR"/>
               </w:rPr>
-              <w:t xml:space="preserve">관측한 범위의 타임테이블·프로그램 집계와 미수집 구간 표시</w:t>
+              <w:t xml:space="preserve">수집한 범위의 타임테이블·프로그램 집계와 미수집 구간 표시</w:t>
             </w:r>
           </w:p>
         </w:tc>
@@ -1727,7 +1872,7 @@
           <w:szCs w:val="28"/>
           <w:lang w:val="ko-KR" w:eastAsia="ko-KR"/>
         </w:rPr>
-        <w:t xml:space="preserve">대표 시연은 두 개 이상의 프로그램에서 ‘스프레드시트 자료 취합 → 업무 사이트 확인 → 문서 정리’를 수행하는 흐름으로 구성한다. 1일 차에는 허용 조건 판별·수집·로컬 저장과 AI 자동 분류를 연결하고, 2일 차에는 반복 패턴·솔루션 한 개와 일일 보고 초안·근거 연결·내보내기를 구현할 계획이다.</w:t>
+        <w:t xml:space="preserve">대표 시연은 두 개 이상의 프로그램에서 ‘스프레드시트 자료 취합 → 업무 사이트 확인 → 문서 정리’를 수행하는 흐름으로 구성합니다. 먼저 관련 기록이 업무별 수행 내역으로 정리되는 모습을 보여줍니다. 이어서 같은 작업을 반복한 기록에서 공통 흐름을 확인하고 개선 제안으로 연결한 뒤, 같은 수행 내역으로 일일 보고 초안을 생성합니다.</w:t>
       </w:r>
     </w:p>
     <w:p>
@@ -1741,7 +1886,7 @@
           <w:szCs w:val="28"/>
           <w:lang w:val="ko-KR" w:eastAsia="ko-KR"/>
         </w:rPr>
-        <w:t xml:space="preserve">허용·비허용 파일과 사이트를 섞어 제외한 개인 작업이 저장·전송되지 않는지도 확인한다. 실제 수집한 날짜·프로그램·범위를 표시하고, 여러 날의 누적 모습은 별도의 가상 자료로 설명한다.</w:t>
+        <w:t xml:space="preserve">1일 차에는 허용 조건 판별·수집·사용자 PC 저장과 AI 업무 분류·목록 조회를 연결합니다. 2일 차에는 반복 흐름을 패턴화하고, 개선 제안 한 개와 일일 보고 초안·근거 연결·내보내기를 구현할 계획입니다. 허용·비허용 파일과 사이트를 섞어 제외한 개인 작업이 저장·전송되지 않는지도 확인합니다. 실제 수집한 날짜·프로그램·범위를 표시하고, 여러 날의 누적 모습은 별도의 가상 자료로 설명합니다.</w:t>
       </w:r>
     </w:p>
     <w:p>
@@ -1755,7 +1900,7 @@
           <w:szCs w:val="28"/>
           <w:lang w:val="ko-KR" w:eastAsia="ko-KR"/>
         </w:rPr>
-        <w:t xml:space="preserve">타임테이블·프로그램 집계는 여유가 있을 때 시연한다. 메신저 대화 상대 등 추가 세부 필터, 주간·월간 보고·다양한 서식·정기 문서 생성, 고급 편집과 여러 앱·운영체제 지원은 후속 확장으로 둔다. 앱별 조건을 판별할 수 없으면 해당 작업은 수집하지 않는다.</w:t>
+        <w:t xml:space="preserve">타임테이블·프로그램 집계는 여유가 있을 때 시연합니다. 메신저 대화 상대 등 추가 세부 수집 조건, 주간·월간 보고와 평가 노트 등 다양한 서식·정기 문서 생성, 고급 편집과 여러 앱·운영체제 지원은 후속 확장으로 둡니다. 앱별 조건을 판별할 수 없으면 해당 작업은 수집하지 않습니다.</w:t>
       </w:r>
     </w:p>
     <w:p>
@@ -1819,7 +1964,7 @@
           <w:szCs w:val="28"/>
           <w:lang w:val="ko-KR" w:eastAsia="ko-KR"/>
         </w:rPr>
-        <w:t xml:space="preserve">이다. 기획·개발·분석·운영·지원 등 직무와 사용하는 도구가 달라도, 반복 수작업을 줄이고 자신의 업무를 돌아보려는 필요에 대응한다. 보고서 작성 여부와 관계없이 활용할 수 있으며, 장기적으로 다양한 조직의 PC 업무로 확장하고자 한다.</w:t>
+        <w:t xml:space="preserve">입니다. 기획·개발·분석·운영·지원 등 여러 직무에서 흩어진 작업을 업무별 수행 내역으로 확인하고 자신의 일을 돌아보도록 돕습니다. 기록이 쌓이면 반복 수작업의 개선 대상을 찾고, 필요한 문서에도 같은 기록을 활용합니다. 보고서 작성 여부와 관계없이 사용할 수 있으며, 장기적으로 다양한 조직의 PC 업무로 확장하고자 합니다.</w:t>
       </w:r>
     </w:p>
     <w:tbl>
@@ -1861,6 +2006,7 @@
             <w:pPr>
               <w:pStyle w:val="Normal"/>
               <w:spacing w:after="40" w:line="280" w:lineRule="auto"/>
+              <w:keepNext/>
             </w:pPr>
             <w:r>
               <w:rPr>
@@ -1885,6 +2031,7 @@
             <w:pPr>
               <w:pStyle w:val="Normal"/>
               <w:spacing w:after="40" w:line="280" w:lineRule="auto"/>
+              <w:keepNext/>
             </w:pPr>
             <w:r>
               <w:rPr>
@@ -1909,6 +2056,7 @@
             <w:pPr>
               <w:pStyle w:val="Normal"/>
               <w:spacing w:after="40" w:line="280" w:lineRule="auto"/>
+              <w:keepNext/>
             </w:pPr>
             <w:r>
               <w:rPr>
@@ -1945,7 +2093,7 @@
                 <w:szCs w:val="28"/>
                 <w:lang w:val="ko-KR" w:eastAsia="ko-KR"/>
               </w:rPr>
-              <w:t xml:space="preserve">자료 이동·입력·서식 맞춤 반복</w:t>
+              <w:t xml:space="preserve">여러 프로그램에 작업 기록이 흩어짐</w:t>
             </w:r>
           </w:p>
         </w:tc>
@@ -1966,7 +2114,7 @@
                 <w:szCs w:val="28"/>
                 <w:lang w:val="ko-KR" w:eastAsia="ko-KR"/>
               </w:rPr>
-              <w:t xml:space="preserve">반복 패턴을 근거로 효율화 솔루션과 적용 방법 제공</w:t>
+              <w:t xml:space="preserve">수행한 일을 업무별로 연결·분류해 어떤 업무를 했는지 한눈에 확인</w:t>
             </w:r>
           </w:p>
         </w:tc>
@@ -1987,7 +2135,7 @@
                 <w:szCs w:val="28"/>
                 <w:lang w:val="ko-KR" w:eastAsia="ko-KR"/>
               </w:rPr>
-              <w:t xml:space="preserve">제안의 실행 가능성 검토, 적용 후 시간·수작업 변화 확인</w:t>
+              <w:t xml:space="preserve">사용자 기준 업무와 비교해 잘못된 연결·누락·수정 부담 확인</w:t>
             </w:r>
           </w:p>
         </w:tc>
@@ -2013,7 +2161,7 @@
                 <w:szCs w:val="28"/>
                 <w:lang w:val="ko-KR" w:eastAsia="ko-KR"/>
               </w:rPr>
-              <w:t xml:space="preserve">여러 앱에 업무 맥락이 흩어짐</w:t>
+              <w:t xml:space="preserve">자료 이동·입력·서식 맞춤 반복</w:t>
             </w:r>
           </w:p>
         </w:tc>
@@ -2034,7 +2182,7 @@
                 <w:szCs w:val="28"/>
                 <w:lang w:val="ko-KR" w:eastAsia="ko-KR"/>
               </w:rPr>
-              <w:t xml:space="preserve">업무 성격에 맞게 연결·분류하고 놓친 일을 떠올릴 단서 제공</w:t>
+              <w:t xml:space="preserve">누적된 수행 내역에서 반복 패턴을 찾고 개선 방법과 적용 조건 제안</w:t>
             </w:r>
           </w:p>
         </w:tc>
@@ -2055,7 +2203,7 @@
                 <w:szCs w:val="28"/>
                 <w:lang w:val="ko-KR" w:eastAsia="ko-KR"/>
               </w:rPr>
-              <w:t xml:space="preserve">사용자 기준 업무와 비교해 잘못된 연결·누락·수정 부담 확인</w:t>
+              <w:t xml:space="preserve">제안의 실행 가능성 검토, 적용 후 시간·수작업 변화 확인</w:t>
             </w:r>
           </w:p>
         </w:tc>
@@ -2102,7 +2250,7 @@
                 <w:szCs w:val="28"/>
                 <w:lang w:val="ko-KR" w:eastAsia="ko-KR"/>
               </w:rPr>
-              <w:t xml:space="preserve">기간·프로젝트별 기록과 개선 시도를 회고</w:t>
+              <w:t xml:space="preserve">기간·프로젝트별 수행 내역과 개선 시도를 회고</w:t>
             </w:r>
           </w:p>
         </w:tc>
@@ -2149,7 +2297,7 @@
                 <w:szCs w:val="28"/>
                 <w:lang w:val="ko-KR" w:eastAsia="ko-KR"/>
               </w:rPr>
-              <w:t xml:space="preserve">보고 문서를 반복 작성</w:t>
+              <w:t xml:space="preserve">보고·업무 문서를 반복 작성</w:t>
             </w:r>
           </w:p>
         </w:tc>
@@ -2170,7 +2318,7 @@
                 <w:szCs w:val="28"/>
                 <w:lang w:val="ko-KR" w:eastAsia="ko-KR"/>
               </w:rPr>
-              <w:t xml:space="preserve">같은 기록으로 초안을 만들고 관련 근거에 바로 접근</w:t>
+              <w:t xml:space="preserve">같은 수행 내역을 근거로 초안을 만들고 관련 기록에 바로 접근</w:t>
             </w:r>
           </w:p>
         </w:tc>
@@ -2344,7 +2492,7 @@
           <w:szCs w:val="28"/>
           <w:lang w:val="ko-KR" w:eastAsia="ko-KR"/>
         </w:rPr>
-        <w:t xml:space="preserve">최초 수집 설정과 일상적인 검토·수정 부담을 함께 측정한다. 솔루션 제안의 유용성과 실제 적용 효과는 구분하고, 장기적인 시간 절감과 오류 감소는 후속 사용을 통해 검증한다. 조직에는 사용자가 선택해 공유한 업무 요약과 개선 제안으로 표준화·자동화 우선순위 논의를 도울 수 있다.</w:t>
+        <w:t xml:space="preserve">최초 수집 설정과 일상적인 검토·수정 부담을 함께 측정합니다. 업무별 수행 내역의 정확성, 개선 제안의 유용성, 문서 작성 부담의 변화를 각각 확인합니다. 장기적인 시간 절감과 오류 감소는 실제 솔루션 적용 후 검증합니다. 사용자가 선택해 공유한 업무 요약과 개선 제안은 조직의 표준화·자동화 우선순위 논의에도 활용할 수 있습니다.</w:t>
       </w:r>
     </w:p>
     <w:p>
@@ -2358,7 +2506,7 @@
           <w:szCs w:val="28"/>
           <w:lang w:val="ko-KR" w:eastAsia="ko-KR"/>
         </w:rPr>
-        <w:t xml:space="preserve">오프라인 업무나 미지원 앱의 작업은 필요시 사용자가 추가할 수 있게 한다. 관측한 활동 시간·입력 횟수·유휴 시간을 전체 근무시간이나 개인 생산성 점수로 환산하지 않는다.</w:t>
+        <w:t xml:space="preserve">오프라인 업무나 미지원 앱의 작업은 필요시 사용자가 추가할 수 있게 합니다. 확인된 활동 시간·입력 횟수·입력이 없는 시간을 전체 근무시간이나 개인 생산성 점수로 환산하지 않습니다.</w:t>
       </w:r>
     </w:p>
     <w:p>
@@ -2390,7 +2538,7 @@
           <w:b/>
           <w:bCs/>
         </w:rPr>
-        <w:t xml:space="preserve">평소처럼 일하면 자동으로 쌓이는 업무 데이터를 AI가 업무 성격에 맞게 분류·패턴화해 업무 효율화 솔루션을 제안하고, 나의 업무 회고와 문서 자동화를 돕는 AI 업무 비서.</w:t>
+        <w:t xml:space="preserve">평소처럼 일하면 AI가 업무별 수행 내역을 정리해 보여주고, 누적 기록에서 확인된 반복 흐름을 패턴화해 효율화 솔루션을 제안하며 같은 기록으로 업무 회고와 문서 자동화를 돕는 AI 업무 비서입니다.</w:t>
       </w:r>
     </w:p>
     <w:p>
@@ -2434,7 +2582,7 @@
           <w:szCs w:val="28"/>
           <w:lang w:val="ko-KR" w:eastAsia="ko-KR"/>
         </w:rPr>
-        <w:t xml:space="preserve">해커톤에서는 기밀 없는 테스트 자료로 필요한 데이터를 직접 수집·생성할 계획이다. 표에는 데이터의 원천 위치와 신규 수집·생성 예정 항목을 구분해 적었다.</w:t>
+        <w:t xml:space="preserve">해커톤에서는 기밀 없는 테스트 자료로 필요한 데이터를 직접 수집·생성할 계획입니다. 파일명·수정 시각·페이지 위치처럼 업무를 식별하는 정보는 메타데이터로 정리합니다. 수집한 작업 기록은 JSON 형식의 구조화된 데이터로 정리하고, 사용자 PC에서 실행하는 SQLite 데이터베이스에 저장할 계획입니다. 표에는 데이터의 원천 위치와 신규 수집·생성 예정 항목을 구분했습니다.</w:t>
       </w:r>
     </w:p>
     <w:tbl>
@@ -2477,6 +2625,7 @@
             <w:pPr>
               <w:pStyle w:val="Normal"/>
               <w:spacing w:after="40" w:line="280" w:lineRule="auto"/>
+              <w:keepNext/>
             </w:pPr>
             <w:r>
               <w:rPr>
@@ -2501,6 +2650,7 @@
             <w:pPr>
               <w:pStyle w:val="Normal"/>
               <w:spacing w:after="40" w:line="280" w:lineRule="auto"/>
+              <w:keepNext/>
             </w:pPr>
             <w:r>
               <w:rPr>
@@ -2525,6 +2675,7 @@
             <w:pPr>
               <w:pStyle w:val="Normal"/>
               <w:spacing w:after="40" w:line="280" w:lineRule="auto"/>
+              <w:keepNext/>
             </w:pPr>
             <w:r>
               <w:rPr>
@@ -2549,6 +2700,7 @@
             <w:pPr>
               <w:pStyle w:val="Normal"/>
               <w:spacing w:after="40" w:line="280" w:lineRule="auto"/>
+              <w:keepNext/>
             </w:pPr>
             <w:r>
               <w:rPr>
@@ -2805,7 +2957,7 @@
                 <w:szCs w:val="28"/>
                 <w:lang w:val="ko-KR" w:eastAsia="ko-KR"/>
               </w:rPr>
-              <w:t xml:space="preserve">신규 로컬 설정 화면에서 사용자 지정 예정</w:t>
+              <w:t xml:space="preserve">신규 사용자 PC 설정 화면에서 지정 예정</w:t>
             </w:r>
           </w:p>
         </w:tc>
@@ -2894,7 +3046,7 @@
                 <w:szCs w:val="28"/>
                 <w:lang w:val="ko-KR" w:eastAsia="ko-KR"/>
               </w:rPr>
-              <w:t xml:space="preserve">신규 로컬 DB에 생성·저장 예정</w:t>
+              <w:t xml:space="preserve">신규 사용자 PC 데이터베이스에 생성·저장 예정</w:t>
             </w:r>
           </w:p>
         </w:tc>
@@ -2983,7 +3135,7 @@
                 <w:szCs w:val="28"/>
                 <w:lang w:val="ko-KR" w:eastAsia="ko-KR"/>
               </w:rPr>
-              <w:t xml:space="preserve">신규 분석 모듈에서 생성해 로컬 저장 예정</w:t>
+              <w:t xml:space="preserve">신규 분석 기능에서 생성해 사용자 PC에 저장 예정</w:t>
             </w:r>
           </w:p>
         </w:tc>
@@ -3135,7 +3287,7 @@
           <w:szCs w:val="28"/>
           <w:lang w:val="ko-KR" w:eastAsia="ko-KR"/>
         </w:rPr>
-        <w:t xml:space="preserve"> AI 모델 호출 권한과 접속 환경, 기밀 없는 테스트 업무를 수행할 PC·프로그램, 업무 분류·솔루션·문서 초안을 검토할 SDS 임직원의 협조가 필요하다. 사내 자료를 활용할 경우에는 해당 환경에서 허용된 모델과 자료 범위를 적용한다.</w:t>
+        <w:t xml:space="preserve"> AI 모델 호출 권한과 접속 환경, 기밀 없는 테스트 업무를 수행할 PC·프로그램, 업무별 수행 내역·개선 제안·문서 초안을 검토할 SDS 임직원의 협조가 필요합니다. 사내 자료를 활용할 경우에는 해당 환경에서 허용된 모델과 자료 범위를 적용합니다.</w:t>
       </w:r>
     </w:p>
     <w:p>
@@ -3179,7 +3331,7 @@
           <w:szCs w:val="28"/>
           <w:lang w:val="ko-KR" w:eastAsia="ko-KR"/>
         </w:rPr>
-        <w:t xml:space="preserve">기본값은 수집하지 않는 상태로 두고, 사용자가 선택한 프로그램과 세부 조건에 맞는 작업만 추적하도록 설계한다. 프로그램 전체를 허용하거나, 같은 프로그램 안에서도 업무용 파일·대화·사이트로 범위를 좁힐 수 있게 한다.</w:t>
+        <w:t xml:space="preserve">기본값은 수집하지 않는 상태로 두고, 사용자가 선택한 프로그램과 세부 조건에 맞는 작업만 추적하도록 설계합니다. 프로그램 전체를 허용하거나, 같은 프로그램 안에서도 업무용 파일·대화·사이트로 범위를 좁힐 수 있게 합니다.</w:t>
       </w:r>
     </w:p>
     <w:tbl>
@@ -3221,6 +3373,7 @@
             <w:pPr>
               <w:pStyle w:val="Normal"/>
               <w:spacing w:after="40" w:line="280" w:lineRule="auto"/>
+              <w:keepNext/>
             </w:pPr>
             <w:r>
               <w:rPr>
@@ -3245,6 +3398,7 @@
             <w:pPr>
               <w:pStyle w:val="Normal"/>
               <w:spacing w:after="40" w:line="280" w:lineRule="auto"/>
+              <w:keepNext/>
             </w:pPr>
             <w:r>
               <w:rPr>
@@ -3269,6 +3423,7 @@
             <w:pPr>
               <w:pStyle w:val="Normal"/>
               <w:spacing w:after="40" w:line="280" w:lineRule="auto"/>
+              <w:keepNext/>
             </w:pPr>
             <w:r>
               <w:rPr>
@@ -3530,7 +3685,7 @@
                 <w:szCs w:val="28"/>
                 <w:lang w:val="ko-KR" w:eastAsia="ko-KR"/>
               </w:rPr>
-              <w:t xml:space="preserve">Chrome에서 지정한 업무 도메인·경로만 허용</w:t>
+              <w:t xml:space="preserve">Chrome에서 지정한 업무 사이트·페이지 경로만 허용</w:t>
             </w:r>
           </w:p>
         </w:tc>
@@ -3551,7 +3706,7 @@
                 <w:szCs w:val="28"/>
                 <w:lang w:val="ko-KR" w:eastAsia="ko-KR"/>
               </w:rPr>
-              <w:t xml:space="preserve">조건 밖의 개인 사이트·탭 제외. 전체 방문 기록·URL 쿼리는 기본 제외</w:t>
+              <w:t xml:space="preserve">조건 밖의 개인 사이트·탭 제외. 전체 방문 기록과 주소에 포함된 검색어·인증값은 기본 제외</w:t>
             </w:r>
           </w:p>
         </w:tc>
@@ -3568,7 +3723,7 @@
           <w:szCs w:val="28"/>
           <w:lang w:val="ko-KR" w:eastAsia="ko-KR"/>
         </w:rPr>
-        <w:t xml:space="preserve">허용 여부는 로컬에서 최소 식별 정보로 먼저 판단하고, </w:t>
+        <w:t xml:space="preserve">허용 여부는 사용자 PC에서 파일명·대화 상대·사이트 주소 등 최소한의 식별 정보로 먼저 판단합니다. </w:t>
       </w:r>
       <w:r>
         <w:rPr>
@@ -3579,16 +3734,16 @@
           <w:b/>
           <w:bCs/>
         </w:rPr>
-        <w:t xml:space="preserve">프로그램과 설정한 세부 조건을 함께 만족한 작업만 상세 맥락을 읽고 저장</w:t>
-      </w:r>
-      <w:r>
-        <w:rPr>
-          <w:rFonts w:ascii="바탕체" w:hAnsi="바탕체" w:eastAsia="바탕체" w:cs="바탕체"/>
-          <w:sz w:val="28"/>
-          <w:szCs w:val="28"/>
-          <w:lang w:val="ko-KR" w:eastAsia="ko-KR"/>
-        </w:rPr>
-        <w:t xml:space="preserve">한다. 제외 조건을 우선하고, 조건을 판별할 수 없으면 수집하지 않는다. 앱·파일·대화·탭이 전환될 때 다시 확인하며, 판단에 잠시 사용한 비허용 식별 정보도 기록하거나 외부로 보내지 않는다. 앱별 세부 식별의 지원 범위는 구현 과정에서 검증해 표시한다.</w:t>
+        <w:t xml:space="preserve">프로그램과 설정한 세부 조건을 함께 만족한 작업만 상세 정보를 읽고 저장</w:t>
+      </w:r>
+      <w:r>
+        <w:rPr>
+          <w:rFonts w:ascii="바탕체" w:hAnsi="바탕체" w:eastAsia="바탕체" w:cs="바탕체"/>
+          <w:sz w:val="28"/>
+          <w:szCs w:val="28"/>
+          <w:lang w:val="ko-KR" w:eastAsia="ko-KR"/>
+        </w:rPr>
+        <w:t xml:space="preserve">합니다. 제외 조건을 우선하고, 조건을 판별할 수 없으면 수집하지 않습니다. 앱·파일·대화·탭이 전환될 때 다시 확인하며, 판단에 잠시 사용한 비허용 식별 정보도 기록하거나 외부로 보내지 않습니다. 앱별 세부 식별의 지원 범위는 구현 과정에서 검증해 표시합니다.</w:t>
       </w:r>
     </w:p>
     <w:p>
@@ -3602,7 +3757,7 @@
           <w:szCs w:val="28"/>
           <w:lang w:val="ko-KR" w:eastAsia="ko-KR"/>
         </w:rPr>
-        <w:t xml:space="preserve">비밀번호·인증정보 입력은 제외하고, 연속 키 입력 원문·전체 화면·클립보드 원문·문서와 대화의 전체 내용은 기본 수집하지 않는다. 기록 시작·일시중지·현재 수집 상태 확인·전체 삭제를 제공한다. 원문은 로컬에 우선 저장하며 운영체제 보호 기능을 활용한다.</w:t>
+        <w:t xml:space="preserve">비밀번호·인증정보 입력은 제외하고, 연속 키 입력 원문·전체 화면·클립보드 원문·문서와 대화의 전체 내용은 기본 수집하지 않습니다. 기록 시작·일시중지·현재 수집 상태 확인·전체 삭제를 제공합니다. 수집 기록은 사용자 PC에 우선 저장하며 운영체제 보호 기능을 활용합니다.</w:t>
       </w:r>
     </w:p>
     <w:p>
@@ -3616,7 +3771,7 @@
           <w:szCs w:val="28"/>
           <w:lang w:val="ko-KR" w:eastAsia="ko-KR"/>
         </w:rPr>
-        <w:t xml:space="preserve">수집 허용과 외부 AI 전송 허용은 별도로 설정한다. 외부 모델에는 허용 자료 중 필요한 최소 맥락만 전송하고 민감정보 가림 처리와 전송 자료 미리보기를 제공할 계획이다. 자동 분석도 사용자가 정한 범위에서만 실행한다. 삭제는 원본과 분석 입력 사본·업무 카드·솔루션·문서 초안·시간 집계에 함께 적용한다. 개인 원본을 조직에 자동 공유하지 않고, 사용자가 선택한 요약과 제안만 공유할 수 있도록 한다.</w:t>
+        <w:t xml:space="preserve">수집 허용과 외부 AI 전송 허용은 별도로 설정합니다. 외부 모델에는 허용 자료 중 필요한 최소 정보만 전송하고, 민감정보를 가리는 처리와 전송 자료 미리보기를 제공할 계획입니다. 자동 분석도 사용자가 정한 범위에서만 실행합니다. 삭제는 수집 기록과 이를 토대로 생성한 업무 카드·개선 제안·문서 초안·시간 집계, 분석 입력 사본에 함께 적용합니다. 개인 수집 기록을 조직에 자동 공유하지 않고, 사용자가 선택한 요약과 제안만 공유할 수 있도록 합니다.</w:t>
       </w:r>
     </w:p>
     <w:p>
@@ -3630,7 +3785,7 @@
           <w:szCs w:val="28"/>
           <w:lang w:val="ko-KR" w:eastAsia="ko-KR"/>
         </w:rPr>
-        <w:t xml:space="preserve">장기적으로는 솔루션 적용 전후 비교, 직무별 템플릿과 지원 환경을 확장하고자 한다. </w:t>
+        <w:t xml:space="preserve">장기적으로는 직무별 분류와 문서 양식, 지원 환경을 확장하고 개선 방법의 적용 전후를 비교할 계획입니다. </w:t>
       </w:r>
       <w:r>
         <w:rPr>
@@ -3641,16 +3796,16 @@
           <w:b/>
           <w:bCs/>
         </w:rPr>
-        <w:t xml:space="preserve">반복 업무의 발견이 효율화 솔루션으로 이어지고, 같은 기록이 업무 회고와 문서 초안에 활용되는 경험</w:t>
-      </w:r>
-      <w:r>
-        <w:rPr>
-          <w:rFonts w:ascii="바탕체" w:hAnsi="바탕체" w:eastAsia="바탕체" w:cs="바탕체"/>
-          <w:sz w:val="28"/>
-          <w:szCs w:val="28"/>
-          <w:lang w:val="ko-KR" w:eastAsia="ko-KR"/>
-        </w:rPr>
-        <w:t xml:space="preserve">을 핵심 가치로 둔다.</w:t>
+        <w:t xml:space="preserve">먼저 내가 한 일을 업무별로 확인하고, 누적 기록의 반복 흐름을 개선 기회로 연결하며, 같은 기록을 회고와 문서 작성에 활용하는 경험</w:t>
+      </w:r>
+      <w:r>
+        <w:rPr>
+          <w:rFonts w:ascii="바탕체" w:hAnsi="바탕체" w:eastAsia="바탕체" w:cs="바탕체"/>
+          <w:sz w:val="28"/>
+          <w:szCs w:val="28"/>
+          <w:lang w:val="ko-KR" w:eastAsia="ko-KR"/>
+        </w:rPr>
+        <w:t xml:space="preserve">을 핵심 가치로 둡니다.</w:t>
       </w:r>
     </w:p>
     <w:sectPr>

</xml_diff>

<commit_message>
docs: remove collapsible sections from Word and HTML proposals
</commit_message>
<xml_diff>
--- a/AX-hackathon-proposal.docx
+++ b/AX-hackathon-proposal.docx
@@ -4,7 +4,7 @@
   <w:body>
     <w:p>
       <w:pPr>
-        <w:pStyle w:val="Title"/>
+        <w:pStyle w:val="DocumentTitle"/>
       </w:pPr>
       <w:r>
         <w:rPr>
@@ -18,7 +18,7 @@
     </w:p>
     <w:p>
       <w:pPr>
-        <w:pStyle w:val="Heading1"/>
+        <w:pStyle w:val="QuestionTitle"/>
       </w:pPr>
       <w:r>
         <w:rPr>
@@ -184,7 +184,7 @@
     </w:p>
     <w:p>
       <w:pPr>
-        <w:pStyle w:val="Heading1"/>
+        <w:pStyle w:val="QuestionTitle"/>
       </w:pPr>
       <w:r>
         <w:rPr>
@@ -214,7 +214,7 @@
     </w:p>
     <w:p>
       <w:pPr>
-        <w:pStyle w:val="Heading2"/>
+        <w:pStyle w:val="SectionTitle"/>
       </w:pPr>
       <w:r>
         <w:rPr>
@@ -513,7 +513,7 @@
     </w:p>
     <w:p>
       <w:pPr>
-        <w:pStyle w:val="Heading2"/>
+        <w:pStyle w:val="SectionTitle"/>
       </w:pPr>
       <w:r>
         <w:rPr>
@@ -921,7 +921,7 @@
     </w:p>
     <w:p>
       <w:pPr>
-        <w:pStyle w:val="Heading2"/>
+        <w:pStyle w:val="SectionTitle"/>
       </w:pPr>
       <w:r>
         <w:rPr>
@@ -1275,7 +1275,7 @@
     </w:p>
     <w:p>
       <w:pPr>
-        <w:pStyle w:val="Heading2"/>
+        <w:pStyle w:val="SectionTitle"/>
       </w:pPr>
       <w:r>
         <w:rPr>
@@ -1353,7 +1353,7 @@
     </w:p>
     <w:p>
       <w:pPr>
-        <w:pStyle w:val="Heading1"/>
+        <w:pStyle w:val="QuestionTitle"/>
       </w:pPr>
       <w:r>
         <w:rPr>
@@ -1905,7 +1905,7 @@
     </w:p>
     <w:p>
       <w:pPr>
-        <w:pStyle w:val="Heading1"/>
+        <w:pStyle w:val="QuestionTitle"/>
       </w:pPr>
       <w:r>
         <w:rPr>
@@ -2511,7 +2511,7 @@
     </w:p>
     <w:p>
       <w:pPr>
-        <w:pStyle w:val="Heading1"/>
+        <w:pStyle w:val="QuestionTitle"/>
       </w:pPr>
       <w:r>
         <w:rPr>
@@ -2543,7 +2543,7 @@
     </w:p>
     <w:p>
       <w:pPr>
-        <w:pStyle w:val="Heading1"/>
+        <w:pStyle w:val="QuestionTitle"/>
       </w:pPr>
       <w:r>
         <w:rPr>
@@ -3292,7 +3292,7 @@
     </w:p>
     <w:p>
       <w:pPr>
-        <w:pStyle w:val="Heading1"/>
+        <w:pStyle w:val="QuestionTitle"/>
       </w:pPr>
       <w:r>
         <w:rPr>
@@ -3308,7 +3308,7 @@
     </w:p>
     <w:p>
       <w:pPr>
-        <w:pStyle w:val="Heading2"/>
+        <w:pStyle w:val="SectionTitle"/>
       </w:pPr>
       <w:r>
         <w:rPr>
@@ -3861,8 +3861,8 @@
       <w:color w:val="59635B"/>
     </w:rPr>
   </w:style>
-  <w:style w:type="paragraph" w:styleId="Title">
-    <w:name w:val="제목"/>
+  <w:style w:type="paragraph" w:styleId="DocumentTitle">
+    <w:name w:val="기획서 제목"/>
     <w:basedOn w:val="Normal"/>
     <w:next w:val="Normal"/>
     <w:qFormat/>
@@ -3871,7 +3871,7 @@
       <w:keepLines/>
       <w:spacing w:before="240" w:after="160"/>
       <w:jc w:val="center"/>
-      <w:outlineLvl w:val="0"/>
+      <w:outlineLvl w:val="9"/>
     </w:pPr>
     <w:rPr>
       <w:rFonts w:ascii="바탕체" w:hAnsi="바탕체" w:eastAsia="바탕체" w:cs="바탕체"/>
@@ -3882,8 +3882,8 @@
       <w:bCs/>
     </w:rPr>
   </w:style>
-  <w:style w:type="paragraph" w:styleId="Heading1">
-    <w:name w:val="heading 1"/>
+  <w:style w:type="paragraph" w:styleId="QuestionTitle">
+    <w:name w:val="문항 제목"/>
     <w:basedOn w:val="Normal"/>
     <w:next w:val="Normal"/>
     <w:qFormat/>
@@ -3891,7 +3891,7 @@
       <w:keepNext/>
       <w:keepLines/>
       <w:spacing w:before="240" w:after="160"/>
-      <w:outlineLvl w:val="0"/>
+      <w:outlineLvl w:val="9"/>
     </w:pPr>
     <w:rPr>
       <w:rFonts w:ascii="바탕체" w:hAnsi="바탕체" w:eastAsia="바탕체" w:cs="바탕체"/>
@@ -3902,8 +3902,8 @@
       <w:bCs/>
     </w:rPr>
   </w:style>
-  <w:style w:type="paragraph" w:styleId="Heading2">
-    <w:name w:val="heading 2"/>
+  <w:style w:type="paragraph" w:styleId="SectionTitle">
+    <w:name w:val="본문 소제목"/>
     <w:basedOn w:val="Normal"/>
     <w:next w:val="Normal"/>
     <w:qFormat/>
@@ -3911,7 +3911,7 @@
       <w:keepNext/>
       <w:keepLines/>
       <w:spacing w:before="240" w:after="160"/>
-      <w:outlineLvl w:val="1"/>
+      <w:outlineLvl w:val="9"/>
     </w:pPr>
     <w:rPr>
       <w:rFonts w:ascii="바탕체" w:hAnsi="바탕체" w:eastAsia="바탕체" w:cs="바탕체"/>

</xml_diff>

<commit_message>
docs: remove square formatting markers from Word proposal
</commit_message>
<xml_diff>
--- a/AX-hackathon-proposal.docx
+++ b/AX-hackathon-proposal.docx
@@ -294,7 +294,6 @@
             <w:pPr>
               <w:pStyle w:val="Normal"/>
               <w:spacing w:after="40" w:line="280" w:lineRule="auto"/>
-              <w:keepNext/>
             </w:pPr>
             <w:r>
               <w:rPr>
@@ -319,7 +318,6 @@
             <w:pPr>
               <w:pStyle w:val="Normal"/>
               <w:spacing w:after="40" w:line="280" w:lineRule="auto"/>
-              <w:keepNext/>
             </w:pPr>
             <w:r>
               <w:rPr>
@@ -634,7 +632,6 @@
             <w:pPr>
               <w:pStyle w:val="Normal"/>
               <w:spacing w:after="40" w:line="280" w:lineRule="auto"/>
-              <w:keepNext/>
             </w:pPr>
             <w:r>
               <w:rPr>
@@ -659,7 +656,6 @@
             <w:pPr>
               <w:pStyle w:val="Normal"/>
               <w:spacing w:after="40" w:line="280" w:lineRule="auto"/>
-              <w:keepNext/>
             </w:pPr>
             <w:r>
               <w:rPr>
@@ -684,7 +680,6 @@
             <w:pPr>
               <w:pStyle w:val="Normal"/>
               <w:spacing w:after="40" w:line="280" w:lineRule="auto"/>
-              <w:keepNext/>
             </w:pPr>
             <w:r>
               <w:rPr>
@@ -988,7 +983,6 @@
             <w:pPr>
               <w:pStyle w:val="Normal"/>
               <w:spacing w:after="40" w:line="280" w:lineRule="auto"/>
-              <w:keepNext/>
             </w:pPr>
             <w:r>
               <w:rPr>
@@ -1013,7 +1007,6 @@
             <w:pPr>
               <w:pStyle w:val="Normal"/>
               <w:spacing w:after="40" w:line="280" w:lineRule="auto"/>
-              <w:keepNext/>
             </w:pPr>
             <w:r>
               <w:rPr>
@@ -1038,7 +1031,6 @@
             <w:pPr>
               <w:pStyle w:val="Normal"/>
               <w:spacing w:after="40" w:line="280" w:lineRule="auto"/>
-              <w:keepNext/>
             </w:pPr>
             <w:r>
               <w:rPr>
@@ -1454,7 +1446,6 @@
             <w:pPr>
               <w:pStyle w:val="Normal"/>
               <w:spacing w:after="40" w:line="280" w:lineRule="auto"/>
-              <w:keepNext/>
             </w:pPr>
             <w:r>
               <w:rPr>
@@ -1479,7 +1470,6 @@
             <w:pPr>
               <w:pStyle w:val="Normal"/>
               <w:spacing w:after="40" w:line="280" w:lineRule="auto"/>
-              <w:keepNext/>
             </w:pPr>
             <w:r>
               <w:rPr>
@@ -1504,7 +1494,6 @@
             <w:pPr>
               <w:pStyle w:val="Normal"/>
               <w:spacing w:after="40" w:line="280" w:lineRule="auto"/>
-              <w:keepNext/>
             </w:pPr>
             <w:r>
               <w:rPr>
@@ -2006,7 +1995,6 @@
             <w:pPr>
               <w:pStyle w:val="Normal"/>
               <w:spacing w:after="40" w:line="280" w:lineRule="auto"/>
-              <w:keepNext/>
             </w:pPr>
             <w:r>
               <w:rPr>
@@ -2031,7 +2019,6 @@
             <w:pPr>
               <w:pStyle w:val="Normal"/>
               <w:spacing w:after="40" w:line="280" w:lineRule="auto"/>
-              <w:keepNext/>
             </w:pPr>
             <w:r>
               <w:rPr>
@@ -2056,7 +2043,6 @@
             <w:pPr>
               <w:pStyle w:val="Normal"/>
               <w:spacing w:after="40" w:line="280" w:lineRule="auto"/>
-              <w:keepNext/>
             </w:pPr>
             <w:r>
               <w:rPr>
@@ -2625,7 +2611,6 @@
             <w:pPr>
               <w:pStyle w:val="Normal"/>
               <w:spacing w:after="40" w:line="280" w:lineRule="auto"/>
-              <w:keepNext/>
             </w:pPr>
             <w:r>
               <w:rPr>
@@ -2650,7 +2635,6 @@
             <w:pPr>
               <w:pStyle w:val="Normal"/>
               <w:spacing w:after="40" w:line="280" w:lineRule="auto"/>
-              <w:keepNext/>
             </w:pPr>
             <w:r>
               <w:rPr>
@@ -2675,7 +2659,6 @@
             <w:pPr>
               <w:pStyle w:val="Normal"/>
               <w:spacing w:after="40" w:line="280" w:lineRule="auto"/>
-              <w:keepNext/>
             </w:pPr>
             <w:r>
               <w:rPr>
@@ -2700,7 +2683,6 @@
             <w:pPr>
               <w:pStyle w:val="Normal"/>
               <w:spacing w:after="40" w:line="280" w:lineRule="auto"/>
-              <w:keepNext/>
             </w:pPr>
             <w:r>
               <w:rPr>
@@ -3373,7 +3355,6 @@
             <w:pPr>
               <w:pStyle w:val="Normal"/>
               <w:spacing w:after="40" w:line="280" w:lineRule="auto"/>
-              <w:keepNext/>
             </w:pPr>
             <w:r>
               <w:rPr>
@@ -3398,7 +3379,6 @@
             <w:pPr>
               <w:pStyle w:val="Normal"/>
               <w:spacing w:after="40" w:line="280" w:lineRule="auto"/>
-              <w:keepNext/>
             </w:pPr>
             <w:r>
               <w:rPr>
@@ -3423,7 +3403,6 @@
             <w:pPr>
               <w:pStyle w:val="Normal"/>
               <w:spacing w:after="40" w:line="280" w:lineRule="auto"/>
-              <w:keepNext/>
             </w:pPr>
             <w:r>
               <w:rPr>
@@ -3848,8 +3827,6 @@
     <w:basedOn w:val="Normal"/>
     <w:next w:val="Normal"/>
     <w:pPr>
-      <w:keepNext/>
-      <w:keepLines/>
       <w:ind w:left="120" w:right="120"/>
       <w:shd w:val="clear" w:fill="F2F4F1"/>
     </w:pPr>
@@ -3867,8 +3844,6 @@
     <w:next w:val="Normal"/>
     <w:qFormat/>
     <w:pPr>
-      <w:keepNext/>
-      <w:keepLines/>
       <w:spacing w:before="240" w:after="160"/>
       <w:jc w:val="center"/>
       <w:outlineLvl w:val="9"/>
@@ -3888,8 +3863,6 @@
     <w:next w:val="Normal"/>
     <w:qFormat/>
     <w:pPr>
-      <w:keepNext/>
-      <w:keepLines/>
       <w:spacing w:before="240" w:after="160"/>
       <w:outlineLvl w:val="9"/>
     </w:pPr>
@@ -3908,8 +3881,6 @@
     <w:next w:val="Normal"/>
     <w:qFormat/>
     <w:pPr>
-      <w:keepNext/>
-      <w:keepLines/>
       <w:spacing w:before="240" w:after="160"/>
       <w:outlineLvl w:val="9"/>
     </w:pPr>

</xml_diff>